<commit_message>
Expand team responsibilities and delivery plan
</commit_message>
<xml_diff>
--- a/docs/design/game-design.docx
+++ b/docs/design/game-design.docx
@@ -526,7 +526,7 @@
         <w:rPr>
           <w:b w:val="0"/>
         </w:rPr>
-        <w:t>第3页从立意与场景出发；第4—7页解释一次修复及其判定；第8—11页展开三个房间；第12—15页说明画面、声音、界面与时间同步；第16—17页记录当前验证和团队安排。</w:t>
+        <w:t>第3页从立意与场景出发；第4—7页解释一次修复及其判定；第8—11页展开三个房间；第12—15页说明画面、声音、界面与时间同步；第16页记录当前验证，第17—22页说明团队组织、个人职责、工作交接与阶段安排。</w:t>
       </w:r>
     </w:p>
     <w:p>
@@ -5142,7 +5142,15 @@
         <w:pageBreakBefore/>
       </w:pPr>
       <w:r>
-        <w:t>16 团队分工与后续完善</w:t>
+        <w:t>16 团队组织与人员分工</w:t>
+      </w:r>
+    </w:p>
+    <w:p>
+      <w:pPr>
+        <w:pStyle w:val="Heading2"/>
+      </w:pPr>
+      <w:r>
+        <w:t>一 团队构成</w:t>
       </w:r>
     </w:p>
     <w:p>
@@ -5150,7 +5158,15 @@
         <w:rPr>
           <w:b w:val="0"/>
         </w:rPr>
-        <w:t>团队由严楷哲、沈语雯、李星莹三人组成，严楷哲担任队长。职责按程序与版本、策划与视觉、音频与验证分配；涉及共同规则的修改，由对应成员交叉复核。下表说明已确认的职责安排，不替代个人实际完成记录。</w:t>
+        <w:t>团队由严楷哲、沈语雯、李星莹三人组成，严楷哲担任队长。围绕游戏的制作与呈现，将工作分为程序及版本、策划及视觉、音频及测试展示三个方向。每个方向设一名主负责人，相关成果由其他成员按各自职责复核后汇总。</w:t>
+      </w:r>
+    </w:p>
+    <w:p>
+      <w:r>
+        <w:rPr>
+          <w:b w:val="0"/>
+        </w:rPr>
+        <w:t>本章说明三人的职责范围和工作安排。现有项目已经具备可玩版本及配套材料，接下来的重点是完善体验、核对版本并完成交付；个人实际完成情况以修改记录、作品文件和复测结果为依据。</w:t>
       </w:r>
     </w:p>
     <w:tbl>
@@ -5170,8 +5186,9 @@
       </w:tblPr>
       <w:tblGrid>
         <w:gridCol w:w="1134"/>
-        <w:gridCol w:w="4025"/>
-        <w:gridCol w:w="4139"/>
+        <w:gridCol w:w="1928"/>
+        <w:gridCol w:w="3118"/>
+        <w:gridCol w:w="3118"/>
       </w:tblGrid>
       <w:tr>
         <w:trPr>
@@ -5207,7 +5224,7 @@
         </w:tc>
         <w:tc>
           <w:tcPr>
-            <w:tcW w:type="dxa" w:w="4025"/>
+            <w:tcW w:type="dxa" w:w="1928"/>
             <w:vAlign w:val="center"/>
             <w:shd w:fill="233C4A"/>
             <w:tcMar>
@@ -5228,13 +5245,13 @@
                 <w:color w:val="FFFFFF"/>
                 <w:sz w:val="20"/>
               </w:rPr>
-              <w:t>主要职责</w:t>
+              <w:t>职责定位</w:t>
             </w:r>
           </w:p>
         </w:tc>
         <w:tc>
           <w:tcPr>
-            <w:tcW w:type="dxa" w:w="4139"/>
+            <w:tcW w:type="dxa" w:w="3118"/>
             <w:vAlign w:val="center"/>
             <w:shd w:fill="233C4A"/>
             <w:tcMar>
@@ -5255,7 +5272,34 @@
                 <w:color w:val="FFFFFF"/>
                 <w:sz w:val="20"/>
               </w:rPr>
-              <w:t>工作交接与复核重点</w:t>
+              <w:t>主要负责对象</w:t>
+            </w:r>
+          </w:p>
+        </w:tc>
+        <w:tc>
+          <w:tcPr>
+            <w:tcW w:type="dxa" w:w="3118"/>
+            <w:vAlign w:val="center"/>
+            <w:shd w:fill="233C4A"/>
+            <w:tcMar>
+              <w:top w:w="75" w:type="dxa"/>
+              <w:bottom w:w="75" w:type="dxa"/>
+              <w:left w:w="95" w:type="dxa"/>
+              <w:right w:w="95" w:type="dxa"/>
+            </w:tcMar>
+          </w:tcPr>
+          <w:p>
+            <w:pPr>
+              <w:spacing w:line="300" w:lineRule="exact" w:after="0"/>
+              <w:jc w:val="left"/>
+            </w:pPr>
+            <w:r>
+              <w:rPr>
+                <w:b/>
+                <w:color w:val="FFFFFF"/>
+                <w:sz w:val="20"/>
+              </w:rPr>
+              <w:t>对应成果</w:t>
             </w:r>
           </w:p>
         </w:tc>
@@ -5292,7 +5336,7 @@
         </w:tc>
         <w:tc>
           <w:tcPr>
-            <w:tcW w:type="dxa" w:w="4025"/>
+            <w:tcW w:type="dxa" w:w="1928"/>
             <w:vAlign w:val="center"/>
             <w:shd w:fill="FFFFFF"/>
             <w:tcMar>
@@ -5312,13 +5356,15 @@
                 <w:b w:val="0"/>
                 <w:sz w:val="20"/>
               </w:rPr>
-              <w:t>队长；维护角色、节拍、机关与房间流程；处理程序问题；统一工程与运行版本</w:t>
+              <w:t>队长</w:t>
+              <w:br/>
+              <w:t>程序与版本统筹</w:t>
             </w:r>
           </w:p>
         </w:tc>
         <w:tc>
           <w:tcPr>
-            <w:tcW w:type="dxa" w:w="4139"/>
+            <w:tcW w:type="dxa" w:w="3118"/>
             <w:vAlign w:val="center"/>
             <w:shd w:fill="FFFFFF"/>
             <w:tcMar>
@@ -5338,7 +5384,33 @@
                 <w:b w:val="0"/>
                 <w:sz w:val="20"/>
               </w:rPr>
-              <w:t>接收带有复现步骤的问题，说明修复影响，提供统一版本供复测；统筹最终验收</w:t>
+              <w:t>角色、节拍、机关、房间流程及统一工程</w:t>
+            </w:r>
+          </w:p>
+        </w:tc>
+        <w:tc>
+          <w:tcPr>
+            <w:tcW w:type="dxa" w:w="3118"/>
+            <w:vAlign w:val="center"/>
+            <w:shd w:fill="FFFFFF"/>
+            <w:tcMar>
+              <w:top w:w="75" w:type="dxa"/>
+              <w:bottom w:w="75" w:type="dxa"/>
+              <w:left w:w="95" w:type="dxa"/>
+              <w:right w:w="95" w:type="dxa"/>
+            </w:tcMar>
+          </w:tcPr>
+          <w:p>
+            <w:pPr>
+              <w:spacing w:line="300" w:lineRule="exact" w:after="0"/>
+              <w:jc w:val="left"/>
+            </w:pPr>
+            <w:r>
+              <w:rPr>
+                <w:b w:val="0"/>
+                <w:sz w:val="20"/>
+              </w:rPr>
+              <w:t>游戏工程、运行包、版本说明与最终目录</w:t>
             </w:r>
           </w:p>
         </w:tc>
@@ -5375,7 +5447,7 @@
         </w:tc>
         <w:tc>
           <w:tcPr>
-            <w:tcW w:type="dxa" w:w="4025"/>
+            <w:tcW w:type="dxa" w:w="1928"/>
             <w:vAlign w:val="center"/>
             <w:shd w:fill="F3F6F7"/>
             <w:tcMar>
@@ -5395,13 +5467,15 @@
                 <w:b w:val="0"/>
                 <w:sz w:val="20"/>
               </w:rPr>
-              <w:t>维护玩法、关卡和策划内容；检查教学、落脚点、视觉状态和界面用语</w:t>
+              <w:t>策划、关卡</w:t>
+              <w:br/>
+              <w:t>与视觉交互</w:t>
             </w:r>
           </w:p>
         </w:tc>
         <w:tc>
           <w:tcPr>
-            <w:tcW w:type="dxa" w:w="4139"/>
+            <w:tcW w:type="dxa" w:w="3118"/>
             <w:vAlign w:val="center"/>
             <w:shd w:fill="F3F6F7"/>
             <w:tcMar>
@@ -5421,7 +5495,33 @@
                 <w:b w:val="0"/>
                 <w:sz w:val="20"/>
               </w:rPr>
-              <w:t>将体验问题落实到具体位置与修改建议；复核游戏、策划和展示内容中的规则是否一致</w:t>
+              <w:t>规则说明、关卡递进、教学、画面状态及界面文字</w:t>
+            </w:r>
+          </w:p>
+        </w:tc>
+        <w:tc>
+          <w:tcPr>
+            <w:tcW w:type="dxa" w:w="3118"/>
+            <w:vAlign w:val="center"/>
+            <w:shd w:fill="F3F6F7"/>
+            <w:tcMar>
+              <w:top w:w="75" w:type="dxa"/>
+              <w:bottom w:w="75" w:type="dxa"/>
+              <w:left w:w="95" w:type="dxa"/>
+              <w:right w:w="95" w:type="dxa"/>
+            </w:tcMar>
+          </w:tcPr>
+          <w:p>
+            <w:pPr>
+              <w:spacing w:line="300" w:lineRule="exact" w:after="0"/>
+              <w:jc w:val="left"/>
+            </w:pPr>
+            <w:r>
+              <w:rPr>
+                <w:b w:val="0"/>
+                <w:sz w:val="20"/>
+              </w:rPr>
+              <w:t>策划案、关卡调整建议、视觉与文案核对结果</w:t>
             </w:r>
           </w:p>
         </w:tc>
@@ -5458,7 +5558,7 @@
         </w:tc>
         <w:tc>
           <w:tcPr>
-            <w:tcW w:type="dxa" w:w="4025"/>
+            <w:tcW w:type="dxa" w:w="1928"/>
             <w:vAlign w:val="center"/>
             <w:shd w:fill="FFFFFF"/>
             <w:tcMar>
@@ -5478,13 +5578,15 @@
                 <w:b w:val="0"/>
                 <w:sz w:val="20"/>
               </w:rPr>
-              <w:t>检查配乐、校准与暂停恢复；组织功能及设备测试；维护音画与展示材料</w:t>
+              <w:t>音频、测试</w:t>
+              <w:br/>
+              <w:t>与展示材料</w:t>
             </w:r>
           </w:p>
         </w:tc>
         <w:tc>
           <w:tcPr>
-            <w:tcW w:type="dxa" w:w="4139"/>
+            <w:tcW w:type="dxa" w:w="3118"/>
             <w:vAlign w:val="center"/>
             <w:shd w:fill="FFFFFF"/>
             <w:tcMar>
@@ -5504,7 +5606,33 @@
                 <w:b w:val="0"/>
                 <w:sz w:val="20"/>
               </w:rPr>
-              <w:t>记录版本、设备、操作和结果；按原步骤复测；检查视频、PPT、讲稿与游戏画面对应</w:t>
+              <w:t>配乐与校准检查、功能与设备验证、视频及宣讲材料</w:t>
+            </w:r>
+          </w:p>
+        </w:tc>
+        <w:tc>
+          <w:tcPr>
+            <w:tcW w:type="dxa" w:w="3118"/>
+            <w:vAlign w:val="center"/>
+            <w:shd w:fill="FFFFFF"/>
+            <w:tcMar>
+              <w:top w:w="75" w:type="dxa"/>
+              <w:bottom w:w="75" w:type="dxa"/>
+              <w:left w:w="95" w:type="dxa"/>
+              <w:right w:w="95" w:type="dxa"/>
+            </w:tcMar>
+          </w:tcPr>
+          <w:p>
+            <w:pPr>
+              <w:spacing w:line="300" w:lineRule="exact" w:after="0"/>
+              <w:jc w:val="left"/>
+            </w:pPr>
+            <w:r>
+              <w:rPr>
+                <w:b w:val="0"/>
+                <w:sz w:val="20"/>
+              </w:rPr>
+              <w:t>测试记录、音画素材、展示文件及排练记录</w:t>
             </w:r>
           </w:p>
         </w:tc>
@@ -5521,11 +5649,19 @@
       </w:r>
     </w:p>
     <w:p>
+      <w:pPr>
+        <w:pStyle w:val="Heading2"/>
+      </w:pPr>
       <w:r>
-        <w:rPr>
-          <w:b w:val="0"/>
-        </w:rPr>
-        <w:t>程序改动完成后，李星莹复测原问题，沈语雯检查是否改变关卡理解或提示含义；玩法、声音或参数变化也应同步到相关说明。三人共同核对最终版本，具体人员活动与阶段安排见配套《人员分工与活动安排》。</w:t>
+        <w:t>二 职责划分原则</w:t>
+      </w:r>
+    </w:p>
+    <w:p>
+      <w:pPr>
+        <w:pStyle w:val="Heading3"/>
+      </w:pPr>
+      <w:r>
+        <w:t>每项工作有明确的主负责人</w:t>
       </w:r>
     </w:p>
     <w:p>
@@ -5533,12 +5669,2145 @@
         <w:rPr>
           <w:b w:val="0"/>
         </w:rPr>
-        <w:t>下一阶段优先补充完整试玩和独立设备记录，处理会影响通关、同步和理解的问题，再完善修复、失败与通关的声音反馈。当前三房间已经承载了完整的核心体验，新增房间、变速或额外角色能力不列入这一阶段范围。完善工作的判断标准是现有规则是否清楚、动作反馈是否一致，以及玩家能否在一次旅程中学会并完成“起跳造路，落拍留光”。</w:t>
+        <w:t>主负责人承担整理需求、推进修改和交付文件的责任。需要他人配合时，先写明所需输入与完成条件；发现问题后记录到统一待办，由队长协调处理顺序，避免口头安排遗漏或多人重复修改同一文件。</w:t>
+      </w:r>
+    </w:p>
+    <w:p>
+      <w:pPr>
+        <w:pStyle w:val="Heading3"/>
+      </w:pPr>
+      <w:r>
+        <w:t>制作与复核分别落实</w:t>
+      </w:r>
+    </w:p>
+    <w:p>
+      <w:r>
+        <w:rPr>
+          <w:b w:val="0"/>
+        </w:rPr>
+        <w:t>程序改动由李星莹复测，规则和视觉变化由沈语雯复核，最终运行版本由严楷哲汇总。涉及跳跃、光桥或节拍参数的调整，需要同时检查实际操作、提示文字及展示说明，不能仅以其中一项通过代替整项完成。</w:t>
+      </w:r>
+    </w:p>
+    <w:p>
+      <w:pPr>
+        <w:pStyle w:val="Heading3"/>
+      </w:pPr>
+      <w:r>
+        <w:t>分工不割裂作品理解</w:t>
+      </w:r>
+    </w:p>
+    <w:p>
+      <w:r>
+        <w:rPr>
+          <w:b w:val="0"/>
+        </w:rPr>
+        <w:t>三位成员均需熟悉完整游玩流程和核心机制。各自负责的成果可以独立维护，但关卡、程序和声音之间的取舍须共同确认；现场展示使用同一版本，成员能够说明各自负责内容与整体玩法的关系。</w:t>
       </w:r>
     </w:p>
     <w:p>
       <w:pPr>
         <w:pStyle w:val="Heading2"/>
+        <w:pageBreakBefore/>
+        <w:spacing w:before="0" w:after="240"/>
+      </w:pPr>
+      <w:r>
+        <w:rPr>
+          <w:sz w:val="36"/>
+        </w:rPr>
+        <w:t>三 严楷哲 队长与程序负责人</w:t>
+      </w:r>
+    </w:p>
+    <w:p>
+      <w:pPr>
+        <w:pStyle w:val="Heading3"/>
+      </w:pPr>
+      <w:r>
+        <w:t>职责定位</w:t>
+      </w:r>
+    </w:p>
+    <w:p>
+      <w:r>
+        <w:rPr>
+          <w:b w:val="0"/>
+        </w:rPr>
+        <w:t>担任队长，负责程序维护、版本管理与工作统筹。将策划调整、测试问题和材料更新落实为可执行任务，确定处理顺序与交接对象，组织三人围绕同一版本完成复核。</w:t>
+      </w:r>
+    </w:p>
+    <w:p>
+      <w:pPr>
+        <w:pStyle w:val="Heading3"/>
+      </w:pPr>
+      <w:r>
+        <w:t>程序维护与规则落实</w:t>
+      </w:r>
+    </w:p>
+    <w:p>
+      <w:r>
+        <w:rPr>
+          <w:b w:val="0"/>
+        </w:rPr>
+        <w:t>维护角色移动、真实起落事件、节拍时钟、光桥、激光及房间流程。重点检查两拍起落、四拍临时桥、落拍固定和共鸣出口之间的关系，以及暂停、重试后的时间与状态是否一致。涉及跳跃、平台或判定参数的调整，先与沈语雯核对预期，再落实到工程和操作提示中。</w:t>
+      </w:r>
+    </w:p>
+    <w:p>
+      <w:pPr>
+        <w:pStyle w:val="Heading3"/>
+      </w:pPr>
+      <w:r>
+        <w:t>问题处理与版本管理</w:t>
+      </w:r>
+    </w:p>
+    <w:p>
+      <w:r>
+        <w:rPr>
+          <w:b w:val="0"/>
+        </w:rPr>
+        <w:t>根据李星莹提供的版本、设备和复现步骤定位问题，优先处理无法启动、无法通关、机关异常及状态残留。修复后说明改动位置与影响范围，导出带有明确版本标记的运行包。源码、可执行文件和包内说明保持对应，供成员按原步骤复测。</w:t>
+      </w:r>
+    </w:p>
+    <w:p>
+      <w:pPr>
+        <w:pStyle w:val="Heading3"/>
+      </w:pPr>
+      <w:r>
+        <w:t>进度统筹与材料汇总</w:t>
+      </w:r>
+    </w:p>
+    <w:p>
+      <w:r>
+        <w:rPr>
+          <w:b w:val="0"/>
+        </w:rPr>
+        <w:t>维护统一待办，为每项工作写明负责人、所需材料和验收条件。接收沈语雯复核的策划内容，以及李星莹核验的音画与展示文件，检查名称、规则和版本是否一致。统筹最终目录、离线备份与演示设备；正式提交前组织三人核对文件和访问权限，保存提交结果。</w:t>
+      </w:r>
+    </w:p>
+    <w:p>
+      <w:pPr>
+        <w:pStyle w:val="Heading3"/>
+      </w:pPr>
+      <w:r>
+        <w:t>交付与复核</w:t>
+      </w:r>
+    </w:p>
+    <w:p>
+      <w:r>
+        <w:rPr>
+          <w:b w:val="0"/>
+        </w:rPr>
+        <w:t>负责交付游戏工程、Windows 运行包、版本说明和最终目录。程序修复交李星莹复测；玩法或界面变化交沈语雯复核。尚未解决的问题保留影响说明，避免混入“已完成”事项。版本确定后记录使用范围，减少成员误用旧文件。</w:t>
+      </w:r>
+    </w:p>
+    <w:p>
+      <w:pPr>
+        <w:pStyle w:val="Heading3"/>
+      </w:pPr>
+      <w:r>
+        <w:t>协作边界</w:t>
+      </w:r>
+    </w:p>
+    <w:p>
+      <w:r>
+        <w:rPr>
+          <w:b w:val="0"/>
+        </w:rPr>
+        <w:t>负责技术实现与任务协调，玩法取舍须与策划负责人确认，声音与展示更新由材料负责人同步。队长汇总验收结果，原问题是否解决仍以复测记录和对应成员确认作为依据。</w:t>
+      </w:r>
+    </w:p>
+    <w:p>
+      <w:pPr>
+        <w:pStyle w:val="Heading2"/>
+        <w:pageBreakBefore/>
+        <w:spacing w:before="0" w:after="240"/>
+      </w:pPr>
+      <w:r>
+        <w:rPr>
+          <w:sz w:val="36"/>
+        </w:rPr>
+        <w:t>四 沈语雯 策划与视觉负责人</w:t>
+      </w:r>
+    </w:p>
+    <w:p>
+      <w:pPr>
+        <w:pStyle w:val="Heading3"/>
+      </w:pPr>
+      <w:r>
+        <w:t>职责定位</w:t>
+      </w:r>
+    </w:p>
+    <w:p>
+      <w:r>
+        <w:rPr>
+          <w:b w:val="0"/>
+        </w:rPr>
+        <w:t>负责玩法策划、关卡设计与视觉交互。将“起跳造路，落拍留光”落实为清楚的规则、路线和提示，并检查游戏、策划案及展示材料是否传达同一套体验。</w:t>
+      </w:r>
+    </w:p>
+    <w:p>
+      <w:pPr>
+        <w:pStyle w:val="Heading3"/>
+      </w:pPr>
+      <w:r>
+        <w:t>玩法规则与策划维护</w:t>
+      </w:r>
+    </w:p>
+    <w:p>
+      <w:r>
+        <w:rPr>
+          <w:b w:val="0"/>
+        </w:rPr>
+        <w:t>维护起跳判定、临时桥、落拍固定、激光阶段、计分和出口条件的说明，区分当前实现与后续计划。参数变更后同步正文、表格和图注，重点核对四拍寿命、金桥仅在当前尝试内固定等容易产生误解的表述，保证文字能在实际游戏中找到对应结果。</w:t>
+      </w:r>
+    </w:p>
+    <w:p>
+      <w:pPr>
+        <w:pStyle w:val="Heading3"/>
+      </w:pPr>
+      <w:r>
+        <w:t>关卡检查与体验分析</w:t>
+      </w:r>
+    </w:p>
+    <w:p>
+      <w:r>
+        <w:rPr>
+          <w:b w:val="0"/>
+        </w:rPr>
+        <w:t>逐间检查“唤醒余音、让光留下、接续回响”的递进，核对桥前起跳空间、桥后落脚点、安全等待位置及激光间歇。结合试玩记录定位理解或操作困难，写明房间、位置、行为和预期结果；提出调整时说明希望解决的问题，交严楷哲评估实现，更新后再检查原处。</w:t>
+      </w:r>
+    </w:p>
+    <w:p>
+      <w:pPr>
+        <w:pStyle w:val="Heading3"/>
+      </w:pPr>
+      <w:r>
+        <w:t>视觉交互与内容审核</w:t>
+      </w:r>
+    </w:p>
+    <w:p>
+      <w:r>
+        <w:rPr>
+          <w:b w:val="0"/>
+        </w:rPr>
+        <w:t>检查青桥、金桥、预警虚线和危险光束是否容易区分，确认角色落点、共鸣数量及出口状态清楚可见。统一教学、按键提示、判定和结算用语，避免文字遮挡操作区域。审核视频、PPT和讲稿中的规则、截图与讲述顺序，并准备立意、关卡及视觉设计方面的答辩说明。</w:t>
+      </w:r>
+    </w:p>
+    <w:p>
+      <w:pPr>
+        <w:pStyle w:val="Heading3"/>
+      </w:pPr>
+      <w:r>
+        <w:t>交付与复核</w:t>
+      </w:r>
+    </w:p>
+    <w:p>
+      <w:r>
+        <w:rPr>
+          <w:b w:val="0"/>
+        </w:rPr>
+        <w:t>负责交付更新后的策划案、关卡与界面问题清单、具体调整建议及核对后的展示文案。每项建议附问题位置、预期变化和验收条件；交付前由严楷哲核对技术事实，李星莹检查其与当前运行版本和展示画面是否一致。</w:t>
+      </w:r>
+    </w:p>
+    <w:p>
+      <w:pPr>
+        <w:pStyle w:val="Heading3"/>
+      </w:pPr>
+      <w:r>
+        <w:t>协作边界</w:t>
+      </w:r>
+    </w:p>
+    <w:p>
+      <w:r>
+        <w:rPr>
+          <w:b w:val="0"/>
+        </w:rPr>
+        <w:t>对规则解释、关卡体验和视觉表达承担主责；涉及程序、声音或材料文件的修改，与对应负责人约定后执行。策划建议与已落实改动分开记录，实际试玩未确认的判断保留为待验证项。</w:t>
+      </w:r>
+    </w:p>
+    <w:p>
+      <w:pPr>
+        <w:pStyle w:val="Heading2"/>
+        <w:pageBreakBefore/>
+        <w:spacing w:before="0" w:after="240"/>
+      </w:pPr>
+      <w:r>
+        <w:rPr>
+          <w:sz w:val="36"/>
+        </w:rPr>
+        <w:t>五 李星莹 音频测试与展示负责人</w:t>
+      </w:r>
+    </w:p>
+    <w:p>
+      <w:pPr>
+        <w:pStyle w:val="Heading3"/>
+      </w:pPr>
+      <w:r>
+        <w:t>职责定位</w:t>
+      </w:r>
+    </w:p>
+    <w:p>
+      <w:r>
+        <w:rPr>
+          <w:b w:val="0"/>
+        </w:rPr>
+        <w:t>负责音频检查、功能与设备验证，以及展示材料维护。将游玩中出现的问题记录为可复现的步骤，并确保声音、画面、字幕与讲述对应当前版本。</w:t>
+      </w:r>
+    </w:p>
+    <w:p>
+      <w:pPr>
+        <w:pStyle w:val="Heading3"/>
+      </w:pPr>
+      <w:r>
+        <w:t>声音与同步检查</w:t>
+      </w:r>
+    </w:p>
+    <w:p>
+      <w:r>
+        <w:rPr>
+          <w:b w:val="0"/>
+        </w:rPr>
+        <w:t>检查循环配乐衔接、响度、音乐开关及暂停恢复，记录扬声器或耳机环境下的判定感受和校准设置。若出现听感与判定不一致，提供设备、偏差表现和操作条件，交严楷哲检查时钟与校准处理；后续事件音效另列为完善任务。</w:t>
+      </w:r>
+    </w:p>
+    <w:p>
+      <w:pPr>
+        <w:pStyle w:val="Heading3"/>
+      </w:pPr>
+      <w:r>
+        <w:t>功能测试与复测</w:t>
+      </w:r>
+    </w:p>
+    <w:p>
+      <w:r>
+        <w:rPr>
+          <w:b w:val="0"/>
+        </w:rPr>
+        <w:t>按启动、教学、三房间、失败重试、暂停继续、校准及结算逐项检查，安排完整通关和独立 Windows 设备验证。记录版本、系统、操作步骤、预期与实际结果，必要时附截图或录像。收到修复包后按相同步骤复测，保留通过结果或仍可复现的情况。</w:t>
+      </w:r>
+    </w:p>
+    <w:p>
+      <w:pPr>
+        <w:pStyle w:val="Heading3"/>
+      </w:pPr>
+      <w:r>
+        <w:t>展示文件与排练</w:t>
+      </w:r>
+    </w:p>
+    <w:p>
+      <w:r>
+        <w:rPr>
+          <w:b w:val="0"/>
+        </w:rPr>
+        <w:t>完整核看介绍视频的字幕、解说、音乐平衡和画面衔接，确认成片不超过五分钟。维护PPT与讲稿中的姓名、分工及规则说明，与沈语雯核对内容，组织三至五分钟的计时排练，记录翻页、讲述和游戏演示需要衔接的位置。</w:t>
+      </w:r>
+    </w:p>
+    <w:p>
+      <w:pPr>
+        <w:pStyle w:val="Heading3"/>
+      </w:pPr>
+      <w:r>
+        <w:t>音画归档与文件核验</w:t>
+      </w:r>
+    </w:p>
+    <w:p>
+      <w:r>
+        <w:rPr>
+          <w:b w:val="0"/>
+        </w:rPr>
+        <w:t>维护图标、截图、配乐及来源清单，资源变化后同步素材包。检查文件可打开、压缩包可解压，协助验证分享下载，并准备视频、PPT、讲稿和备用PDF，供最终审核与现场使用。</w:t>
+      </w:r>
+    </w:p>
+    <w:p>
+      <w:pPr>
+        <w:pStyle w:val="Heading3"/>
+      </w:pPr>
+      <w:r>
+        <w:t>交付与复核</w:t>
+      </w:r>
+    </w:p>
+    <w:p>
+      <w:r>
+        <w:rPr>
+          <w:b w:val="0"/>
+        </w:rPr>
+        <w:t>负责交付测试与复测记录、核验后的音画和展示文件、排练计时及下载检查记录。规则文字由沈语雯复核，运行版本与程序问题由严楷哲确认，尚未执行的检查保留待办状态。</w:t>
+      </w:r>
+    </w:p>
+    <w:p>
+      <w:pPr>
+        <w:pStyle w:val="Heading3"/>
+      </w:pPr>
+      <w:r>
+        <w:t>协作边界</w:t>
+      </w:r>
+    </w:p>
+    <w:p>
+      <w:r>
+        <w:rPr>
+          <w:b w:val="0"/>
+        </w:rPr>
+        <w:t>承担验证和文件维护主责，记录测试事实；规则取舍、程序修复分别交对应负责人处理。现场主讲与辅助顺序在完整排练后确定。</w:t>
+      </w:r>
+    </w:p>
+    <w:p>
+      <w:pPr>
+        <w:pStyle w:val="Heading2"/>
+        <w:pageBreakBefore/>
+        <w:spacing w:before="0" w:after="240"/>
+      </w:pPr>
+      <w:r>
+        <w:rPr>
+          <w:sz w:val="36"/>
+        </w:rPr>
+        <w:t>六 工作交接与协同复核</w:t>
+      </w:r>
+    </w:p>
+    <w:p>
+      <w:r>
+        <w:rPr>
+          <w:b w:val="0"/>
+        </w:rPr>
+        <w:t>交接以能够继续工作的文件和信息为准。策划提供具体位置与预期结果，程序提供版本与改动说明，测试提供可复现步骤和结果；接收人发现缺少信息时，先补齐再继续处理。以下对应关系用于日常协作和最终复核。</w:t>
+      </w:r>
+    </w:p>
+    <w:tbl>
+      <w:tblPr>
+        <w:tblW w:type="auto" w:w="0"/>
+        <w:jc w:val="center"/>
+        <w:tblLayout w:type="fixed"/>
+        <w:tblLook w:firstColumn="1" w:firstRow="1" w:lastColumn="0" w:lastRow="0" w:noHBand="0" w:noVBand="1" w:val="04A0"/>
+        <w:tblBorders>
+          <w:top w:val="single" w:sz="4" w:color="D9D9D9"/>
+          <w:left w:val="single" w:sz="4" w:color="D9D9D9"/>
+          <w:bottom w:val="single" w:sz="4" w:color="D9D9D9"/>
+          <w:right w:val="single" w:sz="4" w:color="D9D9D9"/>
+          <w:insideH w:val="single" w:sz="4" w:color="D9D9D9"/>
+          <w:insideV w:val="single" w:sz="4" w:color="D9D9D9"/>
+        </w:tblBorders>
+      </w:tblPr>
+      <w:tblGrid>
+        <w:gridCol w:w="1871"/>
+        <w:gridCol w:w="1474"/>
+        <w:gridCol w:w="2324"/>
+        <w:gridCol w:w="3628"/>
+      </w:tblGrid>
+      <w:tr>
+        <w:trPr>
+          <w:cantSplit/>
+          <w:tblHeader/>
+        </w:trPr>
+        <w:tc>
+          <w:tcPr>
+            <w:tcW w:type="dxa" w:w="1871"/>
+            <w:vAlign w:val="center"/>
+            <w:shd w:fill="233C4A"/>
+            <w:tcMar>
+              <w:top w:w="75" w:type="dxa"/>
+              <w:bottom w:w="75" w:type="dxa"/>
+              <w:left w:w="95" w:type="dxa"/>
+              <w:right w:w="95" w:type="dxa"/>
+            </w:tcMar>
+          </w:tcPr>
+          <w:p>
+            <w:pPr>
+              <w:spacing w:line="300" w:lineRule="exact" w:after="0"/>
+              <w:jc w:val="center"/>
+            </w:pPr>
+            <w:r>
+              <w:rPr>
+                <w:b/>
+                <w:color w:val="FFFFFF"/>
+                <w:sz w:val="20"/>
+              </w:rPr>
+              <w:t>工作事项</w:t>
+            </w:r>
+          </w:p>
+        </w:tc>
+        <w:tc>
+          <w:tcPr>
+            <w:tcW w:type="dxa" w:w="1474"/>
+            <w:vAlign w:val="center"/>
+            <w:shd w:fill="233C4A"/>
+            <w:tcMar>
+              <w:top w:w="75" w:type="dxa"/>
+              <w:bottom w:w="75" w:type="dxa"/>
+              <w:left w:w="95" w:type="dxa"/>
+              <w:right w:w="95" w:type="dxa"/>
+            </w:tcMar>
+          </w:tcPr>
+          <w:p>
+            <w:pPr>
+              <w:spacing w:line="300" w:lineRule="exact" w:after="0"/>
+              <w:jc w:val="left"/>
+            </w:pPr>
+            <w:r>
+              <w:rPr>
+                <w:b/>
+                <w:color w:val="FFFFFF"/>
+                <w:sz w:val="20"/>
+              </w:rPr>
+              <w:t>主负责人</w:t>
+            </w:r>
+          </w:p>
+        </w:tc>
+        <w:tc>
+          <w:tcPr>
+            <w:tcW w:type="dxa" w:w="2324"/>
+            <w:vAlign w:val="center"/>
+            <w:shd w:fill="233C4A"/>
+            <w:tcMar>
+              <w:top w:w="75" w:type="dxa"/>
+              <w:bottom w:w="75" w:type="dxa"/>
+              <w:left w:w="95" w:type="dxa"/>
+              <w:right w:w="95" w:type="dxa"/>
+            </w:tcMar>
+          </w:tcPr>
+          <w:p>
+            <w:pPr>
+              <w:spacing w:line="300" w:lineRule="exact" w:after="0"/>
+              <w:jc w:val="left"/>
+            </w:pPr>
+            <w:r>
+              <w:rPr>
+                <w:b/>
+                <w:color w:val="FFFFFF"/>
+                <w:sz w:val="20"/>
+              </w:rPr>
+              <w:t>配合与复核</w:t>
+            </w:r>
+          </w:p>
+        </w:tc>
+        <w:tc>
+          <w:tcPr>
+            <w:tcW w:type="dxa" w:w="3628"/>
+            <w:vAlign w:val="center"/>
+            <w:shd w:fill="233C4A"/>
+            <w:tcMar>
+              <w:top w:w="75" w:type="dxa"/>
+              <w:bottom w:w="75" w:type="dxa"/>
+              <w:left w:w="95" w:type="dxa"/>
+              <w:right w:w="95" w:type="dxa"/>
+            </w:tcMar>
+          </w:tcPr>
+          <w:p>
+            <w:pPr>
+              <w:spacing w:line="300" w:lineRule="exact" w:after="0"/>
+              <w:jc w:val="left"/>
+            </w:pPr>
+            <w:r>
+              <w:rPr>
+                <w:b/>
+                <w:color w:val="FFFFFF"/>
+                <w:sz w:val="20"/>
+              </w:rPr>
+              <w:t>交接内容</w:t>
+            </w:r>
+          </w:p>
+        </w:tc>
+      </w:tr>
+      <w:tr>
+        <w:trPr>
+          <w:cantSplit/>
+        </w:trPr>
+        <w:tc>
+          <w:tcPr>
+            <w:tcW w:type="dxa" w:w="1871"/>
+            <w:vAlign w:val="center"/>
+            <w:shd w:fill="FFFFFF"/>
+            <w:tcMar>
+              <w:top w:w="75" w:type="dxa"/>
+              <w:bottom w:w="75" w:type="dxa"/>
+              <w:left w:w="95" w:type="dxa"/>
+              <w:right w:w="95" w:type="dxa"/>
+            </w:tcMar>
+          </w:tcPr>
+          <w:p>
+            <w:pPr>
+              <w:spacing w:line="300" w:lineRule="exact" w:after="0"/>
+              <w:jc w:val="center"/>
+            </w:pPr>
+            <w:r>
+              <w:rPr>
+                <w:b w:val="0"/>
+                <w:sz w:val="20"/>
+              </w:rPr>
+              <w:t>玩法与参数调整</w:t>
+            </w:r>
+          </w:p>
+        </w:tc>
+        <w:tc>
+          <w:tcPr>
+            <w:tcW w:type="dxa" w:w="1474"/>
+            <w:vAlign w:val="center"/>
+            <w:shd w:fill="FFFFFF"/>
+            <w:tcMar>
+              <w:top w:w="75" w:type="dxa"/>
+              <w:bottom w:w="75" w:type="dxa"/>
+              <w:left w:w="95" w:type="dxa"/>
+              <w:right w:w="95" w:type="dxa"/>
+            </w:tcMar>
+          </w:tcPr>
+          <w:p>
+            <w:pPr>
+              <w:spacing w:line="300" w:lineRule="exact" w:after="0"/>
+              <w:jc w:val="left"/>
+            </w:pPr>
+            <w:r>
+              <w:rPr>
+                <w:b w:val="0"/>
+                <w:sz w:val="20"/>
+              </w:rPr>
+              <w:t>沈语雯</w:t>
+            </w:r>
+          </w:p>
+        </w:tc>
+        <w:tc>
+          <w:tcPr>
+            <w:tcW w:type="dxa" w:w="2324"/>
+            <w:vAlign w:val="center"/>
+            <w:shd w:fill="FFFFFF"/>
+            <w:tcMar>
+              <w:top w:w="75" w:type="dxa"/>
+              <w:bottom w:w="75" w:type="dxa"/>
+              <w:left w:w="95" w:type="dxa"/>
+              <w:right w:w="95" w:type="dxa"/>
+            </w:tcMar>
+          </w:tcPr>
+          <w:p>
+            <w:pPr>
+              <w:spacing w:line="300" w:lineRule="exact" w:after="0"/>
+              <w:jc w:val="left"/>
+            </w:pPr>
+            <w:r>
+              <w:rPr>
+                <w:b w:val="0"/>
+                <w:sz w:val="20"/>
+              </w:rPr>
+              <w:t>严楷哲评估实现</w:t>
+              <w:br/>
+              <w:t>李星莹验证结果</w:t>
+            </w:r>
+          </w:p>
+        </w:tc>
+        <w:tc>
+          <w:tcPr>
+            <w:tcW w:type="dxa" w:w="3628"/>
+            <w:vAlign w:val="center"/>
+            <w:shd w:fill="FFFFFF"/>
+            <w:tcMar>
+              <w:top w:w="75" w:type="dxa"/>
+              <w:bottom w:w="75" w:type="dxa"/>
+              <w:left w:w="95" w:type="dxa"/>
+              <w:right w:w="95" w:type="dxa"/>
+            </w:tcMar>
+          </w:tcPr>
+          <w:p>
+            <w:pPr>
+              <w:spacing w:line="300" w:lineRule="exact" w:after="0"/>
+              <w:jc w:val="left"/>
+            </w:pPr>
+            <w:r>
+              <w:rPr>
+                <w:b w:val="0"/>
+                <w:sz w:val="20"/>
+              </w:rPr>
+              <w:t>问题位置、调整理由、预期操作与验收条件</w:t>
+            </w:r>
+          </w:p>
+        </w:tc>
+      </w:tr>
+      <w:tr>
+        <w:trPr>
+          <w:cantSplit/>
+        </w:trPr>
+        <w:tc>
+          <w:tcPr>
+            <w:tcW w:type="dxa" w:w="1871"/>
+            <w:vAlign w:val="center"/>
+            <w:shd w:fill="F3F6F7"/>
+            <w:tcMar>
+              <w:top w:w="75" w:type="dxa"/>
+              <w:bottom w:w="75" w:type="dxa"/>
+              <w:left w:w="95" w:type="dxa"/>
+              <w:right w:w="95" w:type="dxa"/>
+            </w:tcMar>
+          </w:tcPr>
+          <w:p>
+            <w:pPr>
+              <w:spacing w:line="300" w:lineRule="exact" w:after="0"/>
+              <w:jc w:val="center"/>
+            </w:pPr>
+            <w:r>
+              <w:rPr>
+                <w:b w:val="0"/>
+                <w:sz w:val="20"/>
+              </w:rPr>
+              <w:t>程序修复与导出</w:t>
+            </w:r>
+          </w:p>
+        </w:tc>
+        <w:tc>
+          <w:tcPr>
+            <w:tcW w:type="dxa" w:w="1474"/>
+            <w:vAlign w:val="center"/>
+            <w:shd w:fill="F3F6F7"/>
+            <w:tcMar>
+              <w:top w:w="75" w:type="dxa"/>
+              <w:bottom w:w="75" w:type="dxa"/>
+              <w:left w:w="95" w:type="dxa"/>
+              <w:right w:w="95" w:type="dxa"/>
+            </w:tcMar>
+          </w:tcPr>
+          <w:p>
+            <w:pPr>
+              <w:spacing w:line="300" w:lineRule="exact" w:after="0"/>
+              <w:jc w:val="left"/>
+            </w:pPr>
+            <w:r>
+              <w:rPr>
+                <w:b w:val="0"/>
+                <w:sz w:val="20"/>
+              </w:rPr>
+              <w:t>严楷哲</w:t>
+            </w:r>
+          </w:p>
+        </w:tc>
+        <w:tc>
+          <w:tcPr>
+            <w:tcW w:type="dxa" w:w="2324"/>
+            <w:vAlign w:val="center"/>
+            <w:shd w:fill="F3F6F7"/>
+            <w:tcMar>
+              <w:top w:w="75" w:type="dxa"/>
+              <w:bottom w:w="75" w:type="dxa"/>
+              <w:left w:w="95" w:type="dxa"/>
+              <w:right w:w="95" w:type="dxa"/>
+            </w:tcMar>
+          </w:tcPr>
+          <w:p>
+            <w:pPr>
+              <w:spacing w:line="300" w:lineRule="exact" w:after="0"/>
+              <w:jc w:val="left"/>
+            </w:pPr>
+            <w:r>
+              <w:rPr>
+                <w:b w:val="0"/>
+                <w:sz w:val="20"/>
+              </w:rPr>
+              <w:t>李星莹复测</w:t>
+              <w:br/>
+              <w:t>沈语雯核对体验</w:t>
+            </w:r>
+          </w:p>
+        </w:tc>
+        <w:tc>
+          <w:tcPr>
+            <w:tcW w:type="dxa" w:w="3628"/>
+            <w:vAlign w:val="center"/>
+            <w:shd w:fill="F3F6F7"/>
+            <w:tcMar>
+              <w:top w:w="75" w:type="dxa"/>
+              <w:bottom w:w="75" w:type="dxa"/>
+              <w:left w:w="95" w:type="dxa"/>
+              <w:right w:w="95" w:type="dxa"/>
+            </w:tcMar>
+          </w:tcPr>
+          <w:p>
+            <w:pPr>
+              <w:spacing w:line="300" w:lineRule="exact" w:after="0"/>
+              <w:jc w:val="left"/>
+            </w:pPr>
+            <w:r>
+              <w:rPr>
+                <w:b w:val="0"/>
+                <w:sz w:val="20"/>
+              </w:rPr>
+              <w:t>对应版本、改动范围、运行包与未解决问题</w:t>
+            </w:r>
+          </w:p>
+        </w:tc>
+      </w:tr>
+      <w:tr>
+        <w:trPr>
+          <w:cantSplit/>
+        </w:trPr>
+        <w:tc>
+          <w:tcPr>
+            <w:tcW w:type="dxa" w:w="1871"/>
+            <w:vAlign w:val="center"/>
+            <w:shd w:fill="FFFFFF"/>
+            <w:tcMar>
+              <w:top w:w="75" w:type="dxa"/>
+              <w:bottom w:w="75" w:type="dxa"/>
+              <w:left w:w="95" w:type="dxa"/>
+              <w:right w:w="95" w:type="dxa"/>
+            </w:tcMar>
+          </w:tcPr>
+          <w:p>
+            <w:pPr>
+              <w:spacing w:line="300" w:lineRule="exact" w:after="0"/>
+              <w:jc w:val="center"/>
+            </w:pPr>
+            <w:r>
+              <w:rPr>
+                <w:b w:val="0"/>
+                <w:sz w:val="20"/>
+              </w:rPr>
+              <w:t>视觉与教学调整</w:t>
+            </w:r>
+          </w:p>
+        </w:tc>
+        <w:tc>
+          <w:tcPr>
+            <w:tcW w:type="dxa" w:w="1474"/>
+            <w:vAlign w:val="center"/>
+            <w:shd w:fill="FFFFFF"/>
+            <w:tcMar>
+              <w:top w:w="75" w:type="dxa"/>
+              <w:bottom w:w="75" w:type="dxa"/>
+              <w:left w:w="95" w:type="dxa"/>
+              <w:right w:w="95" w:type="dxa"/>
+            </w:tcMar>
+          </w:tcPr>
+          <w:p>
+            <w:pPr>
+              <w:spacing w:line="300" w:lineRule="exact" w:after="0"/>
+              <w:jc w:val="left"/>
+            </w:pPr>
+            <w:r>
+              <w:rPr>
+                <w:b w:val="0"/>
+                <w:sz w:val="20"/>
+              </w:rPr>
+              <w:t>沈语雯</w:t>
+            </w:r>
+          </w:p>
+        </w:tc>
+        <w:tc>
+          <w:tcPr>
+            <w:tcW w:type="dxa" w:w="2324"/>
+            <w:vAlign w:val="center"/>
+            <w:shd w:fill="FFFFFF"/>
+            <w:tcMar>
+              <w:top w:w="75" w:type="dxa"/>
+              <w:bottom w:w="75" w:type="dxa"/>
+              <w:left w:w="95" w:type="dxa"/>
+              <w:right w:w="95" w:type="dxa"/>
+            </w:tcMar>
+          </w:tcPr>
+          <w:p>
+            <w:pPr>
+              <w:spacing w:line="300" w:lineRule="exact" w:after="0"/>
+              <w:jc w:val="left"/>
+            </w:pPr>
+            <w:r>
+              <w:rPr>
+                <w:b w:val="0"/>
+                <w:sz w:val="20"/>
+              </w:rPr>
+              <w:t>严楷哲落实</w:t>
+              <w:br/>
+              <w:t>李星莹检查画面</w:t>
+            </w:r>
+          </w:p>
+        </w:tc>
+        <w:tc>
+          <w:tcPr>
+            <w:tcW w:type="dxa" w:w="3628"/>
+            <w:vAlign w:val="center"/>
+            <w:shd w:fill="FFFFFF"/>
+            <w:tcMar>
+              <w:top w:w="75" w:type="dxa"/>
+              <w:bottom w:w="75" w:type="dxa"/>
+              <w:left w:w="95" w:type="dxa"/>
+              <w:right w:w="95" w:type="dxa"/>
+            </w:tcMar>
+          </w:tcPr>
+          <w:p>
+            <w:pPr>
+              <w:spacing w:line="300" w:lineRule="exact" w:after="0"/>
+              <w:jc w:val="left"/>
+            </w:pPr>
+            <w:r>
+              <w:rPr>
+                <w:b w:val="0"/>
+                <w:sz w:val="20"/>
+              </w:rPr>
+              <w:t>截图或位置、文案、状态辨识要求</w:t>
+            </w:r>
+          </w:p>
+        </w:tc>
+      </w:tr>
+      <w:tr>
+        <w:trPr>
+          <w:cantSplit/>
+        </w:trPr>
+        <w:tc>
+          <w:tcPr>
+            <w:tcW w:type="dxa" w:w="1871"/>
+            <w:vAlign w:val="center"/>
+            <w:shd w:fill="F3F6F7"/>
+            <w:tcMar>
+              <w:top w:w="75" w:type="dxa"/>
+              <w:bottom w:w="75" w:type="dxa"/>
+              <w:left w:w="95" w:type="dxa"/>
+              <w:right w:w="95" w:type="dxa"/>
+            </w:tcMar>
+          </w:tcPr>
+          <w:p>
+            <w:pPr>
+              <w:spacing w:line="300" w:lineRule="exact" w:after="0"/>
+              <w:jc w:val="center"/>
+            </w:pPr>
+            <w:r>
+              <w:rPr>
+                <w:b w:val="0"/>
+                <w:sz w:val="20"/>
+              </w:rPr>
+              <w:t>声音与同步检查</w:t>
+            </w:r>
+          </w:p>
+        </w:tc>
+        <w:tc>
+          <w:tcPr>
+            <w:tcW w:type="dxa" w:w="1474"/>
+            <w:vAlign w:val="center"/>
+            <w:shd w:fill="F3F6F7"/>
+            <w:tcMar>
+              <w:top w:w="75" w:type="dxa"/>
+              <w:bottom w:w="75" w:type="dxa"/>
+              <w:left w:w="95" w:type="dxa"/>
+              <w:right w:w="95" w:type="dxa"/>
+            </w:tcMar>
+          </w:tcPr>
+          <w:p>
+            <w:pPr>
+              <w:spacing w:line="300" w:lineRule="exact" w:after="0"/>
+              <w:jc w:val="left"/>
+            </w:pPr>
+            <w:r>
+              <w:rPr>
+                <w:b w:val="0"/>
+                <w:sz w:val="20"/>
+              </w:rPr>
+              <w:t>李星莹</w:t>
+            </w:r>
+          </w:p>
+        </w:tc>
+        <w:tc>
+          <w:tcPr>
+            <w:tcW w:type="dxa" w:w="2324"/>
+            <w:vAlign w:val="center"/>
+            <w:shd w:fill="F3F6F7"/>
+            <w:tcMar>
+              <w:top w:w="75" w:type="dxa"/>
+              <w:bottom w:w="75" w:type="dxa"/>
+              <w:left w:w="95" w:type="dxa"/>
+              <w:right w:w="95" w:type="dxa"/>
+            </w:tcMar>
+          </w:tcPr>
+          <w:p>
+            <w:pPr>
+              <w:spacing w:line="300" w:lineRule="exact" w:after="0"/>
+              <w:jc w:val="left"/>
+            </w:pPr>
+            <w:r>
+              <w:rPr>
+                <w:b w:val="0"/>
+                <w:sz w:val="20"/>
+              </w:rPr>
+              <w:t>严楷哲定位处理</w:t>
+            </w:r>
+          </w:p>
+        </w:tc>
+        <w:tc>
+          <w:tcPr>
+            <w:tcW w:type="dxa" w:w="3628"/>
+            <w:vAlign w:val="center"/>
+            <w:shd w:fill="F3F6F7"/>
+            <w:tcMar>
+              <w:top w:w="75" w:type="dxa"/>
+              <w:bottom w:w="75" w:type="dxa"/>
+              <w:left w:w="95" w:type="dxa"/>
+              <w:right w:w="95" w:type="dxa"/>
+            </w:tcMar>
+          </w:tcPr>
+          <w:p>
+            <w:pPr>
+              <w:spacing w:line="300" w:lineRule="exact" w:after="0"/>
+              <w:jc w:val="left"/>
+            </w:pPr>
+            <w:r>
+              <w:rPr>
+                <w:b w:val="0"/>
+                <w:sz w:val="20"/>
+              </w:rPr>
+              <w:t>设备和输出方式、校准值、现象与复现步骤</w:t>
+            </w:r>
+          </w:p>
+        </w:tc>
+      </w:tr>
+      <w:tr>
+        <w:trPr>
+          <w:cantSplit/>
+        </w:trPr>
+        <w:tc>
+          <w:tcPr>
+            <w:tcW w:type="dxa" w:w="1871"/>
+            <w:vAlign w:val="center"/>
+            <w:shd w:fill="FFFFFF"/>
+            <w:tcMar>
+              <w:top w:w="75" w:type="dxa"/>
+              <w:bottom w:w="75" w:type="dxa"/>
+              <w:left w:w="95" w:type="dxa"/>
+              <w:right w:w="95" w:type="dxa"/>
+            </w:tcMar>
+          </w:tcPr>
+          <w:p>
+            <w:pPr>
+              <w:spacing w:line="300" w:lineRule="exact" w:after="0"/>
+              <w:jc w:val="center"/>
+            </w:pPr>
+            <w:r>
+              <w:rPr>
+                <w:b w:val="0"/>
+                <w:sz w:val="20"/>
+              </w:rPr>
+              <w:t>策划与展示材料</w:t>
+            </w:r>
+          </w:p>
+        </w:tc>
+        <w:tc>
+          <w:tcPr>
+            <w:tcW w:type="dxa" w:w="1474"/>
+            <w:vAlign w:val="center"/>
+            <w:shd w:fill="FFFFFF"/>
+            <w:tcMar>
+              <w:top w:w="75" w:type="dxa"/>
+              <w:bottom w:w="75" w:type="dxa"/>
+              <w:left w:w="95" w:type="dxa"/>
+              <w:right w:w="95" w:type="dxa"/>
+            </w:tcMar>
+          </w:tcPr>
+          <w:p>
+            <w:pPr>
+              <w:spacing w:line="300" w:lineRule="exact" w:after="0"/>
+              <w:jc w:val="left"/>
+            </w:pPr>
+            <w:r>
+              <w:rPr>
+                <w:b w:val="0"/>
+                <w:sz w:val="20"/>
+              </w:rPr>
+              <w:t>策划 沈语雯</w:t>
+              <w:br/>
+              <w:t>展示 李星莹</w:t>
+            </w:r>
+          </w:p>
+        </w:tc>
+        <w:tc>
+          <w:tcPr>
+            <w:tcW w:type="dxa" w:w="2324"/>
+            <w:vAlign w:val="center"/>
+            <w:shd w:fill="FFFFFF"/>
+            <w:tcMar>
+              <w:top w:w="75" w:type="dxa"/>
+              <w:bottom w:w="75" w:type="dxa"/>
+              <w:left w:w="95" w:type="dxa"/>
+              <w:right w:w="95" w:type="dxa"/>
+            </w:tcMar>
+          </w:tcPr>
+          <w:p>
+            <w:pPr>
+              <w:spacing w:line="300" w:lineRule="exact" w:after="0"/>
+              <w:jc w:val="left"/>
+            </w:pPr>
+            <w:r>
+              <w:rPr>
+                <w:b w:val="0"/>
+                <w:sz w:val="20"/>
+              </w:rPr>
+              <w:t>沈语雯审规则</w:t>
+              <w:br/>
+              <w:t>严楷哲核版本</w:t>
+            </w:r>
+          </w:p>
+        </w:tc>
+        <w:tc>
+          <w:tcPr>
+            <w:tcW w:type="dxa" w:w="3628"/>
+            <w:vAlign w:val="center"/>
+            <w:shd w:fill="FFFFFF"/>
+            <w:tcMar>
+              <w:top w:w="75" w:type="dxa"/>
+              <w:bottom w:w="75" w:type="dxa"/>
+              <w:left w:w="95" w:type="dxa"/>
+              <w:right w:w="95" w:type="dxa"/>
+            </w:tcMar>
+          </w:tcPr>
+          <w:p>
+            <w:pPr>
+              <w:spacing w:line="300" w:lineRule="exact" w:after="0"/>
+              <w:jc w:val="left"/>
+            </w:pPr>
+            <w:r>
+              <w:rPr>
+                <w:b w:val="0"/>
+                <w:sz w:val="20"/>
+              </w:rPr>
+              <w:t>修改后的文件、对应游戏版本与需同步的材料</w:t>
+            </w:r>
+          </w:p>
+        </w:tc>
+      </w:tr>
+      <w:tr>
+        <w:trPr>
+          <w:cantSplit/>
+        </w:trPr>
+        <w:tc>
+          <w:tcPr>
+            <w:tcW w:type="dxa" w:w="1871"/>
+            <w:vAlign w:val="center"/>
+            <w:shd w:fill="F3F6F7"/>
+            <w:tcMar>
+              <w:top w:w="75" w:type="dxa"/>
+              <w:bottom w:w="75" w:type="dxa"/>
+              <w:left w:w="95" w:type="dxa"/>
+              <w:right w:w="95" w:type="dxa"/>
+            </w:tcMar>
+          </w:tcPr>
+          <w:p>
+            <w:pPr>
+              <w:spacing w:line="300" w:lineRule="exact" w:after="0"/>
+              <w:jc w:val="center"/>
+            </w:pPr>
+            <w:r>
+              <w:rPr>
+                <w:b w:val="0"/>
+                <w:sz w:val="20"/>
+              </w:rPr>
+              <w:t>最终文件与备份</w:t>
+            </w:r>
+          </w:p>
+        </w:tc>
+        <w:tc>
+          <w:tcPr>
+            <w:tcW w:type="dxa" w:w="1474"/>
+            <w:vAlign w:val="center"/>
+            <w:shd w:fill="F3F6F7"/>
+            <w:tcMar>
+              <w:top w:w="75" w:type="dxa"/>
+              <w:bottom w:w="75" w:type="dxa"/>
+              <w:left w:w="95" w:type="dxa"/>
+              <w:right w:w="95" w:type="dxa"/>
+            </w:tcMar>
+          </w:tcPr>
+          <w:p>
+            <w:pPr>
+              <w:spacing w:line="300" w:lineRule="exact" w:after="0"/>
+              <w:jc w:val="left"/>
+            </w:pPr>
+            <w:r>
+              <w:rPr>
+                <w:b w:val="0"/>
+                <w:sz w:val="20"/>
+              </w:rPr>
+              <w:t>严楷哲</w:t>
+            </w:r>
+          </w:p>
+        </w:tc>
+        <w:tc>
+          <w:tcPr>
+            <w:tcW w:type="dxa" w:w="2324"/>
+            <w:vAlign w:val="center"/>
+            <w:shd w:fill="F3F6F7"/>
+            <w:tcMar>
+              <w:top w:w="75" w:type="dxa"/>
+              <w:bottom w:w="75" w:type="dxa"/>
+              <w:left w:w="95" w:type="dxa"/>
+              <w:right w:w="95" w:type="dxa"/>
+            </w:tcMar>
+          </w:tcPr>
+          <w:p>
+            <w:pPr>
+              <w:spacing w:line="300" w:lineRule="exact" w:after="0"/>
+              <w:jc w:val="left"/>
+            </w:pPr>
+            <w:r>
+              <w:rPr>
+                <w:b w:val="0"/>
+                <w:sz w:val="20"/>
+              </w:rPr>
+              <w:t>沈语雯、李星莹</w:t>
+            </w:r>
+          </w:p>
+        </w:tc>
+        <w:tc>
+          <w:tcPr>
+            <w:tcW w:type="dxa" w:w="3628"/>
+            <w:vAlign w:val="center"/>
+            <w:shd w:fill="F3F6F7"/>
+            <w:tcMar>
+              <w:top w:w="75" w:type="dxa"/>
+              <w:bottom w:w="75" w:type="dxa"/>
+              <w:left w:w="95" w:type="dxa"/>
+              <w:right w:w="95" w:type="dxa"/>
+            </w:tcMar>
+          </w:tcPr>
+          <w:p>
+            <w:pPr>
+              <w:spacing w:line="300" w:lineRule="exact" w:after="0"/>
+              <w:jc w:val="left"/>
+            </w:pPr>
+            <w:r>
+              <w:rPr>
+                <w:b w:val="0"/>
+                <w:sz w:val="20"/>
+              </w:rPr>
+              <w:t>完整目录、下载检查结果、核对意见和版本标记</w:t>
+            </w:r>
+          </w:p>
+        </w:tc>
+      </w:tr>
+    </w:tbl>
+    <w:p>
+      <w:pPr>
+        <w:spacing w:after="60" w:before="0" w:line="240" w:lineRule="auto"/>
+      </w:pPr>
+      <w:r>
+        <w:rPr>
+          <w:sz w:val="4"/>
+        </w:rPr>
+      </w:r>
+    </w:p>
+    <w:p>
+      <w:pPr>
+        <w:pStyle w:val="Heading3"/>
+      </w:pPr>
+      <w:r>
+        <w:t>问题处理顺序</w:t>
+      </w:r>
+    </w:p>
+    <w:p>
+      <w:r>
+        <w:rPr>
+          <w:b w:val="0"/>
+        </w:rPr>
+        <w:t>李星莹记录问题后，严楷哲判断是程序异常、资源问题还是说明不清；沈语雯参与需要改变玩法或视觉表达的判断。确定方案后交主负责人修改，再由原记录人按同样步骤复测，确认结果后更新相关文档。无法启动、无法通关和状态错误优先处理，其次是影响理解或同步的问题，最后再补充装饰表现。</w:t>
+      </w:r>
+    </w:p>
+    <w:p>
+      <w:pPr>
+        <w:pStyle w:val="Heading3"/>
+      </w:pPr>
+      <w:r>
+        <w:t>变更示例</w:t>
+      </w:r>
+    </w:p>
+    <w:p>
+      <w:r>
+        <w:rPr>
+          <w:b w:val="0"/>
+        </w:rPr>
+        <w:t>例如玩家在第二间误把激光预警当成伤害阶段，沈语雯先定位提示与画面问题；若需调整颜色、虚线或阶段文字，由严楷哲实现，李星莹复测预警和危险时长，并检查视频与PPT是否需要换图。该项完成后，同步更新仍使用旧画面的展示文件。</w:t>
+      </w:r>
+    </w:p>
+    <w:p>
+      <w:pPr>
+        <w:pStyle w:val="Heading3"/>
+      </w:pPr>
+      <w:r>
+        <w:t>版本与资料管理</w:t>
+      </w:r>
+    </w:p>
+    <w:p>
+      <w:r>
+        <w:rPr>
+          <w:b w:val="0"/>
+        </w:rPr>
+        <w:t>待办按“待处理、修改中、待复测、已确认”记录状态，至少保留日期、版本、负责人、操作步骤和结果。未完成复测时不标记解决。材料统一从队长确认的版本生成；成员替换文件后告知关联负责人，旧文件保留版本标记，避免误用于展示。</w:t>
+      </w:r>
+    </w:p>
+    <w:p>
+      <w:pPr>
+        <w:pStyle w:val="Heading2"/>
+        <w:pageBreakBefore/>
+        <w:spacing w:before="0" w:after="240"/>
+      </w:pPr>
+      <w:r>
+        <w:rPr>
+          <w:sz w:val="36"/>
+        </w:rPr>
+        <w:t>七 阶段计划与成果管理</w:t>
+      </w:r>
+    </w:p>
+    <w:p>
+      <w:r>
+        <w:rPr>
+          <w:b w:val="0"/>
+        </w:rPr>
+        <w:t>以下为阶段计划，日期为计划窗口。各阶段完成后补充实际结果；若某项检查未通过，保留问题及负责人，优先解决影响正常运行、通关或展示的事项。详细逐日安排见配套《人员分工与活动安排》。</w:t>
+      </w:r>
+    </w:p>
+    <w:tbl>
+      <w:tblPr>
+        <w:tblW w:type="auto" w:w="0"/>
+        <w:jc w:val="center"/>
+        <w:tblLayout w:type="fixed"/>
+        <w:tblLook w:firstColumn="1" w:firstRow="1" w:lastColumn="0" w:lastRow="0" w:noHBand="0" w:noVBand="1" w:val="04A0"/>
+        <w:tblBorders>
+          <w:top w:val="single" w:sz="4" w:color="D9D9D9"/>
+          <w:left w:val="single" w:sz="4" w:color="D9D9D9"/>
+          <w:bottom w:val="single" w:sz="4" w:color="D9D9D9"/>
+          <w:right w:val="single" w:sz="4" w:color="D9D9D9"/>
+          <w:insideH w:val="single" w:sz="4" w:color="D9D9D9"/>
+          <w:insideV w:val="single" w:sz="4" w:color="D9D9D9"/>
+        </w:tblBorders>
+      </w:tblPr>
+      <w:tblGrid>
+        <w:gridCol w:w="1814"/>
+        <w:gridCol w:w="1984"/>
+        <w:gridCol w:w="3175"/>
+        <w:gridCol w:w="2324"/>
+      </w:tblGrid>
+      <w:tr>
+        <w:trPr>
+          <w:cantSplit/>
+          <w:tblHeader/>
+        </w:trPr>
+        <w:tc>
+          <w:tcPr>
+            <w:tcW w:type="dxa" w:w="1814"/>
+            <w:vAlign w:val="center"/>
+            <w:shd w:fill="233C4A"/>
+            <w:tcMar>
+              <w:top w:w="75" w:type="dxa"/>
+              <w:bottom w:w="75" w:type="dxa"/>
+              <w:left w:w="95" w:type="dxa"/>
+              <w:right w:w="95" w:type="dxa"/>
+            </w:tcMar>
+          </w:tcPr>
+          <w:p>
+            <w:pPr>
+              <w:spacing w:line="300" w:lineRule="exact" w:after="0"/>
+              <w:jc w:val="center"/>
+            </w:pPr>
+            <w:r>
+              <w:rPr>
+                <w:b/>
+                <w:color w:val="FFFFFF"/>
+                <w:sz w:val="20"/>
+              </w:rPr>
+              <w:t>计划阶段</w:t>
+            </w:r>
+          </w:p>
+        </w:tc>
+        <w:tc>
+          <w:tcPr>
+            <w:tcW w:type="dxa" w:w="1984"/>
+            <w:vAlign w:val="center"/>
+            <w:shd w:fill="233C4A"/>
+            <w:tcMar>
+              <w:top w:w="75" w:type="dxa"/>
+              <w:bottom w:w="75" w:type="dxa"/>
+              <w:left w:w="95" w:type="dxa"/>
+              <w:right w:w="95" w:type="dxa"/>
+            </w:tcMar>
+          </w:tcPr>
+          <w:p>
+            <w:pPr>
+              <w:spacing w:line="300" w:lineRule="exact" w:after="0"/>
+              <w:jc w:val="left"/>
+            </w:pPr>
+            <w:r>
+              <w:rPr>
+                <w:b/>
+                <w:color w:val="FFFFFF"/>
+                <w:sz w:val="20"/>
+              </w:rPr>
+              <w:t>人员安排</w:t>
+            </w:r>
+          </w:p>
+        </w:tc>
+        <w:tc>
+          <w:tcPr>
+            <w:tcW w:type="dxa" w:w="3175"/>
+            <w:vAlign w:val="center"/>
+            <w:shd w:fill="233C4A"/>
+            <w:tcMar>
+              <w:top w:w="75" w:type="dxa"/>
+              <w:bottom w:w="75" w:type="dxa"/>
+              <w:left w:w="95" w:type="dxa"/>
+              <w:right w:w="95" w:type="dxa"/>
+            </w:tcMar>
+          </w:tcPr>
+          <w:p>
+            <w:pPr>
+              <w:spacing w:line="300" w:lineRule="exact" w:after="0"/>
+              <w:jc w:val="left"/>
+            </w:pPr>
+            <w:r>
+              <w:rPr>
+                <w:b/>
+                <w:color w:val="FFFFFF"/>
+                <w:sz w:val="20"/>
+              </w:rPr>
+              <w:t>主要工作</w:t>
+            </w:r>
+          </w:p>
+        </w:tc>
+        <w:tc>
+          <w:tcPr>
+            <w:tcW w:type="dxa" w:w="2324"/>
+            <w:vAlign w:val="center"/>
+            <w:shd w:fill="233C4A"/>
+            <w:tcMar>
+              <w:top w:w="75" w:type="dxa"/>
+              <w:bottom w:w="75" w:type="dxa"/>
+              <w:left w:w="95" w:type="dxa"/>
+              <w:right w:w="95" w:type="dxa"/>
+            </w:tcMar>
+          </w:tcPr>
+          <w:p>
+            <w:pPr>
+              <w:spacing w:line="300" w:lineRule="exact" w:after="0"/>
+              <w:jc w:val="left"/>
+            </w:pPr>
+            <w:r>
+              <w:rPr>
+                <w:b/>
+                <w:color w:val="FFFFFF"/>
+                <w:sz w:val="20"/>
+              </w:rPr>
+              <w:t>阶段成果</w:t>
+            </w:r>
+          </w:p>
+        </w:tc>
+      </w:tr>
+      <w:tr>
+        <w:trPr>
+          <w:cantSplit/>
+        </w:trPr>
+        <w:tc>
+          <w:tcPr>
+            <w:tcW w:type="dxa" w:w="1814"/>
+            <w:vAlign w:val="center"/>
+            <w:shd w:fill="FFFFFF"/>
+            <w:tcMar>
+              <w:top w:w="75" w:type="dxa"/>
+              <w:bottom w:w="75" w:type="dxa"/>
+              <w:left w:w="95" w:type="dxa"/>
+              <w:right w:w="95" w:type="dxa"/>
+            </w:tcMar>
+          </w:tcPr>
+          <w:p>
+            <w:pPr>
+              <w:spacing w:line="300" w:lineRule="exact" w:after="0"/>
+              <w:jc w:val="center"/>
+            </w:pPr>
+            <w:r>
+              <w:rPr>
+                <w:b w:val="0"/>
+                <w:sz w:val="20"/>
+              </w:rPr>
+              <w:t>10月25—26日</w:t>
+              <w:br/>
+              <w:t>集中检查与修复</w:t>
+            </w:r>
+          </w:p>
+        </w:tc>
+        <w:tc>
+          <w:tcPr>
+            <w:tcW w:type="dxa" w:w="1984"/>
+            <w:vAlign w:val="center"/>
+            <w:shd w:fill="FFFFFF"/>
+            <w:tcMar>
+              <w:top w:w="75" w:type="dxa"/>
+              <w:bottom w:w="75" w:type="dxa"/>
+              <w:left w:w="95" w:type="dxa"/>
+              <w:right w:w="95" w:type="dxa"/>
+            </w:tcMar>
+          </w:tcPr>
+          <w:p>
+            <w:pPr>
+              <w:spacing w:line="300" w:lineRule="exact" w:after="0"/>
+              <w:jc w:val="left"/>
+            </w:pPr>
+            <w:r>
+              <w:rPr>
+                <w:b w:val="0"/>
+                <w:sz w:val="20"/>
+              </w:rPr>
+              <w:t>李星莹记录</w:t>
+              <w:br/>
+              <w:t>严楷哲修复</w:t>
+              <w:br/>
+              <w:t>沈语雯复核体验</w:t>
+            </w:r>
+          </w:p>
+        </w:tc>
+        <w:tc>
+          <w:tcPr>
+            <w:tcW w:type="dxa" w:w="3175"/>
+            <w:vAlign w:val="center"/>
+            <w:shd w:fill="FFFFFF"/>
+            <w:tcMar>
+              <w:top w:w="75" w:type="dxa"/>
+              <w:bottom w:w="75" w:type="dxa"/>
+              <w:left w:w="95" w:type="dxa"/>
+              <w:right w:w="95" w:type="dxa"/>
+            </w:tcMar>
+          </w:tcPr>
+          <w:p>
+            <w:pPr>
+              <w:spacing w:line="300" w:lineRule="exact" w:after="0"/>
+              <w:jc w:val="left"/>
+            </w:pPr>
+            <w:r>
+              <w:rPr>
+                <w:b w:val="0"/>
+                <w:sz w:val="20"/>
+              </w:rPr>
+              <w:t>完整通关与独立设备检查；处理运行、机关和教学问题</w:t>
+            </w:r>
+          </w:p>
+        </w:tc>
+        <w:tc>
+          <w:tcPr>
+            <w:tcW w:type="dxa" w:w="2324"/>
+            <w:vAlign w:val="center"/>
+            <w:shd w:fill="FFFFFF"/>
+            <w:tcMar>
+              <w:top w:w="75" w:type="dxa"/>
+              <w:bottom w:w="75" w:type="dxa"/>
+              <w:left w:w="95" w:type="dxa"/>
+              <w:right w:w="95" w:type="dxa"/>
+            </w:tcMar>
+          </w:tcPr>
+          <w:p>
+            <w:pPr>
+              <w:spacing w:line="300" w:lineRule="exact" w:after="0"/>
+              <w:jc w:val="left"/>
+            </w:pPr>
+            <w:r>
+              <w:rPr>
+                <w:b w:val="0"/>
+                <w:sz w:val="20"/>
+              </w:rPr>
+              <w:t>问题清单、改动说明、复测记录</w:t>
+            </w:r>
+          </w:p>
+        </w:tc>
+      </w:tr>
+      <w:tr>
+        <w:trPr>
+          <w:cantSplit/>
+        </w:trPr>
+        <w:tc>
+          <w:tcPr>
+            <w:tcW w:type="dxa" w:w="1814"/>
+            <w:vAlign w:val="center"/>
+            <w:shd w:fill="F3F6F7"/>
+            <w:tcMar>
+              <w:top w:w="75" w:type="dxa"/>
+              <w:bottom w:w="75" w:type="dxa"/>
+              <w:left w:w="95" w:type="dxa"/>
+              <w:right w:w="95" w:type="dxa"/>
+            </w:tcMar>
+          </w:tcPr>
+          <w:p>
+            <w:pPr>
+              <w:spacing w:line="300" w:lineRule="exact" w:after="0"/>
+              <w:jc w:val="center"/>
+            </w:pPr>
+            <w:r>
+              <w:rPr>
+                <w:b w:val="0"/>
+                <w:sz w:val="20"/>
+              </w:rPr>
+              <w:t>10月27—28日</w:t>
+              <w:br/>
+              <w:t>版本与材料统一</w:t>
+            </w:r>
+          </w:p>
+        </w:tc>
+        <w:tc>
+          <w:tcPr>
+            <w:tcW w:type="dxa" w:w="1984"/>
+            <w:vAlign w:val="center"/>
+            <w:shd w:fill="F3F6F7"/>
+            <w:tcMar>
+              <w:top w:w="75" w:type="dxa"/>
+              <w:bottom w:w="75" w:type="dxa"/>
+              <w:left w:w="95" w:type="dxa"/>
+              <w:right w:w="95" w:type="dxa"/>
+            </w:tcMar>
+          </w:tcPr>
+          <w:p>
+            <w:pPr>
+              <w:spacing w:line="300" w:lineRule="exact" w:after="0"/>
+              <w:jc w:val="left"/>
+            </w:pPr>
+            <w:r>
+              <w:rPr>
+                <w:b w:val="0"/>
+                <w:sz w:val="20"/>
+              </w:rPr>
+              <w:t>严楷哲确定版本</w:t>
+              <w:br/>
+              <w:t>沈语雯审内容</w:t>
+              <w:br/>
+              <w:t>李星莹整理文件</w:t>
+            </w:r>
+          </w:p>
+        </w:tc>
+        <w:tc>
+          <w:tcPr>
+            <w:tcW w:type="dxa" w:w="3175"/>
+            <w:vAlign w:val="center"/>
+            <w:shd w:fill="F3F6F7"/>
+            <w:tcMar>
+              <w:top w:w="75" w:type="dxa"/>
+              <w:bottom w:w="75" w:type="dxa"/>
+              <w:left w:w="95" w:type="dxa"/>
+              <w:right w:w="95" w:type="dxa"/>
+            </w:tcMar>
+          </w:tcPr>
+          <w:p>
+            <w:pPr>
+              <w:spacing w:line="300" w:lineRule="exact" w:after="0"/>
+              <w:jc w:val="left"/>
+            </w:pPr>
+            <w:r>
+              <w:rPr>
+                <w:b w:val="0"/>
+                <w:sz w:val="20"/>
+              </w:rPr>
+              <w:t>核对源码和运行包；同步策划、截图、视频及宣讲材料</w:t>
+            </w:r>
+          </w:p>
+        </w:tc>
+        <w:tc>
+          <w:tcPr>
+            <w:tcW w:type="dxa" w:w="2324"/>
+            <w:vAlign w:val="center"/>
+            <w:shd w:fill="F3F6F7"/>
+            <w:tcMar>
+              <w:top w:w="75" w:type="dxa"/>
+              <w:bottom w:w="75" w:type="dxa"/>
+              <w:left w:w="95" w:type="dxa"/>
+              <w:right w:w="95" w:type="dxa"/>
+            </w:tcMar>
+          </w:tcPr>
+          <w:p>
+            <w:pPr>
+              <w:spacing w:line="300" w:lineRule="exact" w:after="0"/>
+              <w:jc w:val="left"/>
+            </w:pPr>
+            <w:r>
+              <w:rPr>
+                <w:b w:val="0"/>
+                <w:sz w:val="20"/>
+              </w:rPr>
+              <w:t>对应同一版本的工程、程序与材料目录</w:t>
+            </w:r>
+          </w:p>
+        </w:tc>
+      </w:tr>
+      <w:tr>
+        <w:trPr>
+          <w:cantSplit/>
+        </w:trPr>
+        <w:tc>
+          <w:tcPr>
+            <w:tcW w:type="dxa" w:w="1814"/>
+            <w:vAlign w:val="center"/>
+            <w:shd w:fill="FFFFFF"/>
+            <w:tcMar>
+              <w:top w:w="75" w:type="dxa"/>
+              <w:bottom w:w="75" w:type="dxa"/>
+              <w:left w:w="95" w:type="dxa"/>
+              <w:right w:w="95" w:type="dxa"/>
+            </w:tcMar>
+          </w:tcPr>
+          <w:p>
+            <w:pPr>
+              <w:spacing w:line="300" w:lineRule="exact" w:after="0"/>
+              <w:jc w:val="center"/>
+            </w:pPr>
+            <w:r>
+              <w:rPr>
+                <w:b w:val="0"/>
+                <w:sz w:val="20"/>
+              </w:rPr>
+              <w:t>10月29日</w:t>
+              <w:br/>
+              <w:t>展示排练</w:t>
+            </w:r>
+          </w:p>
+        </w:tc>
+        <w:tc>
+          <w:tcPr>
+            <w:tcW w:type="dxa" w:w="1984"/>
+            <w:vAlign w:val="center"/>
+            <w:shd w:fill="FFFFFF"/>
+            <w:tcMar>
+              <w:top w:w="75" w:type="dxa"/>
+              <w:bottom w:w="75" w:type="dxa"/>
+              <w:left w:w="95" w:type="dxa"/>
+              <w:right w:w="95" w:type="dxa"/>
+            </w:tcMar>
+          </w:tcPr>
+          <w:p>
+            <w:pPr>
+              <w:spacing w:line="300" w:lineRule="exact" w:after="0"/>
+              <w:jc w:val="left"/>
+            </w:pPr>
+            <w:r>
+              <w:rPr>
+                <w:b w:val="0"/>
+                <w:sz w:val="20"/>
+              </w:rPr>
+              <w:t>李星莹组织</w:t>
+              <w:br/>
+              <w:t>另外两人配合</w:t>
+            </w:r>
+          </w:p>
+        </w:tc>
+        <w:tc>
+          <w:tcPr>
+            <w:tcW w:type="dxa" w:w="3175"/>
+            <w:vAlign w:val="center"/>
+            <w:shd w:fill="FFFFFF"/>
+            <w:tcMar>
+              <w:top w:w="75" w:type="dxa"/>
+              <w:bottom w:w="75" w:type="dxa"/>
+              <w:left w:w="95" w:type="dxa"/>
+              <w:right w:w="95" w:type="dxa"/>
+            </w:tcMar>
+          </w:tcPr>
+          <w:p>
+            <w:pPr>
+              <w:spacing w:line="300" w:lineRule="exact" w:after="0"/>
+              <w:jc w:val="left"/>
+            </w:pPr>
+            <w:r>
+              <w:rPr>
+                <w:b w:val="0"/>
+                <w:sz w:val="20"/>
+              </w:rPr>
+              <w:t>完整计时，确定主讲、翻页及试玩衔接</w:t>
+            </w:r>
+          </w:p>
+        </w:tc>
+        <w:tc>
+          <w:tcPr>
+            <w:tcW w:type="dxa" w:w="2324"/>
+            <w:vAlign w:val="center"/>
+            <w:shd w:fill="FFFFFF"/>
+            <w:tcMar>
+              <w:top w:w="75" w:type="dxa"/>
+              <w:bottom w:w="75" w:type="dxa"/>
+              <w:left w:w="95" w:type="dxa"/>
+              <w:right w:w="95" w:type="dxa"/>
+            </w:tcMar>
+          </w:tcPr>
+          <w:p>
+            <w:pPr>
+              <w:spacing w:line="300" w:lineRule="exact" w:after="0"/>
+              <w:jc w:val="left"/>
+            </w:pPr>
+            <w:r>
+              <w:rPr>
+                <w:b w:val="0"/>
+                <w:sz w:val="20"/>
+              </w:rPr>
+              <w:t>3—5分钟排练记录与待调整事项</w:t>
+            </w:r>
+          </w:p>
+        </w:tc>
+      </w:tr>
+      <w:tr>
+        <w:trPr>
+          <w:cantSplit/>
+        </w:trPr>
+        <w:tc>
+          <w:tcPr>
+            <w:tcW w:type="dxa" w:w="1814"/>
+            <w:vAlign w:val="center"/>
+            <w:shd w:fill="F3F6F7"/>
+            <w:tcMar>
+              <w:top w:w="75" w:type="dxa"/>
+              <w:bottom w:w="75" w:type="dxa"/>
+              <w:left w:w="95" w:type="dxa"/>
+              <w:right w:w="95" w:type="dxa"/>
+            </w:tcMar>
+          </w:tcPr>
+          <w:p>
+            <w:pPr>
+              <w:spacing w:line="300" w:lineRule="exact" w:after="0"/>
+              <w:jc w:val="center"/>
+            </w:pPr>
+            <w:r>
+              <w:rPr>
+                <w:b w:val="0"/>
+                <w:sz w:val="20"/>
+              </w:rPr>
+              <w:t>10月30—31日</w:t>
+              <w:br/>
+              <w:t>交付核验</w:t>
+            </w:r>
+          </w:p>
+        </w:tc>
+        <w:tc>
+          <w:tcPr>
+            <w:tcW w:type="dxa" w:w="1984"/>
+            <w:vAlign w:val="center"/>
+            <w:shd w:fill="F3F6F7"/>
+            <w:tcMar>
+              <w:top w:w="75" w:type="dxa"/>
+              <w:bottom w:w="75" w:type="dxa"/>
+              <w:left w:w="95" w:type="dxa"/>
+              <w:right w:w="95" w:type="dxa"/>
+            </w:tcMar>
+          </w:tcPr>
+          <w:p>
+            <w:pPr>
+              <w:spacing w:line="300" w:lineRule="exact" w:after="0"/>
+              <w:jc w:val="left"/>
+            </w:pPr>
+            <w:r>
+              <w:rPr>
+                <w:b w:val="0"/>
+                <w:sz w:val="20"/>
+              </w:rPr>
+              <w:t>严楷哲统筹</w:t>
+              <w:br/>
+              <w:t>三人共同复核</w:t>
+            </w:r>
+          </w:p>
+        </w:tc>
+        <w:tc>
+          <w:tcPr>
+            <w:tcW w:type="dxa" w:w="3175"/>
+            <w:vAlign w:val="center"/>
+            <w:shd w:fill="F3F6F7"/>
+            <w:tcMar>
+              <w:top w:w="75" w:type="dxa"/>
+              <w:bottom w:w="75" w:type="dxa"/>
+              <w:left w:w="95" w:type="dxa"/>
+              <w:right w:w="95" w:type="dxa"/>
+            </w:tcMar>
+          </w:tcPr>
+          <w:p>
+            <w:pPr>
+              <w:spacing w:line="300" w:lineRule="exact" w:after="0"/>
+              <w:jc w:val="left"/>
+            </w:pPr>
+            <w:r>
+              <w:rPr>
+                <w:b w:val="0"/>
+                <w:sz w:val="20"/>
+              </w:rPr>
+              <w:t>检查五类文件、分享下载和实际提交结果</w:t>
+            </w:r>
+          </w:p>
+        </w:tc>
+        <w:tc>
+          <w:tcPr>
+            <w:tcW w:type="dxa" w:w="2324"/>
+            <w:vAlign w:val="center"/>
+            <w:shd w:fill="F3F6F7"/>
+            <w:tcMar>
+              <w:top w:w="75" w:type="dxa"/>
+              <w:bottom w:w="75" w:type="dxa"/>
+              <w:left w:w="95" w:type="dxa"/>
+              <w:right w:w="95" w:type="dxa"/>
+            </w:tcMar>
+          </w:tcPr>
+          <w:p>
+            <w:pPr>
+              <w:spacing w:line="300" w:lineRule="exact" w:after="0"/>
+              <w:jc w:val="left"/>
+            </w:pPr>
+            <w:r>
+              <w:rPr>
+                <w:b w:val="0"/>
+                <w:sz w:val="20"/>
+              </w:rPr>
+              <w:t>最终目录、备份与交付记录</w:t>
+            </w:r>
+          </w:p>
+        </w:tc>
+      </w:tr>
+      <w:tr>
+        <w:trPr>
+          <w:cantSplit/>
+        </w:trPr>
+        <w:tc>
+          <w:tcPr>
+            <w:tcW w:type="dxa" w:w="1814"/>
+            <w:vAlign w:val="center"/>
+            <w:shd w:fill="FFFFFF"/>
+            <w:tcMar>
+              <w:top w:w="75" w:type="dxa"/>
+              <w:bottom w:w="75" w:type="dxa"/>
+              <w:left w:w="95" w:type="dxa"/>
+              <w:right w:w="95" w:type="dxa"/>
+            </w:tcMar>
+          </w:tcPr>
+          <w:p>
+            <w:pPr>
+              <w:spacing w:line="300" w:lineRule="exact" w:after="0"/>
+              <w:jc w:val="center"/>
+            </w:pPr>
+            <w:r>
+              <w:rPr>
+                <w:b w:val="0"/>
+                <w:sz w:val="20"/>
+              </w:rPr>
+              <w:t>11月1日截止前</w:t>
+              <w:br/>
+              <w:t>状态复核</w:t>
+            </w:r>
+          </w:p>
+        </w:tc>
+        <w:tc>
+          <w:tcPr>
+            <w:tcW w:type="dxa" w:w="1984"/>
+            <w:vAlign w:val="center"/>
+            <w:shd w:fill="FFFFFF"/>
+            <w:tcMar>
+              <w:top w:w="75" w:type="dxa"/>
+              <w:bottom w:w="75" w:type="dxa"/>
+              <w:left w:w="95" w:type="dxa"/>
+              <w:right w:w="95" w:type="dxa"/>
+            </w:tcMar>
+          </w:tcPr>
+          <w:p>
+            <w:pPr>
+              <w:spacing w:line="300" w:lineRule="exact" w:after="0"/>
+              <w:jc w:val="left"/>
+            </w:pPr>
+            <w:r>
+              <w:rPr>
+                <w:b w:val="0"/>
+                <w:sz w:val="20"/>
+              </w:rPr>
+              <w:t>严楷哲确认</w:t>
+              <w:br/>
+              <w:t>李星莹检查访问</w:t>
+            </w:r>
+          </w:p>
+        </w:tc>
+        <w:tc>
+          <w:tcPr>
+            <w:tcW w:type="dxa" w:w="3175"/>
+            <w:vAlign w:val="center"/>
+            <w:shd w:fill="FFFFFF"/>
+            <w:tcMar>
+              <w:top w:w="75" w:type="dxa"/>
+              <w:bottom w:w="75" w:type="dxa"/>
+              <w:left w:w="95" w:type="dxa"/>
+              <w:right w:w="95" w:type="dxa"/>
+            </w:tcMar>
+          </w:tcPr>
+          <w:p>
+            <w:pPr>
+              <w:spacing w:line="300" w:lineRule="exact" w:after="0"/>
+              <w:jc w:val="left"/>
+            </w:pPr>
+            <w:r>
+              <w:rPr>
+                <w:b w:val="0"/>
+                <w:sz w:val="20"/>
+              </w:rPr>
+              <w:t>按手册期限检查文件与提交状态</w:t>
+            </w:r>
+          </w:p>
+        </w:tc>
+        <w:tc>
+          <w:tcPr>
+            <w:tcW w:type="dxa" w:w="2324"/>
+            <w:vAlign w:val="center"/>
+            <w:shd w:fill="FFFFFF"/>
+            <w:tcMar>
+              <w:top w:w="75" w:type="dxa"/>
+              <w:bottom w:w="75" w:type="dxa"/>
+              <w:left w:w="95" w:type="dxa"/>
+              <w:right w:w="95" w:type="dxa"/>
+            </w:tcMar>
+          </w:tcPr>
+          <w:p>
+            <w:pPr>
+              <w:spacing w:line="300" w:lineRule="exact" w:after="0"/>
+              <w:jc w:val="left"/>
+            </w:pPr>
+            <w:r>
+              <w:rPr>
+                <w:b w:val="0"/>
+                <w:sz w:val="20"/>
+              </w:rPr>
+              <w:t>最终版本和可访问结果</w:t>
+            </w:r>
+          </w:p>
+        </w:tc>
+      </w:tr>
+      <w:tr>
+        <w:trPr>
+          <w:cantSplit/>
+        </w:trPr>
+        <w:tc>
+          <w:tcPr>
+            <w:tcW w:type="dxa" w:w="1814"/>
+            <w:vAlign w:val="center"/>
+            <w:shd w:fill="F3F6F7"/>
+            <w:tcMar>
+              <w:top w:w="75" w:type="dxa"/>
+              <w:bottom w:w="75" w:type="dxa"/>
+              <w:left w:w="95" w:type="dxa"/>
+              <w:right w:w="95" w:type="dxa"/>
+            </w:tcMar>
+          </w:tcPr>
+          <w:p>
+            <w:pPr>
+              <w:spacing w:line="300" w:lineRule="exact" w:after="0"/>
+              <w:jc w:val="center"/>
+            </w:pPr>
+            <w:r>
+              <w:rPr>
+                <w:b w:val="0"/>
+                <w:sz w:val="20"/>
+              </w:rPr>
+              <w:t>11月2—8日</w:t>
+              <w:br/>
+              <w:t>现场准备与展示</w:t>
+            </w:r>
+          </w:p>
+        </w:tc>
+        <w:tc>
+          <w:tcPr>
+            <w:tcW w:type="dxa" w:w="1984"/>
+            <w:vAlign w:val="center"/>
+            <w:shd w:fill="F3F6F7"/>
+            <w:tcMar>
+              <w:top w:w="75" w:type="dxa"/>
+              <w:bottom w:w="75" w:type="dxa"/>
+              <w:left w:w="95" w:type="dxa"/>
+              <w:right w:w="95" w:type="dxa"/>
+            </w:tcMar>
+          </w:tcPr>
+          <w:p>
+            <w:pPr>
+              <w:spacing w:line="300" w:lineRule="exact" w:after="0"/>
+              <w:jc w:val="left"/>
+            </w:pPr>
+            <w:r>
+              <w:rPr>
+                <w:b w:val="0"/>
+                <w:sz w:val="20"/>
+              </w:rPr>
+              <w:t>按排练确定分工</w:t>
+            </w:r>
+          </w:p>
+        </w:tc>
+        <w:tc>
+          <w:tcPr>
+            <w:tcW w:type="dxa" w:w="3175"/>
+            <w:vAlign w:val="center"/>
+            <w:shd w:fill="F3F6F7"/>
+            <w:tcMar>
+              <w:top w:w="75" w:type="dxa"/>
+              <w:bottom w:w="75" w:type="dxa"/>
+              <w:left w:w="95" w:type="dxa"/>
+              <w:right w:w="95" w:type="dxa"/>
+            </w:tcMar>
+          </w:tcPr>
+          <w:p>
+            <w:pPr>
+              <w:spacing w:line="300" w:lineRule="exact" w:after="0"/>
+              <w:jc w:val="left"/>
+            </w:pPr>
+            <w:r>
+              <w:rPr>
+                <w:b w:val="0"/>
+                <w:sz w:val="20"/>
+              </w:rPr>
+              <w:t>离线放映、游戏运行和问答准备；使用统一版本展示</w:t>
+            </w:r>
+          </w:p>
+        </w:tc>
+        <w:tc>
+          <w:tcPr>
+            <w:tcW w:type="dxa" w:w="2324"/>
+            <w:vAlign w:val="center"/>
+            <w:shd w:fill="F3F6F7"/>
+            <w:tcMar>
+              <w:top w:w="75" w:type="dxa"/>
+              <w:bottom w:w="75" w:type="dxa"/>
+              <w:left w:w="95" w:type="dxa"/>
+              <w:right w:w="95" w:type="dxa"/>
+            </w:tcMar>
+          </w:tcPr>
+          <w:p>
+            <w:pPr>
+              <w:spacing w:line="300" w:lineRule="exact" w:after="0"/>
+              <w:jc w:val="left"/>
+            </w:pPr>
+            <w:r>
+              <w:rPr>
+                <w:b w:val="0"/>
+                <w:sz w:val="20"/>
+              </w:rPr>
+              <w:t>现场材料与设备备份</w:t>
+            </w:r>
+          </w:p>
+        </w:tc>
+      </w:tr>
+    </w:tbl>
+    <w:p>
+      <w:pPr>
+        <w:spacing w:after="60" w:before="0" w:line="240" w:lineRule="auto"/>
+      </w:pPr>
+      <w:r>
+        <w:rPr>
+          <w:sz w:val="4"/>
+        </w:rPr>
+      </w:r>
+    </w:p>
+    <w:p>
+      <w:pPr>
+        <w:pStyle w:val="Heading3"/>
+      </w:pPr>
+      <w:r>
+        <w:t>成果确认与待完善内容</w:t>
+      </w:r>
+    </w:p>
+    <w:p>
+      <w:r>
+        <w:rPr>
+          <w:b w:val="0"/>
+        </w:rPr>
+        <w:t>每项成果保留负责人、复核人、对应版本和结论。陌生玩家完整体验、独立设备通关及计时排练仍需形成实际记录；修复、失败与通关的独立音效列为后续打磨。新增房间和额外角色能力暂不列入本阶段，先保证现有三房间的规则清楚、操作反馈一致。</w:t>
+      </w:r>
+    </w:p>
+    <w:p>
+      <w:pPr>
+        <w:pStyle w:val="Heading3"/>
+      </w:pPr>
+      <w:r>
+        <w:t>现场配合</w:t>
+      </w:r>
+    </w:p>
+    <w:p>
+      <w:r>
+        <w:rPr>
+          <w:b w:val="0"/>
+        </w:rPr>
+        <w:t>严楷哲负责运行版本与程序实现说明，沈语雯负责立意、关卡及视觉设计问题，李星莹负责音频、测试与展示文件说明。主讲、翻页和演示顺序在排练后固定，三人均保留一份离线材料，遇到设备或网络问题时能够继续展示。</w:t>
+      </w:r>
+    </w:p>
+    <w:p>
+      <w:pPr>
+        <w:pStyle w:val="Heading3"/>
       </w:pPr>
       <w:r>
         <w:t>资料与对应版本</w:t>
@@ -5549,15 +7818,7 @@
         <w:rPr>
           <w:b w:val="0"/>
         </w:rPr>
-        <w:t>正文对应《踏光：两拍回响》v0.2。实录画面来自当前游戏和介绍视频素材；示意图按角色、光桥、节拍时钟及房间布局绘制。具体活动安排保留在配套的《人员分工与活动安排》中。</w:t>
-      </w:r>
-    </w:p>
-    <w:p>
-      <w:r>
-        <w:rPr>
-          <w:b w:val="0"/>
-        </w:rPr>
-        <w:t>完整工程、可运行版本与资源说明：github.com/xunraozhou/treadlight。工程内 docs/assets.md 记录音画内容，docs/development.md 说明运行与检查方法，NOTICE 和 THIRD_PARTY_NOTICES.md 保留相应许可信息。</w:t>
+        <w:t>本案对应《踏光：两拍回响》v0.2。工程与资源说明见 github.com/xunraozhou/treadlight；docs/assets.md 记录音画内容，docs/development.md 说明运行与检查方法，NOTICE 和 THIRD_PARTY_NOTICES.md 保留相应许可信息。</w:t>
       </w:r>
     </w:p>
     <w:sectPr>

</xml_diff>

<commit_message>
Use traditional Chinese report typography
</commit_message>
<xml_diff>
--- a/docs/design/game-design.docx
+++ b/docs/design/game-design.docx
@@ -74,6 +74,9 @@
       </w:r>
     </w:p>
     <w:p>
+      <w:pPr>
+        <w:ind w:firstLine="480"/>
+      </w:pPr>
       <w:r>
         <w:rPr>
           <w:b w:val="0"/>
@@ -82,6 +85,9 @@
       </w:r>
     </w:p>
     <w:p>
+      <w:pPr>
+        <w:ind w:firstLine="480"/>
+      </w:pPr>
       <w:r>
         <w:rPr>
           <w:b w:val="0"/>
@@ -90,6 +96,9 @@
       </w:r>
     </w:p>
     <w:p>
+      <w:pPr>
+        <w:ind w:firstLine="480"/>
+      </w:pPr>
       <w:r>
         <w:rPr>
           <w:b w:val="0"/>
@@ -98,6 +107,9 @@
       </w:r>
     </w:p>
     <w:p>
+      <w:pPr>
+        <w:ind w:firstLine="480"/>
+      </w:pPr>
       <w:r>
         <w:rPr>
           <w:b w:val="0"/>
@@ -115,6 +127,9 @@
       </w:r>
     </w:p>
     <w:p>
+      <w:pPr>
+        <w:ind w:firstLine="480"/>
+      </w:pPr>
       <w:r>
         <w:rPr>
           <w:b w:val="0"/>
@@ -123,6 +138,9 @@
       </w:r>
     </w:p>
     <w:p>
+      <w:pPr>
+        <w:ind w:firstLine="480"/>
+      </w:pPr>
       <w:r>
         <w:rPr>
           <w:b w:val="0"/>
@@ -131,6 +149,9 @@
       </w:r>
     </w:p>
     <w:p>
+      <w:pPr>
+        <w:ind w:firstLine="480"/>
+      </w:pPr>
       <w:r>
         <w:rPr>
           <w:b w:val="0"/>
@@ -166,7 +187,7 @@
           <w:tcPr>
             <w:tcW w:type="dxa" w:w="2154"/>
             <w:vAlign w:val="center"/>
-            <w:shd w:fill="233C4A"/>
+            <w:shd w:fill="EDEDED"/>
             <w:tcMar>
               <w:top w:w="75" w:type="dxa"/>
               <w:bottom w:w="75" w:type="dxa"/>
@@ -181,9 +202,9 @@
             </w:pPr>
             <w:r>
               <w:rPr>
-                <w:b/>
-                <w:color w:val="FFFFFF"/>
-                <w:sz w:val="20"/>
+                <w:rFonts w:ascii="Times New Roman" w:hAnsi="Times New Roman" w:eastAsia="黑体"/>
+                <w:b w:val="0"/>
+                <w:sz w:val="21"/>
               </w:rPr>
               <w:t>项目</w:t>
             </w:r>
@@ -193,7 +214,7 @@
           <w:tcPr>
             <w:tcW w:type="dxa" w:w="7143"/>
             <w:vAlign w:val="center"/>
-            <w:shd w:fill="233C4A"/>
+            <w:shd w:fill="EDEDED"/>
             <w:tcMar>
               <w:top w:w="75" w:type="dxa"/>
               <w:bottom w:w="75" w:type="dxa"/>
@@ -208,9 +229,9 @@
             </w:pPr>
             <w:r>
               <w:rPr>
-                <w:b/>
-                <w:color w:val="FFFFFF"/>
-                <w:sz w:val="20"/>
+                <w:rFonts w:ascii="Times New Roman" w:hAnsi="Times New Roman" w:eastAsia="黑体"/>
+                <w:b w:val="0"/>
+                <w:sz w:val="21"/>
               </w:rPr>
               <w:t>当前版本</w:t>
             </w:r>
@@ -240,8 +261,9 @@
             </w:pPr>
             <w:r>
               <w:rPr>
+                <w:rFonts w:ascii="Times New Roman" w:hAnsi="Times New Roman" w:eastAsia="宋体"/>
                 <w:b w:val="0"/>
-                <w:sz w:val="20"/>
+                <w:sz w:val="21"/>
               </w:rPr>
               <w:t>类型与平台</w:t>
             </w:r>
@@ -266,8 +288,9 @@
             </w:pPr>
             <w:r>
               <w:rPr>
+                <w:rFonts w:ascii="Times New Roman" w:hAnsi="Times New Roman" w:eastAsia="宋体"/>
                 <w:b w:val="0"/>
-                <w:sz w:val="20"/>
+                <w:sz w:val="21"/>
               </w:rPr>
               <w:t>单人节奏平台跳跃；Windows x64</w:t>
             </w:r>
@@ -282,7 +305,7 @@
           <w:tcPr>
             <w:tcW w:type="dxa" w:w="2154"/>
             <w:vAlign w:val="center"/>
-            <w:shd w:fill="F3F6F7"/>
+            <w:shd w:fill="FFFFFF"/>
             <w:tcMar>
               <w:top w:w="75" w:type="dxa"/>
               <w:bottom w:w="75" w:type="dxa"/>
@@ -297,8 +320,9 @@
             </w:pPr>
             <w:r>
               <w:rPr>
+                <w:rFonts w:ascii="Times New Roman" w:hAnsi="Times New Roman" w:eastAsia="宋体"/>
                 <w:b w:val="0"/>
-                <w:sz w:val="20"/>
+                <w:sz w:val="21"/>
               </w:rPr>
               <w:t>核心动作</w:t>
             </w:r>
@@ -308,7 +332,7 @@
           <w:tcPr>
             <w:tcW w:type="dxa" w:w="7143"/>
             <w:vAlign w:val="center"/>
-            <w:shd w:fill="F3F6F7"/>
+            <w:shd w:fill="FFFFFF"/>
             <w:tcMar>
               <w:top w:w="75" w:type="dxa"/>
               <w:bottom w:w="75" w:type="dxa"/>
@@ -323,8 +347,9 @@
             </w:pPr>
             <w:r>
               <w:rPr>
+                <w:rFonts w:ascii="Times New Roman" w:hAnsi="Times New Roman" w:eastAsia="宋体"/>
                 <w:b w:val="0"/>
-                <w:sz w:val="20"/>
+                <w:sz w:val="21"/>
               </w:rPr>
               <w:t>左右移动、地面单次跳跃、自动落地判定</w:t>
             </w:r>
@@ -354,8 +379,9 @@
             </w:pPr>
             <w:r>
               <w:rPr>
+                <w:rFonts w:ascii="Times New Roman" w:hAnsi="Times New Roman" w:eastAsia="宋体"/>
                 <w:b w:val="0"/>
-                <w:sz w:val="20"/>
+                <w:sz w:val="21"/>
               </w:rPr>
               <w:t>关卡规模</w:t>
             </w:r>
@@ -380,8 +406,9 @@
             </w:pPr>
             <w:r>
               <w:rPr>
+                <w:rFonts w:ascii="Times New Roman" w:hAnsi="Times New Roman" w:eastAsia="宋体"/>
                 <w:b w:val="0"/>
-                <w:sz w:val="20"/>
+                <w:sz w:val="21"/>
               </w:rPr>
               <w:t>三个房间，逐步组合光桥与激光</w:t>
             </w:r>
@@ -396,7 +423,7 @@
           <w:tcPr>
             <w:tcW w:type="dxa" w:w="2154"/>
             <w:vAlign w:val="center"/>
-            <w:shd w:fill="F3F6F7"/>
+            <w:shd w:fill="FFFFFF"/>
             <w:tcMar>
               <w:top w:w="75" w:type="dxa"/>
               <w:bottom w:w="75" w:type="dxa"/>
@@ -411,8 +438,9 @@
             </w:pPr>
             <w:r>
               <w:rPr>
+                <w:rFonts w:ascii="Times New Roman" w:hAnsi="Times New Roman" w:eastAsia="宋体"/>
                 <w:b w:val="0"/>
-                <w:sz w:val="20"/>
+                <w:sz w:val="21"/>
               </w:rPr>
               <w:t>通关目标</w:t>
             </w:r>
@@ -422,7 +450,7 @@
           <w:tcPr>
             <w:tcW w:type="dxa" w:w="7143"/>
             <w:vAlign w:val="center"/>
-            <w:shd w:fill="F3F6F7"/>
+            <w:shd w:fill="FFFFFF"/>
             <w:tcMar>
               <w:top w:w="75" w:type="dxa"/>
               <w:bottom w:w="75" w:type="dxa"/>
@@ -437,8 +465,9 @@
             </w:pPr>
             <w:r>
               <w:rPr>
+                <w:rFonts w:ascii="Times New Roman" w:hAnsi="Times New Roman" w:eastAsia="宋体"/>
                 <w:b w:val="0"/>
-                <w:sz w:val="20"/>
+                <w:sz w:val="21"/>
               </w:rPr>
               <w:t>固定房间内全部光桥，再抵达出口</w:t>
             </w:r>
@@ -468,8 +497,9 @@
             </w:pPr>
             <w:r>
               <w:rPr>
+                <w:rFonts w:ascii="Times New Roman" w:hAnsi="Times New Roman" w:eastAsia="宋体"/>
                 <w:b w:val="0"/>
-                <w:sz w:val="20"/>
+                <w:sz w:val="21"/>
               </w:rPr>
               <w:t>实现工具</w:t>
             </w:r>
@@ -494,8 +524,9 @@
             </w:pPr>
             <w:r>
               <w:rPr>
+                <w:rFonts w:ascii="Times New Roman" w:hAnsi="Times New Roman" w:eastAsia="宋体"/>
                 <w:b w:val="0"/>
-                <w:sz w:val="20"/>
+                <w:sz w:val="21"/>
               </w:rPr>
               <w:t>Godot 4.4.1 Standard；GDScript</w:t>
             </w:r>
@@ -522,6 +553,9 @@
       </w:r>
     </w:p>
     <w:p>
+      <w:pPr>
+        <w:ind w:firstLine="480"/>
+      </w:pPr>
       <w:r>
         <w:rPr>
           <w:b w:val="0"/>
@@ -547,6 +581,9 @@
       </w:r>
     </w:p>
     <w:p>
+      <w:pPr>
+        <w:ind w:firstLine="480"/>
+      </w:pPr>
       <w:r>
         <w:rPr>
           <w:b w:val="0"/>
@@ -555,6 +592,9 @@
       </w:r>
     </w:p>
     <w:p>
+      <w:pPr>
+        <w:ind w:firstLine="480"/>
+      </w:pPr>
       <w:r>
         <w:rPr>
           <w:b w:val="0"/>
@@ -563,6 +603,9 @@
       </w:r>
     </w:p>
     <w:p>
+      <w:pPr>
+        <w:ind w:firstLine="480"/>
+      </w:pPr>
       <w:r>
         <w:rPr>
           <w:b w:val="0"/>
@@ -571,6 +614,9 @@
       </w:r>
     </w:p>
     <w:p>
+      <w:pPr>
+        <w:ind w:firstLine="480"/>
+      </w:pPr>
       <w:r>
         <w:rPr>
           <w:b w:val="0"/>
@@ -587,6 +633,9 @@
       </w:r>
     </w:p>
     <w:p>
+      <w:pPr>
+        <w:ind w:firstLine="480"/>
+      </w:pPr>
       <w:r>
         <w:rPr>
           <w:b w:val="0"/>
@@ -595,6 +644,9 @@
       </w:r>
     </w:p>
     <w:p>
+      <w:pPr>
+        <w:ind w:firstLine="480"/>
+      </w:pPr>
       <w:r>
         <w:rPr>
           <w:b w:val="0"/>
@@ -603,6 +655,9 @@
       </w:r>
     </w:p>
     <w:p>
+      <w:pPr>
+        <w:ind w:firstLine="480"/>
+      </w:pPr>
       <w:r>
         <w:rPr>
           <w:b w:val="0"/>
@@ -620,6 +675,9 @@
       </w:r>
     </w:p>
     <w:p>
+      <w:pPr>
+        <w:ind w:firstLine="480"/>
+      </w:pPr>
       <w:r>
         <w:rPr>
           <w:b w:val="0"/>
@@ -628,6 +686,9 @@
       </w:r>
     </w:p>
     <w:p>
+      <w:pPr>
+        <w:ind w:firstLine="480"/>
+      </w:pPr>
       <w:r>
         <w:rPr>
           <w:b w:val="0"/>
@@ -745,6 +806,9 @@
       </w:r>
     </w:p>
     <w:p>
+      <w:pPr>
+        <w:ind w:firstLine="480"/>
+      </w:pPr>
       <w:r>
         <w:rPr>
           <w:b w:val="0"/>
@@ -812,6 +876,9 @@
       </w:r>
     </w:p>
     <w:p>
+      <w:pPr>
+        <w:ind w:firstLine="480"/>
+      </w:pPr>
       <w:r>
         <w:rPr>
           <w:b w:val="0"/>
@@ -898,7 +965,7 @@
           <w:tcPr>
             <w:tcW w:type="dxa" w:w="1757"/>
             <w:vAlign w:val="center"/>
-            <w:shd w:fill="233C4A"/>
+            <w:shd w:fill="EDEDED"/>
             <w:tcMar>
               <w:top w:w="75" w:type="dxa"/>
               <w:bottom w:w="75" w:type="dxa"/>
@@ -913,9 +980,9 @@
             </w:pPr>
             <w:r>
               <w:rPr>
-                <w:b/>
-                <w:color w:val="FFFFFF"/>
-                <w:sz w:val="20"/>
+                <w:rFonts w:ascii="Times New Roman" w:hAnsi="Times New Roman" w:eastAsia="黑体"/>
+                <w:b w:val="0"/>
+                <w:sz w:val="21"/>
               </w:rPr>
               <w:t>项目</w:t>
             </w:r>
@@ -925,7 +992,7 @@
           <w:tcPr>
             <w:tcW w:type="dxa" w:w="3515"/>
             <w:vAlign w:val="center"/>
-            <w:shd w:fill="233C4A"/>
+            <w:shd w:fill="EDEDED"/>
             <w:tcMar>
               <w:top w:w="75" w:type="dxa"/>
               <w:bottom w:w="75" w:type="dxa"/>
@@ -940,9 +1007,9 @@
             </w:pPr>
             <w:r>
               <w:rPr>
-                <w:b/>
-                <w:color w:val="FFFFFF"/>
-                <w:sz w:val="20"/>
+                <w:rFonts w:ascii="Times New Roman" w:hAnsi="Times New Roman" w:eastAsia="黑体"/>
+                <w:b w:val="0"/>
+                <w:sz w:val="21"/>
               </w:rPr>
               <w:t>当前规则</w:t>
             </w:r>
@@ -952,7 +1019,7 @@
           <w:tcPr>
             <w:tcW w:type="dxa" w:w="4025"/>
             <w:vAlign w:val="center"/>
-            <w:shd w:fill="233C4A"/>
+            <w:shd w:fill="EDEDED"/>
             <w:tcMar>
               <w:top w:w="75" w:type="dxa"/>
               <w:bottom w:w="75" w:type="dxa"/>
@@ -967,9 +1034,9 @@
             </w:pPr>
             <w:r>
               <w:rPr>
-                <w:b/>
-                <w:color w:val="FFFFFF"/>
-                <w:sz w:val="20"/>
+                <w:rFonts w:ascii="Times New Roman" w:hAnsi="Times New Roman" w:eastAsia="黑体"/>
+                <w:b w:val="0"/>
+                <w:sz w:val="21"/>
               </w:rPr>
               <w:t>对体验的影响</w:t>
             </w:r>
@@ -999,8 +1066,9 @@
             </w:pPr>
             <w:r>
               <w:rPr>
+                <w:rFonts w:ascii="Times New Roman" w:hAnsi="Times New Roman" w:eastAsia="宋体"/>
                 <w:b w:val="0"/>
-                <w:sz w:val="20"/>
+                <w:sz w:val="21"/>
               </w:rPr>
               <w:t>准确</w:t>
             </w:r>
@@ -1025,8 +1093,9 @@
             </w:pPr>
             <w:r>
               <w:rPr>
+                <w:rFonts w:ascii="Times New Roman" w:hAnsi="Times New Roman" w:eastAsia="宋体"/>
                 <w:b w:val="0"/>
-                <w:sz w:val="20"/>
+                <w:sz w:val="21"/>
               </w:rPr>
               <w:t>距最近拍点不超过 80 毫秒</w:t>
             </w:r>
@@ -1051,8 +1120,9 @@
             </w:pPr>
             <w:r>
               <w:rPr>
+                <w:rFonts w:ascii="Times New Roman" w:hAnsi="Times New Roman" w:eastAsia="宋体"/>
                 <w:b w:val="0"/>
-                <w:sz w:val="20"/>
+                <w:sz w:val="21"/>
               </w:rPr>
               <w:t>对更精确的动作给予较高评价</w:t>
             </w:r>
@@ -1067,7 +1137,7 @@
           <w:tcPr>
             <w:tcW w:type="dxa" w:w="1757"/>
             <w:vAlign w:val="center"/>
-            <w:shd w:fill="F3F6F7"/>
+            <w:shd w:fill="FFFFFF"/>
             <w:tcMar>
               <w:top w:w="75" w:type="dxa"/>
               <w:bottom w:w="75" w:type="dxa"/>
@@ -1082,8 +1152,9 @@
             </w:pPr>
             <w:r>
               <w:rPr>
+                <w:rFonts w:ascii="Times New Roman" w:hAnsi="Times New Roman" w:eastAsia="宋体"/>
                 <w:b w:val="0"/>
-                <w:sz w:val="20"/>
+                <w:sz w:val="21"/>
               </w:rPr>
               <w:t>良好</w:t>
             </w:r>
@@ -1093,7 +1164,7 @@
           <w:tcPr>
             <w:tcW w:type="dxa" w:w="3515"/>
             <w:vAlign w:val="center"/>
-            <w:shd w:fill="F3F6F7"/>
+            <w:shd w:fill="FFFFFF"/>
             <w:tcMar>
               <w:top w:w="75" w:type="dxa"/>
               <w:bottom w:w="75" w:type="dxa"/>
@@ -1108,8 +1179,9 @@
             </w:pPr>
             <w:r>
               <w:rPr>
+                <w:rFonts w:ascii="Times New Roman" w:hAnsi="Times New Roman" w:eastAsia="宋体"/>
                 <w:b w:val="0"/>
-                <w:sz w:val="20"/>
+                <w:sz w:val="21"/>
               </w:rPr>
               <w:t>超过 80 毫秒、但不超过 150 毫秒</w:t>
             </w:r>
@@ -1119,7 +1191,7 @@
           <w:tcPr>
             <w:tcW w:type="dxa" w:w="4025"/>
             <w:vAlign w:val="center"/>
-            <w:shd w:fill="F3F6F7"/>
+            <w:shd w:fill="FFFFFF"/>
             <w:tcMar>
               <w:top w:w="75" w:type="dxa"/>
               <w:bottom w:w="75" w:type="dxa"/>
@@ -1134,8 +1206,9 @@
             </w:pPr>
             <w:r>
               <w:rPr>
+                <w:rFonts w:ascii="Times New Roman" w:hAnsi="Times New Roman" w:eastAsia="宋体"/>
                 <w:b w:val="0"/>
-                <w:sz w:val="20"/>
+                <w:sz w:val="21"/>
               </w:rPr>
               <w:t>仍能激活和固定桥面，保留练习余地</w:t>
             </w:r>
@@ -1165,8 +1238,9 @@
             </w:pPr>
             <w:r>
               <w:rPr>
+                <w:rFonts w:ascii="Times New Roman" w:hAnsi="Times New Roman" w:eastAsia="宋体"/>
                 <w:b w:val="0"/>
-                <w:sz w:val="20"/>
+                <w:sz w:val="21"/>
               </w:rPr>
               <w:t>偏拍</w:t>
             </w:r>
@@ -1191,8 +1265,9 @@
             </w:pPr>
             <w:r>
               <w:rPr>
+                <w:rFonts w:ascii="Times New Roman" w:hAnsi="Times New Roman" w:eastAsia="宋体"/>
                 <w:b w:val="0"/>
-                <w:sz w:val="20"/>
+                <w:sz w:val="21"/>
               </w:rPr>
               <w:t>距最近拍点超过 150 毫秒</w:t>
             </w:r>
@@ -1217,8 +1292,9 @@
             </w:pPr>
             <w:r>
               <w:rPr>
+                <w:rFonts w:ascii="Times New Roman" w:hAnsi="Times New Roman" w:eastAsia="宋体"/>
                 <w:b w:val="0"/>
-                <w:sz w:val="20"/>
+                <w:sz w:val="21"/>
               </w:rPr>
               <w:t>保留普通跳跃，不触发节拍机关</w:t>
             </w:r>
@@ -1233,7 +1309,7 @@
           <w:tcPr>
             <w:tcW w:type="dxa" w:w="1757"/>
             <w:vAlign w:val="center"/>
-            <w:shd w:fill="F3F6F7"/>
+            <w:shd w:fill="FFFFFF"/>
             <w:tcMar>
               <w:top w:w="75" w:type="dxa"/>
               <w:bottom w:w="75" w:type="dxa"/>
@@ -1248,8 +1324,9 @@
             </w:pPr>
             <w:r>
               <w:rPr>
+                <w:rFonts w:ascii="Times New Roman" w:hAnsi="Times New Roman" w:eastAsia="宋体"/>
                 <w:b w:val="0"/>
-                <w:sz w:val="20"/>
+                <w:sz w:val="21"/>
               </w:rPr>
               <w:t>青桥寿命</w:t>
             </w:r>
@@ -1259,7 +1336,7 @@
           <w:tcPr>
             <w:tcW w:type="dxa" w:w="3515"/>
             <w:vAlign w:val="center"/>
-            <w:shd w:fill="F3F6F7"/>
+            <w:shd w:fill="FFFFFF"/>
             <w:tcMar>
               <w:top w:w="75" w:type="dxa"/>
               <w:bottom w:w="75" w:type="dxa"/>
@@ -1274,8 +1351,9 @@
             </w:pPr>
             <w:r>
               <w:rPr>
+                <w:rFonts w:ascii="Times New Roman" w:hAnsi="Times New Roman" w:eastAsia="宋体"/>
                 <w:b w:val="0"/>
-                <w:sz w:val="20"/>
+                <w:sz w:val="21"/>
               </w:rPr>
               <w:t>从实际激活时刻起持续四拍</w:t>
             </w:r>
@@ -1285,7 +1363,7 @@
           <w:tcPr>
             <w:tcW w:type="dxa" w:w="4025"/>
             <w:vAlign w:val="center"/>
-            <w:shd w:fill="F3F6F7"/>
+            <w:shd w:fill="FFFFFF"/>
             <w:tcMar>
               <w:top w:w="75" w:type="dxa"/>
               <w:bottom w:w="75" w:type="dxa"/>
@@ -1300,8 +1378,9 @@
             </w:pPr>
             <w:r>
               <w:rPr>
+                <w:rFonts w:ascii="Times New Roman" w:hAnsi="Times New Roman" w:eastAsia="宋体"/>
                 <w:b w:val="0"/>
-                <w:sz w:val="20"/>
+                <w:sz w:val="21"/>
               </w:rPr>
               <w:t>同高落桥后通常仍有时间观察或补救</w:t>
             </w:r>
@@ -1331,8 +1410,9 @@
             </w:pPr>
             <w:r>
               <w:rPr>
+                <w:rFonts w:ascii="Times New Roman" w:hAnsi="Times New Roman" w:eastAsia="宋体"/>
                 <w:b w:val="0"/>
-                <w:sz w:val="20"/>
+                <w:sz w:val="21"/>
               </w:rPr>
               <w:t>同高跳跃</w:t>
             </w:r>
@@ -1357,8 +1437,9 @@
             </w:pPr>
             <w:r>
               <w:rPr>
+                <w:rFonts w:ascii="Times New Roman" w:hAnsi="Times New Roman" w:eastAsia="宋体"/>
                 <w:b w:val="0"/>
-                <w:sz w:val="20"/>
+                <w:sz w:val="21"/>
               </w:rPr>
               <w:t>约两拍</w:t>
             </w:r>
@@ -1383,8 +1464,9 @@
             </w:pPr>
             <w:r>
               <w:rPr>
+                <w:rFonts w:ascii="Times New Roman" w:hAnsi="Times New Roman" w:eastAsia="宋体"/>
                 <w:b w:val="0"/>
-                <w:sz w:val="20"/>
+                <w:sz w:val="21"/>
               </w:rPr>
               <w:t>为起跳与落地提供可预判的间隔</w:t>
             </w:r>
@@ -1399,7 +1481,7 @@
           <w:tcPr>
             <w:tcW w:type="dxa" w:w="1757"/>
             <w:vAlign w:val="center"/>
-            <w:shd w:fill="F3F6F7"/>
+            <w:shd w:fill="FFFFFF"/>
             <w:tcMar>
               <w:top w:w="75" w:type="dxa"/>
               <w:bottom w:w="75" w:type="dxa"/>
@@ -1414,8 +1496,9 @@
             </w:pPr>
             <w:r>
               <w:rPr>
+                <w:rFonts w:ascii="Times New Roman" w:hAnsi="Times New Roman" w:eastAsia="宋体"/>
                 <w:b w:val="0"/>
-                <w:sz w:val="20"/>
+                <w:sz w:val="21"/>
               </w:rPr>
               <w:t>开场准备</w:t>
             </w:r>
@@ -1425,7 +1508,7 @@
           <w:tcPr>
             <w:tcW w:type="dxa" w:w="3515"/>
             <w:vAlign w:val="center"/>
-            <w:shd w:fill="F3F6F7"/>
+            <w:shd w:fill="FFFFFF"/>
             <w:tcMar>
               <w:top w:w="75" w:type="dxa"/>
               <w:bottom w:w="75" w:type="dxa"/>
@@ -1440,8 +1523,9 @@
             </w:pPr>
             <w:r>
               <w:rPr>
+                <w:rFonts w:ascii="Times New Roman" w:hAnsi="Times New Roman" w:eastAsia="宋体"/>
                 <w:b w:val="0"/>
-                <w:sz w:val="20"/>
+                <w:sz w:val="21"/>
               </w:rPr>
               <w:t>四拍</w:t>
             </w:r>
@@ -1451,7 +1535,7 @@
           <w:tcPr>
             <w:tcW w:type="dxa" w:w="4025"/>
             <w:vAlign w:val="center"/>
-            <w:shd w:fill="F3F6F7"/>
+            <w:shd w:fill="FFFFFF"/>
             <w:tcMar>
               <w:top w:w="75" w:type="dxa"/>
               <w:bottom w:w="75" w:type="dxa"/>
@@ -1466,8 +1550,9 @@
             </w:pPr>
             <w:r>
               <w:rPr>
+                <w:rFonts w:ascii="Times New Roman" w:hAnsi="Times New Roman" w:eastAsia="宋体"/>
                 <w:b w:val="0"/>
-                <w:sz w:val="20"/>
+                <w:sz w:val="21"/>
               </w:rPr>
               <w:t>先听见节奏，再开始移动</w:t>
             </w:r>
@@ -1486,6 +1571,9 @@
       </w:r>
     </w:p>
     <w:p>
+      <w:pPr>
+        <w:ind w:firstLine="480"/>
+      </w:pPr>
       <w:r>
         <w:rPr>
           <w:b w:val="0"/>
@@ -1511,6 +1599,9 @@
       </w:r>
     </w:p>
     <w:p>
+      <w:pPr>
+        <w:ind w:firstLine="480"/>
+      </w:pPr>
       <w:r>
         <w:rPr>
           <w:b w:val="0"/>
@@ -1519,6 +1610,9 @@
       </w:r>
     </w:p>
     <w:p>
+      <w:pPr>
+        <w:ind w:firstLine="480"/>
+      </w:pPr>
       <w:r>
         <w:rPr>
           <w:b w:val="0"/>
@@ -1535,6 +1629,9 @@
       </w:r>
     </w:p>
     <w:p>
+      <w:pPr>
+        <w:ind w:firstLine="480"/>
+      </w:pPr>
       <w:r>
         <w:rPr>
           <w:b w:val="0"/>
@@ -1543,6 +1640,9 @@
       </w:r>
     </w:p>
     <w:p>
+      <w:pPr>
+        <w:ind w:firstLine="480"/>
+      </w:pPr>
       <w:r>
         <w:rPr>
           <w:b w:val="0"/>
@@ -1559,6 +1659,9 @@
       </w:r>
     </w:p>
     <w:p>
+      <w:pPr>
+        <w:ind w:firstLine="480"/>
+      </w:pPr>
       <w:r>
         <w:rPr>
           <w:b w:val="0"/>
@@ -1567,6 +1670,9 @@
       </w:r>
     </w:p>
     <w:p>
+      <w:pPr>
+        <w:ind w:firstLine="480"/>
+      </w:pPr>
       <w:r>
         <w:rPr>
           <w:b w:val="0"/>
@@ -1575,6 +1681,9 @@
       </w:r>
     </w:p>
     <w:p>
+      <w:pPr>
+        <w:ind w:firstLine="480"/>
+      </w:pPr>
       <w:r>
         <w:rPr>
           <w:b w:val="0"/>
@@ -1591,6 +1700,9 @@
       </w:r>
     </w:p>
     <w:p>
+      <w:pPr>
+        <w:ind w:firstLine="480"/>
+      </w:pPr>
       <w:r>
         <w:rPr>
           <w:b w:val="0"/>
@@ -1599,6 +1711,9 @@
       </w:r>
     </w:p>
     <w:p>
+      <w:pPr>
+        <w:ind w:firstLine="480"/>
+      </w:pPr>
       <w:r>
         <w:rPr>
           <w:b w:val="0"/>
@@ -1616,6 +1731,9 @@
       </w:r>
     </w:p>
     <w:p>
+      <w:pPr>
+        <w:ind w:firstLine="480"/>
+      </w:pPr>
       <w:r>
         <w:rPr>
           <w:b w:val="0"/>
@@ -1703,7 +1821,7 @@
           <w:tcPr>
             <w:tcW w:type="dxa" w:w="1871"/>
             <w:vAlign w:val="center"/>
-            <w:shd w:fill="233C4A"/>
+            <w:shd w:fill="EDEDED"/>
             <w:tcMar>
               <w:top w:w="75" w:type="dxa"/>
               <w:bottom w:w="75" w:type="dxa"/>
@@ -1718,9 +1836,9 @@
             </w:pPr>
             <w:r>
               <w:rPr>
-                <w:b/>
-                <w:color w:val="FFFFFF"/>
-                <w:sz w:val="20"/>
+                <w:rFonts w:ascii="Times New Roman" w:hAnsi="Times New Roman" w:eastAsia="黑体"/>
+                <w:b w:val="0"/>
+                <w:sz w:val="21"/>
               </w:rPr>
               <w:t>房间</w:t>
             </w:r>
@@ -1730,7 +1848,7 @@
           <w:tcPr>
             <w:tcW w:type="dxa" w:w="1474"/>
             <w:vAlign w:val="center"/>
-            <w:shd w:fill="233C4A"/>
+            <w:shd w:fill="EDEDED"/>
             <w:tcMar>
               <w:top w:w="75" w:type="dxa"/>
               <w:bottom w:w="75" w:type="dxa"/>
@@ -1745,9 +1863,9 @@
             </w:pPr>
             <w:r>
               <w:rPr>
-                <w:b/>
-                <w:color w:val="FFFFFF"/>
-                <w:sz w:val="20"/>
+                <w:rFonts w:ascii="Times New Roman" w:hAnsi="Times New Roman" w:eastAsia="黑体"/>
+                <w:b w:val="0"/>
+                <w:sz w:val="21"/>
               </w:rPr>
               <w:t>场景宽度</w:t>
             </w:r>
@@ -1757,7 +1875,7 @@
           <w:tcPr>
             <w:tcW w:type="dxa" w:w="2608"/>
             <w:vAlign w:val="center"/>
-            <w:shd w:fill="233C4A"/>
+            <w:shd w:fill="EDEDED"/>
             <w:tcMar>
               <w:top w:w="75" w:type="dxa"/>
               <w:bottom w:w="75" w:type="dxa"/>
@@ -1772,9 +1890,9 @@
             </w:pPr>
             <w:r>
               <w:rPr>
-                <w:b/>
-                <w:color w:val="FFFFFF"/>
-                <w:sz w:val="20"/>
+                <w:rFonts w:ascii="Times New Roman" w:hAnsi="Times New Roman" w:eastAsia="黑体"/>
+                <w:b w:val="0"/>
+                <w:sz w:val="21"/>
               </w:rPr>
               <w:t>修复目标与危险</w:t>
             </w:r>
@@ -1784,7 +1902,7 @@
           <w:tcPr>
             <w:tcW w:type="dxa" w:w="3345"/>
             <w:vAlign w:val="center"/>
-            <w:shd w:fill="233C4A"/>
+            <w:shd w:fill="EDEDED"/>
             <w:tcMar>
               <w:top w:w="75" w:type="dxa"/>
               <w:bottom w:w="75" w:type="dxa"/>
@@ -1799,9 +1917,9 @@
             </w:pPr>
             <w:r>
               <w:rPr>
-                <w:b/>
-                <w:color w:val="FFFFFF"/>
-                <w:sz w:val="20"/>
+                <w:rFonts w:ascii="Times New Roman" w:hAnsi="Times New Roman" w:eastAsia="黑体"/>
+                <w:b w:val="0"/>
+                <w:sz w:val="21"/>
               </w:rPr>
               <w:t>主要学习内容</w:t>
             </w:r>
@@ -1831,8 +1949,9 @@
             </w:pPr>
             <w:r>
               <w:rPr>
+                <w:rFonts w:ascii="Times New Roman" w:hAnsi="Times New Roman" w:eastAsia="宋体"/>
                 <w:b w:val="0"/>
-                <w:sz w:val="20"/>
+                <w:sz w:val="21"/>
               </w:rPr>
               <w:t>唤醒余音</w:t>
             </w:r>
@@ -1857,8 +1976,9 @@
             </w:pPr>
             <w:r>
               <w:rPr>
+                <w:rFonts w:ascii="Times New Roman" w:hAnsi="Times New Roman" w:eastAsia="宋体"/>
                 <w:b w:val="0"/>
-                <w:sz w:val="20"/>
+                <w:sz w:val="21"/>
               </w:rPr>
               <w:t>约 2700 像素</w:t>
             </w:r>
@@ -1883,8 +2003,9 @@
             </w:pPr>
             <w:r>
               <w:rPr>
+                <w:rFonts w:ascii="Times New Roman" w:hAnsi="Times New Roman" w:eastAsia="宋体"/>
                 <w:b w:val="0"/>
-                <w:sz w:val="20"/>
+                <w:sz w:val="21"/>
               </w:rPr>
               <w:t>一座光桥，无激光</w:t>
             </w:r>
@@ -1909,8 +2030,9 @@
             </w:pPr>
             <w:r>
               <w:rPr>
+                <w:rFonts w:ascii="Times New Roman" w:hAnsi="Times New Roman" w:eastAsia="宋体"/>
                 <w:b w:val="0"/>
-                <w:sz w:val="20"/>
+                <w:sz w:val="21"/>
               </w:rPr>
               <w:t>从青桥出现到金桥固定的完整规则</w:t>
             </w:r>
@@ -1925,7 +2047,7 @@
           <w:tcPr>
             <w:tcW w:type="dxa" w:w="1871"/>
             <w:vAlign w:val="center"/>
-            <w:shd w:fill="F3F6F7"/>
+            <w:shd w:fill="FFFFFF"/>
             <w:tcMar>
               <w:top w:w="75" w:type="dxa"/>
               <w:bottom w:w="75" w:type="dxa"/>
@@ -1940,8 +2062,9 @@
             </w:pPr>
             <w:r>
               <w:rPr>
+                <w:rFonts w:ascii="Times New Roman" w:hAnsi="Times New Roman" w:eastAsia="宋体"/>
                 <w:b w:val="0"/>
-                <w:sz w:val="20"/>
+                <w:sz w:val="21"/>
               </w:rPr>
               <w:t>让光留下</w:t>
             </w:r>
@@ -1951,7 +2074,7 @@
           <w:tcPr>
             <w:tcW w:type="dxa" w:w="1474"/>
             <w:vAlign w:val="center"/>
-            <w:shd w:fill="F3F6F7"/>
+            <w:shd w:fill="FFFFFF"/>
             <w:tcMar>
               <w:top w:w="75" w:type="dxa"/>
               <w:bottom w:w="75" w:type="dxa"/>
@@ -1966,8 +2089,9 @@
             </w:pPr>
             <w:r>
               <w:rPr>
+                <w:rFonts w:ascii="Times New Roman" w:hAnsi="Times New Roman" w:eastAsia="宋体"/>
                 <w:b w:val="0"/>
-                <w:sz w:val="20"/>
+                <w:sz w:val="21"/>
               </w:rPr>
               <w:t>约 3000 像素</w:t>
             </w:r>
@@ -1977,7 +2101,7 @@
           <w:tcPr>
             <w:tcW w:type="dxa" w:w="2608"/>
             <w:vAlign w:val="center"/>
-            <w:shd w:fill="F3F6F7"/>
+            <w:shd w:fill="FFFFFF"/>
             <w:tcMar>
               <w:top w:w="75" w:type="dxa"/>
               <w:bottom w:w="75" w:type="dxa"/>
@@ -1992,8 +2116,9 @@
             </w:pPr>
             <w:r>
               <w:rPr>
+                <w:rFonts w:ascii="Times New Roman" w:hAnsi="Times New Roman" w:eastAsia="宋体"/>
                 <w:b w:val="0"/>
-                <w:sz w:val="20"/>
+                <w:sz w:val="21"/>
               </w:rPr>
               <w:t>一座光桥，两处激光</w:t>
             </w:r>
@@ -2003,7 +2128,7 @@
           <w:tcPr>
             <w:tcW w:type="dxa" w:w="3345"/>
             <w:vAlign w:val="center"/>
-            <w:shd w:fill="F3F6F7"/>
+            <w:shd w:fill="FFFFFF"/>
             <w:tcMar>
               <w:top w:w="75" w:type="dxa"/>
               <w:bottom w:w="75" w:type="dxa"/>
@@ -2018,8 +2143,9 @@
             </w:pPr>
             <w:r>
               <w:rPr>
+                <w:rFonts w:ascii="Times New Roman" w:hAnsi="Times New Roman" w:eastAsia="宋体"/>
                 <w:b w:val="0"/>
-                <w:sz w:val="20"/>
+                <w:sz w:val="21"/>
               </w:rPr>
               <w:t>区分预警与危险，选择通过时机</w:t>
             </w:r>
@@ -2049,8 +2175,9 @@
             </w:pPr>
             <w:r>
               <w:rPr>
+                <w:rFonts w:ascii="Times New Roman" w:hAnsi="Times New Roman" w:eastAsia="宋体"/>
                 <w:b w:val="0"/>
-                <w:sz w:val="20"/>
+                <w:sz w:val="21"/>
               </w:rPr>
               <w:t>接续回响</w:t>
             </w:r>
@@ -2075,8 +2202,9 @@
             </w:pPr>
             <w:r>
               <w:rPr>
+                <w:rFonts w:ascii="Times New Roman" w:hAnsi="Times New Roman" w:eastAsia="宋体"/>
                 <w:b w:val="0"/>
-                <w:sz w:val="20"/>
+                <w:sz w:val="21"/>
               </w:rPr>
               <w:t>约 3400 像素</w:t>
             </w:r>
@@ -2101,8 +2229,9 @@
             </w:pPr>
             <w:r>
               <w:rPr>
+                <w:rFonts w:ascii="Times New Roman" w:hAnsi="Times New Roman" w:eastAsia="宋体"/>
                 <w:b w:val="0"/>
-                <w:sz w:val="20"/>
+                <w:sz w:val="21"/>
               </w:rPr>
               <w:t>两座光桥，两处激光</w:t>
             </w:r>
@@ -2127,8 +2256,9 @@
             </w:pPr>
             <w:r>
               <w:rPr>
+                <w:rFonts w:ascii="Times New Roman" w:hAnsi="Times New Roman" w:eastAsia="宋体"/>
                 <w:b w:val="0"/>
-                <w:sz w:val="20"/>
+                <w:sz w:val="21"/>
               </w:rPr>
               <w:t>连续修复，并核对全部共鸣进度</w:t>
             </w:r>
@@ -2164,6 +2294,9 @@
       </w:r>
     </w:p>
     <w:p>
+      <w:pPr>
+        <w:ind w:firstLine="480"/>
+      </w:pPr>
       <w:r>
         <w:rPr>
           <w:b w:val="0"/>
@@ -2172,6 +2305,9 @@
       </w:r>
     </w:p>
     <w:p>
+      <w:pPr>
+        <w:ind w:firstLine="480"/>
+      </w:pPr>
       <w:r>
         <w:rPr>
           <w:b w:val="0"/>
@@ -2258,7 +2394,7 @@
           <w:tcPr>
             <w:tcW w:type="dxa" w:w="1814"/>
             <w:vAlign w:val="center"/>
-            <w:shd w:fill="233C4A"/>
+            <w:shd w:fill="EDEDED"/>
             <w:tcMar>
               <w:top w:w="75" w:type="dxa"/>
               <w:bottom w:w="75" w:type="dxa"/>
@@ -2273,9 +2409,9 @@
             </w:pPr>
             <w:r>
               <w:rPr>
-                <w:b/>
-                <w:color w:val="FFFFFF"/>
-                <w:sz w:val="20"/>
+                <w:rFonts w:ascii="Times New Roman" w:hAnsi="Times New Roman" w:eastAsia="黑体"/>
+                <w:b w:val="0"/>
+                <w:sz w:val="21"/>
               </w:rPr>
               <w:t>路线阶段</w:t>
             </w:r>
@@ -2285,7 +2421,7 @@
           <w:tcPr>
             <w:tcW w:type="dxa" w:w="3061"/>
             <w:vAlign w:val="center"/>
-            <w:shd w:fill="233C4A"/>
+            <w:shd w:fill="EDEDED"/>
             <w:tcMar>
               <w:top w:w="75" w:type="dxa"/>
               <w:bottom w:w="75" w:type="dxa"/>
@@ -2300,9 +2436,9 @@
             </w:pPr>
             <w:r>
               <w:rPr>
-                <w:b/>
-                <w:color w:val="FFFFFF"/>
-                <w:sz w:val="20"/>
+                <w:rFonts w:ascii="Times New Roman" w:hAnsi="Times New Roman" w:eastAsia="黑体"/>
+                <w:b w:val="0"/>
+                <w:sz w:val="21"/>
               </w:rPr>
               <w:t>玩家面对的问题</w:t>
             </w:r>
@@ -2312,7 +2448,7 @@
           <w:tcPr>
             <w:tcW w:type="dxa" w:w="4422"/>
             <w:vAlign w:val="center"/>
-            <w:shd w:fill="233C4A"/>
+            <w:shd w:fill="EDEDED"/>
             <w:tcMar>
               <w:top w:w="75" w:type="dxa"/>
               <w:bottom w:w="75" w:type="dxa"/>
@@ -2327,9 +2463,9 @@
             </w:pPr>
             <w:r>
               <w:rPr>
-                <w:b/>
-                <w:color w:val="FFFFFF"/>
-                <w:sz w:val="20"/>
+                <w:rFonts w:ascii="Times New Roman" w:hAnsi="Times New Roman" w:eastAsia="黑体"/>
+                <w:b w:val="0"/>
+                <w:sz w:val="21"/>
               </w:rPr>
               <w:t>设计安排</w:t>
             </w:r>
@@ -2359,8 +2495,9 @@
             </w:pPr>
             <w:r>
               <w:rPr>
+                <w:rFonts w:ascii="Times New Roman" w:hAnsi="Times New Roman" w:eastAsia="宋体"/>
                 <w:b w:val="0"/>
-                <w:sz w:val="20"/>
+                <w:sz w:val="21"/>
               </w:rPr>
               <w:t>到达断路前</w:t>
             </w:r>
@@ -2385,8 +2522,9 @@
             </w:pPr>
             <w:r>
               <w:rPr>
+                <w:rFonts w:ascii="Times New Roman" w:hAnsi="Times New Roman" w:eastAsia="宋体"/>
                 <w:b w:val="0"/>
-                <w:sz w:val="20"/>
+                <w:sz w:val="21"/>
               </w:rPr>
               <w:t>怎样移动，何时起跳</w:t>
             </w:r>
@@ -2411,8 +2549,9 @@
             </w:pPr>
             <w:r>
               <w:rPr>
+                <w:rFonts w:ascii="Times New Roman" w:hAnsi="Times New Roman" w:eastAsia="宋体"/>
                 <w:b w:val="0"/>
-                <w:sz w:val="20"/>
+                <w:sz w:val="21"/>
               </w:rPr>
               <w:t>先经过固定地面与高度变化</w:t>
             </w:r>
@@ -2427,7 +2566,7 @@
           <w:tcPr>
             <w:tcW w:type="dxa" w:w="1814"/>
             <w:vAlign w:val="center"/>
-            <w:shd w:fill="F3F6F7"/>
+            <w:shd w:fill="FFFFFF"/>
             <w:tcMar>
               <w:top w:w="75" w:type="dxa"/>
               <w:bottom w:w="75" w:type="dxa"/>
@@ -2442,8 +2581,9 @@
             </w:pPr>
             <w:r>
               <w:rPr>
+                <w:rFonts w:ascii="Times New Roman" w:hAnsi="Times New Roman" w:eastAsia="宋体"/>
                 <w:b w:val="0"/>
-                <w:sz w:val="20"/>
+                <w:sz w:val="21"/>
               </w:rPr>
               <w:t>尝试修桥</w:t>
             </w:r>
@@ -2453,7 +2593,7 @@
           <w:tcPr>
             <w:tcW w:type="dxa" w:w="3061"/>
             <w:vAlign w:val="center"/>
-            <w:shd w:fill="F3F6F7"/>
+            <w:shd w:fill="FFFFFF"/>
             <w:tcMar>
               <w:top w:w="75" w:type="dxa"/>
               <w:bottom w:w="75" w:type="dxa"/>
@@ -2468,8 +2608,9 @@
             </w:pPr>
             <w:r>
               <w:rPr>
+                <w:rFonts w:ascii="Times New Roman" w:hAnsi="Times New Roman" w:eastAsia="宋体"/>
                 <w:b w:val="0"/>
-                <w:sz w:val="20"/>
+                <w:sz w:val="21"/>
               </w:rPr>
               <w:t>青桥出现是否就算完成</w:t>
             </w:r>
@@ -2479,7 +2620,7 @@
           <w:tcPr>
             <w:tcW w:type="dxa" w:w="4422"/>
             <w:vAlign w:val="center"/>
-            <w:shd w:fill="F3F6F7"/>
+            <w:shd w:fill="FFFFFF"/>
             <w:tcMar>
               <w:top w:w="75" w:type="dxa"/>
               <w:bottom w:w="75" w:type="dxa"/>
@@ -2494,8 +2635,9 @@
             </w:pPr>
             <w:r>
               <w:rPr>
+                <w:rFonts w:ascii="Times New Roman" w:hAnsi="Times New Roman" w:eastAsia="宋体"/>
                 <w:b w:val="0"/>
-                <w:sz w:val="20"/>
+                <w:sz w:val="21"/>
               </w:rPr>
               <w:t>用金色变化与共鸣数量确认落拍结果</w:t>
             </w:r>
@@ -2525,8 +2667,9 @@
             </w:pPr>
             <w:r>
               <w:rPr>
+                <w:rFonts w:ascii="Times New Roman" w:hAnsi="Times New Roman" w:eastAsia="宋体"/>
                 <w:b w:val="0"/>
-                <w:sz w:val="20"/>
+                <w:sz w:val="21"/>
               </w:rPr>
               <w:t>修复后前进</w:t>
             </w:r>
@@ -2551,8 +2694,9 @@
             </w:pPr>
             <w:r>
               <w:rPr>
+                <w:rFonts w:ascii="Times New Roman" w:hAnsi="Times New Roman" w:eastAsia="宋体"/>
                 <w:b w:val="0"/>
-                <w:sz w:val="20"/>
+                <w:sz w:val="21"/>
               </w:rPr>
               <w:t>怎样确认能够离开</w:t>
             </w:r>
@@ -2577,8 +2721,9 @@
             </w:pPr>
             <w:r>
               <w:rPr>
+                <w:rFonts w:ascii="Times New Roman" w:hAnsi="Times New Roman" w:eastAsia="宋体"/>
                 <w:b w:val="0"/>
-                <w:sz w:val="20"/>
+                <w:sz w:val="21"/>
               </w:rPr>
               <w:t>稳定桥面与较长安全路段用于整理位置</w:t>
             </w:r>
@@ -2597,6 +2742,9 @@
       </w:r>
     </w:p>
     <w:p>
+      <w:pPr>
+        <w:ind w:firstLine="480"/>
+      </w:pPr>
       <w:r>
         <w:rPr>
           <w:b w:val="0"/>
@@ -2622,6 +2770,9 @@
       </w:r>
     </w:p>
     <w:p>
+      <w:pPr>
+        <w:ind w:firstLine="480"/>
+      </w:pPr>
       <w:r>
         <w:rPr>
           <w:b w:val="0"/>
@@ -2630,6 +2781,9 @@
       </w:r>
     </w:p>
     <w:p>
+      <w:pPr>
+        <w:ind w:firstLine="480"/>
+      </w:pPr>
       <w:r>
         <w:rPr>
           <w:b w:val="0"/>
@@ -2755,6 +2909,9 @@
       </w:r>
     </w:p>
     <w:p>
+      <w:pPr>
+        <w:ind w:firstLine="480"/>
+      </w:pPr>
       <w:r>
         <w:rPr>
           <w:b w:val="0"/>
@@ -2763,6 +2920,9 @@
       </w:r>
     </w:p>
     <w:p>
+      <w:pPr>
+        <w:ind w:firstLine="480"/>
+      </w:pPr>
       <w:r>
         <w:rPr>
           <w:b w:val="0"/>
@@ -2880,6 +3040,9 @@
       </w:r>
     </w:p>
     <w:p>
+      <w:pPr>
+        <w:ind w:firstLine="480"/>
+      </w:pPr>
       <w:r>
         <w:rPr>
           <w:b w:val="0"/>
@@ -2888,6 +3051,9 @@
       </w:r>
     </w:p>
     <w:p>
+      <w:pPr>
+        <w:ind w:firstLine="480"/>
+      </w:pPr>
       <w:r>
         <w:rPr>
           <w:b w:val="0"/>
@@ -2896,6 +3062,9 @@
       </w:r>
     </w:p>
     <w:p>
+      <w:pPr>
+        <w:ind w:firstLine="480"/>
+      </w:pPr>
       <w:r>
         <w:rPr>
           <w:b w:val="0"/>
@@ -2932,7 +3101,7 @@
           <w:tcPr>
             <w:tcW w:type="dxa" w:w="2041"/>
             <w:vAlign w:val="center"/>
-            <w:shd w:fill="233C4A"/>
+            <w:shd w:fill="EDEDED"/>
             <w:tcMar>
               <w:top w:w="75" w:type="dxa"/>
               <w:bottom w:w="75" w:type="dxa"/>
@@ -2947,9 +3116,9 @@
             </w:pPr>
             <w:r>
               <w:rPr>
-                <w:b/>
-                <w:color w:val="FFFFFF"/>
-                <w:sz w:val="20"/>
+                <w:rFonts w:ascii="Times New Roman" w:hAnsi="Times New Roman" w:eastAsia="黑体"/>
+                <w:b w:val="0"/>
+                <w:sz w:val="21"/>
               </w:rPr>
               <w:t>画面对象</w:t>
             </w:r>
@@ -2959,7 +3128,7 @@
           <w:tcPr>
             <w:tcW w:type="dxa" w:w="3118"/>
             <w:vAlign w:val="center"/>
-            <w:shd w:fill="233C4A"/>
+            <w:shd w:fill="EDEDED"/>
             <w:tcMar>
               <w:top w:w="75" w:type="dxa"/>
               <w:bottom w:w="75" w:type="dxa"/>
@@ -2974,9 +3143,9 @@
             </w:pPr>
             <w:r>
               <w:rPr>
-                <w:b/>
-                <w:color w:val="FFFFFF"/>
-                <w:sz w:val="20"/>
+                <w:rFonts w:ascii="Times New Roman" w:hAnsi="Times New Roman" w:eastAsia="黑体"/>
+                <w:b w:val="0"/>
+                <w:sz w:val="21"/>
               </w:rPr>
               <w:t>视觉表现</w:t>
             </w:r>
@@ -2986,7 +3155,7 @@
           <w:tcPr>
             <w:tcW w:type="dxa" w:w="4139"/>
             <w:vAlign w:val="center"/>
-            <w:shd w:fill="233C4A"/>
+            <w:shd w:fill="EDEDED"/>
             <w:tcMar>
               <w:top w:w="75" w:type="dxa"/>
               <w:bottom w:w="75" w:type="dxa"/>
@@ -3001,9 +3170,9 @@
             </w:pPr>
             <w:r>
               <w:rPr>
-                <w:b/>
-                <w:color w:val="FFFFFF"/>
-                <w:sz w:val="20"/>
+                <w:rFonts w:ascii="Times New Roman" w:hAnsi="Times New Roman" w:eastAsia="黑体"/>
+                <w:b w:val="0"/>
+                <w:sz w:val="21"/>
               </w:rPr>
               <w:t>所传达的信息</w:t>
             </w:r>
@@ -3033,8 +3202,9 @@
             </w:pPr>
             <w:r>
               <w:rPr>
+                <w:rFonts w:ascii="Times New Roman" w:hAnsi="Times New Roman" w:eastAsia="宋体"/>
                 <w:b w:val="0"/>
-                <w:sz w:val="20"/>
+                <w:sz w:val="21"/>
               </w:rPr>
               <w:t>未激活光桥</w:t>
             </w:r>
@@ -3059,8 +3229,9 @@
             </w:pPr>
             <w:r>
               <w:rPr>
+                <w:rFonts w:ascii="Times New Roman" w:hAnsi="Times New Roman" w:eastAsia="宋体"/>
                 <w:b w:val="0"/>
-                <w:sz w:val="20"/>
+                <w:sz w:val="21"/>
               </w:rPr>
               <w:t>断隙中的虚线轮廓</w:t>
             </w:r>
@@ -3085,8 +3256,9 @@
             </w:pPr>
             <w:r>
               <w:rPr>
+                <w:rFonts w:ascii="Times New Roman" w:hAnsi="Times New Roman" w:eastAsia="宋体"/>
                 <w:b w:val="0"/>
-                <w:sz w:val="20"/>
+                <w:sz w:val="21"/>
               </w:rPr>
               <w:t>此处存在待修复目标</w:t>
             </w:r>
@@ -3101,7 +3273,7 @@
           <w:tcPr>
             <w:tcW w:type="dxa" w:w="2041"/>
             <w:vAlign w:val="center"/>
-            <w:shd w:fill="F3F6F7"/>
+            <w:shd w:fill="FFFFFF"/>
             <w:tcMar>
               <w:top w:w="75" w:type="dxa"/>
               <w:bottom w:w="75" w:type="dxa"/>
@@ -3116,8 +3288,9 @@
             </w:pPr>
             <w:r>
               <w:rPr>
+                <w:rFonts w:ascii="Times New Roman" w:hAnsi="Times New Roman" w:eastAsia="宋体"/>
                 <w:b w:val="0"/>
-                <w:sz w:val="20"/>
+                <w:sz w:val="21"/>
               </w:rPr>
               <w:t>临时光桥</w:t>
             </w:r>
@@ -3127,7 +3300,7 @@
           <w:tcPr>
             <w:tcW w:type="dxa" w:w="3118"/>
             <w:vAlign w:val="center"/>
-            <w:shd w:fill="F3F6F7"/>
+            <w:shd w:fill="FFFFFF"/>
             <w:tcMar>
               <w:top w:w="75" w:type="dxa"/>
               <w:bottom w:w="75" w:type="dxa"/>
@@ -3142,8 +3315,9 @@
             </w:pPr>
             <w:r>
               <w:rPr>
+                <w:rFonts w:ascii="Times New Roman" w:hAnsi="Times New Roman" w:eastAsia="宋体"/>
                 <w:b w:val="0"/>
-                <w:sz w:val="20"/>
+                <w:sz w:val="21"/>
               </w:rPr>
               <w:t>青色实体，末拍闪烁</w:t>
             </w:r>
@@ -3153,7 +3327,7 @@
           <w:tcPr>
             <w:tcW w:type="dxa" w:w="4139"/>
             <w:vAlign w:val="center"/>
-            <w:shd w:fill="F3F6F7"/>
+            <w:shd w:fill="FFFFFF"/>
             <w:tcMar>
               <w:top w:w="75" w:type="dxa"/>
               <w:bottom w:w="75" w:type="dxa"/>
@@ -3168,8 +3342,9 @@
             </w:pPr>
             <w:r>
               <w:rPr>
+                <w:rFonts w:ascii="Times New Roman" w:hAnsi="Times New Roman" w:eastAsia="宋体"/>
                 <w:b w:val="0"/>
-                <w:sz w:val="20"/>
+                <w:sz w:val="21"/>
               </w:rPr>
               <w:t>现在可站立，但尚未稳定</w:t>
             </w:r>
@@ -3199,8 +3374,9 @@
             </w:pPr>
             <w:r>
               <w:rPr>
+                <w:rFonts w:ascii="Times New Roman" w:hAnsi="Times New Roman" w:eastAsia="宋体"/>
                 <w:b w:val="0"/>
-                <w:sz w:val="20"/>
+                <w:sz w:val="21"/>
               </w:rPr>
               <w:t>固定光桥</w:t>
             </w:r>
@@ -3225,8 +3401,9 @@
             </w:pPr>
             <w:r>
               <w:rPr>
+                <w:rFonts w:ascii="Times New Roman" w:hAnsi="Times New Roman" w:eastAsia="宋体"/>
                 <w:b w:val="0"/>
-                <w:sz w:val="20"/>
+                <w:sz w:val="21"/>
               </w:rPr>
               <w:t>金色桥面与共鸣标记</w:t>
             </w:r>
@@ -3251,8 +3428,9 @@
             </w:pPr>
             <w:r>
               <w:rPr>
+                <w:rFonts w:ascii="Times New Roman" w:hAnsi="Times New Roman" w:eastAsia="宋体"/>
                 <w:b w:val="0"/>
-                <w:sz w:val="20"/>
+                <w:sz w:val="21"/>
               </w:rPr>
               <w:t>当前尝试已完成该目标</w:t>
             </w:r>
@@ -3267,7 +3445,7 @@
           <w:tcPr>
             <w:tcW w:type="dxa" w:w="2041"/>
             <w:vAlign w:val="center"/>
-            <w:shd w:fill="F3F6F7"/>
+            <w:shd w:fill="FFFFFF"/>
             <w:tcMar>
               <w:top w:w="75" w:type="dxa"/>
               <w:bottom w:w="75" w:type="dxa"/>
@@ -3282,8 +3460,9 @@
             </w:pPr>
             <w:r>
               <w:rPr>
+                <w:rFonts w:ascii="Times New Roman" w:hAnsi="Times New Roman" w:eastAsia="宋体"/>
                 <w:b w:val="0"/>
-                <w:sz w:val="20"/>
+                <w:sz w:val="21"/>
               </w:rPr>
               <w:t>激光预警／危险</w:t>
             </w:r>
@@ -3293,7 +3472,7 @@
           <w:tcPr>
             <w:tcW w:type="dxa" w:w="3118"/>
             <w:vAlign w:val="center"/>
-            <w:shd w:fill="F3F6F7"/>
+            <w:shd w:fill="FFFFFF"/>
             <w:tcMar>
               <w:top w:w="75" w:type="dxa"/>
               <w:bottom w:w="75" w:type="dxa"/>
@@ -3308,8 +3487,9 @@
             </w:pPr>
             <w:r>
               <w:rPr>
+                <w:rFonts w:ascii="Times New Roman" w:hAnsi="Times New Roman" w:eastAsia="宋体"/>
                 <w:b w:val="0"/>
-                <w:sz w:val="20"/>
+                <w:sz w:val="21"/>
               </w:rPr>
               <w:t>金色虚线／亮色实体光束</w:t>
             </w:r>
@@ -3319,7 +3499,7 @@
           <w:tcPr>
             <w:tcW w:type="dxa" w:w="4139"/>
             <w:vAlign w:val="center"/>
-            <w:shd w:fill="F3F6F7"/>
+            <w:shd w:fill="FFFFFF"/>
             <w:tcMar>
               <w:top w:w="75" w:type="dxa"/>
               <w:bottom w:w="75" w:type="dxa"/>
@@ -3334,8 +3514,9 @@
             </w:pPr>
             <w:r>
               <w:rPr>
+                <w:rFonts w:ascii="Times New Roman" w:hAnsi="Times New Roman" w:eastAsia="宋体"/>
                 <w:b w:val="0"/>
-                <w:sz w:val="20"/>
+                <w:sz w:val="21"/>
               </w:rPr>
               <w:t>区分可观察阶段与伤害阶段</w:t>
             </w:r>
@@ -3365,8 +3546,9 @@
             </w:pPr>
             <w:r>
               <w:rPr>
+                <w:rFonts w:ascii="Times New Roman" w:hAnsi="Times New Roman" w:eastAsia="宋体"/>
                 <w:b w:val="0"/>
-                <w:sz w:val="20"/>
+                <w:sz w:val="21"/>
               </w:rPr>
               <w:t>角色光环、底部拍灯</w:t>
             </w:r>
@@ -3391,8 +3573,9 @@
             </w:pPr>
             <w:r>
               <w:rPr>
+                <w:rFonts w:ascii="Times New Roman" w:hAnsi="Times New Roman" w:eastAsia="宋体"/>
                 <w:b w:val="0"/>
-                <w:sz w:val="20"/>
+                <w:sz w:val="21"/>
               </w:rPr>
               <w:t>持续收缩与四拍循环</w:t>
             </w:r>
@@ -3417,8 +3600,9 @@
             </w:pPr>
             <w:r>
               <w:rPr>
+                <w:rFonts w:ascii="Times New Roman" w:hAnsi="Times New Roman" w:eastAsia="宋体"/>
                 <w:b w:val="0"/>
-                <w:sz w:val="20"/>
+                <w:sz w:val="21"/>
               </w:rPr>
               <w:t>提供声音之外的节拍参照</w:t>
             </w:r>
@@ -3445,6 +3629,9 @@
       </w:r>
     </w:p>
     <w:p>
+      <w:pPr>
+        <w:ind w:firstLine="480"/>
+      </w:pPr>
       <w:r>
         <w:rPr>
           <w:b w:val="0"/>
@@ -3453,6 +3640,9 @@
       </w:r>
     </w:p>
     <w:p>
+      <w:pPr>
+        <w:ind w:firstLine="480"/>
+      </w:pPr>
       <w:r>
         <w:rPr>
           <w:b w:val="0"/>
@@ -3470,6 +3660,9 @@
       </w:r>
     </w:p>
     <w:p>
+      <w:pPr>
+        <w:ind w:firstLine="480"/>
+      </w:pPr>
       <w:r>
         <w:rPr>
           <w:b w:val="0"/>
@@ -3478,6 +3671,9 @@
       </w:r>
     </w:p>
     <w:p>
+      <w:pPr>
+        <w:ind w:firstLine="480"/>
+      </w:pPr>
       <w:r>
         <w:rPr>
           <w:b w:val="0"/>
@@ -3486,6 +3682,9 @@
       </w:r>
     </w:p>
     <w:p>
+      <w:pPr>
+        <w:ind w:firstLine="480"/>
+      </w:pPr>
       <w:r>
         <w:rPr>
           <w:b w:val="0"/>
@@ -3571,7 +3770,7 @@
           <w:tcPr>
             <w:tcW w:type="dxa" w:w="3005"/>
             <w:vAlign w:val="center"/>
-            <w:shd w:fill="233C4A"/>
+            <w:shd w:fill="EDEDED"/>
             <w:tcMar>
               <w:top w:w="75" w:type="dxa"/>
               <w:bottom w:w="75" w:type="dxa"/>
@@ -3586,9 +3785,9 @@
             </w:pPr>
             <w:r>
               <w:rPr>
-                <w:b/>
-                <w:color w:val="FFFFFF"/>
-                <w:sz w:val="20"/>
+                <w:rFonts w:ascii="Times New Roman" w:hAnsi="Times New Roman" w:eastAsia="黑体"/>
+                <w:b w:val="0"/>
+                <w:sz w:val="21"/>
               </w:rPr>
               <w:t>声音与时间项目</w:t>
             </w:r>
@@ -3598,7 +3797,7 @@
           <w:tcPr>
             <w:tcW w:type="dxa" w:w="6293"/>
             <w:vAlign w:val="center"/>
-            <w:shd w:fill="233C4A"/>
+            <w:shd w:fill="EDEDED"/>
             <w:tcMar>
               <w:top w:w="75" w:type="dxa"/>
               <w:bottom w:w="75" w:type="dxa"/>
@@ -3613,9 +3812,9 @@
             </w:pPr>
             <w:r>
               <w:rPr>
-                <w:b/>
-                <w:color w:val="FFFFFF"/>
-                <w:sz w:val="20"/>
+                <w:rFonts w:ascii="Times New Roman" w:hAnsi="Times New Roman" w:eastAsia="黑体"/>
+                <w:b w:val="0"/>
+                <w:sz w:val="21"/>
               </w:rPr>
               <w:t>当前值</w:t>
             </w:r>
@@ -3645,8 +3844,9 @@
             </w:pPr>
             <w:r>
               <w:rPr>
+                <w:rFonts w:ascii="Times New Roman" w:hAnsi="Times New Roman" w:eastAsia="宋体"/>
                 <w:b w:val="0"/>
-                <w:sz w:val="20"/>
+                <w:sz w:val="21"/>
               </w:rPr>
               <w:t>音轨速度与长度</w:t>
             </w:r>
@@ -3671,8 +3871,9 @@
             </w:pPr>
             <w:r>
               <w:rPr>
+                <w:rFonts w:ascii="Times New Roman" w:hAnsi="Times New Roman" w:eastAsia="宋体"/>
                 <w:b w:val="0"/>
-                <w:sz w:val="20"/>
+                <w:sz w:val="21"/>
               </w:rPr>
               <w:t>120 BPM；16秒；32拍循环</w:t>
             </w:r>
@@ -3687,7 +3888,7 @@
           <w:tcPr>
             <w:tcW w:type="dxa" w:w="3005"/>
             <w:vAlign w:val="center"/>
-            <w:shd w:fill="F3F6F7"/>
+            <w:shd w:fill="FFFFFF"/>
             <w:tcMar>
               <w:top w:w="75" w:type="dxa"/>
               <w:bottom w:w="75" w:type="dxa"/>
@@ -3702,8 +3903,9 @@
             </w:pPr>
             <w:r>
               <w:rPr>
+                <w:rFonts w:ascii="Times New Roman" w:hAnsi="Times New Roman" w:eastAsia="宋体"/>
                 <w:b w:val="0"/>
-                <w:sz w:val="20"/>
+                <w:sz w:val="21"/>
               </w:rPr>
               <w:t>保存格式</w:t>
             </w:r>
@@ -3713,7 +3915,7 @@
           <w:tcPr>
             <w:tcW w:type="dxa" w:w="6293"/>
             <w:vAlign w:val="center"/>
-            <w:shd w:fill="F3F6F7"/>
+            <w:shd w:fill="FFFFFF"/>
             <w:tcMar>
               <w:top w:w="75" w:type="dxa"/>
               <w:bottom w:w="75" w:type="dxa"/>
@@ -3728,8 +3930,9 @@
             </w:pPr>
             <w:r>
               <w:rPr>
+                <w:rFonts w:ascii="Times New Roman" w:hAnsi="Times New Roman" w:eastAsia="宋体"/>
                 <w:b w:val="0"/>
-                <w:sz w:val="20"/>
+                <w:sz w:val="21"/>
               </w:rPr>
               <w:t>44.1 kHz；单声道；16位PCM WAV</w:t>
             </w:r>
@@ -3759,8 +3962,9 @@
             </w:pPr>
             <w:r>
               <w:rPr>
+                <w:rFonts w:ascii="Times New Roman" w:hAnsi="Times New Roman" w:eastAsia="宋体"/>
                 <w:b w:val="0"/>
-                <w:sz w:val="20"/>
+                <w:sz w:val="21"/>
               </w:rPr>
               <w:t>判定校准范围</w:t>
             </w:r>
@@ -3785,8 +3989,9 @@
             </w:pPr>
             <w:r>
               <w:rPr>
+                <w:rFonts w:ascii="Times New Roman" w:hAnsi="Times New Roman" w:eastAsia="宋体"/>
                 <w:b w:val="0"/>
-                <w:sz w:val="20"/>
+                <w:sz w:val="21"/>
               </w:rPr>
               <w:t>−250至+250毫秒，每次调整10毫秒</w:t>
             </w:r>
@@ -3801,7 +4006,7 @@
           <w:tcPr>
             <w:tcW w:type="dxa" w:w="3005"/>
             <w:vAlign w:val="center"/>
-            <w:shd w:fill="F3F6F7"/>
+            <w:shd w:fill="FFFFFF"/>
             <w:tcMar>
               <w:top w:w="75" w:type="dxa"/>
               <w:bottom w:w="75" w:type="dxa"/>
@@ -3816,8 +4021,9 @@
             </w:pPr>
             <w:r>
               <w:rPr>
+                <w:rFonts w:ascii="Times New Roman" w:hAnsi="Times New Roman" w:eastAsia="宋体"/>
                 <w:b w:val="0"/>
-                <w:sz w:val="20"/>
+                <w:sz w:val="21"/>
               </w:rPr>
               <w:t>声音资源范围</w:t>
             </w:r>
@@ -3827,7 +4033,7 @@
           <w:tcPr>
             <w:tcW w:type="dxa" w:w="6293"/>
             <w:vAlign w:val="center"/>
-            <w:shd w:fill="F3F6F7"/>
+            <w:shd w:fill="FFFFFF"/>
             <w:tcMar>
               <w:top w:w="75" w:type="dxa"/>
               <w:bottom w:w="75" w:type="dxa"/>
@@ -3842,8 +4048,9 @@
             </w:pPr>
             <w:r>
               <w:rPr>
+                <w:rFonts w:ascii="Times New Roman" w:hAnsi="Times New Roman" w:eastAsia="宋体"/>
                 <w:b w:val="0"/>
-                <w:sz w:val="20"/>
+                <w:sz w:val="21"/>
               </w:rPr>
               <w:t>循环配乐已接入；独立事件音效待补</w:t>
             </w:r>
@@ -3871,6 +4078,9 @@
       </w:r>
     </w:p>
     <w:p>
+      <w:pPr>
+        <w:ind w:firstLine="480"/>
+      </w:pPr>
       <w:r>
         <w:rPr>
           <w:b w:val="0"/>
@@ -3879,6 +4089,9 @@
       </w:r>
     </w:p>
     <w:p>
+      <w:pPr>
+        <w:ind w:firstLine="480"/>
+      </w:pPr>
       <w:r>
         <w:rPr>
           <w:b w:val="0"/>
@@ -3887,6 +4100,9 @@
       </w:r>
     </w:p>
     <w:p>
+      <w:pPr>
+        <w:ind w:firstLine="480"/>
+      </w:pPr>
       <w:r>
         <w:rPr>
           <w:b w:val="0"/>
@@ -3972,7 +4188,7 @@
           <w:tcPr>
             <w:tcW w:type="dxa" w:w="4139"/>
             <w:vAlign w:val="center"/>
-            <w:shd w:fill="233C4A"/>
+            <w:shd w:fill="EDEDED"/>
             <w:tcMar>
               <w:top w:w="75" w:type="dxa"/>
               <w:bottom w:w="75" w:type="dxa"/>
@@ -3987,9 +4203,9 @@
             </w:pPr>
             <w:r>
               <w:rPr>
-                <w:b/>
-                <w:color w:val="FFFFFF"/>
-                <w:sz w:val="20"/>
+                <w:rFonts w:ascii="Times New Roman" w:hAnsi="Times New Roman" w:eastAsia="黑体"/>
+                <w:b w:val="0"/>
+                <w:sz w:val="21"/>
               </w:rPr>
               <w:t>常用操作</w:t>
             </w:r>
@@ -3999,7 +4215,7 @@
           <w:tcPr>
             <w:tcW w:type="dxa" w:w="5159"/>
             <w:vAlign w:val="center"/>
-            <w:shd w:fill="233C4A"/>
+            <w:shd w:fill="EDEDED"/>
             <w:tcMar>
               <w:top w:w="75" w:type="dxa"/>
               <w:bottom w:w="75" w:type="dxa"/>
@@ -4014,9 +4230,9 @@
             </w:pPr>
             <w:r>
               <w:rPr>
-                <w:b/>
-                <w:color w:val="FFFFFF"/>
-                <w:sz w:val="20"/>
+                <w:rFonts w:ascii="Times New Roman" w:hAnsi="Times New Roman" w:eastAsia="黑体"/>
+                <w:b w:val="0"/>
+                <w:sz w:val="21"/>
               </w:rPr>
               <w:t>按键</w:t>
             </w:r>
@@ -4046,8 +4262,9 @@
             </w:pPr>
             <w:r>
               <w:rPr>
+                <w:rFonts w:ascii="Times New Roman" w:hAnsi="Times New Roman" w:eastAsia="宋体"/>
                 <w:b w:val="0"/>
-                <w:sz w:val="20"/>
+                <w:sz w:val="21"/>
               </w:rPr>
               <w:t>左右移动</w:t>
             </w:r>
@@ -4072,8 +4289,9 @@
             </w:pPr>
             <w:r>
               <w:rPr>
+                <w:rFonts w:ascii="Times New Roman" w:hAnsi="Times New Roman" w:eastAsia="宋体"/>
                 <w:b w:val="0"/>
-                <w:sz w:val="20"/>
+                <w:sz w:val="21"/>
               </w:rPr>
               <w:t>A／D 或方向键</w:t>
             </w:r>
@@ -4088,7 +4306,7 @@
           <w:tcPr>
             <w:tcW w:type="dxa" w:w="4139"/>
             <w:vAlign w:val="center"/>
-            <w:shd w:fill="F3F6F7"/>
+            <w:shd w:fill="FFFFFF"/>
             <w:tcMar>
               <w:top w:w="75" w:type="dxa"/>
               <w:bottom w:w="75" w:type="dxa"/>
@@ -4103,8 +4321,9 @@
             </w:pPr>
             <w:r>
               <w:rPr>
+                <w:rFonts w:ascii="Times New Roman" w:hAnsi="Times New Roman" w:eastAsia="宋体"/>
                 <w:b w:val="0"/>
-                <w:sz w:val="20"/>
+                <w:sz w:val="21"/>
               </w:rPr>
               <w:t>地面起跳</w:t>
             </w:r>
@@ -4114,7 +4333,7 @@
           <w:tcPr>
             <w:tcW w:type="dxa" w:w="5159"/>
             <w:vAlign w:val="center"/>
-            <w:shd w:fill="F3F6F7"/>
+            <w:shd w:fill="FFFFFF"/>
             <w:tcMar>
               <w:top w:w="75" w:type="dxa"/>
               <w:bottom w:w="75" w:type="dxa"/>
@@ -4129,8 +4348,9 @@
             </w:pPr>
             <w:r>
               <w:rPr>
+                <w:rFonts w:ascii="Times New Roman" w:hAnsi="Times New Roman" w:eastAsia="宋体"/>
                 <w:b w:val="0"/>
-                <w:sz w:val="20"/>
+                <w:sz w:val="21"/>
               </w:rPr>
               <w:t>空格、W 或 ↑</w:t>
             </w:r>
@@ -4160,8 +4380,9 @@
             </w:pPr>
             <w:r>
               <w:rPr>
+                <w:rFonts w:ascii="Times New Roman" w:hAnsi="Times New Roman" w:eastAsia="宋体"/>
                 <w:b w:val="0"/>
-                <w:sz w:val="20"/>
+                <w:sz w:val="21"/>
               </w:rPr>
               <w:t>开始、重试、进入下一间</w:t>
             </w:r>
@@ -4186,8 +4407,9 @@
             </w:pPr>
             <w:r>
               <w:rPr>
+                <w:rFonts w:ascii="Times New Roman" w:hAnsi="Times New Roman" w:eastAsia="宋体"/>
                 <w:b w:val="0"/>
-                <w:sz w:val="20"/>
+                <w:sz w:val="21"/>
               </w:rPr>
               <w:t>Enter，随页面变化</w:t>
             </w:r>
@@ -4202,7 +4424,7 @@
           <w:tcPr>
             <w:tcW w:type="dxa" w:w="4139"/>
             <w:vAlign w:val="center"/>
-            <w:shd w:fill="F3F6F7"/>
+            <w:shd w:fill="FFFFFF"/>
             <w:tcMar>
               <w:top w:w="75" w:type="dxa"/>
               <w:bottom w:w="75" w:type="dxa"/>
@@ -4217,8 +4439,9 @@
             </w:pPr>
             <w:r>
               <w:rPr>
+                <w:rFonts w:ascii="Times New Roman" w:hAnsi="Times New Roman" w:eastAsia="宋体"/>
                 <w:b w:val="0"/>
-                <w:sz w:val="20"/>
+                <w:sz w:val="21"/>
               </w:rPr>
               <w:t>暂停与继续／重开当前房间</w:t>
             </w:r>
@@ -4228,7 +4451,7 @@
           <w:tcPr>
             <w:tcW w:type="dxa" w:w="5159"/>
             <w:vAlign w:val="center"/>
-            <w:shd w:fill="F3F6F7"/>
+            <w:shd w:fill="FFFFFF"/>
             <w:tcMar>
               <w:top w:w="75" w:type="dxa"/>
               <w:bottom w:w="75" w:type="dxa"/>
@@ -4243,8 +4466,9 @@
             </w:pPr>
             <w:r>
               <w:rPr>
+                <w:rFonts w:ascii="Times New Roman" w:hAnsi="Times New Roman" w:eastAsia="宋体"/>
                 <w:b w:val="0"/>
-                <w:sz w:val="20"/>
+                <w:sz w:val="21"/>
               </w:rPr>
               <w:t>Esc／R</w:t>
             </w:r>
@@ -4274,8 +4498,9 @@
             </w:pPr>
             <w:r>
               <w:rPr>
+                <w:rFonts w:ascii="Times New Roman" w:hAnsi="Times New Roman" w:eastAsia="宋体"/>
                 <w:b w:val="0"/>
-                <w:sz w:val="20"/>
+                <w:sz w:val="21"/>
               </w:rPr>
               <w:t>调整判定校准／音乐开关</w:t>
             </w:r>
@@ -4300,8 +4525,9 @@
             </w:pPr>
             <w:r>
               <w:rPr>
+                <w:rFonts w:ascii="Times New Roman" w:hAnsi="Times New Roman" w:eastAsia="宋体"/>
                 <w:b w:val="0"/>
-                <w:sz w:val="20"/>
+                <w:sz w:val="21"/>
               </w:rPr>
               <w:t>[ 与 ]／M</w:t>
             </w:r>
@@ -4329,6 +4555,9 @@
       </w:r>
     </w:p>
     <w:p>
+      <w:pPr>
+        <w:ind w:firstLine="480"/>
+      </w:pPr>
       <w:r>
         <w:rPr>
           <w:b w:val="0"/>
@@ -4337,6 +4566,9 @@
       </w:r>
     </w:p>
     <w:p>
+      <w:pPr>
+        <w:ind w:firstLine="480"/>
+      </w:pPr>
       <w:r>
         <w:rPr>
           <w:b w:val="0"/>
@@ -4404,6 +4636,9 @@
       </w:r>
     </w:p>
     <w:p>
+      <w:pPr>
+        <w:ind w:firstLine="480"/>
+      </w:pPr>
       <w:r>
         <w:rPr>
           <w:b w:val="0"/>
@@ -4439,7 +4674,7 @@
           <w:tcPr>
             <w:tcW w:type="dxa" w:w="2665"/>
             <w:vAlign w:val="center"/>
-            <w:shd w:fill="233C4A"/>
+            <w:shd w:fill="EDEDED"/>
             <w:tcMar>
               <w:top w:w="75" w:type="dxa"/>
               <w:bottom w:w="75" w:type="dxa"/>
@@ -4454,9 +4689,9 @@
             </w:pPr>
             <w:r>
               <w:rPr>
-                <w:b/>
-                <w:color w:val="FFFFFF"/>
-                <w:sz w:val="20"/>
+                <w:rFonts w:ascii="Times New Roman" w:hAnsi="Times New Roman" w:eastAsia="黑体"/>
+                <w:b w:val="0"/>
+                <w:sz w:val="21"/>
               </w:rPr>
               <w:t>模块</w:t>
             </w:r>
@@ -4466,7 +4701,7 @@
           <w:tcPr>
             <w:tcW w:type="dxa" w:w="6633"/>
             <w:vAlign w:val="center"/>
-            <w:shd w:fill="233C4A"/>
+            <w:shd w:fill="EDEDED"/>
             <w:tcMar>
               <w:top w:w="75" w:type="dxa"/>
               <w:bottom w:w="75" w:type="dxa"/>
@@ -4481,9 +4716,9 @@
             </w:pPr>
             <w:r>
               <w:rPr>
-                <w:b/>
-                <w:color w:val="FFFFFF"/>
-                <w:sz w:val="20"/>
+                <w:rFonts w:ascii="Times New Roman" w:hAnsi="Times New Roman" w:eastAsia="黑体"/>
+                <w:b w:val="0"/>
+                <w:sz w:val="21"/>
               </w:rPr>
               <w:t>主要职责</w:t>
             </w:r>
@@ -4513,8 +4748,9 @@
             </w:pPr>
             <w:r>
               <w:rPr>
+                <w:rFonts w:ascii="Times New Roman" w:hAnsi="Times New Roman" w:eastAsia="宋体"/>
                 <w:b w:val="0"/>
-                <w:sz w:val="20"/>
+                <w:sz w:val="21"/>
               </w:rPr>
               <w:t>角色与节拍时钟</w:t>
             </w:r>
@@ -4539,8 +4775,9 @@
             </w:pPr>
             <w:r>
               <w:rPr>
+                <w:rFonts w:ascii="Times New Roman" w:hAnsi="Times New Roman" w:eastAsia="宋体"/>
                 <w:b w:val="0"/>
-                <w:sz w:val="20"/>
+                <w:sz w:val="21"/>
               </w:rPr>
               <w:t>真实运动事件、音频进度、判定和校准</w:t>
             </w:r>
@@ -4555,7 +4792,7 @@
           <w:tcPr>
             <w:tcW w:type="dxa" w:w="2665"/>
             <w:vAlign w:val="center"/>
-            <w:shd w:fill="F3F6F7"/>
+            <w:shd w:fill="FFFFFF"/>
             <w:tcMar>
               <w:top w:w="75" w:type="dxa"/>
               <w:bottom w:w="75" w:type="dxa"/>
@@ -4570,8 +4807,9 @@
             </w:pPr>
             <w:r>
               <w:rPr>
+                <w:rFonts w:ascii="Times New Roman" w:hAnsi="Times New Roman" w:eastAsia="宋体"/>
                 <w:b w:val="0"/>
-                <w:sz w:val="20"/>
+                <w:sz w:val="21"/>
               </w:rPr>
               <w:t>光桥与激光</w:t>
             </w:r>
@@ -4581,7 +4819,7 @@
           <w:tcPr>
             <w:tcW w:type="dxa" w:w="6633"/>
             <w:vAlign w:val="center"/>
-            <w:shd w:fill="F3F6F7"/>
+            <w:shd w:fill="FFFFFF"/>
             <w:tcMar>
               <w:top w:w="75" w:type="dxa"/>
               <w:bottom w:w="75" w:type="dxa"/>
@@ -4596,8 +4834,9 @@
             </w:pPr>
             <w:r>
               <w:rPr>
+                <w:rFonts w:ascii="Times New Roman" w:hAnsi="Times New Roman" w:eastAsia="宋体"/>
                 <w:b w:val="0"/>
-                <w:sz w:val="20"/>
+                <w:sz w:val="21"/>
               </w:rPr>
               <w:t>桥面状态及碰撞、预警与危险周期</w:t>
             </w:r>
@@ -4627,8 +4866,9 @@
             </w:pPr>
             <w:r>
               <w:rPr>
+                <w:rFonts w:ascii="Times New Roman" w:hAnsi="Times New Roman" w:eastAsia="宋体"/>
                 <w:b w:val="0"/>
-                <w:sz w:val="20"/>
+                <w:sz w:val="21"/>
               </w:rPr>
               <w:t>房间流程</w:t>
             </w:r>
@@ -4653,8 +4893,9 @@
             </w:pPr>
             <w:r>
               <w:rPr>
+                <w:rFonts w:ascii="Times New Roman" w:hAnsi="Times New Roman" w:eastAsia="宋体"/>
                 <w:b w:val="0"/>
-                <w:sz w:val="20"/>
+                <w:sz w:val="21"/>
               </w:rPr>
               <w:t>布局、目标关联、计分、重试和出口条件</w:t>
             </w:r>
@@ -4669,7 +4910,7 @@
           <w:tcPr>
             <w:tcW w:type="dxa" w:w="2665"/>
             <w:vAlign w:val="center"/>
-            <w:shd w:fill="F3F6F7"/>
+            <w:shd w:fill="FFFFFF"/>
             <w:tcMar>
               <w:top w:w="75" w:type="dxa"/>
               <w:bottom w:w="75" w:type="dxa"/>
@@ -4684,8 +4925,9 @@
             </w:pPr>
             <w:r>
               <w:rPr>
+                <w:rFonts w:ascii="Times New Roman" w:hAnsi="Times New Roman" w:eastAsia="宋体"/>
                 <w:b w:val="0"/>
-                <w:sz w:val="20"/>
+                <w:sz w:val="21"/>
               </w:rPr>
               <w:t>界面</w:t>
             </w:r>
@@ -4695,7 +4937,7 @@
           <w:tcPr>
             <w:tcW w:type="dxa" w:w="6633"/>
             <w:vAlign w:val="center"/>
-            <w:shd w:fill="F3F6F7"/>
+            <w:shd w:fill="FFFFFF"/>
             <w:tcMar>
               <w:top w:w="75" w:type="dxa"/>
               <w:bottom w:w="75" w:type="dxa"/>
@@ -4710,8 +4952,9 @@
             </w:pPr>
             <w:r>
               <w:rPr>
+                <w:rFonts w:ascii="Times New Roman" w:hAnsi="Times New Roman" w:eastAsia="宋体"/>
                 <w:b w:val="0"/>
-                <w:sz w:val="20"/>
+                <w:sz w:val="21"/>
               </w:rPr>
               <w:t>菜单、规则提示、节拍灯与过程反馈</w:t>
             </w:r>
@@ -4730,6 +4973,9 @@
       </w:r>
     </w:p>
     <w:p>
+      <w:pPr>
+        <w:ind w:firstLine="480"/>
+      </w:pPr>
       <w:r>
         <w:rPr>
           <w:b w:val="0"/>
@@ -4746,6 +4992,9 @@
       </w:r>
     </w:p>
     <w:p>
+      <w:pPr>
+        <w:ind w:firstLine="480"/>
+      </w:pPr>
       <w:r>
         <w:rPr>
           <w:b w:val="0"/>
@@ -4782,7 +5031,7 @@
           <w:tcPr>
             <w:tcW w:type="dxa" w:w="2154"/>
             <w:vAlign w:val="center"/>
-            <w:shd w:fill="233C4A"/>
+            <w:shd w:fill="EDEDED"/>
             <w:tcMar>
               <w:top w:w="75" w:type="dxa"/>
               <w:bottom w:w="75" w:type="dxa"/>
@@ -4797,9 +5046,9 @@
             </w:pPr>
             <w:r>
               <w:rPr>
-                <w:b/>
-                <w:color w:val="FFFFFF"/>
-                <w:sz w:val="20"/>
+                <w:rFonts w:ascii="Times New Roman" w:hAnsi="Times New Roman" w:eastAsia="黑体"/>
+                <w:b w:val="0"/>
+                <w:sz w:val="21"/>
               </w:rPr>
               <w:t>验证项目</w:t>
             </w:r>
@@ -4809,7 +5058,7 @@
           <w:tcPr>
             <w:tcW w:type="dxa" w:w="3118"/>
             <w:vAlign w:val="center"/>
-            <w:shd w:fill="233C4A"/>
+            <w:shd w:fill="EDEDED"/>
             <w:tcMar>
               <w:top w:w="75" w:type="dxa"/>
               <w:bottom w:w="75" w:type="dxa"/>
@@ -4824,9 +5073,9 @@
             </w:pPr>
             <w:r>
               <w:rPr>
-                <w:b/>
-                <w:color w:val="FFFFFF"/>
-                <w:sz w:val="20"/>
+                <w:rFonts w:ascii="Times New Roman" w:hAnsi="Times New Roman" w:eastAsia="黑体"/>
+                <w:b w:val="0"/>
+                <w:sz w:val="21"/>
               </w:rPr>
               <w:t>当前证据</w:t>
             </w:r>
@@ -4836,7 +5085,7 @@
           <w:tcPr>
             <w:tcW w:type="dxa" w:w="4025"/>
             <w:vAlign w:val="center"/>
-            <w:shd w:fill="233C4A"/>
+            <w:shd w:fill="EDEDED"/>
             <w:tcMar>
               <w:top w:w="75" w:type="dxa"/>
               <w:bottom w:w="75" w:type="dxa"/>
@@ -4851,9 +5100,9 @@
             </w:pPr>
             <w:r>
               <w:rPr>
-                <w:b/>
-                <w:color w:val="FFFFFF"/>
-                <w:sz w:val="20"/>
+                <w:rFonts w:ascii="Times New Roman" w:hAnsi="Times New Roman" w:eastAsia="黑体"/>
+                <w:b w:val="0"/>
+                <w:sz w:val="21"/>
               </w:rPr>
               <w:t>可以说明的问题</w:t>
             </w:r>
@@ -4883,8 +5132,9 @@
             </w:pPr>
             <w:r>
               <w:rPr>
+                <w:rFonts w:ascii="Times New Roman" w:hAnsi="Times New Roman" w:eastAsia="宋体"/>
                 <w:b w:val="0"/>
-                <w:sz w:val="20"/>
+                <w:sz w:val="21"/>
               </w:rPr>
               <w:t>规则检查</w:t>
             </w:r>
@@ -4909,8 +5159,9 @@
             </w:pPr>
             <w:r>
               <w:rPr>
+                <w:rFonts w:ascii="Times New Roman" w:hAnsi="Times New Roman" w:eastAsia="宋体"/>
                 <w:b w:val="0"/>
-                <w:sz w:val="20"/>
+                <w:sz w:val="21"/>
               </w:rPr>
               <w:t>54 项自动检查通过</w:t>
             </w:r>
@@ -4935,8 +5186,9 @@
             </w:pPr>
             <w:r>
               <w:rPr>
+                <w:rFonts w:ascii="Times New Roman" w:hAnsi="Times New Roman" w:eastAsia="宋体"/>
                 <w:b w:val="0"/>
-                <w:sz w:val="20"/>
+                <w:sz w:val="21"/>
               </w:rPr>
               <w:t>已覆盖的判定与状态规则符合预期</w:t>
             </w:r>
@@ -4951,7 +5203,7 @@
           <w:tcPr>
             <w:tcW w:type="dxa" w:w="2154"/>
             <w:vAlign w:val="center"/>
-            <w:shd w:fill="F3F6F7"/>
+            <w:shd w:fill="FFFFFF"/>
             <w:tcMar>
               <w:top w:w="75" w:type="dxa"/>
               <w:bottom w:w="75" w:type="dxa"/>
@@ -4966,8 +5218,9 @@
             </w:pPr>
             <w:r>
               <w:rPr>
+                <w:rFonts w:ascii="Times New Roman" w:hAnsi="Times New Roman" w:eastAsia="宋体"/>
                 <w:b w:val="0"/>
-                <w:sz w:val="20"/>
+                <w:sz w:val="21"/>
               </w:rPr>
               <w:t>三房间路线</w:t>
             </w:r>
@@ -4977,7 +5230,7 @@
           <w:tcPr>
             <w:tcW w:type="dxa" w:w="3118"/>
             <w:vAlign w:val="center"/>
-            <w:shd w:fill="F3F6F7"/>
+            <w:shd w:fill="FFFFFF"/>
             <w:tcMar>
               <w:top w:w="75" w:type="dxa"/>
               <w:bottom w:w="75" w:type="dxa"/>
@@ -4992,8 +5245,9 @@
             </w:pPr>
             <w:r>
               <w:rPr>
+                <w:rFonts w:ascii="Times New Roman" w:hAnsi="Times New Roman" w:eastAsia="宋体"/>
                 <w:b w:val="0"/>
-                <w:sz w:val="20"/>
+                <w:sz w:val="21"/>
               </w:rPr>
               <w:t>自动路线约 18、20、25 秒</w:t>
             </w:r>
@@ -5003,7 +5257,7 @@
           <w:tcPr>
             <w:tcW w:type="dxa" w:w="4025"/>
             <w:vAlign w:val="center"/>
-            <w:shd w:fill="F3F6F7"/>
+            <w:shd w:fill="FFFFFF"/>
             <w:tcMar>
               <w:top w:w="75" w:type="dxa"/>
               <w:bottom w:w="75" w:type="dxa"/>
@@ -5018,8 +5272,9 @@
             </w:pPr>
             <w:r>
               <w:rPr>
+                <w:rFonts w:ascii="Times New Roman" w:hAnsi="Times New Roman" w:eastAsia="宋体"/>
                 <w:b w:val="0"/>
-                <w:sz w:val="20"/>
+                <w:sz w:val="21"/>
               </w:rPr>
               <w:t>现有角色参数与关卡路线可通行</w:t>
             </w:r>
@@ -5049,8 +5304,9 @@
             </w:pPr>
             <w:r>
               <w:rPr>
+                <w:rFonts w:ascii="Times New Roman" w:hAnsi="Times New Roman" w:eastAsia="宋体"/>
                 <w:b w:val="0"/>
-                <w:sz w:val="20"/>
+                <w:sz w:val="21"/>
               </w:rPr>
               <w:t>工程与运行包</w:t>
             </w:r>
@@ -5075,8 +5331,9 @@
             </w:pPr>
             <w:r>
               <w:rPr>
+                <w:rFonts w:ascii="Times New Roman" w:hAnsi="Times New Roman" w:eastAsia="宋体"/>
                 <w:b w:val="0"/>
-                <w:sz w:val="20"/>
+                <w:sz w:val="21"/>
               </w:rPr>
               <w:t>干净导入及启动检查通过</w:t>
             </w:r>
@@ -5101,8 +5358,9 @@
             </w:pPr>
             <w:r>
               <w:rPr>
+                <w:rFonts w:ascii="Times New Roman" w:hAnsi="Times New Roman" w:eastAsia="宋体"/>
                 <w:b w:val="0"/>
-                <w:sz w:val="20"/>
+                <w:sz w:val="21"/>
               </w:rPr>
               <w:t>工程可导入，运行包可以启动</w:t>
             </w:r>
@@ -5121,6 +5379,9 @@
       </w:r>
     </w:p>
     <w:p>
+      <w:pPr>
+        <w:ind w:firstLine="480"/>
+      </w:pPr>
       <w:r>
         <w:rPr>
           <w:b w:val="0"/>
@@ -5129,6 +5390,9 @@
       </w:r>
     </w:p>
     <w:p>
+      <w:pPr>
+        <w:ind w:firstLine="480"/>
+      </w:pPr>
       <w:r>
         <w:rPr>
           <w:b w:val="0"/>
@@ -5154,6 +5418,9 @@
       </w:r>
     </w:p>
     <w:p>
+      <w:pPr>
+        <w:ind w:firstLine="480"/>
+      </w:pPr>
       <w:r>
         <w:rPr>
           <w:b w:val="0"/>
@@ -5162,6 +5429,9 @@
       </w:r>
     </w:p>
     <w:p>
+      <w:pPr>
+        <w:ind w:firstLine="480"/>
+      </w:pPr>
       <w:r>
         <w:rPr>
           <w:b w:val="0"/>
@@ -5199,7 +5469,7 @@
           <w:tcPr>
             <w:tcW w:type="dxa" w:w="1134"/>
             <w:vAlign w:val="center"/>
-            <w:shd w:fill="233C4A"/>
+            <w:shd w:fill="EDEDED"/>
             <w:tcMar>
               <w:top w:w="75" w:type="dxa"/>
               <w:bottom w:w="75" w:type="dxa"/>
@@ -5214,9 +5484,9 @@
             </w:pPr>
             <w:r>
               <w:rPr>
-                <w:b/>
-                <w:color w:val="FFFFFF"/>
-                <w:sz w:val="20"/>
+                <w:rFonts w:ascii="Times New Roman" w:hAnsi="Times New Roman" w:eastAsia="黑体"/>
+                <w:b w:val="0"/>
+                <w:sz w:val="21"/>
               </w:rPr>
               <w:t>成员</w:t>
             </w:r>
@@ -5226,7 +5496,7 @@
           <w:tcPr>
             <w:tcW w:type="dxa" w:w="1928"/>
             <w:vAlign w:val="center"/>
-            <w:shd w:fill="233C4A"/>
+            <w:shd w:fill="EDEDED"/>
             <w:tcMar>
               <w:top w:w="75" w:type="dxa"/>
               <w:bottom w:w="75" w:type="dxa"/>
@@ -5241,9 +5511,9 @@
             </w:pPr>
             <w:r>
               <w:rPr>
-                <w:b/>
-                <w:color w:val="FFFFFF"/>
-                <w:sz w:val="20"/>
+                <w:rFonts w:ascii="Times New Roman" w:hAnsi="Times New Roman" w:eastAsia="黑体"/>
+                <w:b w:val="0"/>
+                <w:sz w:val="21"/>
               </w:rPr>
               <w:t>职责定位</w:t>
             </w:r>
@@ -5253,7 +5523,7 @@
           <w:tcPr>
             <w:tcW w:type="dxa" w:w="3118"/>
             <w:vAlign w:val="center"/>
-            <w:shd w:fill="233C4A"/>
+            <w:shd w:fill="EDEDED"/>
             <w:tcMar>
               <w:top w:w="75" w:type="dxa"/>
               <w:bottom w:w="75" w:type="dxa"/>
@@ -5268,9 +5538,9 @@
             </w:pPr>
             <w:r>
               <w:rPr>
-                <w:b/>
-                <w:color w:val="FFFFFF"/>
-                <w:sz w:val="20"/>
+                <w:rFonts w:ascii="Times New Roman" w:hAnsi="Times New Roman" w:eastAsia="黑体"/>
+                <w:b w:val="0"/>
+                <w:sz w:val="21"/>
               </w:rPr>
               <w:t>主要负责对象</w:t>
             </w:r>
@@ -5280,7 +5550,7 @@
           <w:tcPr>
             <w:tcW w:type="dxa" w:w="3118"/>
             <w:vAlign w:val="center"/>
-            <w:shd w:fill="233C4A"/>
+            <w:shd w:fill="EDEDED"/>
             <w:tcMar>
               <w:top w:w="75" w:type="dxa"/>
               <w:bottom w:w="75" w:type="dxa"/>
@@ -5295,9 +5565,9 @@
             </w:pPr>
             <w:r>
               <w:rPr>
-                <w:b/>
-                <w:color w:val="FFFFFF"/>
-                <w:sz w:val="20"/>
+                <w:rFonts w:ascii="Times New Roman" w:hAnsi="Times New Roman" w:eastAsia="黑体"/>
+                <w:b w:val="0"/>
+                <w:sz w:val="21"/>
               </w:rPr>
               <w:t>对应成果</w:t>
             </w:r>
@@ -5327,8 +5597,9 @@
             </w:pPr>
             <w:r>
               <w:rPr>
+                <w:rFonts w:ascii="Times New Roman" w:hAnsi="Times New Roman" w:eastAsia="宋体"/>
                 <w:b w:val="0"/>
-                <w:sz w:val="20"/>
+                <w:sz w:val="21"/>
               </w:rPr>
               <w:t>严楷哲</w:t>
             </w:r>
@@ -5353,8 +5624,9 @@
             </w:pPr>
             <w:r>
               <w:rPr>
+                <w:rFonts w:ascii="Times New Roman" w:hAnsi="Times New Roman" w:eastAsia="宋体"/>
                 <w:b w:val="0"/>
-                <w:sz w:val="20"/>
+                <w:sz w:val="21"/>
               </w:rPr>
               <w:t>队长</w:t>
               <w:br/>
@@ -5381,8 +5653,9 @@
             </w:pPr>
             <w:r>
               <w:rPr>
+                <w:rFonts w:ascii="Times New Roman" w:hAnsi="Times New Roman" w:eastAsia="宋体"/>
                 <w:b w:val="0"/>
-                <w:sz w:val="20"/>
+                <w:sz w:val="21"/>
               </w:rPr>
               <w:t>角色、节拍、机关、房间流程及统一工程</w:t>
             </w:r>
@@ -5407,8 +5680,9 @@
             </w:pPr>
             <w:r>
               <w:rPr>
+                <w:rFonts w:ascii="Times New Roman" w:hAnsi="Times New Roman" w:eastAsia="宋体"/>
                 <w:b w:val="0"/>
-                <w:sz w:val="20"/>
+                <w:sz w:val="21"/>
               </w:rPr>
               <w:t>游戏工程、运行包、版本说明与最终目录</w:t>
             </w:r>
@@ -5423,7 +5697,7 @@
           <w:tcPr>
             <w:tcW w:type="dxa" w:w="1134"/>
             <w:vAlign w:val="center"/>
-            <w:shd w:fill="F3F6F7"/>
+            <w:shd w:fill="FFFFFF"/>
             <w:tcMar>
               <w:top w:w="75" w:type="dxa"/>
               <w:bottom w:w="75" w:type="dxa"/>
@@ -5438,8 +5712,9 @@
             </w:pPr>
             <w:r>
               <w:rPr>
+                <w:rFonts w:ascii="Times New Roman" w:hAnsi="Times New Roman" w:eastAsia="宋体"/>
                 <w:b w:val="0"/>
-                <w:sz w:val="20"/>
+                <w:sz w:val="21"/>
               </w:rPr>
               <w:t>沈语雯</w:t>
             </w:r>
@@ -5449,7 +5724,7 @@
           <w:tcPr>
             <w:tcW w:type="dxa" w:w="1928"/>
             <w:vAlign w:val="center"/>
-            <w:shd w:fill="F3F6F7"/>
+            <w:shd w:fill="FFFFFF"/>
             <w:tcMar>
               <w:top w:w="75" w:type="dxa"/>
               <w:bottom w:w="75" w:type="dxa"/>
@@ -5464,8 +5739,9 @@
             </w:pPr>
             <w:r>
               <w:rPr>
+                <w:rFonts w:ascii="Times New Roman" w:hAnsi="Times New Roman" w:eastAsia="宋体"/>
                 <w:b w:val="0"/>
-                <w:sz w:val="20"/>
+                <w:sz w:val="21"/>
               </w:rPr>
               <w:t>策划、关卡</w:t>
               <w:br/>
@@ -5477,7 +5753,7 @@
           <w:tcPr>
             <w:tcW w:type="dxa" w:w="3118"/>
             <w:vAlign w:val="center"/>
-            <w:shd w:fill="F3F6F7"/>
+            <w:shd w:fill="FFFFFF"/>
             <w:tcMar>
               <w:top w:w="75" w:type="dxa"/>
               <w:bottom w:w="75" w:type="dxa"/>
@@ -5492,8 +5768,9 @@
             </w:pPr>
             <w:r>
               <w:rPr>
+                <w:rFonts w:ascii="Times New Roman" w:hAnsi="Times New Roman" w:eastAsia="宋体"/>
                 <w:b w:val="0"/>
-                <w:sz w:val="20"/>
+                <w:sz w:val="21"/>
               </w:rPr>
               <w:t>规则说明、关卡递进、教学、画面状态及界面文字</w:t>
             </w:r>
@@ -5503,7 +5780,7 @@
           <w:tcPr>
             <w:tcW w:type="dxa" w:w="3118"/>
             <w:vAlign w:val="center"/>
-            <w:shd w:fill="F3F6F7"/>
+            <w:shd w:fill="FFFFFF"/>
             <w:tcMar>
               <w:top w:w="75" w:type="dxa"/>
               <w:bottom w:w="75" w:type="dxa"/>
@@ -5518,8 +5795,9 @@
             </w:pPr>
             <w:r>
               <w:rPr>
+                <w:rFonts w:ascii="Times New Roman" w:hAnsi="Times New Roman" w:eastAsia="宋体"/>
                 <w:b w:val="0"/>
-                <w:sz w:val="20"/>
+                <w:sz w:val="21"/>
               </w:rPr>
               <w:t>策划案、关卡调整建议、视觉与文案核对结果</w:t>
             </w:r>
@@ -5549,8 +5827,9 @@
             </w:pPr>
             <w:r>
               <w:rPr>
+                <w:rFonts w:ascii="Times New Roman" w:hAnsi="Times New Roman" w:eastAsia="宋体"/>
                 <w:b w:val="0"/>
-                <w:sz w:val="20"/>
+                <w:sz w:val="21"/>
               </w:rPr>
               <w:t>李星莹</w:t>
             </w:r>
@@ -5575,8 +5854,9 @@
             </w:pPr>
             <w:r>
               <w:rPr>
+                <w:rFonts w:ascii="Times New Roman" w:hAnsi="Times New Roman" w:eastAsia="宋体"/>
                 <w:b w:val="0"/>
-                <w:sz w:val="20"/>
+                <w:sz w:val="21"/>
               </w:rPr>
               <w:t>音频、测试</w:t>
               <w:br/>
@@ -5603,8 +5883,9 @@
             </w:pPr>
             <w:r>
               <w:rPr>
+                <w:rFonts w:ascii="Times New Roman" w:hAnsi="Times New Roman" w:eastAsia="宋体"/>
                 <w:b w:val="0"/>
-                <w:sz w:val="20"/>
+                <w:sz w:val="21"/>
               </w:rPr>
               <w:t>配乐与校准检查、功能与设备验证、视频及宣讲材料</w:t>
             </w:r>
@@ -5629,8 +5910,9 @@
             </w:pPr>
             <w:r>
               <w:rPr>
+                <w:rFonts w:ascii="Times New Roman" w:hAnsi="Times New Roman" w:eastAsia="宋体"/>
                 <w:b w:val="0"/>
-                <w:sz w:val="20"/>
+                <w:sz w:val="21"/>
               </w:rPr>
               <w:t>测试记录、音画素材、展示文件及排练记录</w:t>
             </w:r>
@@ -5665,6 +5947,9 @@
       </w:r>
     </w:p>
     <w:p>
+      <w:pPr>
+        <w:ind w:firstLine="480"/>
+      </w:pPr>
       <w:r>
         <w:rPr>
           <w:b w:val="0"/>
@@ -5681,6 +5966,9 @@
       </w:r>
     </w:p>
     <w:p>
+      <w:pPr>
+        <w:ind w:firstLine="480"/>
+      </w:pPr>
       <w:r>
         <w:rPr>
           <w:b w:val="0"/>
@@ -5697,6 +5985,9 @@
       </w:r>
     </w:p>
     <w:p>
+      <w:pPr>
+        <w:ind w:firstLine="480"/>
+      </w:pPr>
       <w:r>
         <w:rPr>
           <w:b w:val="0"/>
@@ -5712,7 +6003,7 @@
       </w:pPr>
       <w:r>
         <w:rPr>
-          <w:sz w:val="36"/>
+          <w:sz w:val="32"/>
         </w:rPr>
         <w:t>三 严楷哲 队长与程序负责人</w:t>
       </w:r>
@@ -5726,6 +6017,9 @@
       </w:r>
     </w:p>
     <w:p>
+      <w:pPr>
+        <w:ind w:firstLine="480"/>
+      </w:pPr>
       <w:r>
         <w:rPr>
           <w:b w:val="0"/>
@@ -5742,6 +6036,9 @@
       </w:r>
     </w:p>
     <w:p>
+      <w:pPr>
+        <w:ind w:firstLine="480"/>
+      </w:pPr>
       <w:r>
         <w:rPr>
           <w:b w:val="0"/>
@@ -5758,6 +6055,9 @@
       </w:r>
     </w:p>
     <w:p>
+      <w:pPr>
+        <w:ind w:firstLine="480"/>
+      </w:pPr>
       <w:r>
         <w:rPr>
           <w:b w:val="0"/>
@@ -5774,6 +6074,9 @@
       </w:r>
     </w:p>
     <w:p>
+      <w:pPr>
+        <w:ind w:firstLine="480"/>
+      </w:pPr>
       <w:r>
         <w:rPr>
           <w:b w:val="0"/>
@@ -5790,6 +6093,9 @@
       </w:r>
     </w:p>
     <w:p>
+      <w:pPr>
+        <w:ind w:firstLine="480"/>
+      </w:pPr>
       <w:r>
         <w:rPr>
           <w:b w:val="0"/>
@@ -5806,9 +6112,13 @@
       </w:r>
     </w:p>
     <w:p>
+      <w:pPr>
+        <w:ind w:firstLine="480"/>
+      </w:pPr>
       <w:r>
         <w:rPr>
           <w:b w:val="0"/>
+          <w:spacing w:val="-5"/>
         </w:rPr>
         <w:t>负责技术实现与任务协调，玩法取舍须与策划负责人确认，声音与展示更新由材料负责人同步。队长汇总验收结果，原问题是否解决仍以复测记录和对应成员确认作为依据。</w:t>
       </w:r>
@@ -5821,7 +6131,7 @@
       </w:pPr>
       <w:r>
         <w:rPr>
-          <w:sz w:val="36"/>
+          <w:sz w:val="32"/>
         </w:rPr>
         <w:t>四 沈语雯 策划与视觉负责人</w:t>
       </w:r>
@@ -5835,6 +6145,9 @@
       </w:r>
     </w:p>
     <w:p>
+      <w:pPr>
+        <w:ind w:firstLine="480"/>
+      </w:pPr>
       <w:r>
         <w:rPr>
           <w:b w:val="0"/>
@@ -5851,6 +6164,9 @@
       </w:r>
     </w:p>
     <w:p>
+      <w:pPr>
+        <w:ind w:firstLine="480"/>
+      </w:pPr>
       <w:r>
         <w:rPr>
           <w:b w:val="0"/>
@@ -5867,6 +6183,9 @@
       </w:r>
     </w:p>
     <w:p>
+      <w:pPr>
+        <w:ind w:firstLine="480"/>
+      </w:pPr>
       <w:r>
         <w:rPr>
           <w:b w:val="0"/>
@@ -5883,6 +6202,9 @@
       </w:r>
     </w:p>
     <w:p>
+      <w:pPr>
+        <w:ind w:firstLine="480"/>
+      </w:pPr>
       <w:r>
         <w:rPr>
           <w:b w:val="0"/>
@@ -5899,6 +6221,9 @@
       </w:r>
     </w:p>
     <w:p>
+      <w:pPr>
+        <w:ind w:firstLine="480"/>
+      </w:pPr>
       <w:r>
         <w:rPr>
           <w:b w:val="0"/>
@@ -5915,6 +6240,9 @@
       </w:r>
     </w:p>
     <w:p>
+      <w:pPr>
+        <w:ind w:firstLine="480"/>
+      </w:pPr>
       <w:r>
         <w:rPr>
           <w:b w:val="0"/>
@@ -5930,7 +6258,7 @@
       </w:pPr>
       <w:r>
         <w:rPr>
-          <w:sz w:val="36"/>
+          <w:sz w:val="32"/>
         </w:rPr>
         <w:t>五 李星莹 音频测试与展示负责人</w:t>
       </w:r>
@@ -5944,6 +6272,9 @@
       </w:r>
     </w:p>
     <w:p>
+      <w:pPr>
+        <w:ind w:firstLine="480"/>
+      </w:pPr>
       <w:r>
         <w:rPr>
           <w:b w:val="0"/>
@@ -5960,6 +6291,9 @@
       </w:r>
     </w:p>
     <w:p>
+      <w:pPr>
+        <w:ind w:firstLine="480"/>
+      </w:pPr>
       <w:r>
         <w:rPr>
           <w:b w:val="0"/>
@@ -5976,6 +6310,9 @@
       </w:r>
     </w:p>
     <w:p>
+      <w:pPr>
+        <w:ind w:firstLine="480"/>
+      </w:pPr>
       <w:r>
         <w:rPr>
           <w:b w:val="0"/>
@@ -5992,6 +6329,9 @@
       </w:r>
     </w:p>
     <w:p>
+      <w:pPr>
+        <w:ind w:firstLine="480"/>
+      </w:pPr>
       <w:r>
         <w:rPr>
           <w:b w:val="0"/>
@@ -6008,6 +6348,9 @@
       </w:r>
     </w:p>
     <w:p>
+      <w:pPr>
+        <w:ind w:firstLine="480"/>
+      </w:pPr>
       <w:r>
         <w:rPr>
           <w:b w:val="0"/>
@@ -6024,6 +6367,9 @@
       </w:r>
     </w:p>
     <w:p>
+      <w:pPr>
+        <w:ind w:firstLine="480"/>
+      </w:pPr>
       <w:r>
         <w:rPr>
           <w:b w:val="0"/>
@@ -6040,6 +6386,9 @@
       </w:r>
     </w:p>
     <w:p>
+      <w:pPr>
+        <w:ind w:firstLine="480"/>
+      </w:pPr>
       <w:r>
         <w:rPr>
           <w:b w:val="0"/>
@@ -6055,12 +6404,15 @@
       </w:pPr>
       <w:r>
         <w:rPr>
-          <w:sz w:val="36"/>
+          <w:sz w:val="32"/>
         </w:rPr>
         <w:t>六 工作交接与协同复核</w:t>
       </w:r>
     </w:p>
     <w:p>
+      <w:pPr>
+        <w:ind w:firstLine="480"/>
+      </w:pPr>
       <w:r>
         <w:rPr>
           <w:b w:val="0"/>
@@ -6098,7 +6450,7 @@
           <w:tcPr>
             <w:tcW w:type="dxa" w:w="1871"/>
             <w:vAlign w:val="center"/>
-            <w:shd w:fill="233C4A"/>
+            <w:shd w:fill="EDEDED"/>
             <w:tcMar>
               <w:top w:w="75" w:type="dxa"/>
               <w:bottom w:w="75" w:type="dxa"/>
@@ -6113,9 +6465,9 @@
             </w:pPr>
             <w:r>
               <w:rPr>
-                <w:b/>
-                <w:color w:val="FFFFFF"/>
-                <w:sz w:val="20"/>
+                <w:rFonts w:ascii="Times New Roman" w:hAnsi="Times New Roman" w:eastAsia="黑体"/>
+                <w:b w:val="0"/>
+                <w:sz w:val="21"/>
               </w:rPr>
               <w:t>工作事项</w:t>
             </w:r>
@@ -6125,7 +6477,7 @@
           <w:tcPr>
             <w:tcW w:type="dxa" w:w="1474"/>
             <w:vAlign w:val="center"/>
-            <w:shd w:fill="233C4A"/>
+            <w:shd w:fill="EDEDED"/>
             <w:tcMar>
               <w:top w:w="75" w:type="dxa"/>
               <w:bottom w:w="75" w:type="dxa"/>
@@ -6140,9 +6492,9 @@
             </w:pPr>
             <w:r>
               <w:rPr>
-                <w:b/>
-                <w:color w:val="FFFFFF"/>
-                <w:sz w:val="20"/>
+                <w:rFonts w:ascii="Times New Roman" w:hAnsi="Times New Roman" w:eastAsia="黑体"/>
+                <w:b w:val="0"/>
+                <w:sz w:val="21"/>
               </w:rPr>
               <w:t>主负责人</w:t>
             </w:r>
@@ -6152,7 +6504,7 @@
           <w:tcPr>
             <w:tcW w:type="dxa" w:w="2324"/>
             <w:vAlign w:val="center"/>
-            <w:shd w:fill="233C4A"/>
+            <w:shd w:fill="EDEDED"/>
             <w:tcMar>
               <w:top w:w="75" w:type="dxa"/>
               <w:bottom w:w="75" w:type="dxa"/>
@@ -6167,9 +6519,9 @@
             </w:pPr>
             <w:r>
               <w:rPr>
-                <w:b/>
-                <w:color w:val="FFFFFF"/>
-                <w:sz w:val="20"/>
+                <w:rFonts w:ascii="Times New Roman" w:hAnsi="Times New Roman" w:eastAsia="黑体"/>
+                <w:b w:val="0"/>
+                <w:sz w:val="21"/>
               </w:rPr>
               <w:t>配合与复核</w:t>
             </w:r>
@@ -6179,7 +6531,7 @@
           <w:tcPr>
             <w:tcW w:type="dxa" w:w="3628"/>
             <w:vAlign w:val="center"/>
-            <w:shd w:fill="233C4A"/>
+            <w:shd w:fill="EDEDED"/>
             <w:tcMar>
               <w:top w:w="75" w:type="dxa"/>
               <w:bottom w:w="75" w:type="dxa"/>
@@ -6194,9 +6546,9 @@
             </w:pPr>
             <w:r>
               <w:rPr>
-                <w:b/>
-                <w:color w:val="FFFFFF"/>
-                <w:sz w:val="20"/>
+                <w:rFonts w:ascii="Times New Roman" w:hAnsi="Times New Roman" w:eastAsia="黑体"/>
+                <w:b w:val="0"/>
+                <w:sz w:val="21"/>
               </w:rPr>
               <w:t>交接内容</w:t>
             </w:r>
@@ -6226,8 +6578,9 @@
             </w:pPr>
             <w:r>
               <w:rPr>
+                <w:rFonts w:ascii="Times New Roman" w:hAnsi="Times New Roman" w:eastAsia="宋体"/>
                 <w:b w:val="0"/>
-                <w:sz w:val="20"/>
+                <w:sz w:val="21"/>
               </w:rPr>
               <w:t>玩法与参数调整</w:t>
             </w:r>
@@ -6252,8 +6605,9 @@
             </w:pPr>
             <w:r>
               <w:rPr>
+                <w:rFonts w:ascii="Times New Roman" w:hAnsi="Times New Roman" w:eastAsia="宋体"/>
                 <w:b w:val="0"/>
-                <w:sz w:val="20"/>
+                <w:sz w:val="21"/>
               </w:rPr>
               <w:t>沈语雯</w:t>
             </w:r>
@@ -6278,8 +6632,9 @@
             </w:pPr>
             <w:r>
               <w:rPr>
+                <w:rFonts w:ascii="Times New Roman" w:hAnsi="Times New Roman" w:eastAsia="宋体"/>
                 <w:b w:val="0"/>
-                <w:sz w:val="20"/>
+                <w:sz w:val="21"/>
               </w:rPr>
               <w:t>严楷哲评估实现</w:t>
               <w:br/>
@@ -6306,8 +6661,9 @@
             </w:pPr>
             <w:r>
               <w:rPr>
+                <w:rFonts w:ascii="Times New Roman" w:hAnsi="Times New Roman" w:eastAsia="宋体"/>
                 <w:b w:val="0"/>
-                <w:sz w:val="20"/>
+                <w:sz w:val="21"/>
               </w:rPr>
               <w:t>问题位置、调整理由、预期操作与验收条件</w:t>
             </w:r>
@@ -6322,7 +6678,7 @@
           <w:tcPr>
             <w:tcW w:type="dxa" w:w="1871"/>
             <w:vAlign w:val="center"/>
-            <w:shd w:fill="F3F6F7"/>
+            <w:shd w:fill="FFFFFF"/>
             <w:tcMar>
               <w:top w:w="75" w:type="dxa"/>
               <w:bottom w:w="75" w:type="dxa"/>
@@ -6337,8 +6693,9 @@
             </w:pPr>
             <w:r>
               <w:rPr>
+                <w:rFonts w:ascii="Times New Roman" w:hAnsi="Times New Roman" w:eastAsia="宋体"/>
                 <w:b w:val="0"/>
-                <w:sz w:val="20"/>
+                <w:sz w:val="21"/>
               </w:rPr>
               <w:t>程序修复与导出</w:t>
             </w:r>
@@ -6348,7 +6705,7 @@
           <w:tcPr>
             <w:tcW w:type="dxa" w:w="1474"/>
             <w:vAlign w:val="center"/>
-            <w:shd w:fill="F3F6F7"/>
+            <w:shd w:fill="FFFFFF"/>
             <w:tcMar>
               <w:top w:w="75" w:type="dxa"/>
               <w:bottom w:w="75" w:type="dxa"/>
@@ -6363,8 +6720,9 @@
             </w:pPr>
             <w:r>
               <w:rPr>
+                <w:rFonts w:ascii="Times New Roman" w:hAnsi="Times New Roman" w:eastAsia="宋体"/>
                 <w:b w:val="0"/>
-                <w:sz w:val="20"/>
+                <w:sz w:val="21"/>
               </w:rPr>
               <w:t>严楷哲</w:t>
             </w:r>
@@ -6374,7 +6732,7 @@
           <w:tcPr>
             <w:tcW w:type="dxa" w:w="2324"/>
             <w:vAlign w:val="center"/>
-            <w:shd w:fill="F3F6F7"/>
+            <w:shd w:fill="FFFFFF"/>
             <w:tcMar>
               <w:top w:w="75" w:type="dxa"/>
               <w:bottom w:w="75" w:type="dxa"/>
@@ -6389,8 +6747,9 @@
             </w:pPr>
             <w:r>
               <w:rPr>
+                <w:rFonts w:ascii="Times New Roman" w:hAnsi="Times New Roman" w:eastAsia="宋体"/>
                 <w:b w:val="0"/>
-                <w:sz w:val="20"/>
+                <w:sz w:val="21"/>
               </w:rPr>
               <w:t>李星莹复测</w:t>
               <w:br/>
@@ -6402,7 +6761,7 @@
           <w:tcPr>
             <w:tcW w:type="dxa" w:w="3628"/>
             <w:vAlign w:val="center"/>
-            <w:shd w:fill="F3F6F7"/>
+            <w:shd w:fill="FFFFFF"/>
             <w:tcMar>
               <w:top w:w="75" w:type="dxa"/>
               <w:bottom w:w="75" w:type="dxa"/>
@@ -6417,8 +6776,9 @@
             </w:pPr>
             <w:r>
               <w:rPr>
+                <w:rFonts w:ascii="Times New Roman" w:hAnsi="Times New Roman" w:eastAsia="宋体"/>
                 <w:b w:val="0"/>
-                <w:sz w:val="20"/>
+                <w:sz w:val="21"/>
               </w:rPr>
               <w:t>对应版本、改动范围、运行包与未解决问题</w:t>
             </w:r>
@@ -6448,8 +6808,9 @@
             </w:pPr>
             <w:r>
               <w:rPr>
+                <w:rFonts w:ascii="Times New Roman" w:hAnsi="Times New Roman" w:eastAsia="宋体"/>
                 <w:b w:val="0"/>
-                <w:sz w:val="20"/>
+                <w:sz w:val="21"/>
               </w:rPr>
               <w:t>视觉与教学调整</w:t>
             </w:r>
@@ -6474,8 +6835,9 @@
             </w:pPr>
             <w:r>
               <w:rPr>
+                <w:rFonts w:ascii="Times New Roman" w:hAnsi="Times New Roman" w:eastAsia="宋体"/>
                 <w:b w:val="0"/>
-                <w:sz w:val="20"/>
+                <w:sz w:val="21"/>
               </w:rPr>
               <w:t>沈语雯</w:t>
             </w:r>
@@ -6500,8 +6862,9 @@
             </w:pPr>
             <w:r>
               <w:rPr>
+                <w:rFonts w:ascii="Times New Roman" w:hAnsi="Times New Roman" w:eastAsia="宋体"/>
                 <w:b w:val="0"/>
-                <w:sz w:val="20"/>
+                <w:sz w:val="21"/>
               </w:rPr>
               <w:t>严楷哲落实</w:t>
               <w:br/>
@@ -6528,8 +6891,9 @@
             </w:pPr>
             <w:r>
               <w:rPr>
+                <w:rFonts w:ascii="Times New Roman" w:hAnsi="Times New Roman" w:eastAsia="宋体"/>
                 <w:b w:val="0"/>
-                <w:sz w:val="20"/>
+                <w:sz w:val="21"/>
               </w:rPr>
               <w:t>截图或位置、文案、状态辨识要求</w:t>
             </w:r>
@@ -6544,7 +6908,7 @@
           <w:tcPr>
             <w:tcW w:type="dxa" w:w="1871"/>
             <w:vAlign w:val="center"/>
-            <w:shd w:fill="F3F6F7"/>
+            <w:shd w:fill="FFFFFF"/>
             <w:tcMar>
               <w:top w:w="75" w:type="dxa"/>
               <w:bottom w:w="75" w:type="dxa"/>
@@ -6559,8 +6923,9 @@
             </w:pPr>
             <w:r>
               <w:rPr>
+                <w:rFonts w:ascii="Times New Roman" w:hAnsi="Times New Roman" w:eastAsia="宋体"/>
                 <w:b w:val="0"/>
-                <w:sz w:val="20"/>
+                <w:sz w:val="21"/>
               </w:rPr>
               <w:t>声音与同步检查</w:t>
             </w:r>
@@ -6570,7 +6935,7 @@
           <w:tcPr>
             <w:tcW w:type="dxa" w:w="1474"/>
             <w:vAlign w:val="center"/>
-            <w:shd w:fill="F3F6F7"/>
+            <w:shd w:fill="FFFFFF"/>
             <w:tcMar>
               <w:top w:w="75" w:type="dxa"/>
               <w:bottom w:w="75" w:type="dxa"/>
@@ -6585,8 +6950,9 @@
             </w:pPr>
             <w:r>
               <w:rPr>
+                <w:rFonts w:ascii="Times New Roman" w:hAnsi="Times New Roman" w:eastAsia="宋体"/>
                 <w:b w:val="0"/>
-                <w:sz w:val="20"/>
+                <w:sz w:val="21"/>
               </w:rPr>
               <w:t>李星莹</w:t>
             </w:r>
@@ -6596,7 +6962,7 @@
           <w:tcPr>
             <w:tcW w:type="dxa" w:w="2324"/>
             <w:vAlign w:val="center"/>
-            <w:shd w:fill="F3F6F7"/>
+            <w:shd w:fill="FFFFFF"/>
             <w:tcMar>
               <w:top w:w="75" w:type="dxa"/>
               <w:bottom w:w="75" w:type="dxa"/>
@@ -6611,8 +6977,9 @@
             </w:pPr>
             <w:r>
               <w:rPr>
+                <w:rFonts w:ascii="Times New Roman" w:hAnsi="Times New Roman" w:eastAsia="宋体"/>
                 <w:b w:val="0"/>
-                <w:sz w:val="20"/>
+                <w:sz w:val="21"/>
               </w:rPr>
               <w:t>严楷哲定位处理</w:t>
             </w:r>
@@ -6622,7 +6989,7 @@
           <w:tcPr>
             <w:tcW w:type="dxa" w:w="3628"/>
             <w:vAlign w:val="center"/>
-            <w:shd w:fill="F3F6F7"/>
+            <w:shd w:fill="FFFFFF"/>
             <w:tcMar>
               <w:top w:w="75" w:type="dxa"/>
               <w:bottom w:w="75" w:type="dxa"/>
@@ -6637,8 +7004,9 @@
             </w:pPr>
             <w:r>
               <w:rPr>
+                <w:rFonts w:ascii="Times New Roman" w:hAnsi="Times New Roman" w:eastAsia="宋体"/>
                 <w:b w:val="0"/>
-                <w:sz w:val="20"/>
+                <w:sz w:val="21"/>
               </w:rPr>
               <w:t>设备和输出方式、校准值、现象与复现步骤</w:t>
             </w:r>
@@ -6668,8 +7036,9 @@
             </w:pPr>
             <w:r>
               <w:rPr>
+                <w:rFonts w:ascii="Times New Roman" w:hAnsi="Times New Roman" w:eastAsia="宋体"/>
                 <w:b w:val="0"/>
-                <w:sz w:val="20"/>
+                <w:sz w:val="21"/>
               </w:rPr>
               <w:t>策划与展示材料</w:t>
             </w:r>
@@ -6694,8 +7063,9 @@
             </w:pPr>
             <w:r>
               <w:rPr>
+                <w:rFonts w:ascii="Times New Roman" w:hAnsi="Times New Roman" w:eastAsia="宋体"/>
                 <w:b w:val="0"/>
-                <w:sz w:val="20"/>
+                <w:sz w:val="21"/>
               </w:rPr>
               <w:t>策划 沈语雯</w:t>
               <w:br/>
@@ -6722,8 +7092,9 @@
             </w:pPr>
             <w:r>
               <w:rPr>
+                <w:rFonts w:ascii="Times New Roman" w:hAnsi="Times New Roman" w:eastAsia="宋体"/>
                 <w:b w:val="0"/>
-                <w:sz w:val="20"/>
+                <w:sz w:val="21"/>
               </w:rPr>
               <w:t>沈语雯审规则</w:t>
               <w:br/>
@@ -6750,8 +7121,9 @@
             </w:pPr>
             <w:r>
               <w:rPr>
+                <w:rFonts w:ascii="Times New Roman" w:hAnsi="Times New Roman" w:eastAsia="宋体"/>
                 <w:b w:val="0"/>
-                <w:sz w:val="20"/>
+                <w:sz w:val="21"/>
               </w:rPr>
               <w:t>修改后的文件、对应游戏版本与需同步的材料</w:t>
             </w:r>
@@ -6766,7 +7138,7 @@
           <w:tcPr>
             <w:tcW w:type="dxa" w:w="1871"/>
             <w:vAlign w:val="center"/>
-            <w:shd w:fill="F3F6F7"/>
+            <w:shd w:fill="FFFFFF"/>
             <w:tcMar>
               <w:top w:w="75" w:type="dxa"/>
               <w:bottom w:w="75" w:type="dxa"/>
@@ -6781,8 +7153,9 @@
             </w:pPr>
             <w:r>
               <w:rPr>
+                <w:rFonts w:ascii="Times New Roman" w:hAnsi="Times New Roman" w:eastAsia="宋体"/>
                 <w:b w:val="0"/>
-                <w:sz w:val="20"/>
+                <w:sz w:val="21"/>
               </w:rPr>
               <w:t>最终文件与备份</w:t>
             </w:r>
@@ -6792,7 +7165,7 @@
           <w:tcPr>
             <w:tcW w:type="dxa" w:w="1474"/>
             <w:vAlign w:val="center"/>
-            <w:shd w:fill="F3F6F7"/>
+            <w:shd w:fill="FFFFFF"/>
             <w:tcMar>
               <w:top w:w="75" w:type="dxa"/>
               <w:bottom w:w="75" w:type="dxa"/>
@@ -6807,8 +7180,9 @@
             </w:pPr>
             <w:r>
               <w:rPr>
+                <w:rFonts w:ascii="Times New Roman" w:hAnsi="Times New Roman" w:eastAsia="宋体"/>
                 <w:b w:val="0"/>
-                <w:sz w:val="20"/>
+                <w:sz w:val="21"/>
               </w:rPr>
               <w:t>严楷哲</w:t>
             </w:r>
@@ -6818,7 +7192,7 @@
           <w:tcPr>
             <w:tcW w:type="dxa" w:w="2324"/>
             <w:vAlign w:val="center"/>
-            <w:shd w:fill="F3F6F7"/>
+            <w:shd w:fill="FFFFFF"/>
             <w:tcMar>
               <w:top w:w="75" w:type="dxa"/>
               <w:bottom w:w="75" w:type="dxa"/>
@@ -6833,8 +7207,9 @@
             </w:pPr>
             <w:r>
               <w:rPr>
+                <w:rFonts w:ascii="Times New Roman" w:hAnsi="Times New Roman" w:eastAsia="宋体"/>
                 <w:b w:val="0"/>
-                <w:sz w:val="20"/>
+                <w:sz w:val="21"/>
               </w:rPr>
               <w:t>沈语雯、李星莹</w:t>
             </w:r>
@@ -6844,7 +7219,7 @@
           <w:tcPr>
             <w:tcW w:type="dxa" w:w="3628"/>
             <w:vAlign w:val="center"/>
-            <w:shd w:fill="F3F6F7"/>
+            <w:shd w:fill="FFFFFF"/>
             <w:tcMar>
               <w:top w:w="75" w:type="dxa"/>
               <w:bottom w:w="75" w:type="dxa"/>
@@ -6859,8 +7234,9 @@
             </w:pPr>
             <w:r>
               <w:rPr>
+                <w:rFonts w:ascii="Times New Roman" w:hAnsi="Times New Roman" w:eastAsia="宋体"/>
                 <w:b w:val="0"/>
-                <w:sz w:val="20"/>
+                <w:sz w:val="21"/>
               </w:rPr>
               <w:t>完整目录、下载检查结果、核对意见和版本标记</w:t>
             </w:r>
@@ -6887,6 +7263,9 @@
       </w:r>
     </w:p>
     <w:p>
+      <w:pPr>
+        <w:ind w:firstLine="480"/>
+      </w:pPr>
       <w:r>
         <w:rPr>
           <w:b w:val="0"/>
@@ -6903,6 +7282,9 @@
       </w:r>
     </w:p>
     <w:p>
+      <w:pPr>
+        <w:ind w:firstLine="480"/>
+      </w:pPr>
       <w:r>
         <w:rPr>
           <w:b w:val="0"/>
@@ -6919,6 +7301,9 @@
       </w:r>
     </w:p>
     <w:p>
+      <w:pPr>
+        <w:ind w:firstLine="480"/>
+      </w:pPr>
       <w:r>
         <w:rPr>
           <w:b w:val="0"/>
@@ -6934,12 +7319,15 @@
       </w:pPr>
       <w:r>
         <w:rPr>
-          <w:sz w:val="36"/>
+          <w:sz w:val="32"/>
         </w:rPr>
         <w:t>七 阶段计划与成果管理</w:t>
       </w:r>
     </w:p>
     <w:p>
+      <w:pPr>
+        <w:ind w:firstLine="480"/>
+      </w:pPr>
       <w:r>
         <w:rPr>
           <w:b w:val="0"/>
@@ -6977,7 +7365,7 @@
           <w:tcPr>
             <w:tcW w:type="dxa" w:w="1814"/>
             <w:vAlign w:val="center"/>
-            <w:shd w:fill="233C4A"/>
+            <w:shd w:fill="EDEDED"/>
             <w:tcMar>
               <w:top w:w="75" w:type="dxa"/>
               <w:bottom w:w="75" w:type="dxa"/>
@@ -6992,9 +7380,9 @@
             </w:pPr>
             <w:r>
               <w:rPr>
-                <w:b/>
-                <w:color w:val="FFFFFF"/>
-                <w:sz w:val="20"/>
+                <w:rFonts w:ascii="Times New Roman" w:hAnsi="Times New Roman" w:eastAsia="黑体"/>
+                <w:b w:val="0"/>
+                <w:sz w:val="21"/>
               </w:rPr>
               <w:t>计划阶段</w:t>
             </w:r>
@@ -7004,7 +7392,7 @@
           <w:tcPr>
             <w:tcW w:type="dxa" w:w="1984"/>
             <w:vAlign w:val="center"/>
-            <w:shd w:fill="233C4A"/>
+            <w:shd w:fill="EDEDED"/>
             <w:tcMar>
               <w:top w:w="75" w:type="dxa"/>
               <w:bottom w:w="75" w:type="dxa"/>
@@ -7019,9 +7407,9 @@
             </w:pPr>
             <w:r>
               <w:rPr>
-                <w:b/>
-                <w:color w:val="FFFFFF"/>
-                <w:sz w:val="20"/>
+                <w:rFonts w:ascii="Times New Roman" w:hAnsi="Times New Roman" w:eastAsia="黑体"/>
+                <w:b w:val="0"/>
+                <w:sz w:val="21"/>
               </w:rPr>
               <w:t>人员安排</w:t>
             </w:r>
@@ -7031,7 +7419,7 @@
           <w:tcPr>
             <w:tcW w:type="dxa" w:w="3175"/>
             <w:vAlign w:val="center"/>
-            <w:shd w:fill="233C4A"/>
+            <w:shd w:fill="EDEDED"/>
             <w:tcMar>
               <w:top w:w="75" w:type="dxa"/>
               <w:bottom w:w="75" w:type="dxa"/>
@@ -7046,9 +7434,9 @@
             </w:pPr>
             <w:r>
               <w:rPr>
-                <w:b/>
-                <w:color w:val="FFFFFF"/>
-                <w:sz w:val="20"/>
+                <w:rFonts w:ascii="Times New Roman" w:hAnsi="Times New Roman" w:eastAsia="黑体"/>
+                <w:b w:val="0"/>
+                <w:sz w:val="21"/>
               </w:rPr>
               <w:t>主要工作</w:t>
             </w:r>
@@ -7058,7 +7446,7 @@
           <w:tcPr>
             <w:tcW w:type="dxa" w:w="2324"/>
             <w:vAlign w:val="center"/>
-            <w:shd w:fill="233C4A"/>
+            <w:shd w:fill="EDEDED"/>
             <w:tcMar>
               <w:top w:w="75" w:type="dxa"/>
               <w:bottom w:w="75" w:type="dxa"/>
@@ -7073,9 +7461,9 @@
             </w:pPr>
             <w:r>
               <w:rPr>
-                <w:b/>
-                <w:color w:val="FFFFFF"/>
-                <w:sz w:val="20"/>
+                <w:rFonts w:ascii="Times New Roman" w:hAnsi="Times New Roman" w:eastAsia="黑体"/>
+                <w:b w:val="0"/>
+                <w:sz w:val="21"/>
               </w:rPr>
               <w:t>阶段成果</w:t>
             </w:r>
@@ -7105,8 +7493,9 @@
             </w:pPr>
             <w:r>
               <w:rPr>
+                <w:rFonts w:ascii="Times New Roman" w:hAnsi="Times New Roman" w:eastAsia="宋体"/>
                 <w:b w:val="0"/>
-                <w:sz w:val="20"/>
+                <w:sz w:val="21"/>
               </w:rPr>
               <w:t>10月25—26日</w:t>
               <w:br/>
@@ -7133,8 +7522,9 @@
             </w:pPr>
             <w:r>
               <w:rPr>
+                <w:rFonts w:ascii="Times New Roman" w:hAnsi="Times New Roman" w:eastAsia="宋体"/>
                 <w:b w:val="0"/>
-                <w:sz w:val="20"/>
+                <w:sz w:val="21"/>
               </w:rPr>
               <w:t>李星莹记录</w:t>
               <w:br/>
@@ -7163,8 +7553,9 @@
             </w:pPr>
             <w:r>
               <w:rPr>
+                <w:rFonts w:ascii="Times New Roman" w:hAnsi="Times New Roman" w:eastAsia="宋体"/>
                 <w:b w:val="0"/>
-                <w:sz w:val="20"/>
+                <w:sz w:val="21"/>
               </w:rPr>
               <w:t>完整通关与独立设备检查；处理运行、机关和教学问题</w:t>
             </w:r>
@@ -7189,8 +7580,9 @@
             </w:pPr>
             <w:r>
               <w:rPr>
+                <w:rFonts w:ascii="Times New Roman" w:hAnsi="Times New Roman" w:eastAsia="宋体"/>
                 <w:b w:val="0"/>
-                <w:sz w:val="20"/>
+                <w:sz w:val="21"/>
               </w:rPr>
               <w:t>问题清单、改动说明、复测记录</w:t>
             </w:r>
@@ -7205,7 +7597,7 @@
           <w:tcPr>
             <w:tcW w:type="dxa" w:w="1814"/>
             <w:vAlign w:val="center"/>
-            <w:shd w:fill="F3F6F7"/>
+            <w:shd w:fill="FFFFFF"/>
             <w:tcMar>
               <w:top w:w="75" w:type="dxa"/>
               <w:bottom w:w="75" w:type="dxa"/>
@@ -7220,8 +7612,9 @@
             </w:pPr>
             <w:r>
               <w:rPr>
+                <w:rFonts w:ascii="Times New Roman" w:hAnsi="Times New Roman" w:eastAsia="宋体"/>
                 <w:b w:val="0"/>
-                <w:sz w:val="20"/>
+                <w:sz w:val="21"/>
               </w:rPr>
               <w:t>10月27—28日</w:t>
               <w:br/>
@@ -7233,7 +7626,7 @@
           <w:tcPr>
             <w:tcW w:type="dxa" w:w="1984"/>
             <w:vAlign w:val="center"/>
-            <w:shd w:fill="F3F6F7"/>
+            <w:shd w:fill="FFFFFF"/>
             <w:tcMar>
               <w:top w:w="75" w:type="dxa"/>
               <w:bottom w:w="75" w:type="dxa"/>
@@ -7248,8 +7641,9 @@
             </w:pPr>
             <w:r>
               <w:rPr>
+                <w:rFonts w:ascii="Times New Roman" w:hAnsi="Times New Roman" w:eastAsia="宋体"/>
                 <w:b w:val="0"/>
-                <w:sz w:val="20"/>
+                <w:sz w:val="21"/>
               </w:rPr>
               <w:t>严楷哲确定版本</w:t>
               <w:br/>
@@ -7263,7 +7657,7 @@
           <w:tcPr>
             <w:tcW w:type="dxa" w:w="3175"/>
             <w:vAlign w:val="center"/>
-            <w:shd w:fill="F3F6F7"/>
+            <w:shd w:fill="FFFFFF"/>
             <w:tcMar>
               <w:top w:w="75" w:type="dxa"/>
               <w:bottom w:w="75" w:type="dxa"/>
@@ -7278,8 +7672,9 @@
             </w:pPr>
             <w:r>
               <w:rPr>
+                <w:rFonts w:ascii="Times New Roman" w:hAnsi="Times New Roman" w:eastAsia="宋体"/>
                 <w:b w:val="0"/>
-                <w:sz w:val="20"/>
+                <w:sz w:val="21"/>
               </w:rPr>
               <w:t>核对源码和运行包；同步策划、截图、视频及宣讲材料</w:t>
             </w:r>
@@ -7289,7 +7684,7 @@
           <w:tcPr>
             <w:tcW w:type="dxa" w:w="2324"/>
             <w:vAlign w:val="center"/>
-            <w:shd w:fill="F3F6F7"/>
+            <w:shd w:fill="FFFFFF"/>
             <w:tcMar>
               <w:top w:w="75" w:type="dxa"/>
               <w:bottom w:w="75" w:type="dxa"/>
@@ -7304,8 +7699,9 @@
             </w:pPr>
             <w:r>
               <w:rPr>
+                <w:rFonts w:ascii="Times New Roman" w:hAnsi="Times New Roman" w:eastAsia="宋体"/>
                 <w:b w:val="0"/>
-                <w:sz w:val="20"/>
+                <w:sz w:val="21"/>
               </w:rPr>
               <w:t>对应同一版本的工程、程序与材料目录</w:t>
             </w:r>
@@ -7335,8 +7731,9 @@
             </w:pPr>
             <w:r>
               <w:rPr>
+                <w:rFonts w:ascii="Times New Roman" w:hAnsi="Times New Roman" w:eastAsia="宋体"/>
                 <w:b w:val="0"/>
-                <w:sz w:val="20"/>
+                <w:sz w:val="21"/>
               </w:rPr>
               <w:t>10月29日</w:t>
               <w:br/>
@@ -7363,8 +7760,9 @@
             </w:pPr>
             <w:r>
               <w:rPr>
+                <w:rFonts w:ascii="Times New Roman" w:hAnsi="Times New Roman" w:eastAsia="宋体"/>
                 <w:b w:val="0"/>
-                <w:sz w:val="20"/>
+                <w:sz w:val="21"/>
               </w:rPr>
               <w:t>李星莹组织</w:t>
               <w:br/>
@@ -7391,8 +7789,9 @@
             </w:pPr>
             <w:r>
               <w:rPr>
+                <w:rFonts w:ascii="Times New Roman" w:hAnsi="Times New Roman" w:eastAsia="宋体"/>
                 <w:b w:val="0"/>
-                <w:sz w:val="20"/>
+                <w:sz w:val="21"/>
               </w:rPr>
               <w:t>完整计时，确定主讲、翻页及试玩衔接</w:t>
             </w:r>
@@ -7417,8 +7816,9 @@
             </w:pPr>
             <w:r>
               <w:rPr>
+                <w:rFonts w:ascii="Times New Roman" w:hAnsi="Times New Roman" w:eastAsia="宋体"/>
                 <w:b w:val="0"/>
-                <w:sz w:val="20"/>
+                <w:sz w:val="21"/>
               </w:rPr>
               <w:t>3—5分钟排练记录与待调整事项</w:t>
             </w:r>
@@ -7433,7 +7833,7 @@
           <w:tcPr>
             <w:tcW w:type="dxa" w:w="1814"/>
             <w:vAlign w:val="center"/>
-            <w:shd w:fill="F3F6F7"/>
+            <w:shd w:fill="FFFFFF"/>
             <w:tcMar>
               <w:top w:w="75" w:type="dxa"/>
               <w:bottom w:w="75" w:type="dxa"/>
@@ -7448,8 +7848,9 @@
             </w:pPr>
             <w:r>
               <w:rPr>
+                <w:rFonts w:ascii="Times New Roman" w:hAnsi="Times New Roman" w:eastAsia="宋体"/>
                 <w:b w:val="0"/>
-                <w:sz w:val="20"/>
+                <w:sz w:val="21"/>
               </w:rPr>
               <w:t>10月30—31日</w:t>
               <w:br/>
@@ -7461,7 +7862,7 @@
           <w:tcPr>
             <w:tcW w:type="dxa" w:w="1984"/>
             <w:vAlign w:val="center"/>
-            <w:shd w:fill="F3F6F7"/>
+            <w:shd w:fill="FFFFFF"/>
             <w:tcMar>
               <w:top w:w="75" w:type="dxa"/>
               <w:bottom w:w="75" w:type="dxa"/>
@@ -7476,8 +7877,9 @@
             </w:pPr>
             <w:r>
               <w:rPr>
+                <w:rFonts w:ascii="Times New Roman" w:hAnsi="Times New Roman" w:eastAsia="宋体"/>
                 <w:b w:val="0"/>
-                <w:sz w:val="20"/>
+                <w:sz w:val="21"/>
               </w:rPr>
               <w:t>严楷哲统筹</w:t>
               <w:br/>
@@ -7489,7 +7891,7 @@
           <w:tcPr>
             <w:tcW w:type="dxa" w:w="3175"/>
             <w:vAlign w:val="center"/>
-            <w:shd w:fill="F3F6F7"/>
+            <w:shd w:fill="FFFFFF"/>
             <w:tcMar>
               <w:top w:w="75" w:type="dxa"/>
               <w:bottom w:w="75" w:type="dxa"/>
@@ -7504,8 +7906,9 @@
             </w:pPr>
             <w:r>
               <w:rPr>
+                <w:rFonts w:ascii="Times New Roman" w:hAnsi="Times New Roman" w:eastAsia="宋体"/>
                 <w:b w:val="0"/>
-                <w:sz w:val="20"/>
+                <w:sz w:val="21"/>
               </w:rPr>
               <w:t>检查五类文件、分享下载和实际提交结果</w:t>
             </w:r>
@@ -7515,7 +7918,7 @@
           <w:tcPr>
             <w:tcW w:type="dxa" w:w="2324"/>
             <w:vAlign w:val="center"/>
-            <w:shd w:fill="F3F6F7"/>
+            <w:shd w:fill="FFFFFF"/>
             <w:tcMar>
               <w:top w:w="75" w:type="dxa"/>
               <w:bottom w:w="75" w:type="dxa"/>
@@ -7530,8 +7933,9 @@
             </w:pPr>
             <w:r>
               <w:rPr>
+                <w:rFonts w:ascii="Times New Roman" w:hAnsi="Times New Roman" w:eastAsia="宋体"/>
                 <w:b w:val="0"/>
-                <w:sz w:val="20"/>
+                <w:sz w:val="21"/>
               </w:rPr>
               <w:t>最终目录、备份与交付记录</w:t>
             </w:r>
@@ -7561,8 +7965,9 @@
             </w:pPr>
             <w:r>
               <w:rPr>
+                <w:rFonts w:ascii="Times New Roman" w:hAnsi="Times New Roman" w:eastAsia="宋体"/>
                 <w:b w:val="0"/>
-                <w:sz w:val="20"/>
+                <w:sz w:val="21"/>
               </w:rPr>
               <w:t>11月1日截止前</w:t>
               <w:br/>
@@ -7589,8 +7994,9 @@
             </w:pPr>
             <w:r>
               <w:rPr>
+                <w:rFonts w:ascii="Times New Roman" w:hAnsi="Times New Roman" w:eastAsia="宋体"/>
                 <w:b w:val="0"/>
-                <w:sz w:val="20"/>
+                <w:sz w:val="21"/>
               </w:rPr>
               <w:t>严楷哲确认</w:t>
               <w:br/>
@@ -7617,8 +8023,9 @@
             </w:pPr>
             <w:r>
               <w:rPr>
+                <w:rFonts w:ascii="Times New Roman" w:hAnsi="Times New Roman" w:eastAsia="宋体"/>
                 <w:b w:val="0"/>
-                <w:sz w:val="20"/>
+                <w:sz w:val="21"/>
               </w:rPr>
               <w:t>按手册期限检查文件与提交状态</w:t>
             </w:r>
@@ -7643,8 +8050,9 @@
             </w:pPr>
             <w:r>
               <w:rPr>
+                <w:rFonts w:ascii="Times New Roman" w:hAnsi="Times New Roman" w:eastAsia="宋体"/>
                 <w:b w:val="0"/>
-                <w:sz w:val="20"/>
+                <w:sz w:val="21"/>
               </w:rPr>
               <w:t>最终版本和可访问结果</w:t>
             </w:r>
@@ -7659,7 +8067,7 @@
           <w:tcPr>
             <w:tcW w:type="dxa" w:w="1814"/>
             <w:vAlign w:val="center"/>
-            <w:shd w:fill="F3F6F7"/>
+            <w:shd w:fill="FFFFFF"/>
             <w:tcMar>
               <w:top w:w="75" w:type="dxa"/>
               <w:bottom w:w="75" w:type="dxa"/>
@@ -7674,8 +8082,9 @@
             </w:pPr>
             <w:r>
               <w:rPr>
+                <w:rFonts w:ascii="Times New Roman" w:hAnsi="Times New Roman" w:eastAsia="宋体"/>
                 <w:b w:val="0"/>
-                <w:sz w:val="20"/>
+                <w:sz w:val="21"/>
               </w:rPr>
               <w:t>11月2—8日</w:t>
               <w:br/>
@@ -7687,7 +8096,7 @@
           <w:tcPr>
             <w:tcW w:type="dxa" w:w="1984"/>
             <w:vAlign w:val="center"/>
-            <w:shd w:fill="F3F6F7"/>
+            <w:shd w:fill="FFFFFF"/>
             <w:tcMar>
               <w:top w:w="75" w:type="dxa"/>
               <w:bottom w:w="75" w:type="dxa"/>
@@ -7702,8 +8111,9 @@
             </w:pPr>
             <w:r>
               <w:rPr>
+                <w:rFonts w:ascii="Times New Roman" w:hAnsi="Times New Roman" w:eastAsia="宋体"/>
                 <w:b w:val="0"/>
-                <w:sz w:val="20"/>
+                <w:sz w:val="21"/>
               </w:rPr>
               <w:t>按排练确定分工</w:t>
             </w:r>
@@ -7713,7 +8123,7 @@
           <w:tcPr>
             <w:tcW w:type="dxa" w:w="3175"/>
             <w:vAlign w:val="center"/>
-            <w:shd w:fill="F3F6F7"/>
+            <w:shd w:fill="FFFFFF"/>
             <w:tcMar>
               <w:top w:w="75" w:type="dxa"/>
               <w:bottom w:w="75" w:type="dxa"/>
@@ -7728,8 +8138,9 @@
             </w:pPr>
             <w:r>
               <w:rPr>
+                <w:rFonts w:ascii="Times New Roman" w:hAnsi="Times New Roman" w:eastAsia="宋体"/>
                 <w:b w:val="0"/>
-                <w:sz w:val="20"/>
+                <w:sz w:val="21"/>
               </w:rPr>
               <w:t>离线放映、游戏运行和问答准备；使用统一版本展示</w:t>
             </w:r>
@@ -7739,7 +8150,7 @@
           <w:tcPr>
             <w:tcW w:type="dxa" w:w="2324"/>
             <w:vAlign w:val="center"/>
-            <w:shd w:fill="F3F6F7"/>
+            <w:shd w:fill="FFFFFF"/>
             <w:tcMar>
               <w:top w:w="75" w:type="dxa"/>
               <w:bottom w:w="75" w:type="dxa"/>
@@ -7754,8 +8165,9 @@
             </w:pPr>
             <w:r>
               <w:rPr>
+                <w:rFonts w:ascii="Times New Roman" w:hAnsi="Times New Roman" w:eastAsia="宋体"/>
                 <w:b w:val="0"/>
-                <w:sz w:val="20"/>
+                <w:sz w:val="21"/>
               </w:rPr>
               <w:t>现场材料与设备备份</w:t>
             </w:r>
@@ -7782,6 +8194,9 @@
       </w:r>
     </w:p>
     <w:p>
+      <w:pPr>
+        <w:ind w:firstLine="480"/>
+      </w:pPr>
       <w:r>
         <w:rPr>
           <w:b w:val="0"/>
@@ -7798,6 +8213,9 @@
       </w:r>
     </w:p>
     <w:p>
+      <w:pPr>
+        <w:ind w:firstLine="480"/>
+      </w:pPr>
       <w:r>
         <w:rPr>
           <w:b w:val="0"/>
@@ -7814,6 +8232,9 @@
       </w:r>
     </w:p>
     <w:p>
+      <w:pPr>
+        <w:ind w:firstLine="480"/>
+      </w:pPr>
       <w:r>
         <w:rPr>
           <w:b w:val="0"/>
@@ -8227,13 +8648,14 @@
     <w:rsid w:val="00FC693F"/>
     <w:pPr>
       <w:widowControl/>
-      <w:spacing w:line="350" w:lineRule="exact" w:after="140"/>
+      <w:spacing w:line="360" w:lineRule="exact" w:after="120"/>
     </w:pPr>
     <w:rPr>
-      <w:rFonts w:ascii="Microsoft YaHei" w:hAnsi="Microsoft YaHei" w:eastAsia="微软雅黑"/>
+      <w:rFonts w:ascii="Times New Roman" w:hAnsi="Times New Roman" w:eastAsia="宋体"/>
+      <w:b w:val="0"/>
       <w:i w:val="0"/>
       <w:color w:val="000000"/>
-      <w:sz w:val="22"/>
+      <w:sz w:val="24"/>
     </w:rPr>
   </w:style>
   <w:style w:type="paragraph" w:styleId="Header">
@@ -8251,7 +8673,7 @@
       <w:spacing w:after="140" w:line="240" w:lineRule="exact"/>
     </w:pPr>
     <w:rPr>
-      <w:rFonts w:ascii="Microsoft YaHei" w:hAnsi="Microsoft YaHei" w:eastAsia="微软雅黑"/>
+      <w:rFonts w:ascii="Times New Roman" w:hAnsi="Times New Roman" w:eastAsia="宋体"/>
       <w:b w:val="0"/>
       <w:i w:val="0"/>
       <w:color w:val="000000"/>
@@ -8280,7 +8702,7 @@
       <w:spacing w:after="140" w:line="240" w:lineRule="exact"/>
     </w:pPr>
     <w:rPr>
-      <w:rFonts w:ascii="Microsoft YaHei" w:hAnsi="Microsoft YaHei" w:eastAsia="微软雅黑"/>
+      <w:rFonts w:ascii="Times New Roman" w:hAnsi="Times New Roman" w:eastAsia="宋体"/>
       <w:b w:val="0"/>
       <w:i w:val="0"/>
       <w:color w:val="000000"/>
@@ -8309,12 +8731,12 @@
       <w:outlineLvl w:val="0"/>
     </w:pPr>
     <w:rPr>
-      <w:rFonts w:asciiTheme="majorHAnsi" w:eastAsiaTheme="majorEastAsia" w:hAnsiTheme="majorHAnsi" w:cstheme="majorBidi" w:ascii="Microsoft YaHei" w:hAnsi="Microsoft YaHei" w:eastAsia="微软雅黑"/>
-      <w:b/>
+      <w:rFonts w:ascii="Times New Roman" w:hAnsi="Times New Roman" w:eastAsia="黑体"/>
+      <w:b w:val="0"/>
       <w:bCs/>
       <w:i w:val="0"/>
       <w:color w:val="000000"/>
-      <w:sz w:val="40"/>
+      <w:sz w:val="36"/>
       <w:szCs w:val="28"/>
     </w:rPr>
   </w:style>
@@ -8334,12 +8756,12 @@
       <w:outlineLvl w:val="1"/>
     </w:pPr>
     <w:rPr>
-      <w:rFonts w:asciiTheme="majorHAnsi" w:eastAsiaTheme="majorEastAsia" w:hAnsiTheme="majorHAnsi" w:cstheme="majorBidi" w:ascii="Microsoft YaHei" w:hAnsi="Microsoft YaHei" w:eastAsia="微软雅黑"/>
-      <w:b/>
+      <w:rFonts w:ascii="Times New Roman" w:hAnsi="Times New Roman" w:eastAsia="黑体"/>
+      <w:b w:val="0"/>
       <w:bCs/>
       <w:i w:val="0"/>
       <w:color w:val="000000"/>
-      <w:sz w:val="26"/>
+      <w:sz w:val="28"/>
       <w:szCs w:val="26"/>
     </w:rPr>
   </w:style>
@@ -8359,12 +8781,12 @@
       <w:outlineLvl w:val="2"/>
     </w:pPr>
     <w:rPr>
-      <w:rFonts w:asciiTheme="majorHAnsi" w:eastAsiaTheme="majorEastAsia" w:hAnsiTheme="majorHAnsi" w:cstheme="majorBidi" w:ascii="Microsoft YaHei" w:hAnsi="Microsoft YaHei" w:eastAsia="微软雅黑"/>
-      <w:b/>
+      <w:rFonts w:ascii="Times New Roman" w:hAnsi="Times New Roman" w:eastAsia="黑体"/>
+      <w:b w:val="0"/>
       <w:bCs/>
       <w:i w:val="0"/>
       <w:color w:val="000000"/>
-      <w:sz w:val="23"/>
+      <w:sz w:val="24"/>
     </w:rPr>
   </w:style>
   <w:style w:type="paragraph" w:styleId="Heading4">
@@ -8599,13 +9021,13 @@
       <w:contextualSpacing/>
     </w:pPr>
     <w:rPr>
-      <w:rFonts w:asciiTheme="majorHAnsi" w:eastAsiaTheme="majorEastAsia" w:hAnsiTheme="majorHAnsi" w:cstheme="majorBidi" w:ascii="Microsoft YaHei" w:hAnsi="Microsoft YaHei" w:eastAsia="微软雅黑"/>
-      <w:b/>
+      <w:rFonts w:ascii="Times New Roman" w:hAnsi="Times New Roman" w:eastAsia="黑体"/>
+      <w:b w:val="0"/>
       <w:i w:val="0"/>
       <w:color w:val="000000"/>
       <w:spacing w:val="5"/>
       <w:kern w:val="28"/>
-      <w:sz w:val="56"/>
+      <w:sz w:val="52"/>
       <w:szCs w:val="52"/>
     </w:rPr>
   </w:style>
@@ -8639,7 +9061,7 @@
       <w:spacing w:before="180" w:after="180"/>
     </w:pPr>
     <w:rPr>
-      <w:rFonts w:asciiTheme="majorHAnsi" w:eastAsiaTheme="majorEastAsia" w:hAnsiTheme="majorHAnsi" w:cstheme="majorBidi" w:ascii="Microsoft YaHei" w:hAnsi="Microsoft YaHei" w:eastAsia="微软雅黑"/>
+      <w:rFonts w:ascii="Times New Roman" w:hAnsi="Times New Roman" w:eastAsia="宋体"/>
       <w:b w:val="0"/>
       <w:i w:val="0"/>
       <w:iCs/>
@@ -9042,15 +9464,15 @@
     <w:qFormat/>
     <w:rsid w:val="00FC693F"/>
     <w:pPr>
-      <w:spacing w:line="240" w:lineRule="exact" w:after="140"/>
+      <w:spacing w:line="280" w:lineRule="exact" w:after="140"/>
     </w:pPr>
     <w:rPr>
-      <w:rFonts w:ascii="Microsoft YaHei" w:hAnsi="Microsoft YaHei" w:eastAsia="微软雅黑"/>
+      <w:rFonts w:ascii="Times New Roman" w:hAnsi="Times New Roman" w:eastAsia="宋体"/>
       <w:b w:val="0"/>
       <w:bCs/>
       <w:i w:val="0"/>
       <w:color w:val="000000"/>
-      <w:sz w:val="18"/>
+      <w:sz w:val="21"/>
       <w:szCs w:val="18"/>
     </w:rPr>
   </w:style>

</xml_diff>

<commit_message>
Add restrained blue and gold report colors
</commit_message>
<xml_diff>
--- a/docs/design/game-design.docx
+++ b/docs/design/game-design.docx
@@ -180,7 +180,7 @@
           <w:tcPr>
             <w:tcW w:type="dxa" w:w="1984"/>
             <w:vAlign w:val="center"/>
-            <w:shd w:fill="EDEDED"/>
+            <w:shd w:fill="244E60"/>
             <w:tcMar>
               <w:top w:w="75" w:type="dxa"/>
               <w:bottom w:w="75" w:type="dxa"/>
@@ -197,6 +197,7 @@
               <w:rPr>
                 <w:rFonts w:ascii="Times New Roman" w:hAnsi="Times New Roman" w:eastAsia="黑体"/>
                 <w:b w:val="0"/>
+                <w:color w:val="FFFFFF"/>
                 <w:sz w:val="21"/>
               </w:rPr>
               <w:t>作品信息</w:t>
@@ -207,7 +208,7 @@
           <w:tcPr>
             <w:tcW w:type="dxa" w:w="7313"/>
             <w:vAlign w:val="center"/>
-            <w:shd w:fill="EDEDED"/>
+            <w:shd w:fill="244E60"/>
             <w:tcMar>
               <w:top w:w="75" w:type="dxa"/>
               <w:bottom w:w="75" w:type="dxa"/>
@@ -224,6 +225,7 @@
               <w:rPr>
                 <w:rFonts w:ascii="Times New Roman" w:hAnsi="Times New Roman" w:eastAsia="黑体"/>
                 <w:b w:val="0"/>
+                <w:color w:val="FFFFFF"/>
                 <w:sz w:val="21"/>
               </w:rPr>
               <w:t>当前版本</w:t>
@@ -239,7 +241,7 @@
           <w:tcPr>
             <w:tcW w:type="dxa" w:w="1984"/>
             <w:vAlign w:val="center"/>
-            <w:shd w:fill="FFFFFF"/>
+            <w:shd w:fill="FAF4E7"/>
             <w:tcMar>
               <w:top w:w="75" w:type="dxa"/>
               <w:bottom w:w="75" w:type="dxa"/>
@@ -256,6 +258,7 @@
               <w:rPr>
                 <w:rFonts w:ascii="Times New Roman" w:hAnsi="Times New Roman" w:eastAsia="宋体"/>
                 <w:b w:val="0"/>
+                <w:color w:val="000000"/>
                 <w:sz w:val="21"/>
               </w:rPr>
               <w:t>类型与操作</w:t>
@@ -266,7 +269,7 @@
           <w:tcPr>
             <w:tcW w:type="dxa" w:w="7313"/>
             <w:vAlign w:val="center"/>
-            <w:shd w:fill="FFFFFF"/>
+            <w:shd w:fill="F0F6F8"/>
             <w:tcMar>
               <w:top w:w="75" w:type="dxa"/>
               <w:bottom w:w="75" w:type="dxa"/>
@@ -283,6 +286,7 @@
               <w:rPr>
                 <w:rFonts w:ascii="Times New Roman" w:hAnsi="Times New Roman" w:eastAsia="宋体"/>
                 <w:b w:val="0"/>
+                <w:color w:val="000000"/>
                 <w:sz w:val="21"/>
               </w:rPr>
               <w:t>单人节奏平台跳跃；左右移动与地面单次跳跃</w:t>
@@ -298,7 +302,7 @@
           <w:tcPr>
             <w:tcW w:type="dxa" w:w="1984"/>
             <w:vAlign w:val="center"/>
-            <w:shd w:fill="FFFFFF"/>
+            <w:shd w:fill="FAF4E7"/>
             <w:tcMar>
               <w:top w:w="75" w:type="dxa"/>
               <w:bottom w:w="75" w:type="dxa"/>
@@ -315,6 +319,7 @@
               <w:rPr>
                 <w:rFonts w:ascii="Times New Roman" w:hAnsi="Times New Roman" w:eastAsia="宋体"/>
                 <w:b w:val="0"/>
+                <w:color w:val="000000"/>
                 <w:sz w:val="21"/>
               </w:rPr>
               <w:t>内容规模</w:t>
@@ -342,6 +347,7 @@
               <w:rPr>
                 <w:rFonts w:ascii="Times New Roman" w:hAnsi="Times New Roman" w:eastAsia="宋体"/>
                 <w:b w:val="0"/>
+                <w:color w:val="000000"/>
                 <w:sz w:val="21"/>
               </w:rPr>
               <w:t>三间房间，四座光桥，四处激光</w:t>
@@ -357,7 +363,7 @@
           <w:tcPr>
             <w:tcW w:type="dxa" w:w="1984"/>
             <w:vAlign w:val="center"/>
-            <w:shd w:fill="FFFFFF"/>
+            <w:shd w:fill="FAF4E7"/>
             <w:tcMar>
               <w:top w:w="75" w:type="dxa"/>
               <w:bottom w:w="75" w:type="dxa"/>
@@ -374,6 +380,7 @@
               <w:rPr>
                 <w:rFonts w:ascii="Times New Roman" w:hAnsi="Times New Roman" w:eastAsia="宋体"/>
                 <w:b w:val="0"/>
+                <w:color w:val="000000"/>
                 <w:sz w:val="21"/>
               </w:rPr>
               <w:t>核心目标</w:t>
@@ -384,7 +391,7 @@
           <w:tcPr>
             <w:tcW w:type="dxa" w:w="7313"/>
             <w:vAlign w:val="center"/>
-            <w:shd w:fill="FFFFFF"/>
+            <w:shd w:fill="F0F6F8"/>
             <w:tcMar>
               <w:top w:w="75" w:type="dxa"/>
               <w:bottom w:w="75" w:type="dxa"/>
@@ -401,6 +408,7 @@
               <w:rPr>
                 <w:rFonts w:ascii="Times New Roman" w:hAnsi="Times New Roman" w:eastAsia="宋体"/>
                 <w:b w:val="0"/>
+                <w:color w:val="000000"/>
                 <w:sz w:val="21"/>
               </w:rPr>
               <w:t>完成房间内全部光桥的修复，再抵达出口</w:t>
@@ -416,7 +424,7 @@
           <w:tcPr>
             <w:tcW w:type="dxa" w:w="1984"/>
             <w:vAlign w:val="center"/>
-            <w:shd w:fill="FFFFFF"/>
+            <w:shd w:fill="FAF4E7"/>
             <w:tcMar>
               <w:top w:w="75" w:type="dxa"/>
               <w:bottom w:w="75" w:type="dxa"/>
@@ -433,6 +441,7 @@
               <w:rPr>
                 <w:rFonts w:ascii="Times New Roman" w:hAnsi="Times New Roman" w:eastAsia="宋体"/>
                 <w:b w:val="0"/>
+                <w:color w:val="000000"/>
                 <w:sz w:val="21"/>
               </w:rPr>
               <w:t>运行与实现</w:t>
@@ -460,6 +469,7 @@
               <w:rPr>
                 <w:rFonts w:ascii="Times New Roman" w:hAnsi="Times New Roman" w:eastAsia="宋体"/>
                 <w:b w:val="0"/>
+                <w:color w:val="000000"/>
                 <w:sz w:val="21"/>
               </w:rPr>
               <w:t>Windows x64；Godot 4.4.1 Standard；GDScript</w:t>
@@ -515,7 +525,7 @@
           <w:tcPr>
             <w:tcW w:type="dxa" w:w="2154"/>
             <w:vAlign w:val="center"/>
-            <w:shd w:fill="EDEDED"/>
+            <w:shd w:fill="244E60"/>
             <w:tcMar>
               <w:top w:w="75" w:type="dxa"/>
               <w:bottom w:w="75" w:type="dxa"/>
@@ -532,6 +542,7 @@
               <w:rPr>
                 <w:rFonts w:ascii="Times New Roman" w:hAnsi="Times New Roman" w:eastAsia="黑体"/>
                 <w:b w:val="0"/>
+                <w:color w:val="FFFFFF"/>
                 <w:sz w:val="21"/>
               </w:rPr>
               <w:t>章节</w:t>
@@ -542,7 +553,7 @@
           <w:tcPr>
             <w:tcW w:type="dxa" w:w="6180"/>
             <w:vAlign w:val="center"/>
-            <w:shd w:fill="EDEDED"/>
+            <w:shd w:fill="244E60"/>
             <w:tcMar>
               <w:top w:w="75" w:type="dxa"/>
               <w:bottom w:w="75" w:type="dxa"/>
@@ -559,6 +570,7 @@
               <w:rPr>
                 <w:rFonts w:ascii="Times New Roman" w:hAnsi="Times New Roman" w:eastAsia="黑体"/>
                 <w:b w:val="0"/>
+                <w:color w:val="FFFFFF"/>
                 <w:sz w:val="21"/>
               </w:rPr>
               <w:t>主要内容</w:t>
@@ -569,7 +581,7 @@
           <w:tcPr>
             <w:tcW w:type="dxa" w:w="964"/>
             <w:vAlign w:val="center"/>
-            <w:shd w:fill="EDEDED"/>
+            <w:shd w:fill="244E60"/>
             <w:tcMar>
               <w:top w:w="75" w:type="dxa"/>
               <w:bottom w:w="75" w:type="dxa"/>
@@ -586,6 +598,7 @@
               <w:rPr>
                 <w:rFonts w:ascii="Times New Roman" w:hAnsi="Times New Roman" w:eastAsia="黑体"/>
                 <w:b w:val="0"/>
+                <w:color w:val="FFFFFF"/>
                 <w:sz w:val="21"/>
               </w:rPr>
               <w:t>页码</w:t>
@@ -601,7 +614,7 @@
           <w:tcPr>
             <w:tcW w:type="dxa" w:w="2154"/>
             <w:vAlign w:val="center"/>
-            <w:shd w:fill="FFFFFF"/>
+            <w:shd w:fill="FAF4E7"/>
             <w:tcMar>
               <w:top w:w="75" w:type="dxa"/>
               <w:bottom w:w="75" w:type="dxa"/>
@@ -618,6 +631,7 @@
               <w:rPr>
                 <w:rFonts w:ascii="Times New Roman" w:hAnsi="Times New Roman" w:eastAsia="宋体"/>
                 <w:b w:val="0"/>
+                <w:color w:val="000000"/>
                 <w:sz w:val="21"/>
               </w:rPr>
               <w:t>一 设计立意</w:t>
@@ -628,7 +642,7 @@
           <w:tcPr>
             <w:tcW w:type="dxa" w:w="6180"/>
             <w:vAlign w:val="center"/>
-            <w:shd w:fill="FFFFFF"/>
+            <w:shd w:fill="F0F6F8"/>
             <w:tcMar>
               <w:top w:w="75" w:type="dxa"/>
               <w:bottom w:w="75" w:type="dxa"/>
@@ -645,6 +659,7 @@
               <w:rPr>
                 <w:rFonts w:ascii="Times New Roman" w:hAnsi="Times New Roman" w:eastAsia="宋体"/>
                 <w:b w:val="0"/>
+                <w:color w:val="000000"/>
                 <w:sz w:val="21"/>
               </w:rPr>
               <w:t>主题表达、环境叙事与操作取舍</w:t>
@@ -655,7 +670,7 @@
           <w:tcPr>
             <w:tcW w:type="dxa" w:w="964"/>
             <w:vAlign w:val="center"/>
-            <w:shd w:fill="FFFFFF"/>
+            <w:shd w:fill="F0F6F8"/>
             <w:tcMar>
               <w:top w:w="75" w:type="dxa"/>
               <w:bottom w:w="75" w:type="dxa"/>
@@ -672,6 +687,7 @@
               <w:rPr>
                 <w:rFonts w:ascii="Times New Roman" w:hAnsi="Times New Roman" w:eastAsia="宋体"/>
                 <w:b w:val="0"/>
+                <w:color w:val="000000"/>
                 <w:sz w:val="21"/>
               </w:rPr>
               <w:t>3</w:t>
@@ -687,7 +703,7 @@
           <w:tcPr>
             <w:tcW w:type="dxa" w:w="2154"/>
             <w:vAlign w:val="center"/>
-            <w:shd w:fill="FFFFFF"/>
+            <w:shd w:fill="FAF4E7"/>
             <w:tcMar>
               <w:top w:w="75" w:type="dxa"/>
               <w:bottom w:w="75" w:type="dxa"/>
@@ -704,6 +720,7 @@
               <w:rPr>
                 <w:rFonts w:ascii="Times New Roman" w:hAnsi="Times New Roman" w:eastAsia="宋体"/>
                 <w:b w:val="0"/>
+                <w:color w:val="000000"/>
                 <w:sz w:val="21"/>
               </w:rPr>
               <w:t>二 核心机制</w:t>
@@ -731,6 +748,7 @@
               <w:rPr>
                 <w:rFonts w:ascii="Times New Roman" w:hAnsi="Times New Roman" w:eastAsia="宋体"/>
                 <w:b w:val="0"/>
+                <w:color w:val="000000"/>
                 <w:sz w:val="21"/>
               </w:rPr>
               <w:t>修桥过程、参数依据、容错与计分</w:t>
@@ -758,6 +776,7 @@
               <w:rPr>
                 <w:rFonts w:ascii="Times New Roman" w:hAnsi="Times New Roman" w:eastAsia="宋体"/>
                 <w:b w:val="0"/>
+                <w:color w:val="000000"/>
                 <w:sz w:val="21"/>
               </w:rPr>
               <w:t>4—6</w:t>
@@ -773,7 +792,7 @@
           <w:tcPr>
             <w:tcW w:type="dxa" w:w="2154"/>
             <w:vAlign w:val="center"/>
-            <w:shd w:fill="FFFFFF"/>
+            <w:shd w:fill="FAF4E7"/>
             <w:tcMar>
               <w:top w:w="75" w:type="dxa"/>
               <w:bottom w:w="75" w:type="dxa"/>
@@ -790,6 +809,7 @@
               <w:rPr>
                 <w:rFonts w:ascii="Times New Roman" w:hAnsi="Times New Roman" w:eastAsia="宋体"/>
                 <w:b w:val="0"/>
+                <w:color w:val="000000"/>
                 <w:sz w:val="21"/>
               </w:rPr>
               <w:t>三 关卡设计</w:t>
@@ -800,7 +820,7 @@
           <w:tcPr>
             <w:tcW w:type="dxa" w:w="6180"/>
             <w:vAlign w:val="center"/>
-            <w:shd w:fill="FFFFFF"/>
+            <w:shd w:fill="F0F6F8"/>
             <w:tcMar>
               <w:top w:w="75" w:type="dxa"/>
               <w:bottom w:w="75" w:type="dxa"/>
@@ -817,6 +837,7 @@
               <w:rPr>
                 <w:rFonts w:ascii="Times New Roman" w:hAnsi="Times New Roman" w:eastAsia="宋体"/>
                 <w:b w:val="0"/>
+                <w:color w:val="000000"/>
                 <w:sz w:val="21"/>
               </w:rPr>
               <w:t>空间结构与三个房间的教学安排</w:t>
@@ -827,7 +848,7 @@
           <w:tcPr>
             <w:tcW w:type="dxa" w:w="964"/>
             <w:vAlign w:val="center"/>
-            <w:shd w:fill="FFFFFF"/>
+            <w:shd w:fill="F0F6F8"/>
             <w:tcMar>
               <w:top w:w="75" w:type="dxa"/>
               <w:bottom w:w="75" w:type="dxa"/>
@@ -844,6 +865,7 @@
               <w:rPr>
                 <w:rFonts w:ascii="Times New Roman" w:hAnsi="Times New Roman" w:eastAsia="宋体"/>
                 <w:b w:val="0"/>
+                <w:color w:val="000000"/>
                 <w:sz w:val="21"/>
               </w:rPr>
               <w:t>7—9</w:t>
@@ -859,7 +881,7 @@
           <w:tcPr>
             <w:tcW w:type="dxa" w:w="2154"/>
             <w:vAlign w:val="center"/>
-            <w:shd w:fill="FFFFFF"/>
+            <w:shd w:fill="FAF4E7"/>
             <w:tcMar>
               <w:top w:w="75" w:type="dxa"/>
               <w:bottom w:w="75" w:type="dxa"/>
@@ -876,6 +898,7 @@
               <w:rPr>
                 <w:rFonts w:ascii="Times New Roman" w:hAnsi="Times New Roman" w:eastAsia="宋体"/>
                 <w:b w:val="0"/>
+                <w:color w:val="000000"/>
                 <w:sz w:val="21"/>
               </w:rPr>
               <w:t>四 视听与交互</w:t>
@@ -903,6 +926,7 @@
               <w:rPr>
                 <w:rFonts w:ascii="Times New Roman" w:hAnsi="Times New Roman" w:eastAsia="宋体"/>
                 <w:b w:val="0"/>
+                <w:color w:val="000000"/>
                 <w:sz w:val="21"/>
               </w:rPr>
               <w:t>图形状态、界面信息、配乐与校准</w:t>
@@ -930,6 +954,7 @@
               <w:rPr>
                 <w:rFonts w:ascii="Times New Roman" w:hAnsi="Times New Roman" w:eastAsia="宋体"/>
                 <w:b w:val="0"/>
+                <w:color w:val="000000"/>
                 <w:sz w:val="21"/>
               </w:rPr>
               <w:t>10—11</w:t>
@@ -945,7 +970,7 @@
           <w:tcPr>
             <w:tcW w:type="dxa" w:w="2154"/>
             <w:vAlign w:val="center"/>
-            <w:shd w:fill="FFFFFF"/>
+            <w:shd w:fill="FAF4E7"/>
             <w:tcMar>
               <w:top w:w="75" w:type="dxa"/>
               <w:bottom w:w="75" w:type="dxa"/>
@@ -962,6 +987,7 @@
               <w:rPr>
                 <w:rFonts w:ascii="Times New Roman" w:hAnsi="Times New Roman" w:eastAsia="宋体"/>
                 <w:b w:val="0"/>
+                <w:color w:val="000000"/>
                 <w:sz w:val="21"/>
               </w:rPr>
               <w:t>五 实现方式</w:t>
@@ -972,7 +998,7 @@
           <w:tcPr>
             <w:tcW w:type="dxa" w:w="6180"/>
             <w:vAlign w:val="center"/>
-            <w:shd w:fill="FFFFFF"/>
+            <w:shd w:fill="F0F6F8"/>
             <w:tcMar>
               <w:top w:w="75" w:type="dxa"/>
               <w:bottom w:w="75" w:type="dxa"/>
@@ -989,6 +1015,7 @@
               <w:rPr>
                 <w:rFonts w:ascii="Times New Roman" w:hAnsi="Times New Roman" w:eastAsia="宋体"/>
                 <w:b w:val="0"/>
+                <w:color w:val="000000"/>
                 <w:sz w:val="21"/>
               </w:rPr>
               <w:t>统一时间参照、模块与状态一致性</w:t>
@@ -999,7 +1026,7 @@
           <w:tcPr>
             <w:tcW w:type="dxa" w:w="964"/>
             <w:vAlign w:val="center"/>
-            <w:shd w:fill="FFFFFF"/>
+            <w:shd w:fill="F0F6F8"/>
             <w:tcMar>
               <w:top w:w="75" w:type="dxa"/>
               <w:bottom w:w="75" w:type="dxa"/>
@@ -1016,6 +1043,7 @@
               <w:rPr>
                 <w:rFonts w:ascii="Times New Roman" w:hAnsi="Times New Roman" w:eastAsia="宋体"/>
                 <w:b w:val="0"/>
+                <w:color w:val="000000"/>
                 <w:sz w:val="21"/>
               </w:rPr>
               <w:t>12</w:t>
@@ -1031,7 +1059,7 @@
           <w:tcPr>
             <w:tcW w:type="dxa" w:w="2154"/>
             <w:vAlign w:val="center"/>
-            <w:shd w:fill="FFFFFF"/>
+            <w:shd w:fill="FAF4E7"/>
             <w:tcMar>
               <w:top w:w="75" w:type="dxa"/>
               <w:bottom w:w="75" w:type="dxa"/>
@@ -1048,6 +1076,7 @@
               <w:rPr>
                 <w:rFonts w:ascii="Times New Roman" w:hAnsi="Times New Roman" w:eastAsia="宋体"/>
                 <w:b w:val="0"/>
+                <w:color w:val="000000"/>
                 <w:sz w:val="21"/>
               </w:rPr>
               <w:t>六 完成情况与验证</w:t>
@@ -1075,6 +1104,7 @@
               <w:rPr>
                 <w:rFonts w:ascii="Times New Roman" w:hAnsi="Times New Roman" w:eastAsia="宋体"/>
                 <w:b w:val="0"/>
+                <w:color w:val="000000"/>
                 <w:sz w:val="21"/>
               </w:rPr>
               <w:t>已有结果、证据范围与后续完善</w:t>
@@ -1102,6 +1132,7 @@
               <w:rPr>
                 <w:rFonts w:ascii="Times New Roman" w:hAnsi="Times New Roman" w:eastAsia="宋体"/>
                 <w:b w:val="0"/>
+                <w:color w:val="000000"/>
                 <w:sz w:val="21"/>
               </w:rPr>
               <w:t>13</w:t>
@@ -1117,7 +1148,7 @@
           <w:tcPr>
             <w:tcW w:type="dxa" w:w="2154"/>
             <w:vAlign w:val="center"/>
-            <w:shd w:fill="FFFFFF"/>
+            <w:shd w:fill="FAF4E7"/>
             <w:tcMar>
               <w:top w:w="75" w:type="dxa"/>
               <w:bottom w:w="75" w:type="dxa"/>
@@ -1134,6 +1165,7 @@
               <w:rPr>
                 <w:rFonts w:ascii="Times New Roman" w:hAnsi="Times New Roman" w:eastAsia="宋体"/>
                 <w:b w:val="0"/>
+                <w:color w:val="000000"/>
                 <w:sz w:val="21"/>
               </w:rPr>
               <w:t>附录 团队与实施</w:t>
@@ -1144,7 +1176,7 @@
           <w:tcPr>
             <w:tcW w:type="dxa" w:w="6180"/>
             <w:vAlign w:val="center"/>
-            <w:shd w:fill="FFFFFF"/>
+            <w:shd w:fill="F0F6F8"/>
             <w:tcMar>
               <w:top w:w="75" w:type="dxa"/>
               <w:bottom w:w="75" w:type="dxa"/>
@@ -1161,6 +1193,7 @@
               <w:rPr>
                 <w:rFonts w:ascii="Times New Roman" w:hAnsi="Times New Roman" w:eastAsia="宋体"/>
                 <w:b w:val="0"/>
+                <w:color w:val="000000"/>
                 <w:sz w:val="21"/>
               </w:rPr>
               <w:t>职责总览、个人任务、协作及阶段安排</w:t>
@@ -1171,7 +1204,7 @@
           <w:tcPr>
             <w:tcW w:type="dxa" w:w="964"/>
             <w:vAlign w:val="center"/>
-            <w:shd w:fill="FFFFFF"/>
+            <w:shd w:fill="F0F6F8"/>
             <w:tcMar>
               <w:top w:w="75" w:type="dxa"/>
               <w:bottom w:w="75" w:type="dxa"/>
@@ -1188,6 +1221,7 @@
               <w:rPr>
                 <w:rFonts w:ascii="Times New Roman" w:hAnsi="Times New Roman" w:eastAsia="宋体"/>
                 <w:b w:val="0"/>
+                <w:color w:val="000000"/>
                 <w:sz w:val="21"/>
               </w:rPr>
               <w:t>14—18</w:t>
@@ -1312,7 +1346,7 @@
           <w:tcPr>
             <w:tcW w:type="dxa" w:w="2098"/>
             <w:vAlign w:val="center"/>
-            <w:shd w:fill="EDEDED"/>
+            <w:shd w:fill="244E60"/>
             <w:tcMar>
               <w:top w:w="75" w:type="dxa"/>
               <w:bottom w:w="75" w:type="dxa"/>
@@ -1329,6 +1363,7 @@
               <w:rPr>
                 <w:rFonts w:ascii="Times New Roman" w:hAnsi="Times New Roman" w:eastAsia="黑体"/>
                 <w:b w:val="0"/>
+                <w:color w:val="FFFFFF"/>
                 <w:sz w:val="21"/>
               </w:rPr>
               <w:t>保留的体验</w:t>
@@ -1339,7 +1374,7 @@
           <w:tcPr>
             <w:tcW w:type="dxa" w:w="3118"/>
             <w:vAlign w:val="center"/>
-            <w:shd w:fill="EDEDED"/>
+            <w:shd w:fill="244E60"/>
             <w:tcMar>
               <w:top w:w="75" w:type="dxa"/>
               <w:bottom w:w="75" w:type="dxa"/>
@@ -1356,6 +1391,7 @@
               <w:rPr>
                 <w:rFonts w:ascii="Times New Roman" w:hAnsi="Times New Roman" w:eastAsia="黑体"/>
                 <w:b w:val="0"/>
+                <w:color w:val="FFFFFF"/>
                 <w:sz w:val="21"/>
               </w:rPr>
               <w:t>落实方式</w:t>
@@ -1366,7 +1402,7 @@
           <w:tcPr>
             <w:tcW w:type="dxa" w:w="4082"/>
             <w:vAlign w:val="center"/>
-            <w:shd w:fill="EDEDED"/>
+            <w:shd w:fill="244E60"/>
             <w:tcMar>
               <w:top w:w="75" w:type="dxa"/>
               <w:bottom w:w="75" w:type="dxa"/>
@@ -1383,6 +1419,7 @@
               <w:rPr>
                 <w:rFonts w:ascii="Times New Roman" w:hAnsi="Times New Roman" w:eastAsia="黑体"/>
                 <w:b w:val="0"/>
+                <w:color w:val="FFFFFF"/>
                 <w:sz w:val="21"/>
               </w:rPr>
               <w:t>范围选择</w:t>
@@ -1398,7 +1435,7 @@
           <w:tcPr>
             <w:tcW w:type="dxa" w:w="2098"/>
             <w:vAlign w:val="center"/>
-            <w:shd w:fill="FFFFFF"/>
+            <w:shd w:fill="FAF4E7"/>
             <w:tcMar>
               <w:top w:w="75" w:type="dxa"/>
               <w:bottom w:w="75" w:type="dxa"/>
@@ -1415,6 +1452,7 @@
               <w:rPr>
                 <w:rFonts w:ascii="Times New Roman" w:hAnsi="Times New Roman" w:eastAsia="宋体"/>
                 <w:b w:val="0"/>
+                <w:color w:val="000000"/>
                 <w:sz w:val="21"/>
               </w:rPr>
               <w:t>可预判的运动</w:t>
@@ -1425,7 +1463,7 @@
           <w:tcPr>
             <w:tcW w:type="dxa" w:w="3118"/>
             <w:vAlign w:val="center"/>
-            <w:shd w:fill="FFFFFF"/>
+            <w:shd w:fill="F0F6F8"/>
             <w:tcMar>
               <w:top w:w="75" w:type="dxa"/>
               <w:bottom w:w="75" w:type="dxa"/>
@@ -1442,6 +1480,7 @@
               <w:rPr>
                 <w:rFonts w:ascii="Times New Roman" w:hAnsi="Times New Roman" w:eastAsia="宋体"/>
                 <w:b w:val="0"/>
+                <w:color w:val="000000"/>
                 <w:sz w:val="21"/>
               </w:rPr>
               <w:t>普通跳跃与踩拍跳跃共用轨迹</w:t>
@@ -1452,7 +1491,7 @@
           <w:tcPr>
             <w:tcW w:type="dxa" w:w="4082"/>
             <w:vAlign w:val="center"/>
-            <w:shd w:fill="FFFFFF"/>
+            <w:shd w:fill="F0F6F8"/>
             <w:tcMar>
               <w:top w:w="75" w:type="dxa"/>
               <w:bottom w:w="75" w:type="dxa"/>
@@ -1469,6 +1508,7 @@
               <w:rPr>
                 <w:rFonts w:ascii="Times New Roman" w:hAnsi="Times New Roman" w:eastAsia="宋体"/>
                 <w:b w:val="0"/>
+                <w:color w:val="000000"/>
                 <w:sz w:val="21"/>
               </w:rPr>
               <w:t>节拍改变通路状态，不改变跳跃高度</w:t>
@@ -1484,7 +1524,7 @@
           <w:tcPr>
             <w:tcW w:type="dxa" w:w="2098"/>
             <w:vAlign w:val="center"/>
-            <w:shd w:fill="FFFFFF"/>
+            <w:shd w:fill="FAF4E7"/>
             <w:tcMar>
               <w:top w:w="75" w:type="dxa"/>
               <w:bottom w:w="75" w:type="dxa"/>
@@ -1501,6 +1541,7 @@
               <w:rPr>
                 <w:rFonts w:ascii="Times New Roman" w:hAnsi="Times New Roman" w:eastAsia="宋体"/>
                 <w:b w:val="0"/>
+                <w:color w:val="000000"/>
                 <w:sz w:val="21"/>
               </w:rPr>
               <w:t>可观察的进展</w:t>
@@ -1528,6 +1569,7 @@
               <w:rPr>
                 <w:rFonts w:ascii="Times New Roman" w:hAnsi="Times New Roman" w:eastAsia="宋体"/>
                 <w:b w:val="0"/>
+                <w:color w:val="000000"/>
                 <w:sz w:val="21"/>
               </w:rPr>
               <w:t>金桥、共鸣与环境颜色对应修复</w:t>
@@ -1555,6 +1597,7 @@
               <w:rPr>
                 <w:rFonts w:ascii="Times New Roman" w:hAnsi="Times New Roman" w:eastAsia="宋体"/>
                 <w:b w:val="0"/>
+                <w:color w:val="000000"/>
                 <w:sz w:val="21"/>
               </w:rPr>
               <w:t>叙事通过操作和空间变化展开</w:t>
@@ -1570,7 +1613,7 @@
           <w:tcPr>
             <w:tcW w:type="dxa" w:w="2098"/>
             <w:vAlign w:val="center"/>
-            <w:shd w:fill="FFFFFF"/>
+            <w:shd w:fill="FAF4E7"/>
             <w:tcMar>
               <w:top w:w="75" w:type="dxa"/>
               <w:bottom w:w="75" w:type="dxa"/>
@@ -1587,6 +1630,7 @@
               <w:rPr>
                 <w:rFonts w:ascii="Times New Roman" w:hAnsi="Times New Roman" w:eastAsia="宋体"/>
                 <w:b w:val="0"/>
+                <w:color w:val="000000"/>
                 <w:sz w:val="21"/>
               </w:rPr>
               <w:t>局部的行动压力</w:t>
@@ -1597,7 +1641,7 @@
           <w:tcPr>
             <w:tcW w:type="dxa" w:w="3118"/>
             <w:vAlign w:val="center"/>
-            <w:shd w:fill="FFFFFF"/>
+            <w:shd w:fill="F0F6F8"/>
             <w:tcMar>
               <w:top w:w="75" w:type="dxa"/>
               <w:bottom w:w="75" w:type="dxa"/>
@@ -1614,6 +1658,7 @@
               <w:rPr>
                 <w:rFonts w:ascii="Times New Roman" w:hAnsi="Times New Roman" w:eastAsia="宋体"/>
                 <w:b w:val="0"/>
+                <w:color w:val="000000"/>
                 <w:sz w:val="21"/>
               </w:rPr>
               <w:t>临时桥限时，固定平台可等待</w:t>
@@ -1624,7 +1669,7 @@
           <w:tcPr>
             <w:tcW w:type="dxa" w:w="4082"/>
             <w:vAlign w:val="center"/>
-            <w:shd w:fill="FFFFFF"/>
+            <w:shd w:fill="F0F6F8"/>
             <w:tcMar>
               <w:top w:w="75" w:type="dxa"/>
               <w:bottom w:w="75" w:type="dxa"/>
@@ -1641,6 +1686,7 @@
               <w:rPr>
                 <w:rFonts w:ascii="Times New Roman" w:hAnsi="Times New Roman" w:eastAsia="宋体"/>
                 <w:b w:val="0"/>
+                <w:color w:val="000000"/>
                 <w:sz w:val="21"/>
               </w:rPr>
               <w:t>不设置整间房间的通关倒计时</w:t>
@@ -1895,7 +1941,7 @@
           <w:tcPr>
             <w:tcW w:type="dxa" w:w="1814"/>
             <w:vAlign w:val="center"/>
-            <w:shd w:fill="EDEDED"/>
+            <w:shd w:fill="244E60"/>
             <w:tcMar>
               <w:top w:w="75" w:type="dxa"/>
               <w:bottom w:w="75" w:type="dxa"/>
@@ -1912,6 +1958,7 @@
               <w:rPr>
                 <w:rFonts w:ascii="Times New Roman" w:hAnsi="Times New Roman" w:eastAsia="黑体"/>
                 <w:b w:val="0"/>
+                <w:color w:val="FFFFFF"/>
                 <w:sz w:val="21"/>
               </w:rPr>
               <w:t>参数</w:t>
@@ -1922,7 +1969,7 @@
           <w:tcPr>
             <w:tcW w:type="dxa" w:w="3345"/>
             <w:vAlign w:val="center"/>
-            <w:shd w:fill="EDEDED"/>
+            <w:shd w:fill="244E60"/>
             <w:tcMar>
               <w:top w:w="75" w:type="dxa"/>
               <w:bottom w:w="75" w:type="dxa"/>
@@ -1939,6 +1986,7 @@
               <w:rPr>
                 <w:rFonts w:ascii="Times New Roman" w:hAnsi="Times New Roman" w:eastAsia="黑体"/>
                 <w:b w:val="0"/>
+                <w:color w:val="FFFFFF"/>
                 <w:sz w:val="21"/>
               </w:rPr>
               <w:t>当前值</w:t>
@@ -1949,7 +1997,7 @@
           <w:tcPr>
             <w:tcW w:type="dxa" w:w="4139"/>
             <w:vAlign w:val="center"/>
-            <w:shd w:fill="EDEDED"/>
+            <w:shd w:fill="244E60"/>
             <w:tcMar>
               <w:top w:w="75" w:type="dxa"/>
               <w:bottom w:w="75" w:type="dxa"/>
@@ -1966,6 +2014,7 @@
               <w:rPr>
                 <w:rFonts w:ascii="Times New Roman" w:hAnsi="Times New Roman" w:eastAsia="黑体"/>
                 <w:b w:val="0"/>
+                <w:color w:val="FFFFFF"/>
                 <w:sz w:val="21"/>
               </w:rPr>
               <w:t>设计作用</w:t>
@@ -1981,7 +2030,7 @@
           <w:tcPr>
             <w:tcW w:type="dxa" w:w="1814"/>
             <w:vAlign w:val="center"/>
-            <w:shd w:fill="FFFFFF"/>
+            <w:shd w:fill="FAF4E7"/>
             <w:tcMar>
               <w:top w:w="75" w:type="dxa"/>
               <w:bottom w:w="75" w:type="dxa"/>
@@ -1998,6 +2047,7 @@
               <w:rPr>
                 <w:rFonts w:ascii="Times New Roman" w:hAnsi="Times New Roman" w:eastAsia="宋体"/>
                 <w:b w:val="0"/>
+                <w:color w:val="000000"/>
                 <w:sz w:val="21"/>
               </w:rPr>
               <w:t>音乐速度</w:t>
@@ -2008,7 +2058,7 @@
           <w:tcPr>
             <w:tcW w:type="dxa" w:w="3345"/>
             <w:vAlign w:val="center"/>
-            <w:shd w:fill="FFFFFF"/>
+            <w:shd w:fill="F0F6F8"/>
             <w:tcMar>
               <w:top w:w="75" w:type="dxa"/>
               <w:bottom w:w="75" w:type="dxa"/>
@@ -2025,6 +2075,7 @@
               <w:rPr>
                 <w:rFonts w:ascii="Times New Roman" w:hAnsi="Times New Roman" w:eastAsia="宋体"/>
                 <w:b w:val="0"/>
+                <w:color w:val="000000"/>
                 <w:sz w:val="21"/>
               </w:rPr>
               <w:t>120 BPM，每拍0.5秒</w:t>
@@ -2035,7 +2086,7 @@
           <w:tcPr>
             <w:tcW w:type="dxa" w:w="4139"/>
             <w:vAlign w:val="center"/>
-            <w:shd w:fill="FFFFFF"/>
+            <w:shd w:fill="F0F6F8"/>
             <w:tcMar>
               <w:top w:w="75" w:type="dxa"/>
               <w:bottom w:w="75" w:type="dxa"/>
@@ -2052,6 +2103,7 @@
               <w:rPr>
                 <w:rFonts w:ascii="Times New Roman" w:hAnsi="Times New Roman" w:eastAsia="宋体"/>
                 <w:b w:val="0"/>
+                <w:color w:val="000000"/>
                 <w:sz w:val="21"/>
               </w:rPr>
               <w:t>三间房间共用稳定的时间参照</w:t>
@@ -2067,7 +2119,7 @@
           <w:tcPr>
             <w:tcW w:type="dxa" w:w="1814"/>
             <w:vAlign w:val="center"/>
-            <w:shd w:fill="FFFFFF"/>
+            <w:shd w:fill="FAF4E7"/>
             <w:tcMar>
               <w:top w:w="75" w:type="dxa"/>
               <w:bottom w:w="75" w:type="dxa"/>
@@ -2084,6 +2136,7 @@
               <w:rPr>
                 <w:rFonts w:ascii="Times New Roman" w:hAnsi="Times New Roman" w:eastAsia="宋体"/>
                 <w:b w:val="0"/>
+                <w:color w:val="000000"/>
                 <w:sz w:val="21"/>
               </w:rPr>
               <w:t>同高起落</w:t>
@@ -2111,6 +2164,7 @@
               <w:rPr>
                 <w:rFonts w:ascii="Times New Roman" w:hAnsi="Times New Roman" w:eastAsia="宋体"/>
                 <w:b w:val="0"/>
+                <w:color w:val="000000"/>
                 <w:sz w:val="21"/>
               </w:rPr>
               <w:t>约1秒，水平位移约140像素</w:t>
@@ -2138,6 +2192,7 @@
               <w:rPr>
                 <w:rFonts w:ascii="Times New Roman" w:hAnsi="Times New Roman" w:eastAsia="宋体"/>
                 <w:b w:val="0"/>
+                <w:color w:val="000000"/>
                 <w:sz w:val="21"/>
               </w:rPr>
               <w:t>将落桥安排在起跳后约两拍</w:t>
@@ -2153,7 +2208,7 @@
           <w:tcPr>
             <w:tcW w:type="dxa" w:w="1814"/>
             <w:vAlign w:val="center"/>
-            <w:shd w:fill="FFFFFF"/>
+            <w:shd w:fill="FAF4E7"/>
             <w:tcMar>
               <w:top w:w="75" w:type="dxa"/>
               <w:bottom w:w="75" w:type="dxa"/>
@@ -2170,6 +2225,7 @@
               <w:rPr>
                 <w:rFonts w:ascii="Times New Roman" w:hAnsi="Times New Roman" w:eastAsia="宋体"/>
                 <w:b w:val="0"/>
+                <w:color w:val="000000"/>
                 <w:sz w:val="21"/>
               </w:rPr>
               <w:t>光桥宽度</w:t>
@@ -2180,7 +2236,7 @@
           <w:tcPr>
             <w:tcW w:type="dxa" w:w="3345"/>
             <w:vAlign w:val="center"/>
-            <w:shd w:fill="FFFFFF"/>
+            <w:shd w:fill="F0F6F8"/>
             <w:tcMar>
               <w:top w:w="75" w:type="dxa"/>
               <w:bottom w:w="75" w:type="dxa"/>
@@ -2197,6 +2253,7 @@
               <w:rPr>
                 <w:rFonts w:ascii="Times New Roman" w:hAnsi="Times New Roman" w:eastAsia="宋体"/>
                 <w:b w:val="0"/>
+                <w:color w:val="000000"/>
                 <w:sz w:val="21"/>
               </w:rPr>
               <w:t>200像素</w:t>
@@ -2207,7 +2264,7 @@
           <w:tcPr>
             <w:tcW w:type="dxa" w:w="4139"/>
             <w:vAlign w:val="center"/>
-            <w:shd w:fill="FFFFFF"/>
+            <w:shd w:fill="F0F6F8"/>
             <w:tcMar>
               <w:top w:w="75" w:type="dxa"/>
               <w:bottom w:w="75" w:type="dxa"/>
@@ -2224,6 +2281,7 @@
               <w:rPr>
                 <w:rFonts w:ascii="Times New Roman" w:hAnsi="Times New Roman" w:eastAsia="宋体"/>
                 <w:b w:val="0"/>
+                <w:color w:val="000000"/>
                 <w:sz w:val="21"/>
               </w:rPr>
               <w:t>需要利用桥面落脚后继续通过</w:t>
@@ -2239,7 +2297,7 @@
           <w:tcPr>
             <w:tcW w:type="dxa" w:w="1814"/>
             <w:vAlign w:val="center"/>
-            <w:shd w:fill="FFFFFF"/>
+            <w:shd w:fill="FAF4E7"/>
             <w:tcMar>
               <w:top w:w="75" w:type="dxa"/>
               <w:bottom w:w="75" w:type="dxa"/>
@@ -2256,6 +2314,7 @@
               <w:rPr>
                 <w:rFonts w:ascii="Times New Roman" w:hAnsi="Times New Roman" w:eastAsia="宋体"/>
                 <w:b w:val="0"/>
+                <w:color w:val="000000"/>
                 <w:sz w:val="21"/>
               </w:rPr>
               <w:t>有效窗口</w:t>
@@ -2283,6 +2342,7 @@
               <w:rPr>
                 <w:rFonts w:ascii="Times New Roman" w:hAnsi="Times New Roman" w:eastAsia="宋体"/>
                 <w:b w:val="0"/>
+                <w:color w:val="000000"/>
                 <w:sz w:val="21"/>
               </w:rPr>
               <w:t>准确±80毫秒；良好至±150毫秒</w:t>
@@ -2310,6 +2370,7 @@
               <w:rPr>
                 <w:rFonts w:ascii="Times New Roman" w:hAnsi="Times New Roman" w:eastAsia="宋体"/>
                 <w:b w:val="0"/>
+                <w:color w:val="000000"/>
                 <w:sz w:val="21"/>
               </w:rPr>
               <w:t>两种判定均可完成桥面交互</w:t>
@@ -2422,7 +2483,7 @@
           <w:tcPr>
             <w:tcW w:type="dxa" w:w="2098"/>
             <w:vAlign w:val="center"/>
-            <w:shd w:fill="EDEDED"/>
+            <w:shd w:fill="244E60"/>
             <w:tcMar>
               <w:top w:w="75" w:type="dxa"/>
               <w:bottom w:w="75" w:type="dxa"/>
@@ -2439,6 +2500,7 @@
               <w:rPr>
                 <w:rFonts w:ascii="Times New Roman" w:hAnsi="Times New Roman" w:eastAsia="黑体"/>
                 <w:b w:val="0"/>
+                <w:color w:val="FFFFFF"/>
                 <w:sz w:val="21"/>
               </w:rPr>
               <w:t>设计选择</w:t>
@@ -2449,7 +2511,7 @@
           <w:tcPr>
             <w:tcW w:type="dxa" w:w="3515"/>
             <w:vAlign w:val="center"/>
-            <w:shd w:fill="EDEDED"/>
+            <w:shd w:fill="244E60"/>
             <w:tcMar>
               <w:top w:w="75" w:type="dxa"/>
               <w:bottom w:w="75" w:type="dxa"/>
@@ -2466,6 +2528,7 @@
               <w:rPr>
                 <w:rFonts w:ascii="Times New Roman" w:hAnsi="Times New Roman" w:eastAsia="黑体"/>
                 <w:b w:val="0"/>
+                <w:color w:val="FFFFFF"/>
                 <w:sz w:val="21"/>
               </w:rPr>
               <w:t>当前作用</w:t>
@@ -2476,7 +2539,7 @@
           <w:tcPr>
             <w:tcW w:type="dxa" w:w="3685"/>
             <w:vAlign w:val="center"/>
-            <w:shd w:fill="EDEDED"/>
+            <w:shd w:fill="244E60"/>
             <w:tcMar>
               <w:top w:w="75" w:type="dxa"/>
               <w:bottom w:w="75" w:type="dxa"/>
@@ -2493,6 +2556,7 @@
               <w:rPr>
                 <w:rFonts w:ascii="Times New Roman" w:hAnsi="Times New Roman" w:eastAsia="黑体"/>
                 <w:b w:val="0"/>
+                <w:color w:val="FFFFFF"/>
                 <w:sz w:val="21"/>
               </w:rPr>
               <w:t>需要接受的限制</w:t>
@@ -2508,7 +2572,7 @@
           <w:tcPr>
             <w:tcW w:type="dxa" w:w="2098"/>
             <w:vAlign w:val="center"/>
-            <w:shd w:fill="FFFFFF"/>
+            <w:shd w:fill="FAF4E7"/>
             <w:tcMar>
               <w:top w:w="75" w:type="dxa"/>
               <w:bottom w:w="75" w:type="dxa"/>
@@ -2525,6 +2589,7 @@
               <w:rPr>
                 <w:rFonts w:ascii="Times New Roman" w:hAnsi="Times New Roman" w:eastAsia="宋体"/>
                 <w:b w:val="0"/>
+                <w:color w:val="000000"/>
                 <w:sz w:val="21"/>
               </w:rPr>
               <w:t>跳跃轨迹固定</w:t>
@@ -2535,7 +2600,7 @@
           <w:tcPr>
             <w:tcW w:type="dxa" w:w="3515"/>
             <w:vAlign w:val="center"/>
-            <w:shd w:fill="FFFFFF"/>
+            <w:shd w:fill="F0F6F8"/>
             <w:tcMar>
               <w:top w:w="75" w:type="dxa"/>
               <w:bottom w:w="75" w:type="dxa"/>
@@ -2552,6 +2617,7 @@
               <w:rPr>
                 <w:rFonts w:ascii="Times New Roman" w:hAnsi="Times New Roman" w:eastAsia="宋体"/>
                 <w:b w:val="0"/>
+                <w:color w:val="000000"/>
                 <w:sz w:val="21"/>
               </w:rPr>
               <w:t>使落点与节拍的关系可重复观察</w:t>
@@ -2562,7 +2628,7 @@
           <w:tcPr>
             <w:tcW w:type="dxa" w:w="3685"/>
             <w:vAlign w:val="center"/>
-            <w:shd w:fill="FFFFFF"/>
+            <w:shd w:fill="F0F6F8"/>
             <w:tcMar>
               <w:top w:w="75" w:type="dxa"/>
               <w:bottom w:w="75" w:type="dxa"/>
@@ -2579,6 +2645,7 @@
               <w:rPr>
                 <w:rFonts w:ascii="Times New Roman" w:hAnsi="Times New Roman" w:eastAsia="宋体"/>
                 <w:b w:val="0"/>
+                <w:color w:val="000000"/>
                 <w:sz w:val="21"/>
               </w:rPr>
               <w:t>节奏变化主要由机关与布局承担</w:t>
@@ -2594,7 +2661,7 @@
           <w:tcPr>
             <w:tcW w:type="dxa" w:w="2098"/>
             <w:vAlign w:val="center"/>
-            <w:shd w:fill="FFFFFF"/>
+            <w:shd w:fill="FAF4E7"/>
             <w:tcMar>
               <w:top w:w="75" w:type="dxa"/>
               <w:bottom w:w="75" w:type="dxa"/>
@@ -2611,6 +2678,7 @@
               <w:rPr>
                 <w:rFonts w:ascii="Times New Roman" w:hAnsi="Times New Roman" w:eastAsia="宋体"/>
                 <w:b w:val="0"/>
+                <w:color w:val="000000"/>
                 <w:sz w:val="21"/>
               </w:rPr>
               <w:t>落地自动判定</w:t>
@@ -2638,6 +2706,7 @@
               <w:rPr>
                 <w:rFonts w:ascii="Times New Roman" w:hAnsi="Times New Roman" w:eastAsia="宋体"/>
                 <w:b w:val="0"/>
+                <w:color w:val="000000"/>
                 <w:sz w:val="21"/>
               </w:rPr>
               <w:t>让按键集中在移动和起跳</w:t>
@@ -2665,6 +2734,7 @@
               <w:rPr>
                 <w:rFonts w:ascii="Times New Roman" w:hAnsi="Times New Roman" w:eastAsia="宋体"/>
                 <w:b w:val="0"/>
+                <w:color w:val="000000"/>
                 <w:sz w:val="21"/>
               </w:rPr>
               <w:t>起跳时机与空中位置必须配合</w:t>
@@ -2680,7 +2750,7 @@
           <w:tcPr>
             <w:tcW w:type="dxa" w:w="2098"/>
             <w:vAlign w:val="center"/>
-            <w:shd w:fill="FFFFFF"/>
+            <w:shd w:fill="FAF4E7"/>
             <w:tcMar>
               <w:top w:w="75" w:type="dxa"/>
               <w:bottom w:w="75" w:type="dxa"/>
@@ -2697,6 +2767,7 @@
               <w:rPr>
                 <w:rFonts w:ascii="Times New Roman" w:hAnsi="Times New Roman" w:eastAsia="宋体"/>
                 <w:b w:val="0"/>
+                <w:color w:val="000000"/>
                 <w:sz w:val="21"/>
               </w:rPr>
               <w:t>青桥持续四拍</w:t>
@@ -2707,7 +2778,7 @@
           <w:tcPr>
             <w:tcW w:type="dxa" w:w="3515"/>
             <w:vAlign w:val="center"/>
-            <w:shd w:fill="FFFFFF"/>
+            <w:shd w:fill="F0F6F8"/>
             <w:tcMar>
               <w:top w:w="75" w:type="dxa"/>
               <w:bottom w:w="75" w:type="dxa"/>
@@ -2724,6 +2795,7 @@
               <w:rPr>
                 <w:rFonts w:ascii="Times New Roman" w:hAnsi="Times New Roman" w:eastAsia="宋体"/>
                 <w:b w:val="0"/>
+                <w:color w:val="000000"/>
                 <w:sz w:val="21"/>
               </w:rPr>
               <w:t>为一次修复和局部补救留出时间</w:t>
@@ -2734,7 +2806,7 @@
           <w:tcPr>
             <w:tcW w:type="dxa" w:w="3685"/>
             <w:vAlign w:val="center"/>
-            <w:shd w:fill="FFFFFF"/>
+            <w:shd w:fill="F0F6F8"/>
             <w:tcMar>
               <w:top w:w="75" w:type="dxa"/>
               <w:bottom w:w="75" w:type="dxa"/>
@@ -2751,6 +2823,7 @@
               <w:rPr>
                 <w:rFonts w:ascii="Times New Roman" w:hAnsi="Times New Roman" w:eastAsia="宋体"/>
                 <w:b w:val="0"/>
+                <w:color w:val="000000"/>
                 <w:sz w:val="21"/>
               </w:rPr>
               <w:t>偏拍落地后仍须留意剩余寿命</w:t>
@@ -2766,7 +2839,7 @@
           <w:tcPr>
             <w:tcW w:type="dxa" w:w="2098"/>
             <w:vAlign w:val="center"/>
-            <w:shd w:fill="FFFFFF"/>
+            <w:shd w:fill="FAF4E7"/>
             <w:tcMar>
               <w:top w:w="75" w:type="dxa"/>
               <w:bottom w:w="75" w:type="dxa"/>
@@ -2783,6 +2856,7 @@
               <w:rPr>
                 <w:rFonts w:ascii="Times New Roman" w:hAnsi="Times New Roman" w:eastAsia="宋体"/>
                 <w:b w:val="0"/>
+                <w:color w:val="000000"/>
                 <w:sz w:val="21"/>
               </w:rPr>
               <w:t>安全平台可等待</w:t>
@@ -2810,6 +2884,7 @@
               <w:rPr>
                 <w:rFonts w:ascii="Times New Roman" w:hAnsi="Times New Roman" w:eastAsia="宋体"/>
                 <w:b w:val="0"/>
+                <w:color w:val="000000"/>
                 <w:sz w:val="21"/>
               </w:rPr>
               <w:t>允许重新听拍、观察危险周期</w:t>
@@ -2837,6 +2912,7 @@
               <w:rPr>
                 <w:rFonts w:ascii="Times New Roman" w:hAnsi="Times New Roman" w:eastAsia="宋体"/>
                 <w:b w:val="0"/>
+                <w:color w:val="000000"/>
                 <w:sz w:val="21"/>
               </w:rPr>
               <w:t>关卡紧张感集中在局部行动中</w:t>
@@ -2995,7 +3071,7 @@
           <w:tcPr>
             <w:tcW w:type="dxa" w:w="1757"/>
             <w:vAlign w:val="center"/>
-            <w:shd w:fill="EDEDED"/>
+            <w:shd w:fill="244E60"/>
             <w:tcMar>
               <w:top w:w="75" w:type="dxa"/>
               <w:bottom w:w="75" w:type="dxa"/>
@@ -3012,6 +3088,7 @@
               <w:rPr>
                 <w:rFonts w:ascii="Times New Roman" w:hAnsi="Times New Roman" w:eastAsia="黑体"/>
                 <w:b w:val="0"/>
+                <w:color w:val="FFFFFF"/>
                 <w:sz w:val="21"/>
               </w:rPr>
               <w:t>房间</w:t>
@@ -3022,7 +3099,7 @@
           <w:tcPr>
             <w:tcW w:type="dxa" w:w="3458"/>
             <w:vAlign w:val="center"/>
-            <w:shd w:fill="EDEDED"/>
+            <w:shd w:fill="244E60"/>
             <w:tcMar>
               <w:top w:w="75" w:type="dxa"/>
               <w:bottom w:w="75" w:type="dxa"/>
@@ -3039,6 +3116,7 @@
               <w:rPr>
                 <w:rFonts w:ascii="Times New Roman" w:hAnsi="Times New Roman" w:eastAsia="黑体"/>
                 <w:b w:val="0"/>
+                <w:color w:val="FFFFFF"/>
                 <w:sz w:val="21"/>
               </w:rPr>
               <w:t>配置</w:t>
@@ -3049,7 +3127,7 @@
           <w:tcPr>
             <w:tcW w:type="dxa" w:w="4082"/>
             <w:vAlign w:val="center"/>
-            <w:shd w:fill="EDEDED"/>
+            <w:shd w:fill="244E60"/>
             <w:tcMar>
               <w:top w:w="75" w:type="dxa"/>
               <w:bottom w:w="75" w:type="dxa"/>
@@ -3066,6 +3144,7 @@
               <w:rPr>
                 <w:rFonts w:ascii="Times New Roman" w:hAnsi="Times New Roman" w:eastAsia="黑体"/>
                 <w:b w:val="0"/>
+                <w:color w:val="FFFFFF"/>
                 <w:sz w:val="21"/>
               </w:rPr>
               <w:t>希望玩家掌握的判断</w:t>
@@ -3081,7 +3160,7 @@
           <w:tcPr>
             <w:tcW w:type="dxa" w:w="1757"/>
             <w:vAlign w:val="center"/>
-            <w:shd w:fill="FFFFFF"/>
+            <w:shd w:fill="FAF4E7"/>
             <w:tcMar>
               <w:top w:w="75" w:type="dxa"/>
               <w:bottom w:w="75" w:type="dxa"/>
@@ -3098,6 +3177,7 @@
               <w:rPr>
                 <w:rFonts w:ascii="Times New Roman" w:hAnsi="Times New Roman" w:eastAsia="宋体"/>
                 <w:b w:val="0"/>
+                <w:color w:val="000000"/>
                 <w:sz w:val="21"/>
               </w:rPr>
               <w:t>唤醒余音</w:t>
@@ -3108,7 +3188,7 @@
           <w:tcPr>
             <w:tcW w:type="dxa" w:w="3458"/>
             <w:vAlign w:val="center"/>
-            <w:shd w:fill="FFFFFF"/>
+            <w:shd w:fill="F0F6F8"/>
             <w:tcMar>
               <w:top w:w="75" w:type="dxa"/>
               <w:bottom w:w="75" w:type="dxa"/>
@@ -3125,6 +3205,7 @@
               <w:rPr>
                 <w:rFonts w:ascii="Times New Roman" w:hAnsi="Times New Roman" w:eastAsia="宋体"/>
                 <w:b w:val="0"/>
+                <w:color w:val="000000"/>
                 <w:sz w:val="21"/>
               </w:rPr>
               <w:t>一桥，无激光；宽2700像素</w:t>
@@ -3135,7 +3216,7 @@
           <w:tcPr>
             <w:tcW w:type="dxa" w:w="4082"/>
             <w:vAlign w:val="center"/>
-            <w:shd w:fill="FFFFFF"/>
+            <w:shd w:fill="F0F6F8"/>
             <w:tcMar>
               <w:top w:w="75" w:type="dxa"/>
               <w:bottom w:w="75" w:type="dxa"/>
@@ -3152,6 +3233,7 @@
               <w:rPr>
                 <w:rFonts w:ascii="Times New Roman" w:hAnsi="Times New Roman" w:eastAsia="宋体"/>
                 <w:b w:val="0"/>
+                <w:color w:val="000000"/>
                 <w:sz w:val="21"/>
               </w:rPr>
               <w:t>区分青桥出现与金桥固定</w:t>
@@ -3167,7 +3249,7 @@
           <w:tcPr>
             <w:tcW w:type="dxa" w:w="1757"/>
             <w:vAlign w:val="center"/>
-            <w:shd w:fill="FFFFFF"/>
+            <w:shd w:fill="FAF4E7"/>
             <w:tcMar>
               <w:top w:w="75" w:type="dxa"/>
               <w:bottom w:w="75" w:type="dxa"/>
@@ -3184,6 +3266,7 @@
               <w:rPr>
                 <w:rFonts w:ascii="Times New Roman" w:hAnsi="Times New Roman" w:eastAsia="宋体"/>
                 <w:b w:val="0"/>
+                <w:color w:val="000000"/>
                 <w:sz w:val="21"/>
               </w:rPr>
               <w:t>让光留下</w:t>
@@ -3211,6 +3294,7 @@
               <w:rPr>
                 <w:rFonts w:ascii="Times New Roman" w:hAnsi="Times New Roman" w:eastAsia="宋体"/>
                 <w:b w:val="0"/>
+                <w:color w:val="000000"/>
                 <w:sz w:val="21"/>
               </w:rPr>
               <w:t>一桥，两处激光；宽3000像素</w:t>
@@ -3238,6 +3322,7 @@
               <w:rPr>
                 <w:rFonts w:ascii="Times New Roman" w:hAnsi="Times New Roman" w:eastAsia="宋体"/>
                 <w:b w:val="0"/>
+                <w:color w:val="000000"/>
                 <w:sz w:val="21"/>
               </w:rPr>
               <w:t>识别预警和伤害，选择通过时机</w:t>
@@ -3253,7 +3338,7 @@
           <w:tcPr>
             <w:tcW w:type="dxa" w:w="1757"/>
             <w:vAlign w:val="center"/>
-            <w:shd w:fill="FFFFFF"/>
+            <w:shd w:fill="FAF4E7"/>
             <w:tcMar>
               <w:top w:w="75" w:type="dxa"/>
               <w:bottom w:w="75" w:type="dxa"/>
@@ -3270,6 +3355,7 @@
               <w:rPr>
                 <w:rFonts w:ascii="Times New Roman" w:hAnsi="Times New Roman" w:eastAsia="宋体"/>
                 <w:b w:val="0"/>
+                <w:color w:val="000000"/>
                 <w:sz w:val="21"/>
               </w:rPr>
               <w:t>接续回响</w:t>
@@ -3280,7 +3366,7 @@
           <w:tcPr>
             <w:tcW w:type="dxa" w:w="3458"/>
             <w:vAlign w:val="center"/>
-            <w:shd w:fill="FFFFFF"/>
+            <w:shd w:fill="F0F6F8"/>
             <w:tcMar>
               <w:top w:w="75" w:type="dxa"/>
               <w:bottom w:w="75" w:type="dxa"/>
@@ -3297,6 +3383,7 @@
               <w:rPr>
                 <w:rFonts w:ascii="Times New Roman" w:hAnsi="Times New Roman" w:eastAsia="宋体"/>
                 <w:b w:val="0"/>
+                <w:color w:val="000000"/>
                 <w:sz w:val="21"/>
               </w:rPr>
               <w:t>两桥，两处激光；宽3400像素</w:t>
@@ -3307,7 +3394,7 @@
           <w:tcPr>
             <w:tcW w:type="dxa" w:w="4082"/>
             <w:vAlign w:val="center"/>
-            <w:shd w:fill="FFFFFF"/>
+            <w:shd w:fill="F0F6F8"/>
             <w:tcMar>
               <w:top w:w="75" w:type="dxa"/>
               <w:bottom w:w="75" w:type="dxa"/>
@@ -3324,6 +3411,7 @@
               <w:rPr>
                 <w:rFonts w:ascii="Times New Roman" w:hAnsi="Times New Roman" w:eastAsia="宋体"/>
                 <w:b w:val="0"/>
+                <w:color w:val="000000"/>
                 <w:sz w:val="21"/>
               </w:rPr>
               <w:t>连续修复，并核对全部共鸣进度</w:t>
@@ -3609,7 +3697,7 @@
           <w:tcPr>
             <w:tcW w:type="dxa" w:w="1701"/>
             <w:vAlign w:val="center"/>
-            <w:shd w:fill="EDEDED"/>
+            <w:shd w:fill="244E60"/>
             <w:tcMar>
               <w:top w:w="75" w:type="dxa"/>
               <w:bottom w:w="75" w:type="dxa"/>
@@ -3626,6 +3714,7 @@
               <w:rPr>
                 <w:rFonts w:ascii="Times New Roman" w:hAnsi="Times New Roman" w:eastAsia="黑体"/>
                 <w:b w:val="0"/>
+                <w:color w:val="FFFFFF"/>
                 <w:sz w:val="21"/>
               </w:rPr>
               <w:t>阶段</w:t>
@@ -3636,7 +3725,7 @@
           <w:tcPr>
             <w:tcW w:type="dxa" w:w="4252"/>
             <w:vAlign w:val="center"/>
-            <w:shd w:fill="EDEDED"/>
+            <w:shd w:fill="244E60"/>
             <w:tcMar>
               <w:top w:w="75" w:type="dxa"/>
               <w:bottom w:w="75" w:type="dxa"/>
@@ -3653,6 +3742,7 @@
               <w:rPr>
                 <w:rFonts w:ascii="Times New Roman" w:hAnsi="Times New Roman" w:eastAsia="黑体"/>
                 <w:b w:val="0"/>
+                <w:color w:val="FFFFFF"/>
                 <w:sz w:val="21"/>
               </w:rPr>
               <w:t>状态变化</w:t>
@@ -3663,7 +3753,7 @@
           <w:tcPr>
             <w:tcW w:type="dxa" w:w="3345"/>
             <w:vAlign w:val="center"/>
-            <w:shd w:fill="EDEDED"/>
+            <w:shd w:fill="244E60"/>
             <w:tcMar>
               <w:top w:w="75" w:type="dxa"/>
               <w:bottom w:w="75" w:type="dxa"/>
@@ -3680,6 +3770,7 @@
               <w:rPr>
                 <w:rFonts w:ascii="Times New Roman" w:hAnsi="Times New Roman" w:eastAsia="黑体"/>
                 <w:b w:val="0"/>
+                <w:color w:val="FFFFFF"/>
                 <w:sz w:val="21"/>
               </w:rPr>
               <w:t>接下来的行动</w:t>
@@ -3695,7 +3786,7 @@
           <w:tcPr>
             <w:tcW w:type="dxa" w:w="1701"/>
             <w:vAlign w:val="center"/>
-            <w:shd w:fill="FFFFFF"/>
+            <w:shd w:fill="FAF4E7"/>
             <w:tcMar>
               <w:top w:w="75" w:type="dxa"/>
               <w:bottom w:w="75" w:type="dxa"/>
@@ -3712,6 +3803,7 @@
               <w:rPr>
                 <w:rFonts w:ascii="Times New Roman" w:hAnsi="Times New Roman" w:eastAsia="宋体"/>
                 <w:b w:val="0"/>
+                <w:color w:val="000000"/>
                 <w:sz w:val="21"/>
               </w:rPr>
               <w:t>准备</w:t>
@@ -3722,7 +3814,7 @@
           <w:tcPr>
             <w:tcW w:type="dxa" w:w="4252"/>
             <w:vAlign w:val="center"/>
-            <w:shd w:fill="FFFFFF"/>
+            <w:shd w:fill="F0F6F8"/>
             <w:tcMar>
               <w:top w:w="75" w:type="dxa"/>
               <w:bottom w:w="75" w:type="dxa"/>
@@ -3739,6 +3831,7 @@
               <w:rPr>
                 <w:rFonts w:ascii="Times New Roman" w:hAnsi="Times New Roman" w:eastAsia="宋体"/>
                 <w:b w:val="0"/>
+                <w:color w:val="000000"/>
                 <w:sz w:val="21"/>
               </w:rPr>
               <w:t>重建机关与四拍倒数</w:t>
@@ -3749,7 +3842,7 @@
           <w:tcPr>
             <w:tcW w:type="dxa" w:w="3345"/>
             <w:vAlign w:val="center"/>
-            <w:shd w:fill="FFFFFF"/>
+            <w:shd w:fill="F0F6F8"/>
             <w:tcMar>
               <w:top w:w="75" w:type="dxa"/>
               <w:bottom w:w="75" w:type="dxa"/>
@@ -3766,6 +3859,7 @@
               <w:rPr>
                 <w:rFonts w:ascii="Times New Roman" w:hAnsi="Times New Roman" w:eastAsia="宋体"/>
                 <w:b w:val="0"/>
+                <w:color w:val="000000"/>
                 <w:sz w:val="21"/>
               </w:rPr>
               <w:t>听拍后开始移动</w:t>
@@ -3781,7 +3875,7 @@
           <w:tcPr>
             <w:tcW w:type="dxa" w:w="1701"/>
             <w:vAlign w:val="center"/>
-            <w:shd w:fill="FFFFFF"/>
+            <w:shd w:fill="FAF4E7"/>
             <w:tcMar>
               <w:top w:w="75" w:type="dxa"/>
               <w:bottom w:w="75" w:type="dxa"/>
@@ -3798,6 +3892,7 @@
               <w:rPr>
                 <w:rFonts w:ascii="Times New Roman" w:hAnsi="Times New Roman" w:eastAsia="宋体"/>
                 <w:b w:val="0"/>
+                <w:color w:val="000000"/>
                 <w:sz w:val="21"/>
               </w:rPr>
               <w:t>游玩</w:t>
@@ -3825,6 +3920,7 @@
               <w:rPr>
                 <w:rFonts w:ascii="Times New Roman" w:hAnsi="Times New Roman" w:eastAsia="宋体"/>
                 <w:b w:val="0"/>
+                <w:color w:val="000000"/>
                 <w:sz w:val="21"/>
               </w:rPr>
               <w:t>修复、躲避、核对共鸣</w:t>
@@ -3852,6 +3948,7 @@
               <w:rPr>
                 <w:rFonts w:ascii="Times New Roman" w:hAnsi="Times New Roman" w:eastAsia="宋体"/>
                 <w:b w:val="0"/>
+                <w:color w:val="000000"/>
                 <w:sz w:val="21"/>
               </w:rPr>
               <w:t>全部修复后到达出口</w:t>
@@ -3867,7 +3964,7 @@
           <w:tcPr>
             <w:tcW w:type="dxa" w:w="1701"/>
             <w:vAlign w:val="center"/>
-            <w:shd w:fill="FFFFFF"/>
+            <w:shd w:fill="FAF4E7"/>
             <w:tcMar>
               <w:top w:w="75" w:type="dxa"/>
               <w:bottom w:w="75" w:type="dxa"/>
@@ -3884,6 +3981,7 @@
               <w:rPr>
                 <w:rFonts w:ascii="Times New Roman" w:hAnsi="Times New Roman" w:eastAsia="宋体"/>
                 <w:b w:val="0"/>
+                <w:color w:val="000000"/>
                 <w:sz w:val="21"/>
               </w:rPr>
               <w:t>失败</w:t>
@@ -3894,7 +3992,7 @@
           <w:tcPr>
             <w:tcW w:type="dxa" w:w="4252"/>
             <w:vAlign w:val="center"/>
-            <w:shd w:fill="FFFFFF"/>
+            <w:shd w:fill="F0F6F8"/>
             <w:tcMar>
               <w:top w:w="75" w:type="dxa"/>
               <w:bottom w:w="75" w:type="dxa"/>
@@ -3911,6 +4009,7 @@
               <w:rPr>
                 <w:rFonts w:ascii="Times New Roman" w:hAnsi="Times New Roman" w:eastAsia="宋体"/>
                 <w:b w:val="0"/>
+                <w:color w:val="000000"/>
                 <w:sz w:val="21"/>
               </w:rPr>
               <w:t>本房间尝试结束</w:t>
@@ -3921,7 +4020,7 @@
           <w:tcPr>
             <w:tcW w:type="dxa" w:w="3345"/>
             <w:vAlign w:val="center"/>
-            <w:shd w:fill="FFFFFF"/>
+            <w:shd w:fill="F0F6F8"/>
             <w:tcMar>
               <w:top w:w="75" w:type="dxa"/>
               <w:bottom w:w="75" w:type="dxa"/>
@@ -3938,6 +4037,7 @@
               <w:rPr>
                 <w:rFonts w:ascii="Times New Roman" w:hAnsi="Times New Roman" w:eastAsia="宋体"/>
                 <w:b w:val="0"/>
+                <w:color w:val="000000"/>
                 <w:sz w:val="21"/>
               </w:rPr>
               <w:t>重试并重置本房间</w:t>
@@ -3953,7 +4053,7 @@
           <w:tcPr>
             <w:tcW w:type="dxa" w:w="1701"/>
             <w:vAlign w:val="center"/>
-            <w:shd w:fill="FFFFFF"/>
+            <w:shd w:fill="FAF4E7"/>
             <w:tcMar>
               <w:top w:w="75" w:type="dxa"/>
               <w:bottom w:w="75" w:type="dxa"/>
@@ -3970,6 +4070,7 @@
               <w:rPr>
                 <w:rFonts w:ascii="Times New Roman" w:hAnsi="Times New Roman" w:eastAsia="宋体"/>
                 <w:b w:val="0"/>
+                <w:color w:val="000000"/>
                 <w:sz w:val="21"/>
               </w:rPr>
               <w:t>房间完成</w:t>
@@ -3997,6 +4098,7 @@
               <w:rPr>
                 <w:rFonts w:ascii="Times New Roman" w:hAnsi="Times New Roman" w:eastAsia="宋体"/>
                 <w:b w:val="0"/>
+                <w:color w:val="000000"/>
                 <w:sz w:val="21"/>
               </w:rPr>
               <w:t>确认本关与累计表现</w:t>
@@ -4024,6 +4126,7 @@
               <w:rPr>
                 <w:rFonts w:ascii="Times New Roman" w:hAnsi="Times New Roman" w:eastAsia="宋体"/>
                 <w:b w:val="0"/>
+                <w:color w:val="000000"/>
                 <w:sz w:val="21"/>
               </w:rPr>
               <w:t>进入下一间或最终结算</w:t>
@@ -4121,7 +4224,7 @@
           <w:tcPr>
             <w:tcW w:type="dxa" w:w="1814"/>
             <w:vAlign w:val="center"/>
-            <w:shd w:fill="EDEDED"/>
+            <w:shd w:fill="244E60"/>
             <w:tcMar>
               <w:top w:w="75" w:type="dxa"/>
               <w:bottom w:w="75" w:type="dxa"/>
@@ -4138,6 +4241,7 @@
               <w:rPr>
                 <w:rFonts w:ascii="Times New Roman" w:hAnsi="Times New Roman" w:eastAsia="黑体"/>
                 <w:b w:val="0"/>
+                <w:color w:val="FFFFFF"/>
                 <w:sz w:val="21"/>
               </w:rPr>
               <w:t>观察对象</w:t>
@@ -4148,7 +4252,7 @@
           <w:tcPr>
             <w:tcW w:type="dxa" w:w="4139"/>
             <w:vAlign w:val="center"/>
-            <w:shd w:fill="EDEDED"/>
+            <w:shd w:fill="244E60"/>
             <w:tcMar>
               <w:top w:w="75" w:type="dxa"/>
               <w:bottom w:w="75" w:type="dxa"/>
@@ -4165,6 +4269,7 @@
               <w:rPr>
                 <w:rFonts w:ascii="Times New Roman" w:hAnsi="Times New Roman" w:eastAsia="黑体"/>
                 <w:b w:val="0"/>
+                <w:color w:val="FFFFFF"/>
                 <w:sz w:val="21"/>
               </w:rPr>
               <w:t>主要表现</w:t>
@@ -4175,7 +4280,7 @@
           <w:tcPr>
             <w:tcW w:type="dxa" w:w="3345"/>
             <w:vAlign w:val="center"/>
-            <w:shd w:fill="EDEDED"/>
+            <w:shd w:fill="244E60"/>
             <w:tcMar>
               <w:top w:w="75" w:type="dxa"/>
               <w:bottom w:w="75" w:type="dxa"/>
@@ -4192,6 +4297,7 @@
               <w:rPr>
                 <w:rFonts w:ascii="Times New Roman" w:hAnsi="Times New Roman" w:eastAsia="黑体"/>
                 <w:b w:val="0"/>
+                <w:color w:val="FFFFFF"/>
                 <w:sz w:val="21"/>
               </w:rPr>
               <w:t>玩家据此判断</w:t>
@@ -4207,7 +4313,7 @@
           <w:tcPr>
             <w:tcW w:type="dxa" w:w="1814"/>
             <w:vAlign w:val="center"/>
-            <w:shd w:fill="FFFFFF"/>
+            <w:shd w:fill="FAF4E7"/>
             <w:tcMar>
               <w:top w:w="75" w:type="dxa"/>
               <w:bottom w:w="75" w:type="dxa"/>
@@ -4224,6 +4330,7 @@
               <w:rPr>
                 <w:rFonts w:ascii="Times New Roman" w:hAnsi="Times New Roman" w:eastAsia="宋体"/>
                 <w:b w:val="0"/>
+                <w:color w:val="000000"/>
                 <w:sz w:val="21"/>
               </w:rPr>
               <w:t>地形与角色</w:t>
@@ -4234,7 +4341,7 @@
           <w:tcPr>
             <w:tcW w:type="dxa" w:w="4139"/>
             <w:vAlign w:val="center"/>
-            <w:shd w:fill="FFFFFF"/>
+            <w:shd w:fill="F0F6F8"/>
             <w:tcMar>
               <w:top w:w="75" w:type="dxa"/>
               <w:bottom w:w="75" w:type="dxa"/>
@@ -4251,6 +4358,7 @@
               <w:rPr>
                 <w:rFonts w:ascii="Times New Roman" w:hAnsi="Times New Roman" w:eastAsia="宋体"/>
                 <w:b w:val="0"/>
+                <w:color w:val="000000"/>
                 <w:sz w:val="21"/>
               </w:rPr>
               <w:t>高亮边缘、简洁轮廓</w:t>
@@ -4261,7 +4369,7 @@
           <w:tcPr>
             <w:tcW w:type="dxa" w:w="3345"/>
             <w:vAlign w:val="center"/>
-            <w:shd w:fill="FFFFFF"/>
+            <w:shd w:fill="F0F6F8"/>
             <w:tcMar>
               <w:top w:w="75" w:type="dxa"/>
               <w:bottom w:w="75" w:type="dxa"/>
@@ -4278,6 +4386,7 @@
               <w:rPr>
                 <w:rFonts w:ascii="Times New Roman" w:hAnsi="Times New Roman" w:eastAsia="宋体"/>
                 <w:b w:val="0"/>
+                <w:color w:val="000000"/>
                 <w:sz w:val="21"/>
               </w:rPr>
               <w:t>当前位置与可达落点</w:t>
@@ -4293,7 +4402,7 @@
           <w:tcPr>
             <w:tcW w:type="dxa" w:w="1814"/>
             <w:vAlign w:val="center"/>
-            <w:shd w:fill="FFFFFF"/>
+            <w:shd w:fill="FAF4E7"/>
             <w:tcMar>
               <w:top w:w="75" w:type="dxa"/>
               <w:bottom w:w="75" w:type="dxa"/>
@@ -4310,6 +4419,7 @@
               <w:rPr>
                 <w:rFonts w:ascii="Times New Roman" w:hAnsi="Times New Roman" w:eastAsia="宋体"/>
                 <w:b w:val="0"/>
+                <w:color w:val="000000"/>
                 <w:sz w:val="21"/>
               </w:rPr>
               <w:t>光桥</w:t>
@@ -4337,6 +4447,7 @@
               <w:rPr>
                 <w:rFonts w:ascii="Times New Roman" w:hAnsi="Times New Roman" w:eastAsia="宋体"/>
                 <w:b w:val="0"/>
+                <w:color w:val="000000"/>
                 <w:sz w:val="21"/>
               </w:rPr>
               <w:t>虚线、青色实体、末拍闪烁、金色</w:t>
@@ -4364,6 +4475,7 @@
               <w:rPr>
                 <w:rFonts w:ascii="Times New Roman" w:hAnsi="Times New Roman" w:eastAsia="宋体"/>
                 <w:b w:val="0"/>
+                <w:color w:val="000000"/>
                 <w:sz w:val="21"/>
               </w:rPr>
               <w:t>目标是否可站立、剩余时间、修复结果</w:t>
@@ -4379,7 +4491,7 @@
           <w:tcPr>
             <w:tcW w:type="dxa" w:w="1814"/>
             <w:vAlign w:val="center"/>
-            <w:shd w:fill="FFFFFF"/>
+            <w:shd w:fill="FAF4E7"/>
             <w:tcMar>
               <w:top w:w="75" w:type="dxa"/>
               <w:bottom w:w="75" w:type="dxa"/>
@@ -4396,6 +4508,7 @@
               <w:rPr>
                 <w:rFonts w:ascii="Times New Roman" w:hAnsi="Times New Roman" w:eastAsia="宋体"/>
                 <w:b w:val="0"/>
+                <w:color w:val="000000"/>
                 <w:sz w:val="21"/>
               </w:rPr>
               <w:t>激光</w:t>
@@ -4406,7 +4519,7 @@
           <w:tcPr>
             <w:tcW w:type="dxa" w:w="4139"/>
             <w:vAlign w:val="center"/>
-            <w:shd w:fill="FFFFFF"/>
+            <w:shd w:fill="F0F6F8"/>
             <w:tcMar>
               <w:top w:w="75" w:type="dxa"/>
               <w:bottom w:w="75" w:type="dxa"/>
@@ -4423,6 +4536,7 @@
               <w:rPr>
                 <w:rFonts w:ascii="Times New Roman" w:hAnsi="Times New Roman" w:eastAsia="宋体"/>
                 <w:b w:val="0"/>
+                <w:color w:val="000000"/>
                 <w:sz w:val="21"/>
               </w:rPr>
               <w:t>金色虚线与粉红实体</w:t>
@@ -4433,7 +4547,7 @@
           <w:tcPr>
             <w:tcW w:type="dxa" w:w="3345"/>
             <w:vAlign w:val="center"/>
-            <w:shd w:fill="FFFFFF"/>
+            <w:shd w:fill="F0F6F8"/>
             <w:tcMar>
               <w:top w:w="75" w:type="dxa"/>
               <w:bottom w:w="75" w:type="dxa"/>
@@ -4450,6 +4564,7 @@
               <w:rPr>
                 <w:rFonts w:ascii="Times New Roman" w:hAnsi="Times New Roman" w:eastAsia="宋体"/>
                 <w:b w:val="0"/>
+                <w:color w:val="000000"/>
                 <w:sz w:val="21"/>
               </w:rPr>
               <w:t>预警与伤害阶段</w:t>
@@ -4465,7 +4580,7 @@
           <w:tcPr>
             <w:tcW w:type="dxa" w:w="1814"/>
             <w:vAlign w:val="center"/>
-            <w:shd w:fill="FFFFFF"/>
+            <w:shd w:fill="FAF4E7"/>
             <w:tcMar>
               <w:top w:w="75" w:type="dxa"/>
               <w:bottom w:w="75" w:type="dxa"/>
@@ -4482,6 +4597,7 @@
               <w:rPr>
                 <w:rFonts w:ascii="Times New Roman" w:hAnsi="Times New Roman" w:eastAsia="宋体"/>
                 <w:b w:val="0"/>
+                <w:color w:val="000000"/>
                 <w:sz w:val="21"/>
               </w:rPr>
               <w:t>节拍提示</w:t>
@@ -4509,6 +4625,7 @@
               <w:rPr>
                 <w:rFonts w:ascii="Times New Roman" w:hAnsi="Times New Roman" w:eastAsia="宋体"/>
                 <w:b w:val="0"/>
+                <w:color w:val="000000"/>
                 <w:sz w:val="21"/>
               </w:rPr>
               <w:t>底部四拍灯与角色光环</w:t>
@@ -4536,6 +4653,7 @@
               <w:rPr>
                 <w:rFonts w:ascii="Times New Roman" w:hAnsi="Times New Roman" w:eastAsia="宋体"/>
                 <w:b w:val="0"/>
+                <w:color w:val="000000"/>
                 <w:sz w:val="21"/>
               </w:rPr>
               <w:t>拍点次序与下一拍接近</w:t>
@@ -4551,7 +4669,7 @@
           <w:tcPr>
             <w:tcW w:type="dxa" w:w="1814"/>
             <w:vAlign w:val="center"/>
-            <w:shd w:fill="FFFFFF"/>
+            <w:shd w:fill="FAF4E7"/>
             <w:tcMar>
               <w:top w:w="75" w:type="dxa"/>
               <w:bottom w:w="75" w:type="dxa"/>
@@ -4568,6 +4686,7 @@
               <w:rPr>
                 <w:rFonts w:ascii="Times New Roman" w:hAnsi="Times New Roman" w:eastAsia="宋体"/>
                 <w:b w:val="0"/>
+                <w:color w:val="000000"/>
                 <w:sz w:val="21"/>
               </w:rPr>
               <w:t>进程信息</w:t>
@@ -4578,7 +4697,7 @@
           <w:tcPr>
             <w:tcW w:type="dxa" w:w="4139"/>
             <w:vAlign w:val="center"/>
-            <w:shd w:fill="FFFFFF"/>
+            <w:shd w:fill="F0F6F8"/>
             <w:tcMar>
               <w:top w:w="75" w:type="dxa"/>
               <w:bottom w:w="75" w:type="dxa"/>
@@ -4595,6 +4714,7 @@
               <w:rPr>
                 <w:rFonts w:ascii="Times New Roman" w:hAnsi="Times New Roman" w:eastAsia="宋体"/>
                 <w:b w:val="0"/>
+                <w:color w:val="000000"/>
                 <w:sz w:val="21"/>
               </w:rPr>
               <w:t>共鸣、出口与背景色彩</w:t>
@@ -4605,7 +4725,7 @@
           <w:tcPr>
             <w:tcW w:type="dxa" w:w="3345"/>
             <w:vAlign w:val="center"/>
-            <w:shd w:fill="FFFFFF"/>
+            <w:shd w:fill="F0F6F8"/>
             <w:tcMar>
               <w:top w:w="75" w:type="dxa"/>
               <w:bottom w:w="75" w:type="dxa"/>
@@ -4622,6 +4742,7 @@
               <w:rPr>
                 <w:rFonts w:ascii="Times New Roman" w:hAnsi="Times New Roman" w:eastAsia="宋体"/>
                 <w:b w:val="0"/>
+                <w:color w:val="000000"/>
                 <w:sz w:val="21"/>
               </w:rPr>
               <w:t>房间目标和整体进展</w:t>
@@ -4783,7 +4904,7 @@
           <w:tcPr>
             <w:tcW w:type="dxa" w:w="2494"/>
             <w:vAlign w:val="center"/>
-            <w:shd w:fill="EDEDED"/>
+            <w:shd w:fill="244E60"/>
             <w:tcMar>
               <w:top w:w="75" w:type="dxa"/>
               <w:bottom w:w="75" w:type="dxa"/>
@@ -4800,6 +4921,7 @@
               <w:rPr>
                 <w:rFonts w:ascii="Times New Roman" w:hAnsi="Times New Roman" w:eastAsia="黑体"/>
                 <w:b w:val="0"/>
+                <w:color w:val="FFFFFF"/>
                 <w:sz w:val="21"/>
               </w:rPr>
               <w:t>项目</w:t>
@@ -4810,7 +4932,7 @@
           <w:tcPr>
             <w:tcW w:type="dxa" w:w="6803"/>
             <w:vAlign w:val="center"/>
-            <w:shd w:fill="EDEDED"/>
+            <w:shd w:fill="244E60"/>
             <w:tcMar>
               <w:top w:w="75" w:type="dxa"/>
               <w:bottom w:w="75" w:type="dxa"/>
@@ -4827,6 +4949,7 @@
               <w:rPr>
                 <w:rFonts w:ascii="Times New Roman" w:hAnsi="Times New Roman" w:eastAsia="黑体"/>
                 <w:b w:val="0"/>
+                <w:color w:val="FFFFFF"/>
                 <w:sz w:val="21"/>
               </w:rPr>
               <w:t>当前实现</w:t>
@@ -4842,7 +4965,7 @@
           <w:tcPr>
             <w:tcW w:type="dxa" w:w="2494"/>
             <w:vAlign w:val="center"/>
-            <w:shd w:fill="FFFFFF"/>
+            <w:shd w:fill="FAF4E7"/>
             <w:tcMar>
               <w:top w:w="75" w:type="dxa"/>
               <w:bottom w:w="75" w:type="dxa"/>
@@ -4859,6 +4982,7 @@
               <w:rPr>
                 <w:rFonts w:ascii="Times New Roman" w:hAnsi="Times New Roman" w:eastAsia="宋体"/>
                 <w:b w:val="0"/>
+                <w:color w:val="000000"/>
                 <w:sz w:val="21"/>
               </w:rPr>
               <w:t>音乐文件</w:t>
@@ -4869,7 +4993,7 @@
           <w:tcPr>
             <w:tcW w:type="dxa" w:w="6803"/>
             <w:vAlign w:val="center"/>
-            <w:shd w:fill="FFFFFF"/>
+            <w:shd w:fill="F0F6F8"/>
             <w:tcMar>
               <w:top w:w="75" w:type="dxa"/>
               <w:bottom w:w="75" w:type="dxa"/>
@@ -4886,6 +5010,7 @@
               <w:rPr>
                 <w:rFonts w:ascii="Times New Roman" w:hAnsi="Times New Roman" w:eastAsia="宋体"/>
                 <w:b w:val="0"/>
+                <w:color w:val="000000"/>
                 <w:sz w:val="21"/>
               </w:rPr>
               <w:t>16秒，32拍；44.1 kHz单声道16位PCM WAV</w:t>
@@ -4901,7 +5026,7 @@
           <w:tcPr>
             <w:tcW w:type="dxa" w:w="2494"/>
             <w:vAlign w:val="center"/>
-            <w:shd w:fill="FFFFFF"/>
+            <w:shd w:fill="FAF4E7"/>
             <w:tcMar>
               <w:top w:w="75" w:type="dxa"/>
               <w:bottom w:w="75" w:type="dxa"/>
@@ -4918,6 +5043,7 @@
               <w:rPr>
                 <w:rFonts w:ascii="Times New Roman" w:hAnsi="Times New Roman" w:eastAsia="宋体"/>
                 <w:b w:val="0"/>
+                <w:color w:val="000000"/>
                 <w:sz w:val="21"/>
               </w:rPr>
               <w:t>判定校准</w:t>
@@ -4945,6 +5071,7 @@
               <w:rPr>
                 <w:rFonts w:ascii="Times New Roman" w:hAnsi="Times New Roman" w:eastAsia="宋体"/>
                 <w:b w:val="0"/>
+                <w:color w:val="000000"/>
                 <w:sz w:val="21"/>
               </w:rPr>
               <w:t>−250至+250毫秒，步长10毫秒，设置保存</w:t>
@@ -4960,7 +5087,7 @@
           <w:tcPr>
             <w:tcW w:type="dxa" w:w="2494"/>
             <w:vAlign w:val="center"/>
-            <w:shd w:fill="FFFFFF"/>
+            <w:shd w:fill="FAF4E7"/>
             <w:tcMar>
               <w:top w:w="75" w:type="dxa"/>
               <w:bottom w:w="75" w:type="dxa"/>
@@ -4977,6 +5104,7 @@
               <w:rPr>
                 <w:rFonts w:ascii="Times New Roman" w:hAnsi="Times New Roman" w:eastAsia="宋体"/>
                 <w:b w:val="0"/>
+                <w:color w:val="000000"/>
                 <w:sz w:val="21"/>
               </w:rPr>
               <w:t>校准影响</w:t>
@@ -4987,7 +5115,7 @@
           <w:tcPr>
             <w:tcW w:type="dxa" w:w="6803"/>
             <w:vAlign w:val="center"/>
-            <w:shd w:fill="FFFFFF"/>
+            <w:shd w:fill="F0F6F8"/>
             <w:tcMar>
               <w:top w:w="75" w:type="dxa"/>
               <w:bottom w:w="75" w:type="dxa"/>
@@ -5004,6 +5132,7 @@
               <w:rPr>
                 <w:rFonts w:ascii="Times New Roman" w:hAnsi="Times New Roman" w:eastAsia="宋体"/>
                 <w:b w:val="0"/>
+                <w:color w:val="000000"/>
                 <w:sz w:val="21"/>
               </w:rPr>
               <w:t>只修正动作判定时间，不改变运动与机关周期</w:t>
@@ -5019,7 +5148,7 @@
           <w:tcPr>
             <w:tcW w:type="dxa" w:w="2494"/>
             <w:vAlign w:val="center"/>
-            <w:shd w:fill="FFFFFF"/>
+            <w:shd w:fill="FAF4E7"/>
             <w:tcMar>
               <w:top w:w="75" w:type="dxa"/>
               <w:bottom w:w="75" w:type="dxa"/>
@@ -5036,6 +5165,7 @@
               <w:rPr>
                 <w:rFonts w:ascii="Times New Roman" w:hAnsi="Times New Roman" w:eastAsia="宋体"/>
                 <w:b w:val="0"/>
+                <w:color w:val="000000"/>
                 <w:sz w:val="21"/>
               </w:rPr>
               <w:t>后续声音完善</w:t>
@@ -5063,6 +5193,7 @@
               <w:rPr>
                 <w:rFonts w:ascii="Times New Roman" w:hAnsi="Times New Roman" w:eastAsia="宋体"/>
                 <w:b w:val="0"/>
+                <w:color w:val="000000"/>
                 <w:sz w:val="21"/>
               </w:rPr>
               <w:t>补充修复、失败与通关的短反馈，并检查主拍是否仍清楚</w:t>
@@ -5212,7 +5343,7 @@
           <w:tcPr>
             <w:tcW w:type="dxa" w:w="3231"/>
             <w:vAlign w:val="center"/>
-            <w:shd w:fill="EDEDED"/>
+            <w:shd w:fill="244E60"/>
             <w:tcMar>
               <w:top w:w="75" w:type="dxa"/>
               <w:bottom w:w="75" w:type="dxa"/>
@@ -5229,6 +5360,7 @@
               <w:rPr>
                 <w:rFonts w:ascii="Times New Roman" w:hAnsi="Times New Roman" w:eastAsia="黑体"/>
                 <w:b w:val="0"/>
+                <w:color w:val="FFFFFF"/>
                 <w:sz w:val="21"/>
               </w:rPr>
               <w:t>实现职责</w:t>
@@ -5239,7 +5371,7 @@
           <w:tcPr>
             <w:tcW w:type="dxa" w:w="6066"/>
             <w:vAlign w:val="center"/>
-            <w:shd w:fill="EDEDED"/>
+            <w:shd w:fill="244E60"/>
             <w:tcMar>
               <w:top w:w="75" w:type="dxa"/>
               <w:bottom w:w="75" w:type="dxa"/>
@@ -5256,6 +5388,7 @@
               <w:rPr>
                 <w:rFonts w:ascii="Times New Roman" w:hAnsi="Times New Roman" w:eastAsia="黑体"/>
                 <w:b w:val="0"/>
+                <w:color w:val="FFFFFF"/>
                 <w:sz w:val="21"/>
               </w:rPr>
               <w:t>对应工程</w:t>
@@ -5271,7 +5404,7 @@
           <w:tcPr>
             <w:tcW w:type="dxa" w:w="3231"/>
             <w:vAlign w:val="center"/>
-            <w:shd w:fill="FFFFFF"/>
+            <w:shd w:fill="FAF4E7"/>
             <w:tcMar>
               <w:top w:w="75" w:type="dxa"/>
               <w:bottom w:w="75" w:type="dxa"/>
@@ -5288,6 +5421,7 @@
               <w:rPr>
                 <w:rFonts w:ascii="Times New Roman" w:hAnsi="Times New Roman" w:eastAsia="宋体"/>
                 <w:b w:val="0"/>
+                <w:color w:val="000000"/>
                 <w:sz w:val="21"/>
               </w:rPr>
               <w:t>运动与真实起落</w:t>
@@ -5298,7 +5432,7 @@
           <w:tcPr>
             <w:tcW w:type="dxa" w:w="6066"/>
             <w:vAlign w:val="center"/>
-            <w:shd w:fill="FFFFFF"/>
+            <w:shd w:fill="F0F6F8"/>
             <w:tcMar>
               <w:top w:w="75" w:type="dxa"/>
               <w:bottom w:w="75" w:type="dxa"/>
@@ -5315,6 +5449,7 @@
               <w:rPr>
                 <w:rFonts w:ascii="Times New Roman" w:hAnsi="Times New Roman" w:eastAsia="宋体"/>
                 <w:b w:val="0"/>
+                <w:color w:val="000000"/>
                 <w:sz w:val="21"/>
               </w:rPr>
               <w:t>player.gd</w:t>
@@ -5330,7 +5465,7 @@
           <w:tcPr>
             <w:tcW w:type="dxa" w:w="3231"/>
             <w:vAlign w:val="center"/>
-            <w:shd w:fill="FFFFFF"/>
+            <w:shd w:fill="FAF4E7"/>
             <w:tcMar>
               <w:top w:w="75" w:type="dxa"/>
               <w:bottom w:w="75" w:type="dxa"/>
@@ -5347,6 +5482,7 @@
               <w:rPr>
                 <w:rFonts w:ascii="Times New Roman" w:hAnsi="Times New Roman" w:eastAsia="宋体"/>
                 <w:b w:val="0"/>
+                <w:color w:val="000000"/>
                 <w:sz w:val="21"/>
               </w:rPr>
               <w:t>节拍与校准</w:t>
@@ -5374,6 +5510,7 @@
               <w:rPr>
                 <w:rFonts w:ascii="Times New Roman" w:hAnsi="Times New Roman" w:eastAsia="宋体"/>
                 <w:b w:val="0"/>
+                <w:color w:val="000000"/>
                 <w:sz w:val="21"/>
               </w:rPr>
               <w:t>beat_clock.gd</w:t>
@@ -5389,7 +5526,7 @@
           <w:tcPr>
             <w:tcW w:type="dxa" w:w="3231"/>
             <w:vAlign w:val="center"/>
-            <w:shd w:fill="FFFFFF"/>
+            <w:shd w:fill="FAF4E7"/>
             <w:tcMar>
               <w:top w:w="75" w:type="dxa"/>
               <w:bottom w:w="75" w:type="dxa"/>
@@ -5406,6 +5543,7 @@
               <w:rPr>
                 <w:rFonts w:ascii="Times New Roman" w:hAnsi="Times New Roman" w:eastAsia="宋体"/>
                 <w:b w:val="0"/>
+                <w:color w:val="000000"/>
                 <w:sz w:val="21"/>
               </w:rPr>
               <w:t>桥面与危险阶段</w:t>
@@ -5416,7 +5554,7 @@
           <w:tcPr>
             <w:tcW w:type="dxa" w:w="6066"/>
             <w:vAlign w:val="center"/>
-            <w:shd w:fill="FFFFFF"/>
+            <w:shd w:fill="F0F6F8"/>
             <w:tcMar>
               <w:top w:w="75" w:type="dxa"/>
               <w:bottom w:w="75" w:type="dxa"/>
@@ -5433,6 +5571,7 @@
               <w:rPr>
                 <w:rFonts w:ascii="Times New Roman" w:hAnsi="Times New Roman" w:eastAsia="宋体"/>
                 <w:b w:val="0"/>
+                <w:color w:val="000000"/>
                 <w:sz w:val="21"/>
               </w:rPr>
               <w:t>light_bridge.gd、laser.gd</w:t>
@@ -5448,7 +5587,7 @@
           <w:tcPr>
             <w:tcW w:type="dxa" w:w="3231"/>
             <w:vAlign w:val="center"/>
-            <w:shd w:fill="FFFFFF"/>
+            <w:shd w:fill="FAF4E7"/>
             <w:tcMar>
               <w:top w:w="75" w:type="dxa"/>
               <w:bottom w:w="75" w:type="dxa"/>
@@ -5465,6 +5604,7 @@
               <w:rPr>
                 <w:rFonts w:ascii="Times New Roman" w:hAnsi="Times New Roman" w:eastAsia="宋体"/>
                 <w:b w:val="0"/>
+                <w:color w:val="000000"/>
                 <w:sz w:val="21"/>
               </w:rPr>
               <w:t>房间进程与界面</w:t>
@@ -5492,6 +5632,7 @@
               <w:rPr>
                 <w:rFonts w:ascii="Times New Roman" w:hAnsi="Times New Roman" w:eastAsia="宋体"/>
                 <w:b w:val="0"/>
+                <w:color w:val="000000"/>
                 <w:sz w:val="21"/>
               </w:rPr>
               <w:t>campaign.gd、hud.gd</w:t>
@@ -5570,7 +5711,7 @@
           <w:tcPr>
             <w:tcW w:type="dxa" w:w="2041"/>
             <w:vAlign w:val="center"/>
-            <w:shd w:fill="EDEDED"/>
+            <w:shd w:fill="244E60"/>
             <w:tcMar>
               <w:top w:w="75" w:type="dxa"/>
               <w:bottom w:w="75" w:type="dxa"/>
@@ -5587,6 +5728,7 @@
               <w:rPr>
                 <w:rFonts w:ascii="Times New Roman" w:hAnsi="Times New Roman" w:eastAsia="黑体"/>
                 <w:b w:val="0"/>
+                <w:color w:val="FFFFFF"/>
                 <w:sz w:val="21"/>
               </w:rPr>
               <w:t>证据</w:t>
@@ -5597,7 +5739,7 @@
           <w:tcPr>
             <w:tcW w:type="dxa" w:w="3515"/>
             <w:vAlign w:val="center"/>
-            <w:shd w:fill="EDEDED"/>
+            <w:shd w:fill="244E60"/>
             <w:tcMar>
               <w:top w:w="75" w:type="dxa"/>
               <w:bottom w:w="75" w:type="dxa"/>
@@ -5614,6 +5756,7 @@
               <w:rPr>
                 <w:rFonts w:ascii="Times New Roman" w:hAnsi="Times New Roman" w:eastAsia="黑体"/>
                 <w:b w:val="0"/>
+                <w:color w:val="FFFFFF"/>
                 <w:sz w:val="21"/>
               </w:rPr>
               <w:t>已验证的范围</w:t>
@@ -5624,7 +5767,7 @@
           <w:tcPr>
             <w:tcW w:type="dxa" w:w="3742"/>
             <w:vAlign w:val="center"/>
-            <w:shd w:fill="EDEDED"/>
+            <w:shd w:fill="244E60"/>
             <w:tcMar>
               <w:top w:w="75" w:type="dxa"/>
               <w:bottom w:w="75" w:type="dxa"/>
@@ -5641,6 +5784,7 @@
               <w:rPr>
                 <w:rFonts w:ascii="Times New Roman" w:hAnsi="Times New Roman" w:eastAsia="黑体"/>
                 <w:b w:val="0"/>
+                <w:color w:val="FFFFFF"/>
                 <w:sz w:val="21"/>
               </w:rPr>
               <w:t>结论的边界</w:t>
@@ -5656,7 +5800,7 @@
           <w:tcPr>
             <w:tcW w:type="dxa" w:w="2041"/>
             <w:vAlign w:val="center"/>
-            <w:shd w:fill="FFFFFF"/>
+            <w:shd w:fill="FAF4E7"/>
             <w:tcMar>
               <w:top w:w="75" w:type="dxa"/>
               <w:bottom w:w="75" w:type="dxa"/>
@@ -5673,6 +5817,7 @@
               <w:rPr>
                 <w:rFonts w:ascii="Times New Roman" w:hAnsi="Times New Roman" w:eastAsia="宋体"/>
                 <w:b w:val="0"/>
+                <w:color w:val="000000"/>
                 <w:sz w:val="21"/>
               </w:rPr>
               <w:t>54项自动检查</w:t>
@@ -5683,7 +5828,7 @@
           <w:tcPr>
             <w:tcW w:type="dxa" w:w="3515"/>
             <w:vAlign w:val="center"/>
-            <w:shd w:fill="FFFFFF"/>
+            <w:shd w:fill="F0F6F8"/>
             <w:tcMar>
               <w:top w:w="75" w:type="dxa"/>
               <w:bottom w:w="75" w:type="dxa"/>
@@ -5700,6 +5845,7 @@
               <w:rPr>
                 <w:rFonts w:ascii="Times New Roman" w:hAnsi="Times New Roman" w:eastAsia="宋体"/>
                 <w:b w:val="0"/>
+                <w:color w:val="000000"/>
                 <w:sz w:val="21"/>
               </w:rPr>
               <w:t>判定边界、机关状态、奖励、出口及完整路线</w:t>
@@ -5710,7 +5856,7 @@
           <w:tcPr>
             <w:tcW w:type="dxa" w:w="3742"/>
             <w:vAlign w:val="center"/>
-            <w:shd w:fill="FFFFFF"/>
+            <w:shd w:fill="F0F6F8"/>
             <w:tcMar>
               <w:top w:w="75" w:type="dxa"/>
               <w:bottom w:w="75" w:type="dxa"/>
@@ -5727,6 +5873,7 @@
               <w:rPr>
                 <w:rFonts w:ascii="Times New Roman" w:hAnsi="Times New Roman" w:eastAsia="宋体"/>
                 <w:b w:val="0"/>
+                <w:color w:val="000000"/>
                 <w:sz w:val="21"/>
               </w:rPr>
               <w:t>仅覆盖脚本列出的条件，不代表所有玩法情况</w:t>
@@ -5742,7 +5889,7 @@
           <w:tcPr>
             <w:tcW w:type="dxa" w:w="2041"/>
             <w:vAlign w:val="center"/>
-            <w:shd w:fill="FFFFFF"/>
+            <w:shd w:fill="FAF4E7"/>
             <w:tcMar>
               <w:top w:w="75" w:type="dxa"/>
               <w:bottom w:w="75" w:type="dxa"/>
@@ -5759,6 +5906,7 @@
               <w:rPr>
                 <w:rFonts w:ascii="Times New Roman" w:hAnsi="Times New Roman" w:eastAsia="宋体"/>
                 <w:b w:val="0"/>
+                <w:color w:val="000000"/>
                 <w:sz w:val="21"/>
               </w:rPr>
               <w:t>三间物理路线</w:t>
@@ -5786,6 +5934,7 @@
               <w:rPr>
                 <w:rFonts w:ascii="Times New Roman" w:hAnsi="Times New Roman" w:eastAsia="宋体"/>
                 <w:b w:val="0"/>
+                <w:color w:val="000000"/>
                 <w:sz w:val="21"/>
               </w:rPr>
               <w:t>自动操作角色完成三个房间</w:t>
@@ -5813,6 +5962,7 @@
               <w:rPr>
                 <w:rFonts w:ascii="Times New Roman" w:hAnsi="Times New Roman" w:eastAsia="宋体"/>
                 <w:b w:val="0"/>
+                <w:color w:val="000000"/>
                 <w:sz w:val="21"/>
               </w:rPr>
               <w:t>约18、20、25秒，不含每间约2秒准备；不代表玩家平均通关时长</w:t>
@@ -5828,7 +5978,7 @@
           <w:tcPr>
             <w:tcW w:type="dxa" w:w="2041"/>
             <w:vAlign w:val="center"/>
-            <w:shd w:fill="FFFFFF"/>
+            <w:shd w:fill="FAF4E7"/>
             <w:tcMar>
               <w:top w:w="75" w:type="dxa"/>
               <w:bottom w:w="75" w:type="dxa"/>
@@ -5845,6 +5995,7 @@
               <w:rPr>
                 <w:rFonts w:ascii="Times New Roman" w:hAnsi="Times New Roman" w:eastAsia="宋体"/>
                 <w:b w:val="0"/>
+                <w:color w:val="000000"/>
                 <w:sz w:val="21"/>
               </w:rPr>
               <w:t>工程与运行包检查</w:t>
@@ -5855,7 +6006,7 @@
           <w:tcPr>
             <w:tcW w:type="dxa" w:w="3515"/>
             <w:vAlign w:val="center"/>
-            <w:shd w:fill="FFFFFF"/>
+            <w:shd w:fill="F0F6F8"/>
             <w:tcMar>
               <w:top w:w="75" w:type="dxa"/>
               <w:bottom w:w="75" w:type="dxa"/>
@@ -5872,6 +6023,7 @@
               <w:rPr>
                 <w:rFonts w:ascii="Times New Roman" w:hAnsi="Times New Roman" w:eastAsia="宋体"/>
                 <w:b w:val="0"/>
+                <w:color w:val="000000"/>
                 <w:sz w:val="21"/>
               </w:rPr>
               <w:t>干净源码导入、Windows运行启动</w:t>
@@ -5882,7 +6034,7 @@
           <w:tcPr>
             <w:tcW w:type="dxa" w:w="3742"/>
             <w:vAlign w:val="center"/>
-            <w:shd w:fill="FFFFFF"/>
+            <w:shd w:fill="F0F6F8"/>
             <w:tcMar>
               <w:top w:w="75" w:type="dxa"/>
               <w:bottom w:w="75" w:type="dxa"/>
@@ -5899,6 +6051,7 @@
               <w:rPr>
                 <w:rFonts w:ascii="Times New Roman" w:hAnsi="Times New Roman" w:eastAsia="宋体"/>
                 <w:b w:val="0"/>
+                <w:color w:val="000000"/>
                 <w:sz w:val="21"/>
               </w:rPr>
               <w:t>不等于已完成另一台电脑的全流程试玩</w:t>
@@ -5965,7 +6118,7 @@
           <w:tcPr>
             <w:tcW w:type="dxa" w:w="1814"/>
             <w:vAlign w:val="center"/>
-            <w:shd w:fill="EDEDED"/>
+            <w:shd w:fill="244E60"/>
             <w:tcMar>
               <w:top w:w="75" w:type="dxa"/>
               <w:bottom w:w="75" w:type="dxa"/>
@@ -5982,6 +6135,7 @@
               <w:rPr>
                 <w:rFonts w:ascii="Times New Roman" w:hAnsi="Times New Roman" w:eastAsia="黑体"/>
                 <w:b w:val="0"/>
+                <w:color w:val="FFFFFF"/>
                 <w:sz w:val="21"/>
               </w:rPr>
               <w:t>完善顺序</w:t>
@@ -5992,7 +6146,7 @@
           <w:tcPr>
             <w:tcW w:type="dxa" w:w="3685"/>
             <w:vAlign w:val="center"/>
-            <w:shd w:fill="EDEDED"/>
+            <w:shd w:fill="244E60"/>
             <w:tcMar>
               <w:top w:w="75" w:type="dxa"/>
               <w:bottom w:w="75" w:type="dxa"/>
@@ -6009,6 +6163,7 @@
               <w:rPr>
                 <w:rFonts w:ascii="Times New Roman" w:hAnsi="Times New Roman" w:eastAsia="黑体"/>
                 <w:b w:val="0"/>
+                <w:color w:val="FFFFFF"/>
                 <w:sz w:val="21"/>
               </w:rPr>
               <w:t>具体工作</w:t>
@@ -6019,7 +6174,7 @@
           <w:tcPr>
             <w:tcW w:type="dxa" w:w="3798"/>
             <w:vAlign w:val="center"/>
-            <w:shd w:fill="EDEDED"/>
+            <w:shd w:fill="244E60"/>
             <w:tcMar>
               <w:top w:w="75" w:type="dxa"/>
               <w:bottom w:w="75" w:type="dxa"/>
@@ -6036,6 +6191,7 @@
               <w:rPr>
                 <w:rFonts w:ascii="Times New Roman" w:hAnsi="Times New Roman" w:eastAsia="黑体"/>
                 <w:b w:val="0"/>
+                <w:color w:val="FFFFFF"/>
                 <w:sz w:val="21"/>
               </w:rPr>
               <w:t>判断依据</w:t>
@@ -6051,7 +6207,7 @@
           <w:tcPr>
             <w:tcW w:type="dxa" w:w="1814"/>
             <w:vAlign w:val="center"/>
-            <w:shd w:fill="FFFFFF"/>
+            <w:shd w:fill="FAF4E7"/>
             <w:tcMar>
               <w:top w:w="75" w:type="dxa"/>
               <w:bottom w:w="75" w:type="dxa"/>
@@ -6068,6 +6224,7 @@
               <w:rPr>
                 <w:rFonts w:ascii="Times New Roman" w:hAnsi="Times New Roman" w:eastAsia="宋体"/>
                 <w:b w:val="0"/>
+                <w:color w:val="000000"/>
                 <w:sz w:val="21"/>
               </w:rPr>
               <w:t>先验证理解</w:t>
@@ -6078,7 +6235,7 @@
           <w:tcPr>
             <w:tcW w:type="dxa" w:w="3685"/>
             <w:vAlign w:val="center"/>
-            <w:shd w:fill="FFFFFF"/>
+            <w:shd w:fill="F0F6F8"/>
             <w:tcMar>
               <w:top w:w="75" w:type="dxa"/>
               <w:bottom w:w="75" w:type="dxa"/>
@@ -6095,6 +6252,7 @@
               <w:rPr>
                 <w:rFonts w:ascii="Times New Roman" w:hAnsi="Times New Roman" w:eastAsia="宋体"/>
                 <w:b w:val="0"/>
+                <w:color w:val="000000"/>
                 <w:sz w:val="21"/>
               </w:rPr>
               <w:t>记录首次玩家在桥前、落地和激光处的操作</w:t>
@@ -6105,7 +6263,7 @@
           <w:tcPr>
             <w:tcW w:type="dxa" w:w="3798"/>
             <w:vAlign w:val="center"/>
-            <w:shd w:fill="FFFFFF"/>
+            <w:shd w:fill="F0F6F8"/>
             <w:tcMar>
               <w:top w:w="75" w:type="dxa"/>
               <w:bottom w:w="75" w:type="dxa"/>
@@ -6122,6 +6280,7 @@
               <w:rPr>
                 <w:rFonts w:ascii="Times New Roman" w:hAnsi="Times New Roman" w:eastAsia="宋体"/>
                 <w:b w:val="0"/>
+                <w:color w:val="000000"/>
                 <w:sz w:val="21"/>
               </w:rPr>
               <w:t>误解发生的位置、等待原因与重试步骤</w:t>
@@ -6137,7 +6296,7 @@
           <w:tcPr>
             <w:tcW w:type="dxa" w:w="1814"/>
             <w:vAlign w:val="center"/>
-            <w:shd w:fill="FFFFFF"/>
+            <w:shd w:fill="FAF4E7"/>
             <w:tcMar>
               <w:top w:w="75" w:type="dxa"/>
               <w:bottom w:w="75" w:type="dxa"/>
@@ -6154,6 +6313,7 @@
               <w:rPr>
                 <w:rFonts w:ascii="Times New Roman" w:hAnsi="Times New Roman" w:eastAsia="宋体"/>
                 <w:b w:val="0"/>
+                <w:color w:val="000000"/>
                 <w:sz w:val="21"/>
               </w:rPr>
               <w:t>再核对设备</w:t>
@@ -6181,6 +6341,7 @@
               <w:rPr>
                 <w:rFonts w:ascii="Times New Roman" w:hAnsi="Times New Roman" w:eastAsia="宋体"/>
                 <w:b w:val="0"/>
+                <w:color w:val="000000"/>
                 <w:sz w:val="21"/>
               </w:rPr>
               <w:t>另一台Windows电脑完整通关，检查中文与声音</w:t>
@@ -6208,6 +6369,7 @@
               <w:rPr>
                 <w:rFonts w:ascii="Times New Roman" w:hAnsi="Times New Roman" w:eastAsia="宋体"/>
                 <w:b w:val="0"/>
+                <w:color w:val="000000"/>
                 <w:sz w:val="21"/>
               </w:rPr>
               <w:t>设备、版本、输出方式及完整流程记录</w:t>
@@ -6223,7 +6385,7 @@
           <w:tcPr>
             <w:tcW w:type="dxa" w:w="1814"/>
             <w:vAlign w:val="center"/>
-            <w:shd w:fill="FFFFFF"/>
+            <w:shd w:fill="FAF4E7"/>
             <w:tcMar>
               <w:top w:w="75" w:type="dxa"/>
               <w:bottom w:w="75" w:type="dxa"/>
@@ -6240,6 +6402,7 @@
               <w:rPr>
                 <w:rFonts w:ascii="Times New Roman" w:hAnsi="Times New Roman" w:eastAsia="宋体"/>
                 <w:b w:val="0"/>
+                <w:color w:val="000000"/>
                 <w:sz w:val="21"/>
               </w:rPr>
               <w:t>补足事件反馈</w:t>
@@ -6250,7 +6413,7 @@
           <w:tcPr>
             <w:tcW w:type="dxa" w:w="3685"/>
             <w:vAlign w:val="center"/>
-            <w:shd w:fill="FFFFFF"/>
+            <w:shd w:fill="F0F6F8"/>
             <w:tcMar>
               <w:top w:w="75" w:type="dxa"/>
               <w:bottom w:w="75" w:type="dxa"/>
@@ -6267,6 +6430,7 @@
               <w:rPr>
                 <w:rFonts w:ascii="Times New Roman" w:hAnsi="Times New Roman" w:eastAsia="宋体"/>
                 <w:b w:val="0"/>
+                <w:color w:val="000000"/>
                 <w:sz w:val="21"/>
               </w:rPr>
               <w:t>增加修复、失败、通关音效</w:t>
@@ -6277,7 +6441,7 @@
           <w:tcPr>
             <w:tcW w:type="dxa" w:w="3798"/>
             <w:vAlign w:val="center"/>
-            <w:shd w:fill="FFFFFF"/>
+            <w:shd w:fill="F0F6F8"/>
             <w:tcMar>
               <w:top w:w="75" w:type="dxa"/>
               <w:bottom w:w="75" w:type="dxa"/>
@@ -6294,6 +6458,7 @@
               <w:rPr>
                 <w:rFonts w:ascii="Times New Roman" w:hAnsi="Times New Roman" w:eastAsia="宋体"/>
                 <w:b w:val="0"/>
+                <w:color w:val="000000"/>
                 <w:sz w:val="21"/>
               </w:rPr>
               <w:t>反馈可辨认，且不遮盖用于判断的主拍</w:t>
@@ -6372,7 +6537,7 @@
           <w:tcPr>
             <w:tcW w:type="dxa" w:w="1587"/>
             <w:vAlign w:val="center"/>
-            <w:shd w:fill="EDEDED"/>
+            <w:shd w:fill="244E60"/>
             <w:tcMar>
               <w:top w:w="75" w:type="dxa"/>
               <w:bottom w:w="75" w:type="dxa"/>
@@ -6389,6 +6554,7 @@
               <w:rPr>
                 <w:rFonts w:ascii="Times New Roman" w:hAnsi="Times New Roman" w:eastAsia="黑体"/>
                 <w:b w:val="0"/>
+                <w:color w:val="FFFFFF"/>
                 <w:sz w:val="21"/>
               </w:rPr>
               <w:t>成员</w:t>
@@ -6399,7 +6565,7 @@
           <w:tcPr>
             <w:tcW w:type="dxa" w:w="3515"/>
             <w:vAlign w:val="center"/>
-            <w:shd w:fill="EDEDED"/>
+            <w:shd w:fill="244E60"/>
             <w:tcMar>
               <w:top w:w="75" w:type="dxa"/>
               <w:bottom w:w="75" w:type="dxa"/>
@@ -6416,6 +6582,7 @@
               <w:rPr>
                 <w:rFonts w:ascii="Times New Roman" w:hAnsi="Times New Roman" w:eastAsia="黑体"/>
                 <w:b w:val="0"/>
+                <w:color w:val="FFFFFF"/>
                 <w:sz w:val="21"/>
               </w:rPr>
               <w:t>主要负责</w:t>
@@ -6426,7 +6593,7 @@
           <w:tcPr>
             <w:tcW w:type="dxa" w:w="4195"/>
             <w:vAlign w:val="center"/>
-            <w:shd w:fill="EDEDED"/>
+            <w:shd w:fill="244E60"/>
             <w:tcMar>
               <w:top w:w="75" w:type="dxa"/>
               <w:bottom w:w="75" w:type="dxa"/>
@@ -6443,6 +6610,7 @@
               <w:rPr>
                 <w:rFonts w:ascii="Times New Roman" w:hAnsi="Times New Roman" w:eastAsia="黑体"/>
                 <w:b w:val="0"/>
+                <w:color w:val="FFFFFF"/>
                 <w:sz w:val="21"/>
               </w:rPr>
               <w:t>主要成果</w:t>
@@ -6458,7 +6626,7 @@
           <w:tcPr>
             <w:tcW w:type="dxa" w:w="1587"/>
             <w:vAlign w:val="center"/>
-            <w:shd w:fill="FFFFFF"/>
+            <w:shd w:fill="FAF4E7"/>
             <w:tcMar>
               <w:top w:w="75" w:type="dxa"/>
               <w:bottom w:w="75" w:type="dxa"/>
@@ -6475,6 +6643,7 @@
               <w:rPr>
                 <w:rFonts w:ascii="Times New Roman" w:hAnsi="Times New Roman" w:eastAsia="宋体"/>
                 <w:b w:val="0"/>
+                <w:color w:val="000000"/>
                 <w:sz w:val="21"/>
               </w:rPr>
               <w:t>严楷哲</w:t>
@@ -6487,7 +6656,7 @@
           <w:tcPr>
             <w:tcW w:type="dxa" w:w="3515"/>
             <w:vAlign w:val="center"/>
-            <w:shd w:fill="FFFFFF"/>
+            <w:shd w:fill="F0F6F8"/>
             <w:tcMar>
               <w:top w:w="75" w:type="dxa"/>
               <w:bottom w:w="75" w:type="dxa"/>
@@ -6504,6 +6673,7 @@
               <w:rPr>
                 <w:rFonts w:ascii="Times New Roman" w:hAnsi="Times New Roman" w:eastAsia="宋体"/>
                 <w:b w:val="0"/>
+                <w:color w:val="000000"/>
                 <w:sz w:val="21"/>
               </w:rPr>
               <w:t>程序实现、版本维护、任务统筹</w:t>
@@ -6514,7 +6684,7 @@
           <w:tcPr>
             <w:tcW w:type="dxa" w:w="4195"/>
             <w:vAlign w:val="center"/>
-            <w:shd w:fill="FFFFFF"/>
+            <w:shd w:fill="F0F6F8"/>
             <w:tcMar>
               <w:top w:w="75" w:type="dxa"/>
               <w:bottom w:w="75" w:type="dxa"/>
@@ -6531,6 +6701,7 @@
               <w:rPr>
                 <w:rFonts w:ascii="Times New Roman" w:hAnsi="Times New Roman" w:eastAsia="宋体"/>
                 <w:b w:val="0"/>
+                <w:color w:val="000000"/>
                 <w:sz w:val="21"/>
               </w:rPr>
               <w:t>游戏工程、运行包、版本说明、统一材料目录</w:t>
@@ -6546,7 +6717,7 @@
           <w:tcPr>
             <w:tcW w:type="dxa" w:w="1587"/>
             <w:vAlign w:val="center"/>
-            <w:shd w:fill="FFFFFF"/>
+            <w:shd w:fill="FAF4E7"/>
             <w:tcMar>
               <w:top w:w="75" w:type="dxa"/>
               <w:bottom w:w="75" w:type="dxa"/>
@@ -6563,6 +6734,7 @@
               <w:rPr>
                 <w:rFonts w:ascii="Times New Roman" w:hAnsi="Times New Roman" w:eastAsia="宋体"/>
                 <w:b w:val="0"/>
+                <w:color w:val="000000"/>
                 <w:sz w:val="21"/>
               </w:rPr>
               <w:t>沈语雯</w:t>
@@ -6590,6 +6762,7 @@
               <w:rPr>
                 <w:rFonts w:ascii="Times New Roman" w:hAnsi="Times New Roman" w:eastAsia="宋体"/>
                 <w:b w:val="0"/>
+                <w:color w:val="000000"/>
                 <w:sz w:val="21"/>
               </w:rPr>
               <w:t>玩法策划、关卡设计、视觉交互</w:t>
@@ -6617,6 +6790,7 @@
               <w:rPr>
                 <w:rFonts w:ascii="Times New Roman" w:hAnsi="Times New Roman" w:eastAsia="宋体"/>
                 <w:b w:val="0"/>
+                <w:color w:val="000000"/>
                 <w:sz w:val="21"/>
               </w:rPr>
               <w:t>设计报告、关卡建议、界面与展示文案复核</w:t>
@@ -6632,7 +6806,7 @@
           <w:tcPr>
             <w:tcW w:type="dxa" w:w="1587"/>
             <w:vAlign w:val="center"/>
-            <w:shd w:fill="FFFFFF"/>
+            <w:shd w:fill="FAF4E7"/>
             <w:tcMar>
               <w:top w:w="75" w:type="dxa"/>
               <w:bottom w:w="75" w:type="dxa"/>
@@ -6649,6 +6823,7 @@
               <w:rPr>
                 <w:rFonts w:ascii="Times New Roman" w:hAnsi="Times New Roman" w:eastAsia="宋体"/>
                 <w:b w:val="0"/>
+                <w:color w:val="000000"/>
                 <w:sz w:val="21"/>
               </w:rPr>
               <w:t>李星莹</w:t>
@@ -6659,7 +6834,7 @@
           <w:tcPr>
             <w:tcW w:type="dxa" w:w="3515"/>
             <w:vAlign w:val="center"/>
-            <w:shd w:fill="FFFFFF"/>
+            <w:shd w:fill="F0F6F8"/>
             <w:tcMar>
               <w:top w:w="75" w:type="dxa"/>
               <w:bottom w:w="75" w:type="dxa"/>
@@ -6676,6 +6851,7 @@
               <w:rPr>
                 <w:rFonts w:ascii="Times New Roman" w:hAnsi="Times New Roman" w:eastAsia="宋体"/>
                 <w:b w:val="0"/>
+                <w:color w:val="000000"/>
                 <w:sz w:val="21"/>
               </w:rPr>
               <w:t>音频检查、测试、展示材料</w:t>
@@ -6686,7 +6862,7 @@
           <w:tcPr>
             <w:tcW w:type="dxa" w:w="4195"/>
             <w:vAlign w:val="center"/>
-            <w:shd w:fill="FFFFFF"/>
+            <w:shd w:fill="F0F6F8"/>
             <w:tcMar>
               <w:top w:w="75" w:type="dxa"/>
               <w:bottom w:w="75" w:type="dxa"/>
@@ -6703,6 +6879,7 @@
               <w:rPr>
                 <w:rFonts w:ascii="Times New Roman" w:hAnsi="Times New Roman" w:eastAsia="宋体"/>
                 <w:b w:val="0"/>
+                <w:color w:val="000000"/>
                 <w:sz w:val="21"/>
               </w:rPr>
               <w:t>测试记录、音画文件、介绍视频、PPT及讲稿维护</w:t>
@@ -6769,7 +6946,7 @@
           <w:tcPr>
             <w:tcW w:type="dxa" w:w="2891"/>
             <w:vAlign w:val="center"/>
-            <w:shd w:fill="EDEDED"/>
+            <w:shd w:fill="244E60"/>
             <w:tcMar>
               <w:top w:w="75" w:type="dxa"/>
               <w:bottom w:w="75" w:type="dxa"/>
@@ -6786,6 +6963,7 @@
               <w:rPr>
                 <w:rFonts w:ascii="Times New Roman" w:hAnsi="Times New Roman" w:eastAsia="黑体"/>
                 <w:b w:val="0"/>
+                <w:color w:val="FFFFFF"/>
                 <w:sz w:val="21"/>
               </w:rPr>
               <w:t>事项</w:t>
@@ -6796,7 +6974,7 @@
           <w:tcPr>
             <w:tcW w:type="dxa" w:w="1984"/>
             <w:vAlign w:val="center"/>
-            <w:shd w:fill="EDEDED"/>
+            <w:shd w:fill="244E60"/>
             <w:tcMar>
               <w:top w:w="75" w:type="dxa"/>
               <w:bottom w:w="75" w:type="dxa"/>
@@ -6813,6 +6991,7 @@
               <w:rPr>
                 <w:rFonts w:ascii="Times New Roman" w:hAnsi="Times New Roman" w:eastAsia="黑体"/>
                 <w:b w:val="0"/>
+                <w:color w:val="FFFFFF"/>
                 <w:sz w:val="21"/>
               </w:rPr>
               <w:t>主责</w:t>
@@ -6823,7 +7002,7 @@
           <w:tcPr>
             <w:tcW w:type="dxa" w:w="4422"/>
             <w:vAlign w:val="center"/>
-            <w:shd w:fill="EDEDED"/>
+            <w:shd w:fill="244E60"/>
             <w:tcMar>
               <w:top w:w="75" w:type="dxa"/>
               <w:bottom w:w="75" w:type="dxa"/>
@@ -6840,6 +7019,7 @@
               <w:rPr>
                 <w:rFonts w:ascii="Times New Roman" w:hAnsi="Times New Roman" w:eastAsia="黑体"/>
                 <w:b w:val="0"/>
+                <w:color w:val="FFFFFF"/>
                 <w:sz w:val="21"/>
               </w:rPr>
               <w:t>配合与复核</w:t>
@@ -6855,7 +7035,7 @@
           <w:tcPr>
             <w:tcW w:type="dxa" w:w="2891"/>
             <w:vAlign w:val="center"/>
-            <w:shd w:fill="FFFFFF"/>
+            <w:shd w:fill="FAF4E7"/>
             <w:tcMar>
               <w:top w:w="75" w:type="dxa"/>
               <w:bottom w:w="75" w:type="dxa"/>
@@ -6872,6 +7052,7 @@
               <w:rPr>
                 <w:rFonts w:ascii="Times New Roman" w:hAnsi="Times New Roman" w:eastAsia="宋体"/>
                 <w:b w:val="0"/>
+                <w:color w:val="000000"/>
                 <w:sz w:val="21"/>
               </w:rPr>
               <w:t>玩法、关卡和视觉调整</w:t>
@@ -6882,7 +7063,7 @@
           <w:tcPr>
             <w:tcW w:type="dxa" w:w="1984"/>
             <w:vAlign w:val="center"/>
-            <w:shd w:fill="FFFFFF"/>
+            <w:shd w:fill="F0F6F8"/>
             <w:tcMar>
               <w:top w:w="75" w:type="dxa"/>
               <w:bottom w:w="75" w:type="dxa"/>
@@ -6899,6 +7080,7 @@
               <w:rPr>
                 <w:rFonts w:ascii="Times New Roman" w:hAnsi="Times New Roman" w:eastAsia="宋体"/>
                 <w:b w:val="0"/>
+                <w:color w:val="000000"/>
                 <w:sz w:val="21"/>
               </w:rPr>
               <w:t>沈语雯</w:t>
@@ -6909,7 +7091,7 @@
           <w:tcPr>
             <w:tcW w:type="dxa" w:w="4422"/>
             <w:vAlign w:val="center"/>
-            <w:shd w:fill="FFFFFF"/>
+            <w:shd w:fill="F0F6F8"/>
             <w:tcMar>
               <w:top w:w="75" w:type="dxa"/>
               <w:bottom w:w="75" w:type="dxa"/>
@@ -6926,6 +7108,7 @@
               <w:rPr>
                 <w:rFonts w:ascii="Times New Roman" w:hAnsi="Times New Roman" w:eastAsia="宋体"/>
                 <w:b w:val="0"/>
+                <w:color w:val="000000"/>
                 <w:sz w:val="21"/>
               </w:rPr>
               <w:t>严楷哲评估并落实；李星莹复核实际体验</w:t>
@@ -6941,7 +7124,7 @@
           <w:tcPr>
             <w:tcW w:type="dxa" w:w="2891"/>
             <w:vAlign w:val="center"/>
-            <w:shd w:fill="FFFFFF"/>
+            <w:shd w:fill="FAF4E7"/>
             <w:tcMar>
               <w:top w:w="75" w:type="dxa"/>
               <w:bottom w:w="75" w:type="dxa"/>
@@ -6958,6 +7141,7 @@
               <w:rPr>
                 <w:rFonts w:ascii="Times New Roman" w:hAnsi="Times New Roman" w:eastAsia="宋体"/>
                 <w:b w:val="0"/>
+                <w:color w:val="000000"/>
                 <w:sz w:val="21"/>
               </w:rPr>
               <w:t>程序修复和版本导出</w:t>
@@ -6985,6 +7169,7 @@
               <w:rPr>
                 <w:rFonts w:ascii="Times New Roman" w:hAnsi="Times New Roman" w:eastAsia="宋体"/>
                 <w:b w:val="0"/>
+                <w:color w:val="000000"/>
                 <w:sz w:val="21"/>
               </w:rPr>
               <w:t>严楷哲</w:t>
@@ -7012,6 +7197,7 @@
               <w:rPr>
                 <w:rFonts w:ascii="Times New Roman" w:hAnsi="Times New Roman" w:eastAsia="宋体"/>
                 <w:b w:val="0"/>
+                <w:color w:val="000000"/>
                 <w:sz w:val="21"/>
               </w:rPr>
               <w:t>李星莹复测；沈语雯核对规则和画面</w:t>
@@ -7027,7 +7213,7 @@
           <w:tcPr>
             <w:tcW w:type="dxa" w:w="2891"/>
             <w:vAlign w:val="center"/>
-            <w:shd w:fill="FFFFFF"/>
+            <w:shd w:fill="FAF4E7"/>
             <w:tcMar>
               <w:top w:w="75" w:type="dxa"/>
               <w:bottom w:w="75" w:type="dxa"/>
@@ -7044,6 +7230,7 @@
               <w:rPr>
                 <w:rFonts w:ascii="Times New Roman" w:hAnsi="Times New Roman" w:eastAsia="宋体"/>
                 <w:b w:val="0"/>
+                <w:color w:val="000000"/>
                 <w:sz w:val="21"/>
               </w:rPr>
               <w:t>声音、同步与设备检查</w:t>
@@ -7054,7 +7241,7 @@
           <w:tcPr>
             <w:tcW w:type="dxa" w:w="1984"/>
             <w:vAlign w:val="center"/>
-            <w:shd w:fill="FFFFFF"/>
+            <w:shd w:fill="F0F6F8"/>
             <w:tcMar>
               <w:top w:w="75" w:type="dxa"/>
               <w:bottom w:w="75" w:type="dxa"/>
@@ -7071,6 +7258,7 @@
               <w:rPr>
                 <w:rFonts w:ascii="Times New Roman" w:hAnsi="Times New Roman" w:eastAsia="宋体"/>
                 <w:b w:val="0"/>
+                <w:color w:val="000000"/>
                 <w:sz w:val="21"/>
               </w:rPr>
               <w:t>李星莹</w:t>
@@ -7081,7 +7269,7 @@
           <w:tcPr>
             <w:tcW w:type="dxa" w:w="4422"/>
             <w:vAlign w:val="center"/>
-            <w:shd w:fill="FFFFFF"/>
+            <w:shd w:fill="F0F6F8"/>
             <w:tcMar>
               <w:top w:w="75" w:type="dxa"/>
               <w:bottom w:w="75" w:type="dxa"/>
@@ -7098,6 +7286,7 @@
               <w:rPr>
                 <w:rFonts w:ascii="Times New Roman" w:hAnsi="Times New Roman" w:eastAsia="宋体"/>
                 <w:b w:val="0"/>
+                <w:color w:val="000000"/>
                 <w:sz w:val="21"/>
               </w:rPr>
               <w:t>严楷哲定位处理；沈语雯核对反馈可读性</w:t>
@@ -7113,7 +7302,7 @@
           <w:tcPr>
             <w:tcW w:type="dxa" w:w="2891"/>
             <w:vAlign w:val="center"/>
-            <w:shd w:fill="FFFFFF"/>
+            <w:shd w:fill="FAF4E7"/>
             <w:tcMar>
               <w:top w:w="75" w:type="dxa"/>
               <w:bottom w:w="75" w:type="dxa"/>
@@ -7130,6 +7319,7 @@
               <w:rPr>
                 <w:rFonts w:ascii="Times New Roman" w:hAnsi="Times New Roman" w:eastAsia="宋体"/>
                 <w:b w:val="0"/>
+                <w:color w:val="000000"/>
                 <w:sz w:val="21"/>
               </w:rPr>
               <w:t>策划与展示内容</w:t>
@@ -7157,6 +7347,7 @@
               <w:rPr>
                 <w:rFonts w:ascii="Times New Roman" w:hAnsi="Times New Roman" w:eastAsia="宋体"/>
                 <w:b w:val="0"/>
+                <w:color w:val="000000"/>
                 <w:sz w:val="21"/>
               </w:rPr>
               <w:t>策划沈语雯</w:t>
@@ -7186,6 +7377,7 @@
               <w:rPr>
                 <w:rFonts w:ascii="Times New Roman" w:hAnsi="Times New Roman" w:eastAsia="宋体"/>
                 <w:b w:val="0"/>
+                <w:color w:val="000000"/>
                 <w:sz w:val="21"/>
               </w:rPr>
               <w:t>严楷哲核对工程版本；三人确认用语与画面</w:t>
@@ -7201,7 +7393,7 @@
           <w:tcPr>
             <w:tcW w:type="dxa" w:w="2891"/>
             <w:vAlign w:val="center"/>
-            <w:shd w:fill="FFFFFF"/>
+            <w:shd w:fill="FAF4E7"/>
             <w:tcMar>
               <w:top w:w="75" w:type="dxa"/>
               <w:bottom w:w="75" w:type="dxa"/>
@@ -7218,6 +7410,7 @@
               <w:rPr>
                 <w:rFonts w:ascii="Times New Roman" w:hAnsi="Times New Roman" w:eastAsia="宋体"/>
                 <w:b w:val="0"/>
+                <w:color w:val="000000"/>
                 <w:sz w:val="21"/>
               </w:rPr>
               <w:t>最终目录与备份</w:t>
@@ -7228,7 +7421,7 @@
           <w:tcPr>
             <w:tcW w:type="dxa" w:w="1984"/>
             <w:vAlign w:val="center"/>
-            <w:shd w:fill="FFFFFF"/>
+            <w:shd w:fill="F0F6F8"/>
             <w:tcMar>
               <w:top w:w="75" w:type="dxa"/>
               <w:bottom w:w="75" w:type="dxa"/>
@@ -7245,6 +7438,7 @@
               <w:rPr>
                 <w:rFonts w:ascii="Times New Roman" w:hAnsi="Times New Roman" w:eastAsia="宋体"/>
                 <w:b w:val="0"/>
+                <w:color w:val="000000"/>
                 <w:sz w:val="21"/>
               </w:rPr>
               <w:t>严楷哲</w:t>
@@ -7255,7 +7449,7 @@
           <w:tcPr>
             <w:tcW w:type="dxa" w:w="4422"/>
             <w:vAlign w:val="center"/>
-            <w:shd w:fill="FFFFFF"/>
+            <w:shd w:fill="F0F6F8"/>
             <w:tcMar>
               <w:top w:w="75" w:type="dxa"/>
               <w:bottom w:w="75" w:type="dxa"/>
@@ -7272,6 +7466,7 @@
               <w:rPr>
                 <w:rFonts w:ascii="Times New Roman" w:hAnsi="Times New Roman" w:eastAsia="宋体"/>
                 <w:b w:val="0"/>
+                <w:color w:val="000000"/>
                 <w:sz w:val="21"/>
               </w:rPr>
               <w:t>沈语雯、李星莹分别核对负责文件</w:t>
@@ -7763,7 +7958,7 @@
           <w:tcPr>
             <w:tcW w:type="dxa" w:w="2324"/>
             <w:vAlign w:val="center"/>
-            <w:shd w:fill="EDEDED"/>
+            <w:shd w:fill="244E60"/>
             <w:tcMar>
               <w:top w:w="75" w:type="dxa"/>
               <w:bottom w:w="75" w:type="dxa"/>
@@ -7780,6 +7975,7 @@
               <w:rPr>
                 <w:rFonts w:ascii="Times New Roman" w:hAnsi="Times New Roman" w:eastAsia="黑体"/>
                 <w:b w:val="0"/>
+                <w:color w:val="FFFFFF"/>
                 <w:sz w:val="21"/>
               </w:rPr>
               <w:t>计划阶段</w:t>
@@ -7790,7 +7986,7 @@
           <w:tcPr>
             <w:tcW w:type="dxa" w:w="2551"/>
             <w:vAlign w:val="center"/>
-            <w:shd w:fill="EDEDED"/>
+            <w:shd w:fill="244E60"/>
             <w:tcMar>
               <w:top w:w="75" w:type="dxa"/>
               <w:bottom w:w="75" w:type="dxa"/>
@@ -7807,6 +8003,7 @@
               <w:rPr>
                 <w:rFonts w:ascii="Times New Roman" w:hAnsi="Times New Roman" w:eastAsia="黑体"/>
                 <w:b w:val="0"/>
+                <w:color w:val="FFFFFF"/>
                 <w:sz w:val="21"/>
               </w:rPr>
               <w:t>人员安排</w:t>
@@ -7817,7 +8014,7 @@
           <w:tcPr>
             <w:tcW w:type="dxa" w:w="4422"/>
             <w:vAlign w:val="center"/>
-            <w:shd w:fill="EDEDED"/>
+            <w:shd w:fill="244E60"/>
             <w:tcMar>
               <w:top w:w="75" w:type="dxa"/>
               <w:bottom w:w="75" w:type="dxa"/>
@@ -7834,6 +8031,7 @@
               <w:rPr>
                 <w:rFonts w:ascii="Times New Roman" w:hAnsi="Times New Roman" w:eastAsia="黑体"/>
                 <w:b w:val="0"/>
+                <w:color w:val="FFFFFF"/>
                 <w:sz w:val="21"/>
               </w:rPr>
               <w:t>工作与成果</w:t>
@@ -7849,7 +8047,7 @@
           <w:tcPr>
             <w:tcW w:type="dxa" w:w="2324"/>
             <w:vAlign w:val="center"/>
-            <w:shd w:fill="FFFFFF"/>
+            <w:shd w:fill="FAF4E7"/>
             <w:tcMar>
               <w:top w:w="75" w:type="dxa"/>
               <w:bottom w:w="75" w:type="dxa"/>
@@ -7866,6 +8064,7 @@
               <w:rPr>
                 <w:rFonts w:ascii="Times New Roman" w:hAnsi="Times New Roman" w:eastAsia="宋体"/>
                 <w:b w:val="0"/>
+                <w:color w:val="000000"/>
                 <w:sz w:val="21"/>
               </w:rPr>
               <w:t>10月25—26日</w:t>
@@ -7878,7 +8077,7 @@
           <w:tcPr>
             <w:tcW w:type="dxa" w:w="2551"/>
             <w:vAlign w:val="center"/>
-            <w:shd w:fill="FFFFFF"/>
+            <w:shd w:fill="F0F6F8"/>
             <w:tcMar>
               <w:top w:w="75" w:type="dxa"/>
               <w:bottom w:w="75" w:type="dxa"/>
@@ -7895,6 +8094,7 @@
               <w:rPr>
                 <w:rFonts w:ascii="Times New Roman" w:hAnsi="Times New Roman" w:eastAsia="宋体"/>
                 <w:b w:val="0"/>
+                <w:color w:val="000000"/>
                 <w:sz w:val="21"/>
               </w:rPr>
               <w:t>李星莹记录</w:t>
@@ -7909,7 +8109,7 @@
           <w:tcPr>
             <w:tcW w:type="dxa" w:w="4422"/>
             <w:vAlign w:val="center"/>
-            <w:shd w:fill="FFFFFF"/>
+            <w:shd w:fill="F0F6F8"/>
             <w:tcMar>
               <w:top w:w="75" w:type="dxa"/>
               <w:bottom w:w="75" w:type="dxa"/>
@@ -7926,6 +8126,7 @@
               <w:rPr>
                 <w:rFonts w:ascii="Times New Roman" w:hAnsi="Times New Roman" w:eastAsia="宋体"/>
                 <w:b w:val="0"/>
+                <w:color w:val="000000"/>
                 <w:sz w:val="21"/>
               </w:rPr>
               <w:t>完成全流程与独立设备检查，形成问题清单、修复说明和复测结果</w:t>
@@ -7941,7 +8142,7 @@
           <w:tcPr>
             <w:tcW w:type="dxa" w:w="2324"/>
             <w:vAlign w:val="center"/>
-            <w:shd w:fill="FFFFFF"/>
+            <w:shd w:fill="FAF4E7"/>
             <w:tcMar>
               <w:top w:w="75" w:type="dxa"/>
               <w:bottom w:w="75" w:type="dxa"/>
@@ -7958,6 +8159,7 @@
               <w:rPr>
                 <w:rFonts w:ascii="Times New Roman" w:hAnsi="Times New Roman" w:eastAsia="宋体"/>
                 <w:b w:val="0"/>
+                <w:color w:val="000000"/>
                 <w:sz w:val="21"/>
               </w:rPr>
               <w:t>10月27—28日</w:t>
@@ -7987,6 +8189,7 @@
               <w:rPr>
                 <w:rFonts w:ascii="Times New Roman" w:hAnsi="Times New Roman" w:eastAsia="宋体"/>
                 <w:b w:val="0"/>
+                <w:color w:val="000000"/>
                 <w:sz w:val="21"/>
               </w:rPr>
               <w:t>严楷哲定版本</w:t>
@@ -8018,6 +8221,7 @@
               <w:rPr>
                 <w:rFonts w:ascii="Times New Roman" w:hAnsi="Times New Roman" w:eastAsia="宋体"/>
                 <w:b w:val="0"/>
+                <w:color w:val="000000"/>
                 <w:sz w:val="21"/>
               </w:rPr>
               <w:t>核对工程与运行包，同步报告、截图、视频和宣讲文件</w:t>
@@ -8033,7 +8237,7 @@
           <w:tcPr>
             <w:tcW w:type="dxa" w:w="2324"/>
             <w:vAlign w:val="center"/>
-            <w:shd w:fill="FFFFFF"/>
+            <w:shd w:fill="FAF4E7"/>
             <w:tcMar>
               <w:top w:w="75" w:type="dxa"/>
               <w:bottom w:w="75" w:type="dxa"/>
@@ -8050,6 +8254,7 @@
               <w:rPr>
                 <w:rFonts w:ascii="Times New Roman" w:hAnsi="Times New Roman" w:eastAsia="宋体"/>
                 <w:b w:val="0"/>
+                <w:color w:val="000000"/>
                 <w:sz w:val="21"/>
               </w:rPr>
               <w:t>10月29日</w:t>
@@ -8062,7 +8267,7 @@
           <w:tcPr>
             <w:tcW w:type="dxa" w:w="2551"/>
             <w:vAlign w:val="center"/>
-            <w:shd w:fill="FFFFFF"/>
+            <w:shd w:fill="F0F6F8"/>
             <w:tcMar>
               <w:top w:w="75" w:type="dxa"/>
               <w:bottom w:w="75" w:type="dxa"/>
@@ -8079,6 +8284,7 @@
               <w:rPr>
                 <w:rFonts w:ascii="Times New Roman" w:hAnsi="Times New Roman" w:eastAsia="宋体"/>
                 <w:b w:val="0"/>
+                <w:color w:val="000000"/>
                 <w:sz w:val="21"/>
               </w:rPr>
               <w:t>李星莹组织</w:t>
@@ -8091,7 +8297,7 @@
           <w:tcPr>
             <w:tcW w:type="dxa" w:w="4422"/>
             <w:vAlign w:val="center"/>
-            <w:shd w:fill="FFFFFF"/>
+            <w:shd w:fill="F0F6F8"/>
             <w:tcMar>
               <w:top w:w="75" w:type="dxa"/>
               <w:bottom w:w="75" w:type="dxa"/>
@@ -8108,6 +8314,7 @@
               <w:rPr>
                 <w:rFonts w:ascii="Times New Roman" w:hAnsi="Times New Roman" w:eastAsia="宋体"/>
                 <w:b w:val="0"/>
+                <w:color w:val="000000"/>
                 <w:sz w:val="21"/>
               </w:rPr>
               <w:t>完成3—5分钟计时，确定讲述、翻页和演示衔接</w:t>
@@ -8123,7 +8330,7 @@
           <w:tcPr>
             <w:tcW w:type="dxa" w:w="2324"/>
             <w:vAlign w:val="center"/>
-            <w:shd w:fill="FFFFFF"/>
+            <w:shd w:fill="FAF4E7"/>
             <w:tcMar>
               <w:top w:w="75" w:type="dxa"/>
               <w:bottom w:w="75" w:type="dxa"/>
@@ -8140,6 +8347,7 @@
               <w:rPr>
                 <w:rFonts w:ascii="Times New Roman" w:hAnsi="Times New Roman" w:eastAsia="宋体"/>
                 <w:b w:val="0"/>
+                <w:color w:val="000000"/>
                 <w:sz w:val="21"/>
               </w:rPr>
               <w:t>10月30日—11月1日</w:t>
@@ -8169,6 +8377,7 @@
               <w:rPr>
                 <w:rFonts w:ascii="Times New Roman" w:hAnsi="Times New Roman" w:eastAsia="宋体"/>
                 <w:b w:val="0"/>
+                <w:color w:val="000000"/>
                 <w:sz w:val="21"/>
               </w:rPr>
               <w:t>严楷哲统筹</w:t>
@@ -8198,6 +8407,7 @@
               <w:rPr>
                 <w:rFonts w:ascii="Times New Roman" w:hAnsi="Times New Roman" w:eastAsia="宋体"/>
                 <w:b w:val="0"/>
+                <w:color w:val="000000"/>
                 <w:sz w:val="21"/>
               </w:rPr>
               <w:t>核对五类材料、分享下载及实际提交状态，保留最终目录与备份</w:t>
@@ -8213,7 +8423,7 @@
           <w:tcPr>
             <w:tcW w:type="dxa" w:w="2324"/>
             <w:vAlign w:val="center"/>
-            <w:shd w:fill="FFFFFF"/>
+            <w:shd w:fill="FAF4E7"/>
             <w:tcMar>
               <w:top w:w="75" w:type="dxa"/>
               <w:bottom w:w="75" w:type="dxa"/>
@@ -8230,6 +8440,7 @@
               <w:rPr>
                 <w:rFonts w:ascii="Times New Roman" w:hAnsi="Times New Roman" w:eastAsia="宋体"/>
                 <w:b w:val="0"/>
+                <w:color w:val="000000"/>
                 <w:sz w:val="21"/>
               </w:rPr>
               <w:t>11月2—8日</w:t>
@@ -8242,7 +8453,7 @@
           <w:tcPr>
             <w:tcW w:type="dxa" w:w="2551"/>
             <w:vAlign w:val="center"/>
-            <w:shd w:fill="FFFFFF"/>
+            <w:shd w:fill="F0F6F8"/>
             <w:tcMar>
               <w:top w:w="75" w:type="dxa"/>
               <w:bottom w:w="75" w:type="dxa"/>
@@ -8259,6 +8470,7 @@
               <w:rPr>
                 <w:rFonts w:ascii="Times New Roman" w:hAnsi="Times New Roman" w:eastAsia="宋体"/>
                 <w:b w:val="0"/>
+                <w:color w:val="000000"/>
                 <w:sz w:val="21"/>
               </w:rPr>
               <w:t>按排练确定分工</w:t>
@@ -8269,7 +8481,7 @@
           <w:tcPr>
             <w:tcW w:type="dxa" w:w="4422"/>
             <w:vAlign w:val="center"/>
-            <w:shd w:fill="FFFFFF"/>
+            <w:shd w:fill="F0F6F8"/>
             <w:tcMar>
               <w:top w:w="75" w:type="dxa"/>
               <w:bottom w:w="75" w:type="dxa"/>
@@ -8286,6 +8498,7 @@
               <w:rPr>
                 <w:rFonts w:ascii="Times New Roman" w:hAnsi="Times New Roman" w:eastAsia="宋体"/>
                 <w:b w:val="0"/>
+                <w:color w:val="000000"/>
                 <w:sz w:val="21"/>
               </w:rPr>
               <w:t>验证离线放映与运行，准备设计、实现、测试方面的说明</w:t>

</xml_diff>

<commit_message>
Add team academic affiliations to project materials
</commit_message>
<xml_diff>
--- a/docs/design/game-design.docx
+++ b/docs/design/game-design.docx
@@ -7519,6 +7519,19 @@
     </w:p>
     <w:p>
       <w:pPr>
+        <w:ind w:firstLine="0"/>
+      </w:pPr>
+      <w:r>
+        <w:rPr>
+          <w:b w:val="0"/>
+        </w:rPr>
+        <w:t>学院  集成电路科学与工程学院（产教融合学院）</w:t>
+        <w:br/>
+        <w:t>专业  集成电路设计与集成系统</w:t>
+      </w:r>
+    </w:p>
+    <w:p>
+      <w:pPr>
         <w:pStyle w:val="Heading3"/>
       </w:pPr>
       <w:r>
@@ -7647,6 +7660,19 @@
     </w:p>
     <w:p>
       <w:pPr>
+        <w:ind w:firstLine="0"/>
+      </w:pPr>
+      <w:r>
+        <w:rPr>
+          <w:b w:val="0"/>
+        </w:rPr>
+        <w:t>学院  计算机学院、软件学院、网络空间安全学院</w:t>
+        <w:br/>
+        <w:t>专业  计算机科学与技术</w:t>
+      </w:r>
+    </w:p>
+    <w:p>
+      <w:pPr>
         <w:pStyle w:val="Heading3"/>
       </w:pPr>
       <w:r>
@@ -7770,6 +7796,19 @@
           <w:sz w:val="32"/>
         </w:rPr>
         <w:t>李星莹 音频测试与展示负责人</w:t>
+      </w:r>
+    </w:p>
+    <w:p>
+      <w:pPr>
+        <w:ind w:firstLine="0"/>
+      </w:pPr>
+      <w:r>
+        <w:rPr>
+          <w:b w:val="0"/>
+        </w:rPr>
+        <w:t>学院  计算机学院、软件学院、网络空间安全学院</w:t>
+        <w:br/>
+        <w:t>专业  计算机科学与技术</w:t>
       </w:r>
     </w:p>
     <w:p>

</xml_diff>

<commit_message>
Use black report titles and lighter table shading
</commit_message>
<xml_diff>
--- a/docs/design/game-design.docx
+++ b/docs/design/game-design.docx
@@ -180,7 +180,7 @@
           <w:tcPr>
             <w:tcW w:type="dxa" w:w="1984"/>
             <w:vAlign w:val="center"/>
-            <w:shd w:fill="244E60"/>
+            <w:shd w:fill="E8EEF1"/>
             <w:tcMar>
               <w:top w:w="75" w:type="dxa"/>
               <w:bottom w:w="75" w:type="dxa"/>
@@ -197,7 +197,7 @@
               <w:rPr>
                 <w:rFonts w:ascii="Times New Roman" w:hAnsi="Times New Roman" w:eastAsia="黑体"/>
                 <w:b w:val="0"/>
-                <w:color w:val="FFFFFF"/>
+                <w:color w:val="000000"/>
                 <w:sz w:val="21"/>
               </w:rPr>
               <w:t>作品信息</w:t>
@@ -208,7 +208,7 @@
           <w:tcPr>
             <w:tcW w:type="dxa" w:w="7313"/>
             <w:vAlign w:val="center"/>
-            <w:shd w:fill="244E60"/>
+            <w:shd w:fill="E8EEF1"/>
             <w:tcMar>
               <w:top w:w="75" w:type="dxa"/>
               <w:bottom w:w="75" w:type="dxa"/>
@@ -225,7 +225,7 @@
               <w:rPr>
                 <w:rFonts w:ascii="Times New Roman" w:hAnsi="Times New Roman" w:eastAsia="黑体"/>
                 <w:b w:val="0"/>
-                <w:color w:val="FFFFFF"/>
+                <w:color w:val="000000"/>
                 <w:sz w:val="21"/>
               </w:rPr>
               <w:t>当前版本</w:t>
@@ -241,7 +241,7 @@
           <w:tcPr>
             <w:tcW w:type="dxa" w:w="1984"/>
             <w:vAlign w:val="center"/>
-            <w:shd w:fill="FAF4E7"/>
+            <w:shd w:fill="F7F4EC"/>
             <w:tcMar>
               <w:top w:w="75" w:type="dxa"/>
               <w:bottom w:w="75" w:type="dxa"/>
@@ -269,7 +269,7 @@
           <w:tcPr>
             <w:tcW w:type="dxa" w:w="7313"/>
             <w:vAlign w:val="center"/>
-            <w:shd w:fill="F0F6F8"/>
+            <w:shd w:fill="F8FAFB"/>
             <w:tcMar>
               <w:top w:w="75" w:type="dxa"/>
               <w:bottom w:w="75" w:type="dxa"/>
@@ -302,7 +302,7 @@
           <w:tcPr>
             <w:tcW w:type="dxa" w:w="1984"/>
             <w:vAlign w:val="center"/>
-            <w:shd w:fill="FAF4E7"/>
+            <w:shd w:fill="F7F4EC"/>
             <w:tcMar>
               <w:top w:w="75" w:type="dxa"/>
               <w:bottom w:w="75" w:type="dxa"/>
@@ -363,7 +363,7 @@
           <w:tcPr>
             <w:tcW w:type="dxa" w:w="1984"/>
             <w:vAlign w:val="center"/>
-            <w:shd w:fill="FAF4E7"/>
+            <w:shd w:fill="F7F4EC"/>
             <w:tcMar>
               <w:top w:w="75" w:type="dxa"/>
               <w:bottom w:w="75" w:type="dxa"/>
@@ -391,7 +391,7 @@
           <w:tcPr>
             <w:tcW w:type="dxa" w:w="7313"/>
             <w:vAlign w:val="center"/>
-            <w:shd w:fill="F0F6F8"/>
+            <w:shd w:fill="F8FAFB"/>
             <w:tcMar>
               <w:top w:w="75" w:type="dxa"/>
               <w:bottom w:w="75" w:type="dxa"/>
@@ -424,7 +424,7 @@
           <w:tcPr>
             <w:tcW w:type="dxa" w:w="1984"/>
             <w:vAlign w:val="center"/>
-            <w:shd w:fill="FAF4E7"/>
+            <w:shd w:fill="F7F4EC"/>
             <w:tcMar>
               <w:top w:w="75" w:type="dxa"/>
               <w:bottom w:w="75" w:type="dxa"/>
@@ -525,7 +525,7 @@
           <w:tcPr>
             <w:tcW w:type="dxa" w:w="2154"/>
             <w:vAlign w:val="center"/>
-            <w:shd w:fill="244E60"/>
+            <w:shd w:fill="E8EEF1"/>
             <w:tcMar>
               <w:top w:w="75" w:type="dxa"/>
               <w:bottom w:w="75" w:type="dxa"/>
@@ -542,7 +542,7 @@
               <w:rPr>
                 <w:rFonts w:ascii="Times New Roman" w:hAnsi="Times New Roman" w:eastAsia="黑体"/>
                 <w:b w:val="0"/>
-                <w:color w:val="FFFFFF"/>
+                <w:color w:val="000000"/>
                 <w:sz w:val="21"/>
               </w:rPr>
               <w:t>章节</w:t>
@@ -553,7 +553,7 @@
           <w:tcPr>
             <w:tcW w:type="dxa" w:w="6180"/>
             <w:vAlign w:val="center"/>
-            <w:shd w:fill="244E60"/>
+            <w:shd w:fill="E8EEF1"/>
             <w:tcMar>
               <w:top w:w="75" w:type="dxa"/>
               <w:bottom w:w="75" w:type="dxa"/>
@@ -570,7 +570,7 @@
               <w:rPr>
                 <w:rFonts w:ascii="Times New Roman" w:hAnsi="Times New Roman" w:eastAsia="黑体"/>
                 <w:b w:val="0"/>
-                <w:color w:val="FFFFFF"/>
+                <w:color w:val="000000"/>
                 <w:sz w:val="21"/>
               </w:rPr>
               <w:t>主要内容</w:t>
@@ -581,7 +581,7 @@
           <w:tcPr>
             <w:tcW w:type="dxa" w:w="964"/>
             <w:vAlign w:val="center"/>
-            <w:shd w:fill="244E60"/>
+            <w:shd w:fill="E8EEF1"/>
             <w:tcMar>
               <w:top w:w="75" w:type="dxa"/>
               <w:bottom w:w="75" w:type="dxa"/>
@@ -598,7 +598,7 @@
               <w:rPr>
                 <w:rFonts w:ascii="Times New Roman" w:hAnsi="Times New Roman" w:eastAsia="黑体"/>
                 <w:b w:val="0"/>
-                <w:color w:val="FFFFFF"/>
+                <w:color w:val="000000"/>
                 <w:sz w:val="21"/>
               </w:rPr>
               <w:t>页码</w:t>
@@ -614,7 +614,7 @@
           <w:tcPr>
             <w:tcW w:type="dxa" w:w="2154"/>
             <w:vAlign w:val="center"/>
-            <w:shd w:fill="FAF4E7"/>
+            <w:shd w:fill="F7F4EC"/>
             <w:tcMar>
               <w:top w:w="75" w:type="dxa"/>
               <w:bottom w:w="75" w:type="dxa"/>
@@ -642,7 +642,7 @@
           <w:tcPr>
             <w:tcW w:type="dxa" w:w="6180"/>
             <w:vAlign w:val="center"/>
-            <w:shd w:fill="F0F6F8"/>
+            <w:shd w:fill="F8FAFB"/>
             <w:tcMar>
               <w:top w:w="75" w:type="dxa"/>
               <w:bottom w:w="75" w:type="dxa"/>
@@ -670,7 +670,7 @@
           <w:tcPr>
             <w:tcW w:type="dxa" w:w="964"/>
             <w:vAlign w:val="center"/>
-            <w:shd w:fill="F0F6F8"/>
+            <w:shd w:fill="F8FAFB"/>
             <w:tcMar>
               <w:top w:w="75" w:type="dxa"/>
               <w:bottom w:w="75" w:type="dxa"/>
@@ -703,7 +703,7 @@
           <w:tcPr>
             <w:tcW w:type="dxa" w:w="2154"/>
             <w:vAlign w:val="center"/>
-            <w:shd w:fill="FAF4E7"/>
+            <w:shd w:fill="F7F4EC"/>
             <w:tcMar>
               <w:top w:w="75" w:type="dxa"/>
               <w:bottom w:w="75" w:type="dxa"/>
@@ -792,7 +792,7 @@
           <w:tcPr>
             <w:tcW w:type="dxa" w:w="2154"/>
             <w:vAlign w:val="center"/>
-            <w:shd w:fill="FAF4E7"/>
+            <w:shd w:fill="F7F4EC"/>
             <w:tcMar>
               <w:top w:w="75" w:type="dxa"/>
               <w:bottom w:w="75" w:type="dxa"/>
@@ -820,7 +820,7 @@
           <w:tcPr>
             <w:tcW w:type="dxa" w:w="6180"/>
             <w:vAlign w:val="center"/>
-            <w:shd w:fill="F0F6F8"/>
+            <w:shd w:fill="F8FAFB"/>
             <w:tcMar>
               <w:top w:w="75" w:type="dxa"/>
               <w:bottom w:w="75" w:type="dxa"/>
@@ -848,7 +848,7 @@
           <w:tcPr>
             <w:tcW w:type="dxa" w:w="964"/>
             <w:vAlign w:val="center"/>
-            <w:shd w:fill="F0F6F8"/>
+            <w:shd w:fill="F8FAFB"/>
             <w:tcMar>
               <w:top w:w="75" w:type="dxa"/>
               <w:bottom w:w="75" w:type="dxa"/>
@@ -881,7 +881,7 @@
           <w:tcPr>
             <w:tcW w:type="dxa" w:w="2154"/>
             <w:vAlign w:val="center"/>
-            <w:shd w:fill="FAF4E7"/>
+            <w:shd w:fill="F7F4EC"/>
             <w:tcMar>
               <w:top w:w="75" w:type="dxa"/>
               <w:bottom w:w="75" w:type="dxa"/>
@@ -970,7 +970,7 @@
           <w:tcPr>
             <w:tcW w:type="dxa" w:w="2154"/>
             <w:vAlign w:val="center"/>
-            <w:shd w:fill="FAF4E7"/>
+            <w:shd w:fill="F7F4EC"/>
             <w:tcMar>
               <w:top w:w="75" w:type="dxa"/>
               <w:bottom w:w="75" w:type="dxa"/>
@@ -998,7 +998,7 @@
           <w:tcPr>
             <w:tcW w:type="dxa" w:w="6180"/>
             <w:vAlign w:val="center"/>
-            <w:shd w:fill="F0F6F8"/>
+            <w:shd w:fill="F8FAFB"/>
             <w:tcMar>
               <w:top w:w="75" w:type="dxa"/>
               <w:bottom w:w="75" w:type="dxa"/>
@@ -1026,7 +1026,7 @@
           <w:tcPr>
             <w:tcW w:type="dxa" w:w="964"/>
             <w:vAlign w:val="center"/>
-            <w:shd w:fill="F0F6F8"/>
+            <w:shd w:fill="F8FAFB"/>
             <w:tcMar>
               <w:top w:w="75" w:type="dxa"/>
               <w:bottom w:w="75" w:type="dxa"/>
@@ -1059,7 +1059,7 @@
           <w:tcPr>
             <w:tcW w:type="dxa" w:w="2154"/>
             <w:vAlign w:val="center"/>
-            <w:shd w:fill="FAF4E7"/>
+            <w:shd w:fill="F7F4EC"/>
             <w:tcMar>
               <w:top w:w="75" w:type="dxa"/>
               <w:bottom w:w="75" w:type="dxa"/>
@@ -1148,7 +1148,7 @@
           <w:tcPr>
             <w:tcW w:type="dxa" w:w="2154"/>
             <w:vAlign w:val="center"/>
-            <w:shd w:fill="FAF4E7"/>
+            <w:shd w:fill="F7F4EC"/>
             <w:tcMar>
               <w:top w:w="75" w:type="dxa"/>
               <w:bottom w:w="75" w:type="dxa"/>
@@ -1176,7 +1176,7 @@
           <w:tcPr>
             <w:tcW w:type="dxa" w:w="6180"/>
             <w:vAlign w:val="center"/>
-            <w:shd w:fill="F0F6F8"/>
+            <w:shd w:fill="F8FAFB"/>
             <w:tcMar>
               <w:top w:w="75" w:type="dxa"/>
               <w:bottom w:w="75" w:type="dxa"/>
@@ -1204,7 +1204,7 @@
           <w:tcPr>
             <w:tcW w:type="dxa" w:w="964"/>
             <w:vAlign w:val="center"/>
-            <w:shd w:fill="F0F6F8"/>
+            <w:shd w:fill="F8FAFB"/>
             <w:tcMar>
               <w:top w:w="75" w:type="dxa"/>
               <w:bottom w:w="75" w:type="dxa"/>
@@ -1346,7 +1346,7 @@
           <w:tcPr>
             <w:tcW w:type="dxa" w:w="2098"/>
             <w:vAlign w:val="center"/>
-            <w:shd w:fill="244E60"/>
+            <w:shd w:fill="E8EEF1"/>
             <w:tcMar>
               <w:top w:w="75" w:type="dxa"/>
               <w:bottom w:w="75" w:type="dxa"/>
@@ -1363,7 +1363,7 @@
               <w:rPr>
                 <w:rFonts w:ascii="Times New Roman" w:hAnsi="Times New Roman" w:eastAsia="黑体"/>
                 <w:b w:val="0"/>
-                <w:color w:val="FFFFFF"/>
+                <w:color w:val="000000"/>
                 <w:sz w:val="21"/>
               </w:rPr>
               <w:t>保留的体验</w:t>
@@ -1374,7 +1374,7 @@
           <w:tcPr>
             <w:tcW w:type="dxa" w:w="3118"/>
             <w:vAlign w:val="center"/>
-            <w:shd w:fill="244E60"/>
+            <w:shd w:fill="E8EEF1"/>
             <w:tcMar>
               <w:top w:w="75" w:type="dxa"/>
               <w:bottom w:w="75" w:type="dxa"/>
@@ -1391,7 +1391,7 @@
               <w:rPr>
                 <w:rFonts w:ascii="Times New Roman" w:hAnsi="Times New Roman" w:eastAsia="黑体"/>
                 <w:b w:val="0"/>
-                <w:color w:val="FFFFFF"/>
+                <w:color w:val="000000"/>
                 <w:sz w:val="21"/>
               </w:rPr>
               <w:t>落实方式</w:t>
@@ -1402,7 +1402,7 @@
           <w:tcPr>
             <w:tcW w:type="dxa" w:w="4082"/>
             <w:vAlign w:val="center"/>
-            <w:shd w:fill="244E60"/>
+            <w:shd w:fill="E8EEF1"/>
             <w:tcMar>
               <w:top w:w="75" w:type="dxa"/>
               <w:bottom w:w="75" w:type="dxa"/>
@@ -1419,7 +1419,7 @@
               <w:rPr>
                 <w:rFonts w:ascii="Times New Roman" w:hAnsi="Times New Roman" w:eastAsia="黑体"/>
                 <w:b w:val="0"/>
-                <w:color w:val="FFFFFF"/>
+                <w:color w:val="000000"/>
                 <w:sz w:val="21"/>
               </w:rPr>
               <w:t>范围选择</w:t>
@@ -1435,7 +1435,7 @@
           <w:tcPr>
             <w:tcW w:type="dxa" w:w="2098"/>
             <w:vAlign w:val="center"/>
-            <w:shd w:fill="FAF4E7"/>
+            <w:shd w:fill="F7F4EC"/>
             <w:tcMar>
               <w:top w:w="75" w:type="dxa"/>
               <w:bottom w:w="75" w:type="dxa"/>
@@ -1463,7 +1463,7 @@
           <w:tcPr>
             <w:tcW w:type="dxa" w:w="3118"/>
             <w:vAlign w:val="center"/>
-            <w:shd w:fill="F0F6F8"/>
+            <w:shd w:fill="F8FAFB"/>
             <w:tcMar>
               <w:top w:w="75" w:type="dxa"/>
               <w:bottom w:w="75" w:type="dxa"/>
@@ -1491,7 +1491,7 @@
           <w:tcPr>
             <w:tcW w:type="dxa" w:w="4082"/>
             <w:vAlign w:val="center"/>
-            <w:shd w:fill="F0F6F8"/>
+            <w:shd w:fill="F8FAFB"/>
             <w:tcMar>
               <w:top w:w="75" w:type="dxa"/>
               <w:bottom w:w="75" w:type="dxa"/>
@@ -1524,7 +1524,7 @@
           <w:tcPr>
             <w:tcW w:type="dxa" w:w="2098"/>
             <w:vAlign w:val="center"/>
-            <w:shd w:fill="FAF4E7"/>
+            <w:shd w:fill="F7F4EC"/>
             <w:tcMar>
               <w:top w:w="75" w:type="dxa"/>
               <w:bottom w:w="75" w:type="dxa"/>
@@ -1613,7 +1613,7 @@
           <w:tcPr>
             <w:tcW w:type="dxa" w:w="2098"/>
             <w:vAlign w:val="center"/>
-            <w:shd w:fill="FAF4E7"/>
+            <w:shd w:fill="F7F4EC"/>
             <w:tcMar>
               <w:top w:w="75" w:type="dxa"/>
               <w:bottom w:w="75" w:type="dxa"/>
@@ -1641,7 +1641,7 @@
           <w:tcPr>
             <w:tcW w:type="dxa" w:w="3118"/>
             <w:vAlign w:val="center"/>
-            <w:shd w:fill="F0F6F8"/>
+            <w:shd w:fill="F8FAFB"/>
             <w:tcMar>
               <w:top w:w="75" w:type="dxa"/>
               <w:bottom w:w="75" w:type="dxa"/>
@@ -1669,7 +1669,7 @@
           <w:tcPr>
             <w:tcW w:type="dxa" w:w="4082"/>
             <w:vAlign w:val="center"/>
-            <w:shd w:fill="F0F6F8"/>
+            <w:shd w:fill="F8FAFB"/>
             <w:tcMar>
               <w:top w:w="75" w:type="dxa"/>
               <w:bottom w:w="75" w:type="dxa"/>
@@ -1941,7 +1941,7 @@
           <w:tcPr>
             <w:tcW w:type="dxa" w:w="1814"/>
             <w:vAlign w:val="center"/>
-            <w:shd w:fill="244E60"/>
+            <w:shd w:fill="E8EEF1"/>
             <w:tcMar>
               <w:top w:w="75" w:type="dxa"/>
               <w:bottom w:w="75" w:type="dxa"/>
@@ -1958,7 +1958,7 @@
               <w:rPr>
                 <w:rFonts w:ascii="Times New Roman" w:hAnsi="Times New Roman" w:eastAsia="黑体"/>
                 <w:b w:val="0"/>
-                <w:color w:val="FFFFFF"/>
+                <w:color w:val="000000"/>
                 <w:sz w:val="21"/>
               </w:rPr>
               <w:t>参数</w:t>
@@ -1969,7 +1969,7 @@
           <w:tcPr>
             <w:tcW w:type="dxa" w:w="3345"/>
             <w:vAlign w:val="center"/>
-            <w:shd w:fill="244E60"/>
+            <w:shd w:fill="E8EEF1"/>
             <w:tcMar>
               <w:top w:w="75" w:type="dxa"/>
               <w:bottom w:w="75" w:type="dxa"/>
@@ -1986,7 +1986,7 @@
               <w:rPr>
                 <w:rFonts w:ascii="Times New Roman" w:hAnsi="Times New Roman" w:eastAsia="黑体"/>
                 <w:b w:val="0"/>
-                <w:color w:val="FFFFFF"/>
+                <w:color w:val="000000"/>
                 <w:sz w:val="21"/>
               </w:rPr>
               <w:t>当前值</w:t>
@@ -1997,7 +1997,7 @@
           <w:tcPr>
             <w:tcW w:type="dxa" w:w="4139"/>
             <w:vAlign w:val="center"/>
-            <w:shd w:fill="244E60"/>
+            <w:shd w:fill="E8EEF1"/>
             <w:tcMar>
               <w:top w:w="75" w:type="dxa"/>
               <w:bottom w:w="75" w:type="dxa"/>
@@ -2014,7 +2014,7 @@
               <w:rPr>
                 <w:rFonts w:ascii="Times New Roman" w:hAnsi="Times New Roman" w:eastAsia="黑体"/>
                 <w:b w:val="0"/>
-                <w:color w:val="FFFFFF"/>
+                <w:color w:val="000000"/>
                 <w:sz w:val="21"/>
               </w:rPr>
               <w:t>设计作用</w:t>
@@ -2030,7 +2030,7 @@
           <w:tcPr>
             <w:tcW w:type="dxa" w:w="1814"/>
             <w:vAlign w:val="center"/>
-            <w:shd w:fill="FAF4E7"/>
+            <w:shd w:fill="F7F4EC"/>
             <w:tcMar>
               <w:top w:w="75" w:type="dxa"/>
               <w:bottom w:w="75" w:type="dxa"/>
@@ -2058,7 +2058,7 @@
           <w:tcPr>
             <w:tcW w:type="dxa" w:w="3345"/>
             <w:vAlign w:val="center"/>
-            <w:shd w:fill="F0F6F8"/>
+            <w:shd w:fill="F8FAFB"/>
             <w:tcMar>
               <w:top w:w="75" w:type="dxa"/>
               <w:bottom w:w="75" w:type="dxa"/>
@@ -2086,7 +2086,7 @@
           <w:tcPr>
             <w:tcW w:type="dxa" w:w="4139"/>
             <w:vAlign w:val="center"/>
-            <w:shd w:fill="F0F6F8"/>
+            <w:shd w:fill="F8FAFB"/>
             <w:tcMar>
               <w:top w:w="75" w:type="dxa"/>
               <w:bottom w:w="75" w:type="dxa"/>
@@ -2119,7 +2119,7 @@
           <w:tcPr>
             <w:tcW w:type="dxa" w:w="1814"/>
             <w:vAlign w:val="center"/>
-            <w:shd w:fill="FAF4E7"/>
+            <w:shd w:fill="F7F4EC"/>
             <w:tcMar>
               <w:top w:w="75" w:type="dxa"/>
               <w:bottom w:w="75" w:type="dxa"/>
@@ -2208,7 +2208,7 @@
           <w:tcPr>
             <w:tcW w:type="dxa" w:w="1814"/>
             <w:vAlign w:val="center"/>
-            <w:shd w:fill="FAF4E7"/>
+            <w:shd w:fill="F7F4EC"/>
             <w:tcMar>
               <w:top w:w="75" w:type="dxa"/>
               <w:bottom w:w="75" w:type="dxa"/>
@@ -2236,7 +2236,7 @@
           <w:tcPr>
             <w:tcW w:type="dxa" w:w="3345"/>
             <w:vAlign w:val="center"/>
-            <w:shd w:fill="F0F6F8"/>
+            <w:shd w:fill="F8FAFB"/>
             <w:tcMar>
               <w:top w:w="75" w:type="dxa"/>
               <w:bottom w:w="75" w:type="dxa"/>
@@ -2264,7 +2264,7 @@
           <w:tcPr>
             <w:tcW w:type="dxa" w:w="4139"/>
             <w:vAlign w:val="center"/>
-            <w:shd w:fill="F0F6F8"/>
+            <w:shd w:fill="F8FAFB"/>
             <w:tcMar>
               <w:top w:w="75" w:type="dxa"/>
               <w:bottom w:w="75" w:type="dxa"/>
@@ -2297,7 +2297,7 @@
           <w:tcPr>
             <w:tcW w:type="dxa" w:w="1814"/>
             <w:vAlign w:val="center"/>
-            <w:shd w:fill="FAF4E7"/>
+            <w:shd w:fill="F7F4EC"/>
             <w:tcMar>
               <w:top w:w="75" w:type="dxa"/>
               <w:bottom w:w="75" w:type="dxa"/>
@@ -2483,7 +2483,7 @@
           <w:tcPr>
             <w:tcW w:type="dxa" w:w="2098"/>
             <w:vAlign w:val="center"/>
-            <w:shd w:fill="244E60"/>
+            <w:shd w:fill="E8EEF1"/>
             <w:tcMar>
               <w:top w:w="75" w:type="dxa"/>
               <w:bottom w:w="75" w:type="dxa"/>
@@ -2500,7 +2500,7 @@
               <w:rPr>
                 <w:rFonts w:ascii="Times New Roman" w:hAnsi="Times New Roman" w:eastAsia="黑体"/>
                 <w:b w:val="0"/>
-                <w:color w:val="FFFFFF"/>
+                <w:color w:val="000000"/>
                 <w:sz w:val="21"/>
               </w:rPr>
               <w:t>设计选择</w:t>
@@ -2511,7 +2511,7 @@
           <w:tcPr>
             <w:tcW w:type="dxa" w:w="3515"/>
             <w:vAlign w:val="center"/>
-            <w:shd w:fill="244E60"/>
+            <w:shd w:fill="E8EEF1"/>
             <w:tcMar>
               <w:top w:w="75" w:type="dxa"/>
               <w:bottom w:w="75" w:type="dxa"/>
@@ -2528,7 +2528,7 @@
               <w:rPr>
                 <w:rFonts w:ascii="Times New Roman" w:hAnsi="Times New Roman" w:eastAsia="黑体"/>
                 <w:b w:val="0"/>
-                <w:color w:val="FFFFFF"/>
+                <w:color w:val="000000"/>
                 <w:sz w:val="21"/>
               </w:rPr>
               <w:t>当前作用</w:t>
@@ -2539,7 +2539,7 @@
           <w:tcPr>
             <w:tcW w:type="dxa" w:w="3685"/>
             <w:vAlign w:val="center"/>
-            <w:shd w:fill="244E60"/>
+            <w:shd w:fill="E8EEF1"/>
             <w:tcMar>
               <w:top w:w="75" w:type="dxa"/>
               <w:bottom w:w="75" w:type="dxa"/>
@@ -2556,7 +2556,7 @@
               <w:rPr>
                 <w:rFonts w:ascii="Times New Roman" w:hAnsi="Times New Roman" w:eastAsia="黑体"/>
                 <w:b w:val="0"/>
-                <w:color w:val="FFFFFF"/>
+                <w:color w:val="000000"/>
                 <w:sz w:val="21"/>
               </w:rPr>
               <w:t>需要接受的限制</w:t>
@@ -2572,7 +2572,7 @@
           <w:tcPr>
             <w:tcW w:type="dxa" w:w="2098"/>
             <w:vAlign w:val="center"/>
-            <w:shd w:fill="FAF4E7"/>
+            <w:shd w:fill="F7F4EC"/>
             <w:tcMar>
               <w:top w:w="75" w:type="dxa"/>
               <w:bottom w:w="75" w:type="dxa"/>
@@ -2600,7 +2600,7 @@
           <w:tcPr>
             <w:tcW w:type="dxa" w:w="3515"/>
             <w:vAlign w:val="center"/>
-            <w:shd w:fill="F0F6F8"/>
+            <w:shd w:fill="F8FAFB"/>
             <w:tcMar>
               <w:top w:w="75" w:type="dxa"/>
               <w:bottom w:w="75" w:type="dxa"/>
@@ -2628,7 +2628,7 @@
           <w:tcPr>
             <w:tcW w:type="dxa" w:w="3685"/>
             <w:vAlign w:val="center"/>
-            <w:shd w:fill="F0F6F8"/>
+            <w:shd w:fill="F8FAFB"/>
             <w:tcMar>
               <w:top w:w="75" w:type="dxa"/>
               <w:bottom w:w="75" w:type="dxa"/>
@@ -2661,7 +2661,7 @@
           <w:tcPr>
             <w:tcW w:type="dxa" w:w="2098"/>
             <w:vAlign w:val="center"/>
-            <w:shd w:fill="FAF4E7"/>
+            <w:shd w:fill="F7F4EC"/>
             <w:tcMar>
               <w:top w:w="75" w:type="dxa"/>
               <w:bottom w:w="75" w:type="dxa"/>
@@ -2750,7 +2750,7 @@
           <w:tcPr>
             <w:tcW w:type="dxa" w:w="2098"/>
             <w:vAlign w:val="center"/>
-            <w:shd w:fill="FAF4E7"/>
+            <w:shd w:fill="F7F4EC"/>
             <w:tcMar>
               <w:top w:w="75" w:type="dxa"/>
               <w:bottom w:w="75" w:type="dxa"/>
@@ -2778,7 +2778,7 @@
           <w:tcPr>
             <w:tcW w:type="dxa" w:w="3515"/>
             <w:vAlign w:val="center"/>
-            <w:shd w:fill="F0F6F8"/>
+            <w:shd w:fill="F8FAFB"/>
             <w:tcMar>
               <w:top w:w="75" w:type="dxa"/>
               <w:bottom w:w="75" w:type="dxa"/>
@@ -2806,7 +2806,7 @@
           <w:tcPr>
             <w:tcW w:type="dxa" w:w="3685"/>
             <w:vAlign w:val="center"/>
-            <w:shd w:fill="F0F6F8"/>
+            <w:shd w:fill="F8FAFB"/>
             <w:tcMar>
               <w:top w:w="75" w:type="dxa"/>
               <w:bottom w:w="75" w:type="dxa"/>
@@ -2839,7 +2839,7 @@
           <w:tcPr>
             <w:tcW w:type="dxa" w:w="2098"/>
             <w:vAlign w:val="center"/>
-            <w:shd w:fill="FAF4E7"/>
+            <w:shd w:fill="F7F4EC"/>
             <w:tcMar>
               <w:top w:w="75" w:type="dxa"/>
               <w:bottom w:w="75" w:type="dxa"/>
@@ -3071,7 +3071,7 @@
           <w:tcPr>
             <w:tcW w:type="dxa" w:w="1757"/>
             <w:vAlign w:val="center"/>
-            <w:shd w:fill="244E60"/>
+            <w:shd w:fill="E8EEF1"/>
             <w:tcMar>
               <w:top w:w="75" w:type="dxa"/>
               <w:bottom w:w="75" w:type="dxa"/>
@@ -3088,7 +3088,7 @@
               <w:rPr>
                 <w:rFonts w:ascii="Times New Roman" w:hAnsi="Times New Roman" w:eastAsia="黑体"/>
                 <w:b w:val="0"/>
-                <w:color w:val="FFFFFF"/>
+                <w:color w:val="000000"/>
                 <w:sz w:val="21"/>
               </w:rPr>
               <w:t>房间</w:t>
@@ -3099,7 +3099,7 @@
           <w:tcPr>
             <w:tcW w:type="dxa" w:w="3458"/>
             <w:vAlign w:val="center"/>
-            <w:shd w:fill="244E60"/>
+            <w:shd w:fill="E8EEF1"/>
             <w:tcMar>
               <w:top w:w="75" w:type="dxa"/>
               <w:bottom w:w="75" w:type="dxa"/>
@@ -3116,7 +3116,7 @@
               <w:rPr>
                 <w:rFonts w:ascii="Times New Roman" w:hAnsi="Times New Roman" w:eastAsia="黑体"/>
                 <w:b w:val="0"/>
-                <w:color w:val="FFFFFF"/>
+                <w:color w:val="000000"/>
                 <w:sz w:val="21"/>
               </w:rPr>
               <w:t>配置</w:t>
@@ -3127,7 +3127,7 @@
           <w:tcPr>
             <w:tcW w:type="dxa" w:w="4082"/>
             <w:vAlign w:val="center"/>
-            <w:shd w:fill="244E60"/>
+            <w:shd w:fill="E8EEF1"/>
             <w:tcMar>
               <w:top w:w="75" w:type="dxa"/>
               <w:bottom w:w="75" w:type="dxa"/>
@@ -3144,7 +3144,7 @@
               <w:rPr>
                 <w:rFonts w:ascii="Times New Roman" w:hAnsi="Times New Roman" w:eastAsia="黑体"/>
                 <w:b w:val="0"/>
-                <w:color w:val="FFFFFF"/>
+                <w:color w:val="000000"/>
                 <w:sz w:val="21"/>
               </w:rPr>
               <w:t>希望玩家掌握的判断</w:t>
@@ -3160,7 +3160,7 @@
           <w:tcPr>
             <w:tcW w:type="dxa" w:w="1757"/>
             <w:vAlign w:val="center"/>
-            <w:shd w:fill="FAF4E7"/>
+            <w:shd w:fill="F7F4EC"/>
             <w:tcMar>
               <w:top w:w="75" w:type="dxa"/>
               <w:bottom w:w="75" w:type="dxa"/>
@@ -3188,7 +3188,7 @@
           <w:tcPr>
             <w:tcW w:type="dxa" w:w="3458"/>
             <w:vAlign w:val="center"/>
-            <w:shd w:fill="F0F6F8"/>
+            <w:shd w:fill="F8FAFB"/>
             <w:tcMar>
               <w:top w:w="75" w:type="dxa"/>
               <w:bottom w:w="75" w:type="dxa"/>
@@ -3216,7 +3216,7 @@
           <w:tcPr>
             <w:tcW w:type="dxa" w:w="4082"/>
             <w:vAlign w:val="center"/>
-            <w:shd w:fill="F0F6F8"/>
+            <w:shd w:fill="F8FAFB"/>
             <w:tcMar>
               <w:top w:w="75" w:type="dxa"/>
               <w:bottom w:w="75" w:type="dxa"/>
@@ -3249,7 +3249,7 @@
           <w:tcPr>
             <w:tcW w:type="dxa" w:w="1757"/>
             <w:vAlign w:val="center"/>
-            <w:shd w:fill="FAF4E7"/>
+            <w:shd w:fill="F7F4EC"/>
             <w:tcMar>
               <w:top w:w="75" w:type="dxa"/>
               <w:bottom w:w="75" w:type="dxa"/>
@@ -3338,7 +3338,7 @@
           <w:tcPr>
             <w:tcW w:type="dxa" w:w="1757"/>
             <w:vAlign w:val="center"/>
-            <w:shd w:fill="FAF4E7"/>
+            <w:shd w:fill="F7F4EC"/>
             <w:tcMar>
               <w:top w:w="75" w:type="dxa"/>
               <w:bottom w:w="75" w:type="dxa"/>
@@ -3366,7 +3366,7 @@
           <w:tcPr>
             <w:tcW w:type="dxa" w:w="3458"/>
             <w:vAlign w:val="center"/>
-            <w:shd w:fill="F0F6F8"/>
+            <w:shd w:fill="F8FAFB"/>
             <w:tcMar>
               <w:top w:w="75" w:type="dxa"/>
               <w:bottom w:w="75" w:type="dxa"/>
@@ -3394,7 +3394,7 @@
           <w:tcPr>
             <w:tcW w:type="dxa" w:w="4082"/>
             <w:vAlign w:val="center"/>
-            <w:shd w:fill="F0F6F8"/>
+            <w:shd w:fill="F8FAFB"/>
             <w:tcMar>
               <w:top w:w="75" w:type="dxa"/>
               <w:bottom w:w="75" w:type="dxa"/>
@@ -3697,7 +3697,7 @@
           <w:tcPr>
             <w:tcW w:type="dxa" w:w="1701"/>
             <w:vAlign w:val="center"/>
-            <w:shd w:fill="244E60"/>
+            <w:shd w:fill="E8EEF1"/>
             <w:tcMar>
               <w:top w:w="75" w:type="dxa"/>
               <w:bottom w:w="75" w:type="dxa"/>
@@ -3714,7 +3714,7 @@
               <w:rPr>
                 <w:rFonts w:ascii="Times New Roman" w:hAnsi="Times New Roman" w:eastAsia="黑体"/>
                 <w:b w:val="0"/>
-                <w:color w:val="FFFFFF"/>
+                <w:color w:val="000000"/>
                 <w:sz w:val="21"/>
               </w:rPr>
               <w:t>阶段</w:t>
@@ -3725,7 +3725,7 @@
           <w:tcPr>
             <w:tcW w:type="dxa" w:w="4252"/>
             <w:vAlign w:val="center"/>
-            <w:shd w:fill="244E60"/>
+            <w:shd w:fill="E8EEF1"/>
             <w:tcMar>
               <w:top w:w="75" w:type="dxa"/>
               <w:bottom w:w="75" w:type="dxa"/>
@@ -3742,7 +3742,7 @@
               <w:rPr>
                 <w:rFonts w:ascii="Times New Roman" w:hAnsi="Times New Roman" w:eastAsia="黑体"/>
                 <w:b w:val="0"/>
-                <w:color w:val="FFFFFF"/>
+                <w:color w:val="000000"/>
                 <w:sz w:val="21"/>
               </w:rPr>
               <w:t>状态变化</w:t>
@@ -3753,7 +3753,7 @@
           <w:tcPr>
             <w:tcW w:type="dxa" w:w="3345"/>
             <w:vAlign w:val="center"/>
-            <w:shd w:fill="244E60"/>
+            <w:shd w:fill="E8EEF1"/>
             <w:tcMar>
               <w:top w:w="75" w:type="dxa"/>
               <w:bottom w:w="75" w:type="dxa"/>
@@ -3770,7 +3770,7 @@
               <w:rPr>
                 <w:rFonts w:ascii="Times New Roman" w:hAnsi="Times New Roman" w:eastAsia="黑体"/>
                 <w:b w:val="0"/>
-                <w:color w:val="FFFFFF"/>
+                <w:color w:val="000000"/>
                 <w:sz w:val="21"/>
               </w:rPr>
               <w:t>接下来的行动</w:t>
@@ -3786,7 +3786,7 @@
           <w:tcPr>
             <w:tcW w:type="dxa" w:w="1701"/>
             <w:vAlign w:val="center"/>
-            <w:shd w:fill="FAF4E7"/>
+            <w:shd w:fill="F7F4EC"/>
             <w:tcMar>
               <w:top w:w="75" w:type="dxa"/>
               <w:bottom w:w="75" w:type="dxa"/>
@@ -3814,7 +3814,7 @@
           <w:tcPr>
             <w:tcW w:type="dxa" w:w="4252"/>
             <w:vAlign w:val="center"/>
-            <w:shd w:fill="F0F6F8"/>
+            <w:shd w:fill="F8FAFB"/>
             <w:tcMar>
               <w:top w:w="75" w:type="dxa"/>
               <w:bottom w:w="75" w:type="dxa"/>
@@ -3842,7 +3842,7 @@
           <w:tcPr>
             <w:tcW w:type="dxa" w:w="3345"/>
             <w:vAlign w:val="center"/>
-            <w:shd w:fill="F0F6F8"/>
+            <w:shd w:fill="F8FAFB"/>
             <w:tcMar>
               <w:top w:w="75" w:type="dxa"/>
               <w:bottom w:w="75" w:type="dxa"/>
@@ -3875,7 +3875,7 @@
           <w:tcPr>
             <w:tcW w:type="dxa" w:w="1701"/>
             <w:vAlign w:val="center"/>
-            <w:shd w:fill="FAF4E7"/>
+            <w:shd w:fill="F7F4EC"/>
             <w:tcMar>
               <w:top w:w="75" w:type="dxa"/>
               <w:bottom w:w="75" w:type="dxa"/>
@@ -3964,7 +3964,7 @@
           <w:tcPr>
             <w:tcW w:type="dxa" w:w="1701"/>
             <w:vAlign w:val="center"/>
-            <w:shd w:fill="FAF4E7"/>
+            <w:shd w:fill="F7F4EC"/>
             <w:tcMar>
               <w:top w:w="75" w:type="dxa"/>
               <w:bottom w:w="75" w:type="dxa"/>
@@ -3992,7 +3992,7 @@
           <w:tcPr>
             <w:tcW w:type="dxa" w:w="4252"/>
             <w:vAlign w:val="center"/>
-            <w:shd w:fill="F0F6F8"/>
+            <w:shd w:fill="F8FAFB"/>
             <w:tcMar>
               <w:top w:w="75" w:type="dxa"/>
               <w:bottom w:w="75" w:type="dxa"/>
@@ -4020,7 +4020,7 @@
           <w:tcPr>
             <w:tcW w:type="dxa" w:w="3345"/>
             <w:vAlign w:val="center"/>
-            <w:shd w:fill="F0F6F8"/>
+            <w:shd w:fill="F8FAFB"/>
             <w:tcMar>
               <w:top w:w="75" w:type="dxa"/>
               <w:bottom w:w="75" w:type="dxa"/>
@@ -4053,7 +4053,7 @@
           <w:tcPr>
             <w:tcW w:type="dxa" w:w="1701"/>
             <w:vAlign w:val="center"/>
-            <w:shd w:fill="FAF4E7"/>
+            <w:shd w:fill="F7F4EC"/>
             <w:tcMar>
               <w:top w:w="75" w:type="dxa"/>
               <w:bottom w:w="75" w:type="dxa"/>
@@ -4224,7 +4224,7 @@
           <w:tcPr>
             <w:tcW w:type="dxa" w:w="1814"/>
             <w:vAlign w:val="center"/>
-            <w:shd w:fill="244E60"/>
+            <w:shd w:fill="E8EEF1"/>
             <w:tcMar>
               <w:top w:w="75" w:type="dxa"/>
               <w:bottom w:w="75" w:type="dxa"/>
@@ -4241,7 +4241,7 @@
               <w:rPr>
                 <w:rFonts w:ascii="Times New Roman" w:hAnsi="Times New Roman" w:eastAsia="黑体"/>
                 <w:b w:val="0"/>
-                <w:color w:val="FFFFFF"/>
+                <w:color w:val="000000"/>
                 <w:sz w:val="21"/>
               </w:rPr>
               <w:t>观察对象</w:t>
@@ -4252,7 +4252,7 @@
           <w:tcPr>
             <w:tcW w:type="dxa" w:w="4139"/>
             <w:vAlign w:val="center"/>
-            <w:shd w:fill="244E60"/>
+            <w:shd w:fill="E8EEF1"/>
             <w:tcMar>
               <w:top w:w="75" w:type="dxa"/>
               <w:bottom w:w="75" w:type="dxa"/>
@@ -4269,7 +4269,7 @@
               <w:rPr>
                 <w:rFonts w:ascii="Times New Roman" w:hAnsi="Times New Roman" w:eastAsia="黑体"/>
                 <w:b w:val="0"/>
-                <w:color w:val="FFFFFF"/>
+                <w:color w:val="000000"/>
                 <w:sz w:val="21"/>
               </w:rPr>
               <w:t>主要表现</w:t>
@@ -4280,7 +4280,7 @@
           <w:tcPr>
             <w:tcW w:type="dxa" w:w="3345"/>
             <w:vAlign w:val="center"/>
-            <w:shd w:fill="244E60"/>
+            <w:shd w:fill="E8EEF1"/>
             <w:tcMar>
               <w:top w:w="75" w:type="dxa"/>
               <w:bottom w:w="75" w:type="dxa"/>
@@ -4297,7 +4297,7 @@
               <w:rPr>
                 <w:rFonts w:ascii="Times New Roman" w:hAnsi="Times New Roman" w:eastAsia="黑体"/>
                 <w:b w:val="0"/>
-                <w:color w:val="FFFFFF"/>
+                <w:color w:val="000000"/>
                 <w:sz w:val="21"/>
               </w:rPr>
               <w:t>玩家据此判断</w:t>
@@ -4313,7 +4313,7 @@
           <w:tcPr>
             <w:tcW w:type="dxa" w:w="1814"/>
             <w:vAlign w:val="center"/>
-            <w:shd w:fill="FAF4E7"/>
+            <w:shd w:fill="F7F4EC"/>
             <w:tcMar>
               <w:top w:w="75" w:type="dxa"/>
               <w:bottom w:w="75" w:type="dxa"/>
@@ -4341,7 +4341,7 @@
           <w:tcPr>
             <w:tcW w:type="dxa" w:w="4139"/>
             <w:vAlign w:val="center"/>
-            <w:shd w:fill="F0F6F8"/>
+            <w:shd w:fill="F8FAFB"/>
             <w:tcMar>
               <w:top w:w="75" w:type="dxa"/>
               <w:bottom w:w="75" w:type="dxa"/>
@@ -4369,7 +4369,7 @@
           <w:tcPr>
             <w:tcW w:type="dxa" w:w="3345"/>
             <w:vAlign w:val="center"/>
-            <w:shd w:fill="F0F6F8"/>
+            <w:shd w:fill="F8FAFB"/>
             <w:tcMar>
               <w:top w:w="75" w:type="dxa"/>
               <w:bottom w:w="75" w:type="dxa"/>
@@ -4402,7 +4402,7 @@
           <w:tcPr>
             <w:tcW w:type="dxa" w:w="1814"/>
             <w:vAlign w:val="center"/>
-            <w:shd w:fill="FAF4E7"/>
+            <w:shd w:fill="F7F4EC"/>
             <w:tcMar>
               <w:top w:w="75" w:type="dxa"/>
               <w:bottom w:w="75" w:type="dxa"/>
@@ -4491,7 +4491,7 @@
           <w:tcPr>
             <w:tcW w:type="dxa" w:w="1814"/>
             <w:vAlign w:val="center"/>
-            <w:shd w:fill="FAF4E7"/>
+            <w:shd w:fill="F7F4EC"/>
             <w:tcMar>
               <w:top w:w="75" w:type="dxa"/>
               <w:bottom w:w="75" w:type="dxa"/>
@@ -4519,7 +4519,7 @@
           <w:tcPr>
             <w:tcW w:type="dxa" w:w="4139"/>
             <w:vAlign w:val="center"/>
-            <w:shd w:fill="F0F6F8"/>
+            <w:shd w:fill="F8FAFB"/>
             <w:tcMar>
               <w:top w:w="75" w:type="dxa"/>
               <w:bottom w:w="75" w:type="dxa"/>
@@ -4547,7 +4547,7 @@
           <w:tcPr>
             <w:tcW w:type="dxa" w:w="3345"/>
             <w:vAlign w:val="center"/>
-            <w:shd w:fill="F0F6F8"/>
+            <w:shd w:fill="F8FAFB"/>
             <w:tcMar>
               <w:top w:w="75" w:type="dxa"/>
               <w:bottom w:w="75" w:type="dxa"/>
@@ -4580,7 +4580,7 @@
           <w:tcPr>
             <w:tcW w:type="dxa" w:w="1814"/>
             <w:vAlign w:val="center"/>
-            <w:shd w:fill="FAF4E7"/>
+            <w:shd w:fill="F7F4EC"/>
             <w:tcMar>
               <w:top w:w="75" w:type="dxa"/>
               <w:bottom w:w="75" w:type="dxa"/>
@@ -4669,7 +4669,7 @@
           <w:tcPr>
             <w:tcW w:type="dxa" w:w="1814"/>
             <w:vAlign w:val="center"/>
-            <w:shd w:fill="FAF4E7"/>
+            <w:shd w:fill="F7F4EC"/>
             <w:tcMar>
               <w:top w:w="75" w:type="dxa"/>
               <w:bottom w:w="75" w:type="dxa"/>
@@ -4697,7 +4697,7 @@
           <w:tcPr>
             <w:tcW w:type="dxa" w:w="4139"/>
             <w:vAlign w:val="center"/>
-            <w:shd w:fill="F0F6F8"/>
+            <w:shd w:fill="F8FAFB"/>
             <w:tcMar>
               <w:top w:w="75" w:type="dxa"/>
               <w:bottom w:w="75" w:type="dxa"/>
@@ -4725,7 +4725,7 @@
           <w:tcPr>
             <w:tcW w:type="dxa" w:w="3345"/>
             <w:vAlign w:val="center"/>
-            <w:shd w:fill="F0F6F8"/>
+            <w:shd w:fill="F8FAFB"/>
             <w:tcMar>
               <w:top w:w="75" w:type="dxa"/>
               <w:bottom w:w="75" w:type="dxa"/>
@@ -4904,7 +4904,7 @@
           <w:tcPr>
             <w:tcW w:type="dxa" w:w="2494"/>
             <w:vAlign w:val="center"/>
-            <w:shd w:fill="244E60"/>
+            <w:shd w:fill="E8EEF1"/>
             <w:tcMar>
               <w:top w:w="75" w:type="dxa"/>
               <w:bottom w:w="75" w:type="dxa"/>
@@ -4921,7 +4921,7 @@
               <w:rPr>
                 <w:rFonts w:ascii="Times New Roman" w:hAnsi="Times New Roman" w:eastAsia="黑体"/>
                 <w:b w:val="0"/>
-                <w:color w:val="FFFFFF"/>
+                <w:color w:val="000000"/>
                 <w:sz w:val="21"/>
               </w:rPr>
               <w:t>项目</w:t>
@@ -4932,7 +4932,7 @@
           <w:tcPr>
             <w:tcW w:type="dxa" w:w="6803"/>
             <w:vAlign w:val="center"/>
-            <w:shd w:fill="244E60"/>
+            <w:shd w:fill="E8EEF1"/>
             <w:tcMar>
               <w:top w:w="75" w:type="dxa"/>
               <w:bottom w:w="75" w:type="dxa"/>
@@ -4949,7 +4949,7 @@
               <w:rPr>
                 <w:rFonts w:ascii="Times New Roman" w:hAnsi="Times New Roman" w:eastAsia="黑体"/>
                 <w:b w:val="0"/>
-                <w:color w:val="FFFFFF"/>
+                <w:color w:val="000000"/>
                 <w:sz w:val="21"/>
               </w:rPr>
               <w:t>当前实现</w:t>
@@ -4965,7 +4965,7 @@
           <w:tcPr>
             <w:tcW w:type="dxa" w:w="2494"/>
             <w:vAlign w:val="center"/>
-            <w:shd w:fill="FAF4E7"/>
+            <w:shd w:fill="F7F4EC"/>
             <w:tcMar>
               <w:top w:w="75" w:type="dxa"/>
               <w:bottom w:w="75" w:type="dxa"/>
@@ -4993,7 +4993,7 @@
           <w:tcPr>
             <w:tcW w:type="dxa" w:w="6803"/>
             <w:vAlign w:val="center"/>
-            <w:shd w:fill="F0F6F8"/>
+            <w:shd w:fill="F8FAFB"/>
             <w:tcMar>
               <w:top w:w="75" w:type="dxa"/>
               <w:bottom w:w="75" w:type="dxa"/>
@@ -5026,7 +5026,7 @@
           <w:tcPr>
             <w:tcW w:type="dxa" w:w="2494"/>
             <w:vAlign w:val="center"/>
-            <w:shd w:fill="FAF4E7"/>
+            <w:shd w:fill="F7F4EC"/>
             <w:tcMar>
               <w:top w:w="75" w:type="dxa"/>
               <w:bottom w:w="75" w:type="dxa"/>
@@ -5087,7 +5087,7 @@
           <w:tcPr>
             <w:tcW w:type="dxa" w:w="2494"/>
             <w:vAlign w:val="center"/>
-            <w:shd w:fill="FAF4E7"/>
+            <w:shd w:fill="F7F4EC"/>
             <w:tcMar>
               <w:top w:w="75" w:type="dxa"/>
               <w:bottom w:w="75" w:type="dxa"/>
@@ -5115,7 +5115,7 @@
           <w:tcPr>
             <w:tcW w:type="dxa" w:w="6803"/>
             <w:vAlign w:val="center"/>
-            <w:shd w:fill="F0F6F8"/>
+            <w:shd w:fill="F8FAFB"/>
             <w:tcMar>
               <w:top w:w="75" w:type="dxa"/>
               <w:bottom w:w="75" w:type="dxa"/>
@@ -5148,7 +5148,7 @@
           <w:tcPr>
             <w:tcW w:type="dxa" w:w="2494"/>
             <w:vAlign w:val="center"/>
-            <w:shd w:fill="FAF4E7"/>
+            <w:shd w:fill="F7F4EC"/>
             <w:tcMar>
               <w:top w:w="75" w:type="dxa"/>
               <w:bottom w:w="75" w:type="dxa"/>
@@ -5343,7 +5343,7 @@
           <w:tcPr>
             <w:tcW w:type="dxa" w:w="3231"/>
             <w:vAlign w:val="center"/>
-            <w:shd w:fill="244E60"/>
+            <w:shd w:fill="E8EEF1"/>
             <w:tcMar>
               <w:top w:w="75" w:type="dxa"/>
               <w:bottom w:w="75" w:type="dxa"/>
@@ -5360,7 +5360,7 @@
               <w:rPr>
                 <w:rFonts w:ascii="Times New Roman" w:hAnsi="Times New Roman" w:eastAsia="黑体"/>
                 <w:b w:val="0"/>
-                <w:color w:val="FFFFFF"/>
+                <w:color w:val="000000"/>
                 <w:sz w:val="21"/>
               </w:rPr>
               <w:t>实现职责</w:t>
@@ -5371,7 +5371,7 @@
           <w:tcPr>
             <w:tcW w:type="dxa" w:w="6066"/>
             <w:vAlign w:val="center"/>
-            <w:shd w:fill="244E60"/>
+            <w:shd w:fill="E8EEF1"/>
             <w:tcMar>
               <w:top w:w="75" w:type="dxa"/>
               <w:bottom w:w="75" w:type="dxa"/>
@@ -5388,7 +5388,7 @@
               <w:rPr>
                 <w:rFonts w:ascii="Times New Roman" w:hAnsi="Times New Roman" w:eastAsia="黑体"/>
                 <w:b w:val="0"/>
-                <w:color w:val="FFFFFF"/>
+                <w:color w:val="000000"/>
                 <w:sz w:val="21"/>
               </w:rPr>
               <w:t>对应工程</w:t>
@@ -5404,7 +5404,7 @@
           <w:tcPr>
             <w:tcW w:type="dxa" w:w="3231"/>
             <w:vAlign w:val="center"/>
-            <w:shd w:fill="FAF4E7"/>
+            <w:shd w:fill="F7F4EC"/>
             <w:tcMar>
               <w:top w:w="75" w:type="dxa"/>
               <w:bottom w:w="75" w:type="dxa"/>
@@ -5432,7 +5432,7 @@
           <w:tcPr>
             <w:tcW w:type="dxa" w:w="6066"/>
             <w:vAlign w:val="center"/>
-            <w:shd w:fill="F0F6F8"/>
+            <w:shd w:fill="F8FAFB"/>
             <w:tcMar>
               <w:top w:w="75" w:type="dxa"/>
               <w:bottom w:w="75" w:type="dxa"/>
@@ -5465,7 +5465,7 @@
           <w:tcPr>
             <w:tcW w:type="dxa" w:w="3231"/>
             <w:vAlign w:val="center"/>
-            <w:shd w:fill="FAF4E7"/>
+            <w:shd w:fill="F7F4EC"/>
             <w:tcMar>
               <w:top w:w="75" w:type="dxa"/>
               <w:bottom w:w="75" w:type="dxa"/>
@@ -5526,7 +5526,7 @@
           <w:tcPr>
             <w:tcW w:type="dxa" w:w="3231"/>
             <w:vAlign w:val="center"/>
-            <w:shd w:fill="FAF4E7"/>
+            <w:shd w:fill="F7F4EC"/>
             <w:tcMar>
               <w:top w:w="75" w:type="dxa"/>
               <w:bottom w:w="75" w:type="dxa"/>
@@ -5554,7 +5554,7 @@
           <w:tcPr>
             <w:tcW w:type="dxa" w:w="6066"/>
             <w:vAlign w:val="center"/>
-            <w:shd w:fill="F0F6F8"/>
+            <w:shd w:fill="F8FAFB"/>
             <w:tcMar>
               <w:top w:w="75" w:type="dxa"/>
               <w:bottom w:w="75" w:type="dxa"/>
@@ -5587,7 +5587,7 @@
           <w:tcPr>
             <w:tcW w:type="dxa" w:w="3231"/>
             <w:vAlign w:val="center"/>
-            <w:shd w:fill="FAF4E7"/>
+            <w:shd w:fill="F7F4EC"/>
             <w:tcMar>
               <w:top w:w="75" w:type="dxa"/>
               <w:bottom w:w="75" w:type="dxa"/>
@@ -5711,7 +5711,7 @@
           <w:tcPr>
             <w:tcW w:type="dxa" w:w="2041"/>
             <w:vAlign w:val="center"/>
-            <w:shd w:fill="244E60"/>
+            <w:shd w:fill="E8EEF1"/>
             <w:tcMar>
               <w:top w:w="75" w:type="dxa"/>
               <w:bottom w:w="75" w:type="dxa"/>
@@ -5728,7 +5728,7 @@
               <w:rPr>
                 <w:rFonts w:ascii="Times New Roman" w:hAnsi="Times New Roman" w:eastAsia="黑体"/>
                 <w:b w:val="0"/>
-                <w:color w:val="FFFFFF"/>
+                <w:color w:val="000000"/>
                 <w:sz w:val="21"/>
               </w:rPr>
               <w:t>证据</w:t>
@@ -5739,7 +5739,7 @@
           <w:tcPr>
             <w:tcW w:type="dxa" w:w="3515"/>
             <w:vAlign w:val="center"/>
-            <w:shd w:fill="244E60"/>
+            <w:shd w:fill="E8EEF1"/>
             <w:tcMar>
               <w:top w:w="75" w:type="dxa"/>
               <w:bottom w:w="75" w:type="dxa"/>
@@ -5756,7 +5756,7 @@
               <w:rPr>
                 <w:rFonts w:ascii="Times New Roman" w:hAnsi="Times New Roman" w:eastAsia="黑体"/>
                 <w:b w:val="0"/>
-                <w:color w:val="FFFFFF"/>
+                <w:color w:val="000000"/>
                 <w:sz w:val="21"/>
               </w:rPr>
               <w:t>已验证的范围</w:t>
@@ -5767,7 +5767,7 @@
           <w:tcPr>
             <w:tcW w:type="dxa" w:w="3742"/>
             <w:vAlign w:val="center"/>
-            <w:shd w:fill="244E60"/>
+            <w:shd w:fill="E8EEF1"/>
             <w:tcMar>
               <w:top w:w="75" w:type="dxa"/>
               <w:bottom w:w="75" w:type="dxa"/>
@@ -5784,7 +5784,7 @@
               <w:rPr>
                 <w:rFonts w:ascii="Times New Roman" w:hAnsi="Times New Roman" w:eastAsia="黑体"/>
                 <w:b w:val="0"/>
-                <w:color w:val="FFFFFF"/>
+                <w:color w:val="000000"/>
                 <w:sz w:val="21"/>
               </w:rPr>
               <w:t>结论的边界</w:t>
@@ -5800,7 +5800,7 @@
           <w:tcPr>
             <w:tcW w:type="dxa" w:w="2041"/>
             <w:vAlign w:val="center"/>
-            <w:shd w:fill="FAF4E7"/>
+            <w:shd w:fill="F7F4EC"/>
             <w:tcMar>
               <w:top w:w="75" w:type="dxa"/>
               <w:bottom w:w="75" w:type="dxa"/>
@@ -5828,7 +5828,7 @@
           <w:tcPr>
             <w:tcW w:type="dxa" w:w="3515"/>
             <w:vAlign w:val="center"/>
-            <w:shd w:fill="F0F6F8"/>
+            <w:shd w:fill="F8FAFB"/>
             <w:tcMar>
               <w:top w:w="75" w:type="dxa"/>
               <w:bottom w:w="75" w:type="dxa"/>
@@ -5856,7 +5856,7 @@
           <w:tcPr>
             <w:tcW w:type="dxa" w:w="3742"/>
             <w:vAlign w:val="center"/>
-            <w:shd w:fill="F0F6F8"/>
+            <w:shd w:fill="F8FAFB"/>
             <w:tcMar>
               <w:top w:w="75" w:type="dxa"/>
               <w:bottom w:w="75" w:type="dxa"/>
@@ -5889,7 +5889,7 @@
           <w:tcPr>
             <w:tcW w:type="dxa" w:w="2041"/>
             <w:vAlign w:val="center"/>
-            <w:shd w:fill="FAF4E7"/>
+            <w:shd w:fill="F7F4EC"/>
             <w:tcMar>
               <w:top w:w="75" w:type="dxa"/>
               <w:bottom w:w="75" w:type="dxa"/>
@@ -5978,7 +5978,7 @@
           <w:tcPr>
             <w:tcW w:type="dxa" w:w="2041"/>
             <w:vAlign w:val="center"/>
-            <w:shd w:fill="FAF4E7"/>
+            <w:shd w:fill="F7F4EC"/>
             <w:tcMar>
               <w:top w:w="75" w:type="dxa"/>
               <w:bottom w:w="75" w:type="dxa"/>
@@ -6006,7 +6006,7 @@
           <w:tcPr>
             <w:tcW w:type="dxa" w:w="3515"/>
             <w:vAlign w:val="center"/>
-            <w:shd w:fill="F0F6F8"/>
+            <w:shd w:fill="F8FAFB"/>
             <w:tcMar>
               <w:top w:w="75" w:type="dxa"/>
               <w:bottom w:w="75" w:type="dxa"/>
@@ -6034,7 +6034,7 @@
           <w:tcPr>
             <w:tcW w:type="dxa" w:w="3742"/>
             <w:vAlign w:val="center"/>
-            <w:shd w:fill="F0F6F8"/>
+            <w:shd w:fill="F8FAFB"/>
             <w:tcMar>
               <w:top w:w="75" w:type="dxa"/>
               <w:bottom w:w="75" w:type="dxa"/>
@@ -6118,7 +6118,7 @@
           <w:tcPr>
             <w:tcW w:type="dxa" w:w="1814"/>
             <w:vAlign w:val="center"/>
-            <w:shd w:fill="244E60"/>
+            <w:shd w:fill="E8EEF1"/>
             <w:tcMar>
               <w:top w:w="75" w:type="dxa"/>
               <w:bottom w:w="75" w:type="dxa"/>
@@ -6135,7 +6135,7 @@
               <w:rPr>
                 <w:rFonts w:ascii="Times New Roman" w:hAnsi="Times New Roman" w:eastAsia="黑体"/>
                 <w:b w:val="0"/>
-                <w:color w:val="FFFFFF"/>
+                <w:color w:val="000000"/>
                 <w:sz w:val="21"/>
               </w:rPr>
               <w:t>完善顺序</w:t>
@@ -6146,7 +6146,7 @@
           <w:tcPr>
             <w:tcW w:type="dxa" w:w="3685"/>
             <w:vAlign w:val="center"/>
-            <w:shd w:fill="244E60"/>
+            <w:shd w:fill="E8EEF1"/>
             <w:tcMar>
               <w:top w:w="75" w:type="dxa"/>
               <w:bottom w:w="75" w:type="dxa"/>
@@ -6163,7 +6163,7 @@
               <w:rPr>
                 <w:rFonts w:ascii="Times New Roman" w:hAnsi="Times New Roman" w:eastAsia="黑体"/>
                 <w:b w:val="0"/>
-                <w:color w:val="FFFFFF"/>
+                <w:color w:val="000000"/>
                 <w:sz w:val="21"/>
               </w:rPr>
               <w:t>具体工作</w:t>
@@ -6174,7 +6174,7 @@
           <w:tcPr>
             <w:tcW w:type="dxa" w:w="3798"/>
             <w:vAlign w:val="center"/>
-            <w:shd w:fill="244E60"/>
+            <w:shd w:fill="E8EEF1"/>
             <w:tcMar>
               <w:top w:w="75" w:type="dxa"/>
               <w:bottom w:w="75" w:type="dxa"/>
@@ -6191,7 +6191,7 @@
               <w:rPr>
                 <w:rFonts w:ascii="Times New Roman" w:hAnsi="Times New Roman" w:eastAsia="黑体"/>
                 <w:b w:val="0"/>
-                <w:color w:val="FFFFFF"/>
+                <w:color w:val="000000"/>
                 <w:sz w:val="21"/>
               </w:rPr>
               <w:t>判断依据</w:t>
@@ -6207,7 +6207,7 @@
           <w:tcPr>
             <w:tcW w:type="dxa" w:w="1814"/>
             <w:vAlign w:val="center"/>
-            <w:shd w:fill="FAF4E7"/>
+            <w:shd w:fill="F7F4EC"/>
             <w:tcMar>
               <w:top w:w="75" w:type="dxa"/>
               <w:bottom w:w="75" w:type="dxa"/>
@@ -6235,7 +6235,7 @@
           <w:tcPr>
             <w:tcW w:type="dxa" w:w="3685"/>
             <w:vAlign w:val="center"/>
-            <w:shd w:fill="F0F6F8"/>
+            <w:shd w:fill="F8FAFB"/>
             <w:tcMar>
               <w:top w:w="75" w:type="dxa"/>
               <w:bottom w:w="75" w:type="dxa"/>
@@ -6263,7 +6263,7 @@
           <w:tcPr>
             <w:tcW w:type="dxa" w:w="3798"/>
             <w:vAlign w:val="center"/>
-            <w:shd w:fill="F0F6F8"/>
+            <w:shd w:fill="F8FAFB"/>
             <w:tcMar>
               <w:top w:w="75" w:type="dxa"/>
               <w:bottom w:w="75" w:type="dxa"/>
@@ -6296,7 +6296,7 @@
           <w:tcPr>
             <w:tcW w:type="dxa" w:w="1814"/>
             <w:vAlign w:val="center"/>
-            <w:shd w:fill="FAF4E7"/>
+            <w:shd w:fill="F7F4EC"/>
             <w:tcMar>
               <w:top w:w="75" w:type="dxa"/>
               <w:bottom w:w="75" w:type="dxa"/>
@@ -6385,7 +6385,7 @@
           <w:tcPr>
             <w:tcW w:type="dxa" w:w="1814"/>
             <w:vAlign w:val="center"/>
-            <w:shd w:fill="FAF4E7"/>
+            <w:shd w:fill="F7F4EC"/>
             <w:tcMar>
               <w:top w:w="75" w:type="dxa"/>
               <w:bottom w:w="75" w:type="dxa"/>
@@ -6413,7 +6413,7 @@
           <w:tcPr>
             <w:tcW w:type="dxa" w:w="3685"/>
             <w:vAlign w:val="center"/>
-            <w:shd w:fill="F0F6F8"/>
+            <w:shd w:fill="F8FAFB"/>
             <w:tcMar>
               <w:top w:w="75" w:type="dxa"/>
               <w:bottom w:w="75" w:type="dxa"/>
@@ -6441,7 +6441,7 @@
           <w:tcPr>
             <w:tcW w:type="dxa" w:w="3798"/>
             <w:vAlign w:val="center"/>
-            <w:shd w:fill="F0F6F8"/>
+            <w:shd w:fill="F8FAFB"/>
             <w:tcMar>
               <w:top w:w="75" w:type="dxa"/>
               <w:bottom w:w="75" w:type="dxa"/>
@@ -6537,7 +6537,7 @@
           <w:tcPr>
             <w:tcW w:type="dxa" w:w="1587"/>
             <w:vAlign w:val="center"/>
-            <w:shd w:fill="244E60"/>
+            <w:shd w:fill="E8EEF1"/>
             <w:tcMar>
               <w:top w:w="75" w:type="dxa"/>
               <w:bottom w:w="75" w:type="dxa"/>
@@ -6554,7 +6554,7 @@
               <w:rPr>
                 <w:rFonts w:ascii="Times New Roman" w:hAnsi="Times New Roman" w:eastAsia="黑体"/>
                 <w:b w:val="0"/>
-                <w:color w:val="FFFFFF"/>
+                <w:color w:val="000000"/>
                 <w:sz w:val="21"/>
               </w:rPr>
               <w:t>成员</w:t>
@@ -6565,7 +6565,7 @@
           <w:tcPr>
             <w:tcW w:type="dxa" w:w="3515"/>
             <w:vAlign w:val="center"/>
-            <w:shd w:fill="244E60"/>
+            <w:shd w:fill="E8EEF1"/>
             <w:tcMar>
               <w:top w:w="75" w:type="dxa"/>
               <w:bottom w:w="75" w:type="dxa"/>
@@ -6582,7 +6582,7 @@
               <w:rPr>
                 <w:rFonts w:ascii="Times New Roman" w:hAnsi="Times New Roman" w:eastAsia="黑体"/>
                 <w:b w:val="0"/>
-                <w:color w:val="FFFFFF"/>
+                <w:color w:val="000000"/>
                 <w:sz w:val="21"/>
               </w:rPr>
               <w:t>主要负责</w:t>
@@ -6593,7 +6593,7 @@
           <w:tcPr>
             <w:tcW w:type="dxa" w:w="4195"/>
             <w:vAlign w:val="center"/>
-            <w:shd w:fill="244E60"/>
+            <w:shd w:fill="E8EEF1"/>
             <w:tcMar>
               <w:top w:w="75" w:type="dxa"/>
               <w:bottom w:w="75" w:type="dxa"/>
@@ -6610,7 +6610,7 @@
               <w:rPr>
                 <w:rFonts w:ascii="Times New Roman" w:hAnsi="Times New Roman" w:eastAsia="黑体"/>
                 <w:b w:val="0"/>
-                <w:color w:val="FFFFFF"/>
+                <w:color w:val="000000"/>
                 <w:sz w:val="21"/>
               </w:rPr>
               <w:t>主要成果</w:t>
@@ -6626,7 +6626,7 @@
           <w:tcPr>
             <w:tcW w:type="dxa" w:w="1587"/>
             <w:vAlign w:val="center"/>
-            <w:shd w:fill="FAF4E7"/>
+            <w:shd w:fill="F7F4EC"/>
             <w:tcMar>
               <w:top w:w="75" w:type="dxa"/>
               <w:bottom w:w="75" w:type="dxa"/>
@@ -6656,7 +6656,7 @@
           <w:tcPr>
             <w:tcW w:type="dxa" w:w="3515"/>
             <w:vAlign w:val="center"/>
-            <w:shd w:fill="F0F6F8"/>
+            <w:shd w:fill="F8FAFB"/>
             <w:tcMar>
               <w:top w:w="75" w:type="dxa"/>
               <w:bottom w:w="75" w:type="dxa"/>
@@ -6684,7 +6684,7 @@
           <w:tcPr>
             <w:tcW w:type="dxa" w:w="4195"/>
             <w:vAlign w:val="center"/>
-            <w:shd w:fill="F0F6F8"/>
+            <w:shd w:fill="F8FAFB"/>
             <w:tcMar>
               <w:top w:w="75" w:type="dxa"/>
               <w:bottom w:w="75" w:type="dxa"/>
@@ -6717,7 +6717,7 @@
           <w:tcPr>
             <w:tcW w:type="dxa" w:w="1587"/>
             <w:vAlign w:val="center"/>
-            <w:shd w:fill="FAF4E7"/>
+            <w:shd w:fill="F7F4EC"/>
             <w:tcMar>
               <w:top w:w="75" w:type="dxa"/>
               <w:bottom w:w="75" w:type="dxa"/>
@@ -6806,7 +6806,7 @@
           <w:tcPr>
             <w:tcW w:type="dxa" w:w="1587"/>
             <w:vAlign w:val="center"/>
-            <w:shd w:fill="FAF4E7"/>
+            <w:shd w:fill="F7F4EC"/>
             <w:tcMar>
               <w:top w:w="75" w:type="dxa"/>
               <w:bottom w:w="75" w:type="dxa"/>
@@ -6834,7 +6834,7 @@
           <w:tcPr>
             <w:tcW w:type="dxa" w:w="3515"/>
             <w:vAlign w:val="center"/>
-            <w:shd w:fill="F0F6F8"/>
+            <w:shd w:fill="F8FAFB"/>
             <w:tcMar>
               <w:top w:w="75" w:type="dxa"/>
               <w:bottom w:w="75" w:type="dxa"/>
@@ -6862,7 +6862,7 @@
           <w:tcPr>
             <w:tcW w:type="dxa" w:w="4195"/>
             <w:vAlign w:val="center"/>
-            <w:shd w:fill="F0F6F8"/>
+            <w:shd w:fill="F8FAFB"/>
             <w:tcMar>
               <w:top w:w="75" w:type="dxa"/>
               <w:bottom w:w="75" w:type="dxa"/>
@@ -6946,7 +6946,7 @@
           <w:tcPr>
             <w:tcW w:type="dxa" w:w="2891"/>
             <w:vAlign w:val="center"/>
-            <w:shd w:fill="244E60"/>
+            <w:shd w:fill="E8EEF1"/>
             <w:tcMar>
               <w:top w:w="75" w:type="dxa"/>
               <w:bottom w:w="75" w:type="dxa"/>
@@ -6963,7 +6963,7 @@
               <w:rPr>
                 <w:rFonts w:ascii="Times New Roman" w:hAnsi="Times New Roman" w:eastAsia="黑体"/>
                 <w:b w:val="0"/>
-                <w:color w:val="FFFFFF"/>
+                <w:color w:val="000000"/>
                 <w:sz w:val="21"/>
               </w:rPr>
               <w:t>事项</w:t>
@@ -6974,7 +6974,7 @@
           <w:tcPr>
             <w:tcW w:type="dxa" w:w="1984"/>
             <w:vAlign w:val="center"/>
-            <w:shd w:fill="244E60"/>
+            <w:shd w:fill="E8EEF1"/>
             <w:tcMar>
               <w:top w:w="75" w:type="dxa"/>
               <w:bottom w:w="75" w:type="dxa"/>
@@ -6991,7 +6991,7 @@
               <w:rPr>
                 <w:rFonts w:ascii="Times New Roman" w:hAnsi="Times New Roman" w:eastAsia="黑体"/>
                 <w:b w:val="0"/>
-                <w:color w:val="FFFFFF"/>
+                <w:color w:val="000000"/>
                 <w:sz w:val="21"/>
               </w:rPr>
               <w:t>主责</w:t>
@@ -7002,7 +7002,7 @@
           <w:tcPr>
             <w:tcW w:type="dxa" w:w="4422"/>
             <w:vAlign w:val="center"/>
-            <w:shd w:fill="244E60"/>
+            <w:shd w:fill="E8EEF1"/>
             <w:tcMar>
               <w:top w:w="75" w:type="dxa"/>
               <w:bottom w:w="75" w:type="dxa"/>
@@ -7019,7 +7019,7 @@
               <w:rPr>
                 <w:rFonts w:ascii="Times New Roman" w:hAnsi="Times New Roman" w:eastAsia="黑体"/>
                 <w:b w:val="0"/>
-                <w:color w:val="FFFFFF"/>
+                <w:color w:val="000000"/>
                 <w:sz w:val="21"/>
               </w:rPr>
               <w:t>配合与复核</w:t>
@@ -7035,7 +7035,7 @@
           <w:tcPr>
             <w:tcW w:type="dxa" w:w="2891"/>
             <w:vAlign w:val="center"/>
-            <w:shd w:fill="FAF4E7"/>
+            <w:shd w:fill="F7F4EC"/>
             <w:tcMar>
               <w:top w:w="75" w:type="dxa"/>
               <w:bottom w:w="75" w:type="dxa"/>
@@ -7063,7 +7063,7 @@
           <w:tcPr>
             <w:tcW w:type="dxa" w:w="1984"/>
             <w:vAlign w:val="center"/>
-            <w:shd w:fill="F0F6F8"/>
+            <w:shd w:fill="F8FAFB"/>
             <w:tcMar>
               <w:top w:w="75" w:type="dxa"/>
               <w:bottom w:w="75" w:type="dxa"/>
@@ -7091,7 +7091,7 @@
           <w:tcPr>
             <w:tcW w:type="dxa" w:w="4422"/>
             <w:vAlign w:val="center"/>
-            <w:shd w:fill="F0F6F8"/>
+            <w:shd w:fill="F8FAFB"/>
             <w:tcMar>
               <w:top w:w="75" w:type="dxa"/>
               <w:bottom w:w="75" w:type="dxa"/>
@@ -7124,7 +7124,7 @@
           <w:tcPr>
             <w:tcW w:type="dxa" w:w="2891"/>
             <w:vAlign w:val="center"/>
-            <w:shd w:fill="FAF4E7"/>
+            <w:shd w:fill="F7F4EC"/>
             <w:tcMar>
               <w:top w:w="75" w:type="dxa"/>
               <w:bottom w:w="75" w:type="dxa"/>
@@ -7213,7 +7213,7 @@
           <w:tcPr>
             <w:tcW w:type="dxa" w:w="2891"/>
             <w:vAlign w:val="center"/>
-            <w:shd w:fill="FAF4E7"/>
+            <w:shd w:fill="F7F4EC"/>
             <w:tcMar>
               <w:top w:w="75" w:type="dxa"/>
               <w:bottom w:w="75" w:type="dxa"/>
@@ -7241,7 +7241,7 @@
           <w:tcPr>
             <w:tcW w:type="dxa" w:w="1984"/>
             <w:vAlign w:val="center"/>
-            <w:shd w:fill="F0F6F8"/>
+            <w:shd w:fill="F8FAFB"/>
             <w:tcMar>
               <w:top w:w="75" w:type="dxa"/>
               <w:bottom w:w="75" w:type="dxa"/>
@@ -7269,7 +7269,7 @@
           <w:tcPr>
             <w:tcW w:type="dxa" w:w="4422"/>
             <w:vAlign w:val="center"/>
-            <w:shd w:fill="F0F6F8"/>
+            <w:shd w:fill="F8FAFB"/>
             <w:tcMar>
               <w:top w:w="75" w:type="dxa"/>
               <w:bottom w:w="75" w:type="dxa"/>
@@ -7302,7 +7302,7 @@
           <w:tcPr>
             <w:tcW w:type="dxa" w:w="2891"/>
             <w:vAlign w:val="center"/>
-            <w:shd w:fill="FAF4E7"/>
+            <w:shd w:fill="F7F4EC"/>
             <w:tcMar>
               <w:top w:w="75" w:type="dxa"/>
               <w:bottom w:w="75" w:type="dxa"/>
@@ -7393,7 +7393,7 @@
           <w:tcPr>
             <w:tcW w:type="dxa" w:w="2891"/>
             <w:vAlign w:val="center"/>
-            <w:shd w:fill="FAF4E7"/>
+            <w:shd w:fill="F7F4EC"/>
             <w:tcMar>
               <w:top w:w="75" w:type="dxa"/>
               <w:bottom w:w="75" w:type="dxa"/>
@@ -7421,7 +7421,7 @@
           <w:tcPr>
             <w:tcW w:type="dxa" w:w="1984"/>
             <w:vAlign w:val="center"/>
-            <w:shd w:fill="F0F6F8"/>
+            <w:shd w:fill="F8FAFB"/>
             <w:tcMar>
               <w:top w:w="75" w:type="dxa"/>
               <w:bottom w:w="75" w:type="dxa"/>
@@ -7449,7 +7449,7 @@
           <w:tcPr>
             <w:tcW w:type="dxa" w:w="4422"/>
             <w:vAlign w:val="center"/>
-            <w:shd w:fill="F0F6F8"/>
+            <w:shd w:fill="F8FAFB"/>
             <w:tcMar>
               <w:top w:w="75" w:type="dxa"/>
               <w:bottom w:w="75" w:type="dxa"/>
@@ -7997,7 +7997,7 @@
           <w:tcPr>
             <w:tcW w:type="dxa" w:w="2324"/>
             <w:vAlign w:val="center"/>
-            <w:shd w:fill="244E60"/>
+            <w:shd w:fill="E8EEF1"/>
             <w:tcMar>
               <w:top w:w="75" w:type="dxa"/>
               <w:bottom w:w="75" w:type="dxa"/>
@@ -8014,7 +8014,7 @@
               <w:rPr>
                 <w:rFonts w:ascii="Times New Roman" w:hAnsi="Times New Roman" w:eastAsia="黑体"/>
                 <w:b w:val="0"/>
-                <w:color w:val="FFFFFF"/>
+                <w:color w:val="000000"/>
                 <w:sz w:val="21"/>
               </w:rPr>
               <w:t>计划阶段</w:t>
@@ -8025,7 +8025,7 @@
           <w:tcPr>
             <w:tcW w:type="dxa" w:w="2551"/>
             <w:vAlign w:val="center"/>
-            <w:shd w:fill="244E60"/>
+            <w:shd w:fill="E8EEF1"/>
             <w:tcMar>
               <w:top w:w="75" w:type="dxa"/>
               <w:bottom w:w="75" w:type="dxa"/>
@@ -8042,7 +8042,7 @@
               <w:rPr>
                 <w:rFonts w:ascii="Times New Roman" w:hAnsi="Times New Roman" w:eastAsia="黑体"/>
                 <w:b w:val="0"/>
-                <w:color w:val="FFFFFF"/>
+                <w:color w:val="000000"/>
                 <w:sz w:val="21"/>
               </w:rPr>
               <w:t>人员安排</w:t>
@@ -8053,7 +8053,7 @@
           <w:tcPr>
             <w:tcW w:type="dxa" w:w="4422"/>
             <w:vAlign w:val="center"/>
-            <w:shd w:fill="244E60"/>
+            <w:shd w:fill="E8EEF1"/>
             <w:tcMar>
               <w:top w:w="75" w:type="dxa"/>
               <w:bottom w:w="75" w:type="dxa"/>
@@ -8070,7 +8070,7 @@
               <w:rPr>
                 <w:rFonts w:ascii="Times New Roman" w:hAnsi="Times New Roman" w:eastAsia="黑体"/>
                 <w:b w:val="0"/>
-                <w:color w:val="FFFFFF"/>
+                <w:color w:val="000000"/>
                 <w:sz w:val="21"/>
               </w:rPr>
               <w:t>工作与成果</w:t>
@@ -8086,7 +8086,7 @@
           <w:tcPr>
             <w:tcW w:type="dxa" w:w="2324"/>
             <w:vAlign w:val="center"/>
-            <w:shd w:fill="FAF4E7"/>
+            <w:shd w:fill="F7F4EC"/>
             <w:tcMar>
               <w:top w:w="75" w:type="dxa"/>
               <w:bottom w:w="75" w:type="dxa"/>
@@ -8116,7 +8116,7 @@
           <w:tcPr>
             <w:tcW w:type="dxa" w:w="2551"/>
             <w:vAlign w:val="center"/>
-            <w:shd w:fill="F0F6F8"/>
+            <w:shd w:fill="F8FAFB"/>
             <w:tcMar>
               <w:top w:w="75" w:type="dxa"/>
               <w:bottom w:w="75" w:type="dxa"/>
@@ -8148,7 +8148,7 @@
           <w:tcPr>
             <w:tcW w:type="dxa" w:w="4422"/>
             <w:vAlign w:val="center"/>
-            <w:shd w:fill="F0F6F8"/>
+            <w:shd w:fill="F8FAFB"/>
             <w:tcMar>
               <w:top w:w="75" w:type="dxa"/>
               <w:bottom w:w="75" w:type="dxa"/>
@@ -8181,7 +8181,7 @@
           <w:tcPr>
             <w:tcW w:type="dxa" w:w="2324"/>
             <w:vAlign w:val="center"/>
-            <w:shd w:fill="FAF4E7"/>
+            <w:shd w:fill="F7F4EC"/>
             <w:tcMar>
               <w:top w:w="75" w:type="dxa"/>
               <w:bottom w:w="75" w:type="dxa"/>
@@ -8276,7 +8276,7 @@
           <w:tcPr>
             <w:tcW w:type="dxa" w:w="2324"/>
             <w:vAlign w:val="center"/>
-            <w:shd w:fill="FAF4E7"/>
+            <w:shd w:fill="F7F4EC"/>
             <w:tcMar>
               <w:top w:w="75" w:type="dxa"/>
               <w:bottom w:w="75" w:type="dxa"/>
@@ -8306,7 +8306,7 @@
           <w:tcPr>
             <w:tcW w:type="dxa" w:w="2551"/>
             <w:vAlign w:val="center"/>
-            <w:shd w:fill="F0F6F8"/>
+            <w:shd w:fill="F8FAFB"/>
             <w:tcMar>
               <w:top w:w="75" w:type="dxa"/>
               <w:bottom w:w="75" w:type="dxa"/>
@@ -8336,7 +8336,7 @@
           <w:tcPr>
             <w:tcW w:type="dxa" w:w="4422"/>
             <w:vAlign w:val="center"/>
-            <w:shd w:fill="F0F6F8"/>
+            <w:shd w:fill="F8FAFB"/>
             <w:tcMar>
               <w:top w:w="75" w:type="dxa"/>
               <w:bottom w:w="75" w:type="dxa"/>
@@ -8369,7 +8369,7 @@
           <w:tcPr>
             <w:tcW w:type="dxa" w:w="2324"/>
             <w:vAlign w:val="center"/>
-            <w:shd w:fill="FAF4E7"/>
+            <w:shd w:fill="F7F4EC"/>
             <w:tcMar>
               <w:top w:w="75" w:type="dxa"/>
               <w:bottom w:w="75" w:type="dxa"/>
@@ -8462,7 +8462,7 @@
           <w:tcPr>
             <w:tcW w:type="dxa" w:w="2324"/>
             <w:vAlign w:val="center"/>
-            <w:shd w:fill="FAF4E7"/>
+            <w:shd w:fill="F7F4EC"/>
             <w:tcMar>
               <w:top w:w="75" w:type="dxa"/>
               <w:bottom w:w="75" w:type="dxa"/>
@@ -8492,7 +8492,7 @@
           <w:tcPr>
             <w:tcW w:type="dxa" w:w="2551"/>
             <w:vAlign w:val="center"/>
-            <w:shd w:fill="F0F6F8"/>
+            <w:shd w:fill="F8FAFB"/>
             <w:tcMar>
               <w:top w:w="75" w:type="dxa"/>
               <w:bottom w:w="75" w:type="dxa"/>
@@ -8520,7 +8520,7 @@
           <w:tcPr>
             <w:tcW w:type="dxa" w:w="4422"/>
             <w:vAlign w:val="center"/>
-            <w:shd w:fill="F0F6F8"/>
+            <w:shd w:fill="F8FAFB"/>
             <w:tcMar>
               <w:top w:w="75" w:type="dxa"/>
               <w:bottom w:w="75" w:type="dxa"/>

</xml_diff>

<commit_message>
Refine formal game design report and team responsibilities
</commit_message>
<xml_diff>
--- a/docs/design/game-design.docx
+++ b/docs/design/game-design.docx
@@ -58,7 +58,7 @@
           <w:noProof/>
         </w:rPr>
         <w:drawing>
-          <wp:inline distT="0" distB="0" distL="0" distR="0" wp14:anchorId="6EC22DBF" wp14:editId="2A61DA18">
+          <wp:inline distT="0" distB="0" distL="0" distR="0" wp14:anchorId="22EFD0B4" wp14:editId="65264E9F">
             <wp:extent cx="5903999" cy="3320999"/>
             <wp:effectExtent l="0" t="0" r="0" b="0"/>
             <wp:docPr id="1" name="Picture 1"/>
@@ -119,7 +119,7 @@
         <w:ind w:firstLine="480"/>
       </w:pPr>
       <w:r>
-        <w:t>本作将节奏判断放进角色的实际起落，让踩拍动作改变通路状态，并留下继续前进的道路。报告围绕这一设计，说明玩法取舍、关卡教学、视听表达及当前实现。</w:t>
+        <w:t>本作将节奏判断放进角色的实际起落，让踩拍动作改变通路状态，并留下继续前进的道路。玩家在三间遗迹中依次完成修桥、穿越危险与连续接续通路的挑战。</w:t>
       </w:r>
     </w:p>
     <w:p>
@@ -181,14 +181,6 @@
       </w:r>
       <w:r>
         <w:t>测试与展示材料</w:t>
-      </w:r>
-    </w:p>
-    <w:p>
-      <w:pPr>
-        <w:ind w:firstLine="480"/>
-      </w:pPr>
-      <w:r>
-        <w:t>文中截图取自可玩版本；示意图依据工程规则绘制。团队工作安排列于附录，验证结果与后续计划分别说明。</w:t>
       </w:r>
     </w:p>
     <w:p>
@@ -226,7 +218,7 @@
       <w:r>
         <w:fldChar w:fldCharType="separate"/>
       </w:r>
-      <w:hyperlink w:anchor="_Toc243856752" w:history="1">
+      <w:hyperlink w:anchor="_Toc243857949" w:history="1">
         <w:r>
           <w:rPr>
             <w:rStyle w:val="aff9"/>
@@ -265,7 +257,7 @@
             <w:noProof/>
             <w:webHidden/>
           </w:rPr>
-          <w:instrText>PAGEREF _Toc243856752 \h</w:instrText>
+          <w:instrText>PAGEREF _Toc243857949 \h</w:instrText>
         </w:r>
         <w:r>
           <w:rPr>
@@ -323,7 +315,7 @@
           <w14:ligatures w14:val="standardContextual"/>
         </w:rPr>
       </w:pPr>
-      <w:hyperlink w:anchor="_Toc243856753" w:history="1">
+      <w:hyperlink w:anchor="_Toc243857950" w:history="1">
         <w:r>
           <w:rPr>
             <w:rStyle w:val="aff9"/>
@@ -380,7 +372,7 @@
             <w:noProof/>
             <w:webHidden/>
           </w:rPr>
-          <w:instrText>PAGEREF _Toc243856753 \h</w:instrText>
+          <w:instrText>PAGEREF _Toc243857950 \h</w:instrText>
         </w:r>
         <w:r>
           <w:rPr>
@@ -438,7 +430,7 @@
           <w14:ligatures w14:val="standardContextual"/>
         </w:rPr>
       </w:pPr>
-      <w:hyperlink w:anchor="_Toc243856754" w:history="1">
+      <w:hyperlink w:anchor="_Toc243857951" w:history="1">
         <w:r>
           <w:rPr>
             <w:rStyle w:val="aff9"/>
@@ -495,7 +487,7 @@
             <w:noProof/>
             <w:webHidden/>
           </w:rPr>
-          <w:instrText>PAGEREF _Toc243856754 \h</w:instrText>
+          <w:instrText>PAGEREF _Toc243857951 \h</w:instrText>
         </w:r>
         <w:r>
           <w:rPr>
@@ -554,7 +546,7 @@
           <w14:ligatures w14:val="standardContextual"/>
         </w:rPr>
       </w:pPr>
-      <w:hyperlink w:anchor="_Toc243856755" w:history="1">
+      <w:hyperlink w:anchor="_Toc243857952" w:history="1">
         <w:r>
           <w:rPr>
             <w:rStyle w:val="aff9"/>
@@ -593,7 +585,7 @@
             <w:noProof/>
             <w:webHidden/>
           </w:rPr>
-          <w:instrText>PAGEREF _Toc243856755 \h</w:instrText>
+          <w:instrText>PAGEREF _Toc243857952 \h</w:instrText>
         </w:r>
         <w:r>
           <w:rPr>
@@ -652,7 +644,7 @@
           <w14:ligatures w14:val="standardContextual"/>
         </w:rPr>
       </w:pPr>
-      <w:hyperlink w:anchor="_Toc243856756" w:history="1">
+      <w:hyperlink w:anchor="_Toc243857953" w:history="1">
         <w:r>
           <w:rPr>
             <w:rStyle w:val="aff9"/>
@@ -691,7 +683,7 @@
             <w:noProof/>
             <w:webHidden/>
           </w:rPr>
-          <w:instrText>PAGEREF _Toc243856756 \h</w:instrText>
+          <w:instrText>PAGEREF _Toc243857953 \h</w:instrText>
         </w:r>
         <w:r>
           <w:rPr>
@@ -749,7 +741,7 @@
           <w14:ligatures w14:val="standardContextual"/>
         </w:rPr>
       </w:pPr>
-      <w:hyperlink w:anchor="_Toc243856757" w:history="1">
+      <w:hyperlink w:anchor="_Toc243857954" w:history="1">
         <w:r>
           <w:rPr>
             <w:rStyle w:val="aff9"/>
@@ -806,7 +798,7 @@
             <w:noProof/>
             <w:webHidden/>
           </w:rPr>
-          <w:instrText>PAGEREF _Toc243856757 \h</w:instrText>
+          <w:instrText>PAGEREF _Toc243857954 \h</w:instrText>
         </w:r>
         <w:r>
           <w:rPr>
@@ -865,7 +857,7 @@
           <w14:ligatures w14:val="standardContextual"/>
         </w:rPr>
       </w:pPr>
-      <w:hyperlink w:anchor="_Toc243856758" w:history="1">
+      <w:hyperlink w:anchor="_Toc243857955" w:history="1">
         <w:r>
           <w:rPr>
             <w:rStyle w:val="aff9"/>
@@ -904,7 +896,7 @@
             <w:noProof/>
             <w:webHidden/>
           </w:rPr>
-          <w:instrText>PAGEREF _Toc243856758 \h</w:instrText>
+          <w:instrText>PAGEREF _Toc243857955 \h</w:instrText>
         </w:r>
         <w:r>
           <w:rPr>
@@ -963,7 +955,7 @@
           <w14:ligatures w14:val="standardContextual"/>
         </w:rPr>
       </w:pPr>
-      <w:hyperlink w:anchor="_Toc243856759" w:history="1">
+      <w:hyperlink w:anchor="_Toc243857956" w:history="1">
         <w:r>
           <w:rPr>
             <w:rStyle w:val="aff9"/>
@@ -1002,7 +994,7 @@
             <w:noProof/>
             <w:webHidden/>
           </w:rPr>
-          <w:instrText>PAGEREF _Toc243856759 \h</w:instrText>
+          <w:instrText>PAGEREF _Toc243857956 \h</w:instrText>
         </w:r>
         <w:r>
           <w:rPr>
@@ -1060,7 +1052,7 @@
           <w14:ligatures w14:val="standardContextual"/>
         </w:rPr>
       </w:pPr>
-      <w:hyperlink w:anchor="_Toc243856760" w:history="1">
+      <w:hyperlink w:anchor="_Toc243857957" w:history="1">
         <w:r>
           <w:rPr>
             <w:rStyle w:val="aff9"/>
@@ -1117,7 +1109,7 @@
             <w:noProof/>
             <w:webHidden/>
           </w:rPr>
-          <w:instrText>PAGEREF _Toc243856760 \h</w:instrText>
+          <w:instrText>PAGEREF _Toc243857957 \h</w:instrText>
         </w:r>
         <w:r>
           <w:rPr>
@@ -1176,7 +1168,7 @@
           <w14:ligatures w14:val="standardContextual"/>
         </w:rPr>
       </w:pPr>
-      <w:hyperlink w:anchor="_Toc243856761" w:history="1">
+      <w:hyperlink w:anchor="_Toc243857958" w:history="1">
         <w:r>
           <w:rPr>
             <w:rStyle w:val="aff9"/>
@@ -1215,7 +1207,7 @@
             <w:noProof/>
             <w:webHidden/>
           </w:rPr>
-          <w:instrText>PAGEREF _Toc243856761 \h</w:instrText>
+          <w:instrText>PAGEREF _Toc243857958 \h</w:instrText>
         </w:r>
         <w:r>
           <w:rPr>
@@ -1273,7 +1265,7 @@
           <w14:ligatures w14:val="standardContextual"/>
         </w:rPr>
       </w:pPr>
-      <w:hyperlink w:anchor="_Toc243856762" w:history="1">
+      <w:hyperlink w:anchor="_Toc243857959" w:history="1">
         <w:r>
           <w:rPr>
             <w:rStyle w:val="aff9"/>
@@ -1330,7 +1322,7 @@
             <w:noProof/>
             <w:webHidden/>
           </w:rPr>
-          <w:instrText>PAGEREF _Toc243856762 \h</w:instrText>
+          <w:instrText>PAGEREF _Toc243857959 \h</w:instrText>
         </w:r>
         <w:r>
           <w:rPr>
@@ -1388,7 +1380,7 @@
           <w14:ligatures w14:val="standardContextual"/>
         </w:rPr>
       </w:pPr>
-      <w:hyperlink w:anchor="_Toc243856763" w:history="1">
+      <w:hyperlink w:anchor="_Toc243857960" w:history="1">
         <w:r>
           <w:rPr>
             <w:rStyle w:val="aff9"/>
@@ -1445,7 +1437,7 @@
             <w:noProof/>
             <w:webHidden/>
           </w:rPr>
-          <w:instrText>PAGEREF _Toc243856763 \h</w:instrText>
+          <w:instrText>PAGEREF _Toc243857960 \h</w:instrText>
         </w:r>
         <w:r>
           <w:rPr>
@@ -1503,7 +1495,7 @@
           <w14:ligatures w14:val="standardContextual"/>
         </w:rPr>
       </w:pPr>
-      <w:hyperlink w:anchor="_Toc243856764" w:history="1">
+      <w:hyperlink w:anchor="_Toc243857961" w:history="1">
         <w:r>
           <w:rPr>
             <w:rStyle w:val="aff9"/>
@@ -1511,7 +1503,7 @@
             <w:color w:val="000000"/>
             <w:u w:val="none"/>
           </w:rPr>
-          <w:t>附录</w:t>
+          <w:t>七</w:t>
         </w:r>
         <w:r>
           <w:rPr>
@@ -1529,7 +1521,7 @@
             <w:color w:val="000000"/>
             <w:u w:val="none"/>
           </w:rPr>
-          <w:t>团队分工与实施安排</w:t>
+          <w:t>团队分工</w:t>
         </w:r>
         <w:r>
           <w:rPr>
@@ -1560,7 +1552,7 @@
             <w:noProof/>
             <w:webHidden/>
           </w:rPr>
-          <w:instrText>PAGEREF _Toc243856764 \h</w:instrText>
+          <w:instrText>PAGEREF _Toc243857961 \h</w:instrText>
         </w:r>
         <w:r>
           <w:rPr>
@@ -1619,7 +1611,7 @@
           <w14:ligatures w14:val="standardContextual"/>
         </w:rPr>
       </w:pPr>
-      <w:hyperlink w:anchor="_Toc243856765" w:history="1">
+      <w:hyperlink w:anchor="_Toc243857962" w:history="1">
         <w:r>
           <w:rPr>
             <w:rStyle w:val="aff9"/>
@@ -1676,7 +1668,7 @@
             <w:noProof/>
             <w:webHidden/>
           </w:rPr>
-          <w:instrText>PAGEREF _Toc243856765 \h</w:instrText>
+          <w:instrText>PAGEREF _Toc243857962 \h</w:instrText>
         </w:r>
         <w:r>
           <w:rPr>
@@ -1735,7 +1727,7 @@
           <w14:ligatures w14:val="standardContextual"/>
         </w:rPr>
       </w:pPr>
-      <w:hyperlink w:anchor="_Toc243856766" w:history="1">
+      <w:hyperlink w:anchor="_Toc243857963" w:history="1">
         <w:r>
           <w:rPr>
             <w:rStyle w:val="aff9"/>
@@ -1792,7 +1784,7 @@
             <w:noProof/>
             <w:webHidden/>
           </w:rPr>
-          <w:instrText>PAGEREF _Toc243856766 \h</w:instrText>
+          <w:instrText>PAGEREF _Toc243857963 \h</w:instrText>
         </w:r>
         <w:r>
           <w:rPr>
@@ -1851,7 +1843,7 @@
           <w14:ligatures w14:val="standardContextual"/>
         </w:rPr>
       </w:pPr>
-      <w:hyperlink w:anchor="_Toc243856767" w:history="1">
+      <w:hyperlink w:anchor="_Toc243857964" w:history="1">
         <w:r>
           <w:rPr>
             <w:rStyle w:val="aff9"/>
@@ -1908,7 +1900,7 @@
             <w:noProof/>
             <w:webHidden/>
           </w:rPr>
-          <w:instrText>PAGEREF _Toc243856767 \h</w:instrText>
+          <w:instrText>PAGEREF _Toc243857964 \h</w:instrText>
         </w:r>
         <w:r>
           <w:rPr>
@@ -1951,114 +1943,16 @@
       </w:hyperlink>
     </w:p>
     <w:p>
-      <w:pPr>
-        <w:pStyle w:val="TOC2"/>
-        <w:tabs>
-          <w:tab w:val="right" w:leader="dot" w:pos="9288"/>
-        </w:tabs>
-        <w:ind w:left="480"/>
-        <w:rPr>
-          <w:rFonts w:asciiTheme="minorHAnsi" w:eastAsiaTheme="minorEastAsia" w:hAnsiTheme="minorHAnsi" w:hint="eastAsia"/>
-          <w:noProof/>
-          <w:kern w:val="2"/>
-          <w:sz w:val="22"/>
-          <w:szCs w:val="24"/>
-          <w:lang w:eastAsia="zh-CN"/>
-          <w14:ligatures w14:val="standardContextual"/>
-        </w:rPr>
-      </w:pPr>
-      <w:hyperlink w:anchor="_Toc243856768" w:history="1">
-        <w:r>
-          <w:rPr>
-            <w:rStyle w:val="aff9"/>
-            <w:noProof/>
-            <w:color w:val="000000"/>
-            <w:u w:val="none"/>
-          </w:rPr>
-          <w:t>阶段安排与作品资料</w:t>
-        </w:r>
-        <w:r>
-          <w:rPr>
-            <w:rFonts w:hint="eastAsia"/>
-            <w:noProof/>
-            <w:webHidden/>
-          </w:rPr>
-          <w:tab/>
-        </w:r>
-        <w:r>
-          <w:rPr>
-            <w:rFonts w:hint="eastAsia"/>
-            <w:noProof/>
-            <w:webHidden/>
-          </w:rPr>
-          <w:fldChar w:fldCharType="begin"/>
-        </w:r>
-        <w:r>
-          <w:rPr>
-            <w:rFonts w:hint="eastAsia"/>
-            <w:noProof/>
-            <w:webHidden/>
-          </w:rPr>
-          <w:instrText xml:space="preserve"> </w:instrText>
-        </w:r>
-        <w:r>
-          <w:rPr>
-            <w:noProof/>
-            <w:webHidden/>
-          </w:rPr>
-          <w:instrText>PAGEREF _Toc243856768 \h</w:instrText>
-        </w:r>
-        <w:r>
-          <w:rPr>
-            <w:rFonts w:hint="eastAsia"/>
-            <w:noProof/>
-            <w:webHidden/>
-          </w:rPr>
-          <w:instrText xml:space="preserve"> </w:instrText>
-        </w:r>
-        <w:r>
-          <w:rPr>
-            <w:rFonts w:hint="eastAsia"/>
-            <w:noProof/>
-            <w:webHidden/>
-          </w:rPr>
-        </w:r>
-        <w:r>
-          <w:rPr>
-            <w:rFonts w:hint="eastAsia"/>
-            <w:noProof/>
-            <w:webHidden/>
-          </w:rPr>
-          <w:fldChar w:fldCharType="separate"/>
-        </w:r>
-        <w:r>
-          <w:rPr>
-            <w:noProof/>
-            <w:webHidden/>
-          </w:rPr>
-          <w:t>19</w:t>
-        </w:r>
-        <w:r>
-          <w:rPr>
-            <w:rFonts w:hint="eastAsia"/>
-            <w:noProof/>
-            <w:webHidden/>
-          </w:rPr>
-          <w:fldChar w:fldCharType="end"/>
-        </w:r>
-      </w:hyperlink>
+      <w:r>
+        <w:fldChar w:fldCharType="end"/>
+      </w:r>
     </w:p>
     <w:p>
-      <w:r>
-        <w:fldChar w:fldCharType="end"/>
-      </w:r>
-    </w:p>
-    <w:p>
       <w:pPr>
         <w:pStyle w:val="ReportChapter"/>
         <w:pageBreakBefore/>
       </w:pPr>
-      <w:bookmarkStart w:id="0" w:name="_Toc243856752"/>
+      <w:bookmarkStart w:id="0" w:name="_Toc243857949"/>
       <w:r>
         <w:lastRenderedPageBreak/>
         <w:t>作品概要</w:t>
@@ -2431,7 +2325,7 @@
         <w:pStyle w:val="ReportChapter"/>
         <w:pageBreakBefore/>
       </w:pPr>
-      <w:bookmarkStart w:id="1" w:name="_Toc243856753"/>
+      <w:bookmarkStart w:id="1" w:name="_Toc243857950"/>
       <w:r>
         <w:lastRenderedPageBreak/>
         <w:t>一</w:t>
@@ -2884,7 +2778,7 @@
         <w:ind w:firstLine="480"/>
       </w:pPr>
       <w:r>
-        <w:t>本作面向愿意尝试节奏与平台跳跃的玩家。按键种类较少，挑战放在出发时机与落点的配合上；这一安排能否让首次体验者顺利理解，还需要实际试玩记录检验。</w:t>
+        <w:t>本作面向愿意尝试节奏与平台跳跃的玩家。操作集中在左右移动和单次起跳，挑战放在出发时机与落点的配合上。学习过程从识别一次修复开始，逐步转向对危险周期与连续路线的判断。</w:t>
       </w:r>
     </w:p>
     <w:p>
@@ -2892,7 +2786,7 @@
         <w:pStyle w:val="ReportChapter"/>
         <w:pageBreakBefore/>
       </w:pPr>
-      <w:bookmarkStart w:id="2" w:name="_Toc243856754"/>
+      <w:bookmarkStart w:id="2" w:name="_Toc243857951"/>
       <w:r>
         <w:lastRenderedPageBreak/>
         <w:t>二</w:t>
@@ -2940,7 +2834,7 @@
           <w:noProof/>
         </w:rPr>
         <w:drawing>
-          <wp:inline distT="0" distB="0" distL="0" distR="0" wp14:anchorId="06F89F2B" wp14:editId="0AFEDCF0">
+          <wp:inline distT="0" distB="0" distL="0" distR="0" wp14:anchorId="09A323AC" wp14:editId="529C4544">
             <wp:extent cx="5903999" cy="4723199"/>
             <wp:effectExtent l="0" t="0" r="0" b="0"/>
             <wp:docPr id="2" name="Picture 2"/>
@@ -3004,7 +2898,7 @@
         <w:pageBreakBefore/>
         <w:spacing w:before="0" w:after="240"/>
       </w:pPr>
-      <w:bookmarkStart w:id="3" w:name="_Toc243856755"/>
+      <w:bookmarkStart w:id="3" w:name="_Toc243857952"/>
       <w:r>
         <w:rPr>
           <w:sz w:val="32"/>
@@ -3060,7 +2954,7 @@
         <w:t>”</w:t>
       </w:r>
       <w:r>
-        <w:t>因此有具体的操作含义。起跳后，玩家可以沿音乐预判落地，同时观察角色与桥边的关系。相邻岸边与桥面采用同高连接，保留这一核心动作的时间关系；普通平台的高低差则带来其他移动变化。不同高度会改变飞行时间，实际落地仍依据碰撞结果判断。</w:t>
+        <w:t>因此有具体的操作含义。起跳后，玩家可以沿音乐预判落地，同时观察角色与桥边的关系。相邻岸边与桥面采用同高连接，保留这一核心动作的时间关系；普通平台的高低差则带来其他移动变化。高度差会改变飞行时间，实际落地依据碰撞结果。</w:t>
       </w:r>
     </w:p>
     <w:p>
@@ -3074,7 +2968,7 @@
           <w:noProof/>
         </w:rPr>
         <w:drawing>
-          <wp:inline distT="0" distB="0" distL="0" distR="0" wp14:anchorId="6E6E8C05" wp14:editId="21FE9BCC">
+          <wp:inline distT="0" distB="0" distL="0" distR="0" wp14:anchorId="501A1BFE" wp14:editId="14B0B465">
             <wp:extent cx="5903999" cy="2804400"/>
             <wp:effectExtent l="0" t="0" r="0" b="0"/>
             <wp:docPr id="3" name="Picture 3"/>
@@ -3634,7 +3528,7 @@
         <w:ind w:firstLine="480"/>
       </w:pPr>
       <w:r>
-        <w:t>上述数值是当前版本的实现参数。两拍落地是同高运动的近似关系，不表示系统会把任意落点自动吸附到拍点；高度变化和真实碰撞仍会影响落地时刻。</w:t>
+        <w:t>两拍落地对应同高起落的近似时间。不同地形高度会改变飞行过程，落地时刻由角色的实际运动与碰撞决定。</w:t>
       </w:r>
     </w:p>
     <w:p>
@@ -3643,7 +3537,7 @@
         <w:pageBreakBefore/>
         <w:spacing w:before="0" w:after="240"/>
       </w:pPr>
-      <w:bookmarkStart w:id="4" w:name="_Toc243856756"/>
+      <w:bookmarkStart w:id="4" w:name="_Toc243857953"/>
       <w:r>
         <w:rPr>
           <w:sz w:val="32"/>
@@ -3666,7 +3560,7 @@
         <w:ind w:firstLine="480"/>
       </w:pPr>
       <w:r>
-        <w:t>这一过程也允许不完整的结果。偏拍起跳仍按普通轨迹运动，但不会激活桥；青桥上的偏拍落地不会立即清除桥面，也不会重置剩余时间。玩家需要根据位置选择继续尝试或返回岸边。最后一拍，桥面闪烁；如果到期仍未固定，桥恢复为不可站立的虚线状态。</w:t>
+        <w:t>这一过程也允许不完整的结果。偏拍起跳仍按普通轨迹运动，但不会激活桥；青桥上的偏拍落地不会立即清除桥面，也不会重置剩余时间。玩家需要根据位置选择继续尝试或返回岸边。最后一拍，桥面闪烁；到期仍未固定，桥恢复为不可站立的虚线。</w:t>
       </w:r>
     </w:p>
     <w:p>
@@ -4191,7 +4085,7 @@
         <w:t>120</w:t>
       </w:r>
       <w:r>
-        <w:t>分。准确、良好和偏拍次数反映起跳表现，共鸣数量反映修复进度。不同拍在安全地面有效起跳仍能得分，因此当前分数适合作为过程反馈，尚不作为严格排名依据。</w:t>
+        <w:t>分。准确、良好和偏拍次数反映起跳表现，共鸣数量反映修复进度。不同拍在安全地面有效起跳仍能得分，分数用于记录节拍表现，共鸣数量记录修复进程。</w:t>
       </w:r>
     </w:p>
     <w:p>
@@ -4207,7 +4101,7 @@
         <w:pStyle w:val="ReportChapter"/>
         <w:pageBreakBefore/>
       </w:pPr>
-      <w:bookmarkStart w:id="5" w:name="_Toc243856757"/>
+      <w:bookmarkStart w:id="5" w:name="_Toc243857954"/>
       <w:r>
         <w:lastRenderedPageBreak/>
         <w:t>三</w:t>
@@ -4239,7 +4133,7 @@
           <w:noProof/>
         </w:rPr>
         <w:drawing>
-          <wp:inline distT="0" distB="0" distL="0" distR="0" wp14:anchorId="3FAB9DE0" wp14:editId="35D48021">
+          <wp:inline distT="0" distB="0" distL="0" distR="0" wp14:anchorId="5A05475A" wp14:editId="178F3E89">
             <wp:extent cx="5472000" cy="5198400"/>
             <wp:effectExtent l="0" t="0" r="0" b="0"/>
             <wp:docPr id="4" name="Picture 4"/>
@@ -4677,7 +4571,7 @@
         <w:pageBreakBefore/>
         <w:spacing w:before="0" w:after="240"/>
       </w:pPr>
-      <w:bookmarkStart w:id="6" w:name="_Toc243856758"/>
+      <w:bookmarkStart w:id="6" w:name="_Toc243857955"/>
       <w:r>
         <w:rPr>
           <w:sz w:val="32"/>
@@ -4714,7 +4608,7 @@
         <w:ind w:firstLine="480"/>
       </w:pPr>
       <w:r>
-        <w:t>这里需要传达的关键区别是</w:t>
+        <w:t>第一间通过青桥与金桥区分</w:t>
       </w:r>
       <w:r>
         <w:t>“</w:t>
@@ -4732,13 +4626,13 @@
         <w:t>“</w:t>
       </w:r>
       <w:r>
-        <w:t>已经修复</w:t>
+        <w:t>修复完成</w:t>
       </w:r>
       <w:r>
         <w:t>”</w:t>
       </w:r>
       <w:r>
-        <w:t>。如果教学只强调踩拍起跳，玩家可能在青桥出现时就认为任务结束。因此，桥面变色和共鸣进度应与实际落地同时出现，教学也应明确落地会自动判断。是否足够清楚，仍需通过初次体验记录验证。</w:t>
+        <w:t>。桥面变色、共鸣计数及落地波纹共同呈现动作结果；教学页说明落地自动判定，玩家无需增加一次按键。桥后的固定地面用于观察修复结果和调整站位。</w:t>
       </w:r>
     </w:p>
     <w:p>
@@ -4768,7 +4662,7 @@
         <w:ind w:firstLine="480"/>
       </w:pPr>
       <w:r>
-        <w:t>两处激光具有不同相位。玩家可以沿用识别预警的规则，但需要重新判断当下的时机。房间没有变速，危险也采用同一种形态，使新增难度来自已有节拍与当前位置的组合。预警与危险的差异必须在画面上足够明确，否则失败容易被理解为不可预测的碰撞。</w:t>
+        <w:t>两处激光具有不同相位。玩家可以沿用识别预警的规则，但需要重新判断当下的时机。房间没有变速，危险也采用同一种形态，使新增难度来自已有节拍与当前位置的组合。预警采用虚线，危险采用实体光束，同一机关的阶段变化同时体现在颜色与轮廓上。</w:t>
       </w:r>
     </w:p>
     <w:p>
@@ -4782,7 +4676,7 @@
           <w:noProof/>
         </w:rPr>
         <w:drawing>
-          <wp:inline distT="0" distB="0" distL="0" distR="0" wp14:anchorId="34443F17" wp14:editId="39352BAC">
+          <wp:inline distT="0" distB="0" distL="0" distR="0" wp14:anchorId="6D5EC464" wp14:editId="67A11A20">
             <wp:extent cx="5903999" cy="2509200"/>
             <wp:effectExtent l="0" t="0" r="0" b="0"/>
             <wp:docPr id="5" name="Picture 5"/>
@@ -4846,7 +4740,7 @@
         <w:pageBreakBefore/>
         <w:spacing w:before="0" w:after="240"/>
       </w:pPr>
-      <w:bookmarkStart w:id="7" w:name="_Toc243856759"/>
+      <w:bookmarkStart w:id="7" w:name="_Toc243857956"/>
       <w:r>
         <w:rPr>
           <w:sz w:val="32"/>
@@ -4907,7 +4801,7 @@
           <w:noProof/>
         </w:rPr>
         <w:drawing>
-          <wp:inline distT="0" distB="0" distL="0" distR="0" wp14:anchorId="47D948EA" wp14:editId="75CF1444">
+          <wp:inline distT="0" distB="0" distL="0" distR="0" wp14:anchorId="2A7429C0" wp14:editId="45726259">
             <wp:extent cx="5903999" cy="3320999"/>
             <wp:effectExtent l="0" t="0" r="0" b="0"/>
             <wp:docPr id="6" name="Picture 6"/>
@@ -5409,7 +5303,7 @@
         <w:pStyle w:val="ReportChapter"/>
         <w:pageBreakBefore/>
       </w:pPr>
-      <w:bookmarkStart w:id="8" w:name="_Toc243856760"/>
+      <w:bookmarkStart w:id="8" w:name="_Toc243857957"/>
       <w:r>
         <w:lastRenderedPageBreak/>
         <w:t>四</w:t>
@@ -5443,7 +5337,7 @@
         <w:ind w:firstLine="480"/>
       </w:pPr>
       <w:r>
-        <w:t>桥面不仅用颜色表达状态。未激活时是虚线，临时可站立时为青色实体，最后一拍闪烁，固定后转为金色并出现共鸣标记。激光同样通过虚线与实体区分预警和危险。颜色、形态及进度信息相互补充，但当前仍需检验不同显示设备上的辨识情况，不能据此认定已经完成全面适配。</w:t>
+        <w:t>桥面不仅用颜色表达状态。未激活时是虚线，临时可站立时为青色实体，最后一拍闪烁，固定后转为金色并出现共鸣标记。激光同样通过虚线与实体区分预警和危险。颜色、形态及进度信息分别标示机关状态、剩余时间和修复结果。</w:t>
       </w:r>
     </w:p>
     <w:p>
@@ -5985,7 +5879,7 @@
         <w:ind w:firstLine="480"/>
       </w:pPr>
       <w:r>
-        <w:t>这些信息需要围绕角色落点避让。共鸣数量帮助判断离出口条件还有多远，判定文字解释刚才的动作，而桥边与光束仍是游玩时最直接的依据。界面的任务是补足观察，不能让读提示本身成为新的操作障碍。</w:t>
+        <w:t>界面将持续显示的任务信息和短暂出现的动作反馈分开。共鸣数量记录距离出口条件还有多少目标，判定文字解释刚才的起跳，桥面和光束标示脚下与前方是否可通行。</w:t>
       </w:r>
     </w:p>
     <w:p>
@@ -5994,7 +5888,7 @@
         <w:pageBreakBefore/>
         <w:spacing w:before="0" w:after="240"/>
       </w:pPr>
-      <w:bookmarkStart w:id="9" w:name="_Toc243856761"/>
+      <w:bookmarkStart w:id="9" w:name="_Toc243857958"/>
       <w:r>
         <w:rPr>
           <w:sz w:val="32"/>
@@ -6035,7 +5929,7 @@
         <w:ind w:firstLine="480"/>
       </w:pPr>
       <w:r>
-        <w:t>底部四拍灯显示拍点次序，角色周围收缩的光环提示下一拍接近。这两处提示分别服务于整体观察和角色附近的操作。音乐可关闭，判定偏移可手动校准。独立的修复、失败和通关音效尚未加入，后续宜用短声音补充事件反馈，并控制其对主拍的遮盖。</w:t>
+        <w:t>底部四拍灯显示拍点次序，角色周围收缩的光环提示下一拍接近。这两处提示分别服务于整体观察和角色附近的操作。音乐可关闭，判定偏移可手动校准。本版声音内容为循环配乐，修复、失败和通关的独立事件音效列入后续完善。</w:t>
       </w:r>
     </w:p>
     <w:p>
@@ -6049,7 +5943,7 @@
           <w:noProof/>
         </w:rPr>
         <w:drawing>
-          <wp:inline distT="0" distB="0" distL="0" distR="0" wp14:anchorId="24497E0C" wp14:editId="32756A40">
+          <wp:inline distT="0" distB="0" distL="0" distR="0" wp14:anchorId="5033C1A1" wp14:editId="6C981A66">
             <wp:extent cx="5903999" cy="3320999"/>
             <wp:effectExtent l="0" t="0" r="0" b="0"/>
             <wp:docPr id="7" name="Picture 7"/>
@@ -6096,13 +5990,13 @@
         <w:t xml:space="preserve"> 7  </w:t>
       </w:r>
       <w:r>
-        <w:t>校准界面实录。图中</w:t>
+        <w:t>校准界面实录，图示偏移设置为</w:t>
       </w:r>
       <w:r>
         <w:t>+70</w:t>
       </w:r>
       <w:r>
-        <w:t>毫秒仅为演示设置，不是推荐默认值。</w:t>
+        <w:t>毫秒。</w:t>
       </w:r>
     </w:p>
     <w:tbl>
@@ -6492,7 +6386,7 @@
         <w:ind w:firstLine="480"/>
       </w:pPr>
       <w:r>
-        <w:t>校准用于调整设备听感与判定的偏差，不能替代跨设备验证。后续检查会分别记录扬声器或耳机、校准设置和偏差现象，再决定是否需要修改音量、提示或时间处理。</w:t>
+        <w:t>声音输出与输入响应之间可能存在设备差异。校准在动作判定环节调整时间偏移，使玩家能够结合听到的拍点修正判定感受，同时保持关卡的运动参数和机关时序稳定。</w:t>
       </w:r>
     </w:p>
     <w:p>
@@ -6500,7 +6394,7 @@
         <w:pStyle w:val="ReportChapter"/>
         <w:pageBreakBefore/>
       </w:pPr>
-      <w:bookmarkStart w:id="10" w:name="_Toc243856762"/>
+      <w:bookmarkStart w:id="10" w:name="_Toc243857959"/>
       <w:r>
         <w:lastRenderedPageBreak/>
         <w:t>五</w:t>
@@ -6561,7 +6455,7 @@
           <w:noProof/>
         </w:rPr>
         <w:drawing>
-          <wp:inline distT="0" distB="0" distL="0" distR="0" wp14:anchorId="5D79F58F" wp14:editId="2ACE66C3">
+          <wp:inline distT="0" distB="0" distL="0" distR="0" wp14:anchorId="22399DE3" wp14:editId="176AD76C">
             <wp:extent cx="5903999" cy="3320999"/>
             <wp:effectExtent l="0" t="0" r="0" b="0"/>
             <wp:docPr id="8" name="Picture 8"/>
@@ -6946,7 +6840,7 @@
         <w:pStyle w:val="ReportChapter"/>
         <w:pageBreakBefore/>
       </w:pPr>
-      <w:bookmarkStart w:id="11" w:name="_Toc243856763"/>
+      <w:bookmarkStart w:id="11" w:name="_Toc243857960"/>
       <w:r>
         <w:lastRenderedPageBreak/>
         <w:t>六</w:t>
@@ -6972,40 +6866,262 @@
     </w:p>
     <w:p>
       <w:pPr>
-        <w:ind w:firstLine="480"/>
-      </w:pPr>
-      <w:r>
-        <w:t>现有版本已通过</w:t>
-      </w:r>
-      <w:r>
-        <w:t>54</w:t>
-      </w:r>
-      <w:r>
-        <w:t>项自动检查，并用实际角色物理验证三个房间的自动路线可完成。对应路线约</w:t>
-      </w:r>
-      <w:r>
-        <w:t>18</w:t>
-      </w:r>
-      <w:r>
-        <w:t>、</w:t>
-      </w:r>
-      <w:r>
-        <w:t>20</w:t>
-      </w:r>
-      <w:r>
-        <w:t>、</w:t>
-      </w:r>
-      <w:r>
-        <w:t>25</w:t>
-      </w:r>
-      <w:r>
-        <w:t>秒，不含每间约两秒准备；干净工程导入与</w:t>
-      </w:r>
-      <w:r>
-        <w:t>Windows</w:t>
-      </w:r>
-      <w:r>
-        <w:t>启动检查也已通过。这些结果支持已覆盖规则及路线的可行性，不能代替首次玩家表现或完整设备适配结论。</w:t>
+        <w:pStyle w:val="21"/>
+      </w:pPr>
+      <w:r>
+        <w:t>功能完成情况</w:t>
+      </w:r>
+    </w:p>
+    <w:tbl>
+      <w:tblPr>
+        <w:tblW w:w="0" w:type="auto"/>
+        <w:jc w:val="center"/>
+        <w:tblBorders>
+          <w:top w:val="single" w:sz="4" w:space="0" w:color="D9D9D9"/>
+          <w:left w:val="single" w:sz="4" w:space="0" w:color="D9D9D9"/>
+          <w:bottom w:val="single" w:sz="4" w:space="0" w:color="D9D9D9"/>
+          <w:right w:val="single" w:sz="4" w:space="0" w:color="D9D9D9"/>
+          <w:insideH w:val="single" w:sz="4" w:space="0" w:color="D9D9D9"/>
+          <w:insideV w:val="single" w:sz="4" w:space="0" w:color="D9D9D9"/>
+        </w:tblBorders>
+        <w:tblLayout w:type="fixed"/>
+        <w:tblLook w:val="04A0" w:firstRow="1" w:lastRow="0" w:firstColumn="1" w:lastColumn="0" w:noHBand="0" w:noVBand="1"/>
+      </w:tblPr>
+      <w:tblGrid>
+        <w:gridCol w:w="2324"/>
+        <w:gridCol w:w="6973"/>
+      </w:tblGrid>
+      <w:tr>
+        <w:trPr>
+          <w:cantSplit/>
+          <w:tblHeader/>
+          <w:jc w:val="center"/>
+        </w:trPr>
+        <w:tc>
+          <w:tcPr>
+            <w:tcW w:w="2324" w:type="dxa"/>
+            <w:shd w:val="clear" w:color="auto" w:fill="E8EEF1"/>
+            <w:tcMar>
+              <w:top w:w="75" w:type="dxa"/>
+              <w:left w:w="95" w:type="dxa"/>
+              <w:bottom w:w="75" w:type="dxa"/>
+              <w:right w:w="95" w:type="dxa"/>
+            </w:tcMar>
+            <w:vAlign w:val="center"/>
+          </w:tcPr>
+          <w:p>
+            <w:pPr>
+              <w:spacing w:after="0" w:line="300" w:lineRule="exact"/>
+            </w:pPr>
+            <w:r>
+              <w:rPr>
+                <w:rFonts w:eastAsia="黑体"/>
+                <w:sz w:val="21"/>
+              </w:rPr>
+              <w:t>系统</w:t>
+            </w:r>
+          </w:p>
+        </w:tc>
+        <w:tc>
+          <w:tcPr>
+            <w:tcW w:w="6973" w:type="dxa"/>
+            <w:shd w:val="clear" w:color="auto" w:fill="E8EEF1"/>
+            <w:tcMar>
+              <w:top w:w="75" w:type="dxa"/>
+              <w:left w:w="95" w:type="dxa"/>
+              <w:bottom w:w="75" w:type="dxa"/>
+              <w:right w:w="95" w:type="dxa"/>
+            </w:tcMar>
+            <w:vAlign w:val="center"/>
+          </w:tcPr>
+          <w:p>
+            <w:pPr>
+              <w:spacing w:after="0" w:line="300" w:lineRule="exact"/>
+            </w:pPr>
+            <w:r>
+              <w:rPr>
+                <w:rFonts w:eastAsia="黑体"/>
+                <w:sz w:val="21"/>
+              </w:rPr>
+              <w:t>已实现内容</w:t>
+            </w:r>
+          </w:p>
+        </w:tc>
+      </w:tr>
+      <w:tr>
+        <w:trPr>
+          <w:cantSplit/>
+          <w:jc w:val="center"/>
+        </w:trPr>
+        <w:tc>
+          <w:tcPr>
+            <w:tcW w:w="2324" w:type="dxa"/>
+            <w:shd w:val="clear" w:color="auto" w:fill="F7F4EC"/>
+            <w:tcMar>
+              <w:top w:w="75" w:type="dxa"/>
+              <w:left w:w="95" w:type="dxa"/>
+              <w:bottom w:w="75" w:type="dxa"/>
+              <w:right w:w="95" w:type="dxa"/>
+            </w:tcMar>
+            <w:vAlign w:val="center"/>
+          </w:tcPr>
+          <w:p>
+            <w:pPr>
+              <w:spacing w:after="0" w:line="300" w:lineRule="exact"/>
+            </w:pPr>
+            <w:r>
+              <w:rPr>
+                <w:sz w:val="21"/>
+              </w:rPr>
+              <w:t>角色与节拍</w:t>
+            </w:r>
+          </w:p>
+        </w:tc>
+        <w:tc>
+          <w:tcPr>
+            <w:tcW w:w="6973" w:type="dxa"/>
+            <w:shd w:val="clear" w:color="auto" w:fill="F8FAFB"/>
+            <w:tcMar>
+              <w:top w:w="75" w:type="dxa"/>
+              <w:left w:w="95" w:type="dxa"/>
+              <w:bottom w:w="75" w:type="dxa"/>
+              <w:right w:w="95" w:type="dxa"/>
+            </w:tcMar>
+            <w:vAlign w:val="center"/>
+          </w:tcPr>
+          <w:p>
+            <w:pPr>
+              <w:spacing w:after="0" w:line="300" w:lineRule="exact"/>
+            </w:pPr>
+            <w:r>
+              <w:rPr>
+                <w:sz w:val="21"/>
+              </w:rPr>
+              <w:t>移动、单跳、真实起落判定、统一时钟与手动校准</w:t>
+            </w:r>
+          </w:p>
+        </w:tc>
+      </w:tr>
+      <w:tr>
+        <w:trPr>
+          <w:cantSplit/>
+          <w:jc w:val="center"/>
+        </w:trPr>
+        <w:tc>
+          <w:tcPr>
+            <w:tcW w:w="2324" w:type="dxa"/>
+            <w:shd w:val="clear" w:color="auto" w:fill="F7F4EC"/>
+            <w:tcMar>
+              <w:top w:w="75" w:type="dxa"/>
+              <w:left w:w="95" w:type="dxa"/>
+              <w:bottom w:w="75" w:type="dxa"/>
+              <w:right w:w="95" w:type="dxa"/>
+            </w:tcMar>
+            <w:vAlign w:val="center"/>
+          </w:tcPr>
+          <w:p>
+            <w:pPr>
+              <w:spacing w:after="0" w:line="300" w:lineRule="exact"/>
+            </w:pPr>
+            <w:r>
+              <w:rPr>
+                <w:sz w:val="21"/>
+              </w:rPr>
+              <w:t>机关与关卡</w:t>
+            </w:r>
+          </w:p>
+        </w:tc>
+        <w:tc>
+          <w:tcPr>
+            <w:tcW w:w="6973" w:type="dxa"/>
+            <w:shd w:val="clear" w:color="auto" w:fill="FFFFFF"/>
+            <w:tcMar>
+              <w:top w:w="75" w:type="dxa"/>
+              <w:left w:w="95" w:type="dxa"/>
+              <w:bottom w:w="75" w:type="dxa"/>
+              <w:right w:w="95" w:type="dxa"/>
+            </w:tcMar>
+            <w:vAlign w:val="center"/>
+          </w:tcPr>
+          <w:p>
+            <w:pPr>
+              <w:spacing w:after="0" w:line="300" w:lineRule="exact"/>
+            </w:pPr>
+            <w:r>
+              <w:rPr>
+                <w:sz w:val="21"/>
+              </w:rPr>
+              <w:t>临时桥、落拍固定、激光阶段、三间房间及共鸣出口</w:t>
+            </w:r>
+          </w:p>
+        </w:tc>
+      </w:tr>
+      <w:tr>
+        <w:trPr>
+          <w:cantSplit/>
+          <w:jc w:val="center"/>
+        </w:trPr>
+        <w:tc>
+          <w:tcPr>
+            <w:tcW w:w="2324" w:type="dxa"/>
+            <w:shd w:val="clear" w:color="auto" w:fill="F7F4EC"/>
+            <w:tcMar>
+              <w:top w:w="75" w:type="dxa"/>
+              <w:left w:w="95" w:type="dxa"/>
+              <w:bottom w:w="75" w:type="dxa"/>
+              <w:right w:w="95" w:type="dxa"/>
+            </w:tcMar>
+            <w:vAlign w:val="center"/>
+          </w:tcPr>
+          <w:p>
+            <w:pPr>
+              <w:spacing w:after="0" w:line="300" w:lineRule="exact"/>
+            </w:pPr>
+            <w:r>
+              <w:rPr>
+                <w:sz w:val="21"/>
+              </w:rPr>
+              <w:t>流程与反馈</w:t>
+            </w:r>
+          </w:p>
+        </w:tc>
+        <w:tc>
+          <w:tcPr>
+            <w:tcW w:w="6973" w:type="dxa"/>
+            <w:shd w:val="clear" w:color="auto" w:fill="F8FAFB"/>
+            <w:tcMar>
+              <w:top w:w="75" w:type="dxa"/>
+              <w:left w:w="95" w:type="dxa"/>
+              <w:bottom w:w="75" w:type="dxa"/>
+              <w:right w:w="95" w:type="dxa"/>
+            </w:tcMar>
+            <w:vAlign w:val="center"/>
+          </w:tcPr>
+          <w:p>
+            <w:pPr>
+              <w:spacing w:after="0" w:line="300" w:lineRule="exact"/>
+            </w:pPr>
+            <w:r>
+              <w:rPr>
+                <w:sz w:val="21"/>
+              </w:rPr>
+              <w:t>教学、计分、暂停继续、失败重试与最终结算</w:t>
+            </w:r>
+          </w:p>
+        </w:tc>
+      </w:tr>
+    </w:tbl>
+    <w:p>
+      <w:pPr>
+        <w:spacing w:after="60" w:line="240" w:lineRule="auto"/>
+      </w:pPr>
+    </w:p>
+    <w:p>
+      <w:pPr>
+        <w:pStyle w:val="21"/>
+      </w:pPr>
+      <w:r>
+        <w:t>验证结果</w:t>
       </w:r>
     </w:p>
     <w:tbl>
@@ -7025,8 +7141,8 @@
       </w:tblPr>
       <w:tblGrid>
         <w:gridCol w:w="2041"/>
-        <w:gridCol w:w="3515"/>
-        <w:gridCol w:w="3742"/>
+        <w:gridCol w:w="3118"/>
+        <w:gridCol w:w="4139"/>
       </w:tblGrid>
       <w:tr>
         <w:trPr>
@@ -7056,13 +7172,13 @@
                 <w:rFonts w:eastAsia="黑体"/>
                 <w:sz w:val="21"/>
               </w:rPr>
-              <w:t>证据</w:t>
+              <w:t>验证内容</w:t>
             </w:r>
           </w:p>
         </w:tc>
         <w:tc>
           <w:tcPr>
-            <w:tcW w:w="3515" w:type="dxa"/>
+            <w:tcW w:w="3118" w:type="dxa"/>
             <w:shd w:val="clear" w:color="auto" w:fill="E8EEF1"/>
             <w:tcMar>
               <w:top w:w="75" w:type="dxa"/>
@@ -7081,13 +7197,13 @@
                 <w:rFonts w:eastAsia="黑体"/>
                 <w:sz w:val="21"/>
               </w:rPr>
-              <w:t>已验证的范围</w:t>
+              <w:t>结果</w:t>
             </w:r>
           </w:p>
         </w:tc>
         <w:tc>
           <w:tcPr>
-            <w:tcW w:w="3742" w:type="dxa"/>
+            <w:tcW w:w="4139" w:type="dxa"/>
             <w:shd w:val="clear" w:color="auto" w:fill="E8EEF1"/>
             <w:tcMar>
               <w:top w:w="75" w:type="dxa"/>
@@ -7106,7 +7222,7 @@
                 <w:rFonts w:eastAsia="黑体"/>
                 <w:sz w:val="21"/>
               </w:rPr>
-              <w:t>结论的边界</w:t>
+              <w:t>覆盖范围</w:t>
             </w:r>
           </w:p>
         </w:tc>
@@ -7137,19 +7253,13 @@
               <w:rPr>
                 <w:sz w:val="21"/>
               </w:rPr>
-              <w:t>54</w:t>
-            </w:r>
-            <w:r>
-              <w:rPr>
-                <w:sz w:val="21"/>
-              </w:rPr>
-              <w:t>项自动检查</w:t>
+              <w:t>规则与状态</w:t>
             </w:r>
           </w:p>
         </w:tc>
         <w:tc>
           <w:tcPr>
-            <w:tcW w:w="3515" w:type="dxa"/>
+            <w:tcW w:w="3118" w:type="dxa"/>
             <w:shd w:val="clear" w:color="auto" w:fill="F8FAFB"/>
             <w:tcMar>
               <w:top w:w="75" w:type="dxa"/>
@@ -7167,13 +7277,19 @@
               <w:rPr>
                 <w:sz w:val="21"/>
               </w:rPr>
-              <w:t>判定边界、机关状态、奖励、出口及完整路线</w:t>
+              <w:t>54</w:t>
+            </w:r>
+            <w:r>
+              <w:rPr>
+                <w:sz w:val="21"/>
+              </w:rPr>
+              <w:t>项自动检查通过</w:t>
             </w:r>
           </w:p>
         </w:tc>
         <w:tc>
           <w:tcPr>
-            <w:tcW w:w="3742" w:type="dxa"/>
+            <w:tcW w:w="4139" w:type="dxa"/>
             <w:shd w:val="clear" w:color="auto" w:fill="F8FAFB"/>
             <w:tcMar>
               <w:top w:w="75" w:type="dxa"/>
@@ -7191,7 +7307,7 @@
               <w:rPr>
                 <w:sz w:val="21"/>
               </w:rPr>
-              <w:t>仅覆盖脚本列出的条件，不代表所有玩法情况</w:t>
+              <w:t>判定边界、机关状态、奖励、出口及完整路线</w:t>
             </w:r>
           </w:p>
         </w:tc>
@@ -7228,7 +7344,7 @@
         </w:tc>
         <w:tc>
           <w:tcPr>
-            <w:tcW w:w="3515" w:type="dxa"/>
+            <w:tcW w:w="3118" w:type="dxa"/>
             <w:shd w:val="clear" w:color="auto" w:fill="FFFFFF"/>
             <w:tcMar>
               <w:top w:w="75" w:type="dxa"/>
@@ -7246,13 +7362,13 @@
               <w:rPr>
                 <w:sz w:val="21"/>
               </w:rPr>
-              <w:t>自动操作角色完成三个房间</w:t>
+              <w:t>自动路线均可完成</w:t>
             </w:r>
           </w:p>
         </w:tc>
         <w:tc>
           <w:tcPr>
-            <w:tcW w:w="3742" w:type="dxa"/>
+            <w:tcW w:w="4139" w:type="dxa"/>
             <w:shd w:val="clear" w:color="auto" w:fill="FFFFFF"/>
             <w:tcMar>
               <w:top w:w="75" w:type="dxa"/>
@@ -7318,7 +7434,7 @@
               <w:rPr>
                 <w:sz w:val="21"/>
               </w:rPr>
-              <w:t>秒准备；不代表玩家平均通关时长</w:t>
+              <w:t>秒准备</w:t>
             </w:r>
           </w:p>
         </w:tc>
@@ -7349,13 +7465,13 @@
               <w:rPr>
                 <w:sz w:val="21"/>
               </w:rPr>
-              <w:t>工程与运行包检查</w:t>
+              <w:t>工程与运行包</w:t>
             </w:r>
           </w:p>
         </w:tc>
         <w:tc>
           <w:tcPr>
-            <w:tcW w:w="3515" w:type="dxa"/>
+            <w:tcW w:w="3118" w:type="dxa"/>
             <w:shd w:val="clear" w:color="auto" w:fill="F8FAFB"/>
             <w:tcMar>
               <w:top w:w="75" w:type="dxa"/>
@@ -7373,25 +7489,13 @@
               <w:rPr>
                 <w:sz w:val="21"/>
               </w:rPr>
-              <w:t>干净源码导入、</w:t>
-            </w:r>
-            <w:r>
-              <w:rPr>
-                <w:sz w:val="21"/>
-              </w:rPr>
-              <w:t>Windows</w:t>
-            </w:r>
-            <w:r>
-              <w:rPr>
-                <w:sz w:val="21"/>
-              </w:rPr>
-              <w:t>运行启动</w:t>
+              <w:t>导入与启动检查通过</w:t>
             </w:r>
           </w:p>
         </w:tc>
         <w:tc>
           <w:tcPr>
-            <w:tcW w:w="3742" w:type="dxa"/>
+            <w:tcW w:w="4139" w:type="dxa"/>
             <w:shd w:val="clear" w:color="auto" w:fill="F8FAFB"/>
             <w:tcMar>
               <w:top w:w="75" w:type="dxa"/>
@@ -7409,7 +7513,19 @@
               <w:rPr>
                 <w:sz w:val="21"/>
               </w:rPr>
-              <w:t>不等于已完成另一台电脑的全流程试玩</w:t>
+              <w:t>干净工程导入、本机</w:t>
+            </w:r>
+            <w:r>
+              <w:rPr>
+                <w:sz w:val="21"/>
+              </w:rPr>
+              <w:t>Windows</w:t>
+            </w:r>
+            <w:r>
+              <w:rPr>
+                <w:sz w:val="21"/>
+              </w:rPr>
+              <w:t>运行启动</w:t>
             </w:r>
           </w:p>
         </w:tc>
@@ -7422,384 +7538,32 @@
     </w:p>
     <w:p>
       <w:pPr>
-        <w:pStyle w:val="21"/>
-      </w:pPr>
-      <w:r>
-        <w:t>目前仍需验证的体验</w:t>
+        <w:ind w:firstLine="480"/>
+      </w:pPr>
+      <w:r>
+        <w:t>路线计时来自自动操作角色的物理验证。陌生玩家试玩与另一台</w:t>
+      </w:r>
+      <w:r>
+        <w:t>Windows</w:t>
+      </w:r>
+      <w:r>
+        <w:t>设备上的完整通关仍待验证。</w:t>
       </w:r>
     </w:p>
     <w:p>
       <w:pPr>
-        <w:ind w:firstLine="480"/>
-      </w:pPr>
-      <w:r>
-        <w:t>最需要观察的是首次玩家能否分清青桥与金桥、是否知道落地无需额外按键，以及是否能在激光预警期间形成行动判断。现阶段没有独立的陌生玩家试玩记录，因此报告将这些内容作为设计意图与待验证问题，不把自动路线结果当作教学效果。</w:t>
-      </w:r>
-    </w:p>
-    <w:tbl>
-      <w:tblPr>
-        <w:tblW w:w="0" w:type="auto"/>
-        <w:jc w:val="center"/>
-        <w:tblBorders>
-          <w:top w:val="single" w:sz="4" w:space="0" w:color="D9D9D9"/>
-          <w:left w:val="single" w:sz="4" w:space="0" w:color="D9D9D9"/>
-          <w:bottom w:val="single" w:sz="4" w:space="0" w:color="D9D9D9"/>
-          <w:right w:val="single" w:sz="4" w:space="0" w:color="D9D9D9"/>
-          <w:insideH w:val="single" w:sz="4" w:space="0" w:color="D9D9D9"/>
-          <w:insideV w:val="single" w:sz="4" w:space="0" w:color="D9D9D9"/>
-        </w:tblBorders>
-        <w:tblLayout w:type="fixed"/>
-        <w:tblLook w:val="04A0" w:firstRow="1" w:lastRow="0" w:firstColumn="1" w:lastColumn="0" w:noHBand="0" w:noVBand="1"/>
-      </w:tblPr>
-      <w:tblGrid>
-        <w:gridCol w:w="1814"/>
-        <w:gridCol w:w="3685"/>
-        <w:gridCol w:w="3798"/>
-      </w:tblGrid>
-      <w:tr>
-        <w:trPr>
-          <w:cantSplit/>
-          <w:tblHeader/>
-          <w:jc w:val="center"/>
-        </w:trPr>
-        <w:tc>
-          <w:tcPr>
-            <w:tcW w:w="1814" w:type="dxa"/>
-            <w:shd w:val="clear" w:color="auto" w:fill="E8EEF1"/>
-            <w:tcMar>
-              <w:top w:w="75" w:type="dxa"/>
-              <w:left w:w="95" w:type="dxa"/>
-              <w:bottom w:w="75" w:type="dxa"/>
-              <w:right w:w="95" w:type="dxa"/>
-            </w:tcMar>
-            <w:vAlign w:val="center"/>
-          </w:tcPr>
-          <w:p>
-            <w:pPr>
-              <w:spacing w:after="0" w:line="300" w:lineRule="exact"/>
-              <w:jc w:val="center"/>
-            </w:pPr>
-            <w:r>
-              <w:rPr>
-                <w:rFonts w:eastAsia="黑体"/>
-                <w:sz w:val="21"/>
-              </w:rPr>
-              <w:t>完善顺序</w:t>
-            </w:r>
-          </w:p>
-        </w:tc>
-        <w:tc>
-          <w:tcPr>
-            <w:tcW w:w="3685" w:type="dxa"/>
-            <w:shd w:val="clear" w:color="auto" w:fill="E8EEF1"/>
-            <w:tcMar>
-              <w:top w:w="75" w:type="dxa"/>
-              <w:left w:w="95" w:type="dxa"/>
-              <w:bottom w:w="75" w:type="dxa"/>
-              <w:right w:w="95" w:type="dxa"/>
-            </w:tcMar>
-            <w:vAlign w:val="center"/>
-          </w:tcPr>
-          <w:p>
-            <w:pPr>
-              <w:spacing w:after="0" w:line="300" w:lineRule="exact"/>
-            </w:pPr>
-            <w:r>
-              <w:rPr>
-                <w:rFonts w:eastAsia="黑体"/>
-                <w:sz w:val="21"/>
-              </w:rPr>
-              <w:t>具体工作</w:t>
-            </w:r>
-          </w:p>
-        </w:tc>
-        <w:tc>
-          <w:tcPr>
-            <w:tcW w:w="3798" w:type="dxa"/>
-            <w:shd w:val="clear" w:color="auto" w:fill="E8EEF1"/>
-            <w:tcMar>
-              <w:top w:w="75" w:type="dxa"/>
-              <w:left w:w="95" w:type="dxa"/>
-              <w:bottom w:w="75" w:type="dxa"/>
-              <w:right w:w="95" w:type="dxa"/>
-            </w:tcMar>
-            <w:vAlign w:val="center"/>
-          </w:tcPr>
-          <w:p>
-            <w:pPr>
-              <w:spacing w:after="0" w:line="300" w:lineRule="exact"/>
-            </w:pPr>
-            <w:r>
-              <w:rPr>
-                <w:rFonts w:eastAsia="黑体"/>
-                <w:sz w:val="21"/>
-              </w:rPr>
-              <w:t>判断依据</w:t>
-            </w:r>
-          </w:p>
-        </w:tc>
-      </w:tr>
-      <w:tr>
-        <w:trPr>
-          <w:cantSplit/>
-          <w:jc w:val="center"/>
-        </w:trPr>
-        <w:tc>
-          <w:tcPr>
-            <w:tcW w:w="1814" w:type="dxa"/>
-            <w:shd w:val="clear" w:color="auto" w:fill="F7F4EC"/>
-            <w:tcMar>
-              <w:top w:w="75" w:type="dxa"/>
-              <w:left w:w="95" w:type="dxa"/>
-              <w:bottom w:w="75" w:type="dxa"/>
-              <w:right w:w="95" w:type="dxa"/>
-            </w:tcMar>
-            <w:vAlign w:val="center"/>
-          </w:tcPr>
-          <w:p>
-            <w:pPr>
-              <w:spacing w:after="0" w:line="300" w:lineRule="exact"/>
-              <w:jc w:val="center"/>
-            </w:pPr>
-            <w:r>
-              <w:rPr>
-                <w:sz w:val="21"/>
-              </w:rPr>
-              <w:t>先验证理解</w:t>
-            </w:r>
-          </w:p>
-        </w:tc>
-        <w:tc>
-          <w:tcPr>
-            <w:tcW w:w="3685" w:type="dxa"/>
-            <w:shd w:val="clear" w:color="auto" w:fill="F8FAFB"/>
-            <w:tcMar>
-              <w:top w:w="75" w:type="dxa"/>
-              <w:left w:w="95" w:type="dxa"/>
-              <w:bottom w:w="75" w:type="dxa"/>
-              <w:right w:w="95" w:type="dxa"/>
-            </w:tcMar>
-            <w:vAlign w:val="center"/>
-          </w:tcPr>
-          <w:p>
-            <w:pPr>
-              <w:spacing w:after="0" w:line="300" w:lineRule="exact"/>
-            </w:pPr>
-            <w:r>
-              <w:rPr>
-                <w:sz w:val="21"/>
-              </w:rPr>
-              <w:t>记录首次玩家在桥前、落地和激光处的操作</w:t>
-            </w:r>
-          </w:p>
-        </w:tc>
-        <w:tc>
-          <w:tcPr>
-            <w:tcW w:w="3798" w:type="dxa"/>
-            <w:shd w:val="clear" w:color="auto" w:fill="F8FAFB"/>
-            <w:tcMar>
-              <w:top w:w="75" w:type="dxa"/>
-              <w:left w:w="95" w:type="dxa"/>
-              <w:bottom w:w="75" w:type="dxa"/>
-              <w:right w:w="95" w:type="dxa"/>
-            </w:tcMar>
-            <w:vAlign w:val="center"/>
-          </w:tcPr>
-          <w:p>
-            <w:pPr>
-              <w:spacing w:after="0" w:line="300" w:lineRule="exact"/>
-            </w:pPr>
-            <w:r>
-              <w:rPr>
-                <w:sz w:val="21"/>
-              </w:rPr>
-              <w:t>误解发生的位置、等待原因与重试步骤</w:t>
-            </w:r>
-          </w:p>
-        </w:tc>
-      </w:tr>
-      <w:tr>
-        <w:trPr>
-          <w:cantSplit/>
-          <w:jc w:val="center"/>
-        </w:trPr>
-        <w:tc>
-          <w:tcPr>
-            <w:tcW w:w="1814" w:type="dxa"/>
-            <w:shd w:val="clear" w:color="auto" w:fill="F7F4EC"/>
-            <w:tcMar>
-              <w:top w:w="75" w:type="dxa"/>
-              <w:left w:w="95" w:type="dxa"/>
-              <w:bottom w:w="75" w:type="dxa"/>
-              <w:right w:w="95" w:type="dxa"/>
-            </w:tcMar>
-            <w:vAlign w:val="center"/>
-          </w:tcPr>
-          <w:p>
-            <w:pPr>
-              <w:spacing w:after="0" w:line="300" w:lineRule="exact"/>
-              <w:jc w:val="center"/>
-            </w:pPr>
-            <w:r>
-              <w:rPr>
-                <w:sz w:val="21"/>
-              </w:rPr>
-              <w:t>再核对设备</w:t>
-            </w:r>
-          </w:p>
-        </w:tc>
-        <w:tc>
-          <w:tcPr>
-            <w:tcW w:w="3685" w:type="dxa"/>
-            <w:shd w:val="clear" w:color="auto" w:fill="FFFFFF"/>
-            <w:tcMar>
-              <w:top w:w="75" w:type="dxa"/>
-              <w:left w:w="95" w:type="dxa"/>
-              <w:bottom w:w="75" w:type="dxa"/>
-              <w:right w:w="95" w:type="dxa"/>
-            </w:tcMar>
-            <w:vAlign w:val="center"/>
-          </w:tcPr>
-          <w:p>
-            <w:pPr>
-              <w:spacing w:after="0" w:line="300" w:lineRule="exact"/>
-            </w:pPr>
-            <w:r>
-              <w:rPr>
-                <w:sz w:val="21"/>
-              </w:rPr>
-              <w:t>另一台</w:t>
-            </w:r>
-            <w:r>
-              <w:rPr>
-                <w:sz w:val="21"/>
-              </w:rPr>
-              <w:t>Windows</w:t>
-            </w:r>
-            <w:r>
-              <w:rPr>
-                <w:sz w:val="21"/>
-              </w:rPr>
-              <w:t>电脑完整通关，检查中文与声音</w:t>
-            </w:r>
-          </w:p>
-        </w:tc>
-        <w:tc>
-          <w:tcPr>
-            <w:tcW w:w="3798" w:type="dxa"/>
-            <w:shd w:val="clear" w:color="auto" w:fill="FFFFFF"/>
-            <w:tcMar>
-              <w:top w:w="75" w:type="dxa"/>
-              <w:left w:w="95" w:type="dxa"/>
-              <w:bottom w:w="75" w:type="dxa"/>
-              <w:right w:w="95" w:type="dxa"/>
-            </w:tcMar>
-            <w:vAlign w:val="center"/>
-          </w:tcPr>
-          <w:p>
-            <w:pPr>
-              <w:spacing w:after="0" w:line="300" w:lineRule="exact"/>
-            </w:pPr>
-            <w:r>
-              <w:rPr>
-                <w:sz w:val="21"/>
-              </w:rPr>
-              <w:t>设备、版本、输出方式及完整流程记录</w:t>
-            </w:r>
-          </w:p>
-        </w:tc>
-      </w:tr>
-      <w:tr>
-        <w:trPr>
-          <w:cantSplit/>
-          <w:jc w:val="center"/>
-        </w:trPr>
-        <w:tc>
-          <w:tcPr>
-            <w:tcW w:w="1814" w:type="dxa"/>
-            <w:shd w:val="clear" w:color="auto" w:fill="F7F4EC"/>
-            <w:tcMar>
-              <w:top w:w="75" w:type="dxa"/>
-              <w:left w:w="95" w:type="dxa"/>
-              <w:bottom w:w="75" w:type="dxa"/>
-              <w:right w:w="95" w:type="dxa"/>
-            </w:tcMar>
-            <w:vAlign w:val="center"/>
-          </w:tcPr>
-          <w:p>
-            <w:pPr>
-              <w:spacing w:after="0" w:line="300" w:lineRule="exact"/>
-              <w:jc w:val="center"/>
-            </w:pPr>
-            <w:r>
-              <w:rPr>
-                <w:sz w:val="21"/>
-              </w:rPr>
-              <w:t>补足事件反馈</w:t>
-            </w:r>
-          </w:p>
-        </w:tc>
-        <w:tc>
-          <w:tcPr>
-            <w:tcW w:w="3685" w:type="dxa"/>
-            <w:shd w:val="clear" w:color="auto" w:fill="F8FAFB"/>
-            <w:tcMar>
-              <w:top w:w="75" w:type="dxa"/>
-              <w:left w:w="95" w:type="dxa"/>
-              <w:bottom w:w="75" w:type="dxa"/>
-              <w:right w:w="95" w:type="dxa"/>
-            </w:tcMar>
-            <w:vAlign w:val="center"/>
-          </w:tcPr>
-          <w:p>
-            <w:pPr>
-              <w:spacing w:after="0" w:line="300" w:lineRule="exact"/>
-            </w:pPr>
-            <w:r>
-              <w:rPr>
-                <w:sz w:val="21"/>
-              </w:rPr>
-              <w:t>增加修复、失败、通关音效</w:t>
-            </w:r>
-          </w:p>
-        </w:tc>
-        <w:tc>
-          <w:tcPr>
-            <w:tcW w:w="3798" w:type="dxa"/>
-            <w:shd w:val="clear" w:color="auto" w:fill="F8FAFB"/>
-            <w:tcMar>
-              <w:top w:w="75" w:type="dxa"/>
-              <w:left w:w="95" w:type="dxa"/>
-              <w:bottom w:w="75" w:type="dxa"/>
-              <w:right w:w="95" w:type="dxa"/>
-            </w:tcMar>
-            <w:vAlign w:val="center"/>
-          </w:tcPr>
-          <w:p>
-            <w:pPr>
-              <w:spacing w:after="0" w:line="300" w:lineRule="exact"/>
-            </w:pPr>
-            <w:r>
-              <w:rPr>
-                <w:sz w:val="21"/>
-              </w:rPr>
-              <w:t>反馈可辨认，且不遮盖用于判断的主拍</w:t>
-            </w:r>
-          </w:p>
-        </w:tc>
-      </w:tr>
-    </w:tbl>
-    <w:p>
-      <w:pPr>
-        <w:spacing w:after="60" w:line="240" w:lineRule="auto"/>
-      </w:pPr>
+        <w:pStyle w:val="21"/>
+      </w:pPr>
+      <w:r>
+        <w:t>后续完善方向</w:t>
+      </w:r>
     </w:p>
     <w:p>
       <w:pPr>
         <w:ind w:firstLine="480"/>
       </w:pPr>
       <w:r>
-        <w:t>本阶段先完善现有三间房间的可理解性与运行一致性，不扩充额外角色能力和新关卡。若试玩暴露问题，优先定位到规则、布局、提示或同步，再决定调整内容。</w:t>
+        <w:t>后续完善集中在两方面：补充修复、失败和通关的独立声音反馈；结合首次体验与设备验证，调整教学提示、危险辨识和音画同步表现。</w:t>
       </w:r>
     </w:p>
     <w:p>
@@ -7807,16 +7571,16 @@
         <w:pStyle w:val="ReportChapter"/>
         <w:pageBreakBefore/>
       </w:pPr>
-      <w:bookmarkStart w:id="12" w:name="_Toc243856764"/>
+      <w:bookmarkStart w:id="12" w:name="_Toc243857961"/>
       <w:r>
         <w:lastRenderedPageBreak/>
-        <w:t>附录</w:t>
+        <w:t>七</w:t>
       </w:r>
       <w:r>
         <w:t xml:space="preserve"> </w:t>
       </w:r>
       <w:r>
-        <w:t>团队分工与实施安排</w:t>
+        <w:t>团队分工</w:t>
       </w:r>
       <w:bookmarkEnd w:id="12"/>
     </w:p>
@@ -7825,7 +7589,7 @@
         <w:ind w:firstLine="480"/>
       </w:pPr>
       <w:r>
-        <w:t>团队由严楷哲、沈语雯、李星莹三人组成，严楷哲担任队长。以下明确各人的主责、交付成果与协作关系，供后续完善和展示准备使用；实际完成情况以工程修改、作品文件及复测记录为准。</w:t>
+        <w:t>团队由严楷哲、沈语雯、李星莹三人组成，严楷哲担任队长。分工围绕程序实现、玩法与视觉设计、音频及验证展开，共同服务于节拍驱动的道路修复体验。</w:t>
       </w:r>
     </w:p>
     <w:tbl>
@@ -7845,8 +7609,8 @@
       </w:tblPr>
       <w:tblGrid>
         <w:gridCol w:w="1587"/>
-        <w:gridCol w:w="3515"/>
-        <w:gridCol w:w="4195"/>
+        <w:gridCol w:w="3005"/>
+        <w:gridCol w:w="4706"/>
       </w:tblGrid>
       <w:tr>
         <w:trPr>
@@ -7882,7 +7646,7 @@
         </w:tc>
         <w:tc>
           <w:tcPr>
-            <w:tcW w:w="3515" w:type="dxa"/>
+            <w:tcW w:w="3005" w:type="dxa"/>
             <w:shd w:val="clear" w:color="auto" w:fill="E8EEF1"/>
             <w:tcMar>
               <w:top w:w="75" w:type="dxa"/>
@@ -7901,13 +7665,13 @@
                 <w:rFonts w:eastAsia="黑体"/>
                 <w:sz w:val="21"/>
               </w:rPr>
-              <w:t>主要负责</w:t>
+              <w:t>职责方向</w:t>
             </w:r>
           </w:p>
         </w:tc>
         <w:tc>
           <w:tcPr>
-            <w:tcW w:w="4195" w:type="dxa"/>
+            <w:tcW w:w="4706" w:type="dxa"/>
             <w:shd w:val="clear" w:color="auto" w:fill="E8EEF1"/>
             <w:tcMar>
               <w:top w:w="75" w:type="dxa"/>
@@ -7926,7 +7690,7 @@
                 <w:rFonts w:eastAsia="黑体"/>
                 <w:sz w:val="21"/>
               </w:rPr>
-              <w:t>主要成果</w:t>
+              <w:t>主要负责内容</w:t>
             </w:r>
           </w:p>
         </w:tc>
@@ -7975,7 +7739,7 @@
         </w:tc>
         <w:tc>
           <w:tcPr>
-            <w:tcW w:w="3515" w:type="dxa"/>
+            <w:tcW w:w="3005" w:type="dxa"/>
             <w:shd w:val="clear" w:color="auto" w:fill="F8FAFB"/>
             <w:tcMar>
               <w:top w:w="75" w:type="dxa"/>
@@ -7993,13 +7757,13 @@
               <w:rPr>
                 <w:sz w:val="21"/>
               </w:rPr>
-              <w:t>程序实现、版本维护、任务统筹</w:t>
+              <w:t>程序、版本与技术统筹</w:t>
             </w:r>
           </w:p>
         </w:tc>
         <w:tc>
           <w:tcPr>
-            <w:tcW w:w="4195" w:type="dxa"/>
+            <w:tcW w:w="4706" w:type="dxa"/>
             <w:shd w:val="clear" w:color="auto" w:fill="F8FAFB"/>
             <w:tcMar>
               <w:top w:w="75" w:type="dxa"/>
@@ -8017,7 +7781,7 @@
               <w:rPr>
                 <w:sz w:val="21"/>
               </w:rPr>
-              <w:t>游戏工程、运行包、版本说明、统一材料目录</w:t>
+              <w:t>角色运动、统一时钟、机关、房间流程及程序验证</w:t>
             </w:r>
           </w:p>
         </w:tc>
@@ -8054,7 +7818,7 @@
         </w:tc>
         <w:tc>
           <w:tcPr>
-            <w:tcW w:w="3515" w:type="dxa"/>
+            <w:tcW w:w="3005" w:type="dxa"/>
             <w:shd w:val="clear" w:color="auto" w:fill="FFFFFF"/>
             <w:tcMar>
               <w:top w:w="75" w:type="dxa"/>
@@ -8072,13 +7836,13 @@
               <w:rPr>
                 <w:sz w:val="21"/>
               </w:rPr>
-              <w:t>玩法策划、关卡设计、视觉交互</w:t>
+              <w:t>策划、关卡与视觉交互</w:t>
             </w:r>
           </w:p>
         </w:tc>
         <w:tc>
           <w:tcPr>
-            <w:tcW w:w="4195" w:type="dxa"/>
+            <w:tcW w:w="4706" w:type="dxa"/>
             <w:shd w:val="clear" w:color="auto" w:fill="FFFFFF"/>
             <w:tcMar>
               <w:top w:w="75" w:type="dxa"/>
@@ -8096,7 +7860,7 @@
               <w:rPr>
                 <w:sz w:val="21"/>
               </w:rPr>
-              <w:t>设计报告、关卡建议、界面与展示文案复核</w:t>
+              <w:t>玩法分析、路线递进、状态表达、教学与界面文字</w:t>
             </w:r>
           </w:p>
         </w:tc>
@@ -8133,7 +7897,7 @@
         </w:tc>
         <w:tc>
           <w:tcPr>
-            <w:tcW w:w="3515" w:type="dxa"/>
+            <w:tcW w:w="3005" w:type="dxa"/>
             <w:shd w:val="clear" w:color="auto" w:fill="F8FAFB"/>
             <w:tcMar>
               <w:top w:w="75" w:type="dxa"/>
@@ -8151,13 +7915,13 @@
               <w:rPr>
                 <w:sz w:val="21"/>
               </w:rPr>
-              <w:t>音频检查、测试、展示材料</w:t>
+              <w:t>音频、测试与作品呈现</w:t>
             </w:r>
           </w:p>
         </w:tc>
         <w:tc>
           <w:tcPr>
-            <w:tcW w:w="4195" w:type="dxa"/>
+            <w:tcW w:w="4706" w:type="dxa"/>
             <w:shd w:val="clear" w:color="auto" w:fill="F8FAFB"/>
             <w:tcMar>
               <w:top w:w="75" w:type="dxa"/>
@@ -8175,19 +7939,7 @@
               <w:rPr>
                 <w:sz w:val="21"/>
               </w:rPr>
-              <w:t>测试记录、音画文件、介绍视频、</w:t>
-            </w:r>
-            <w:r>
-              <w:rPr>
-                <w:sz w:val="21"/>
-              </w:rPr>
-              <w:t>PPT</w:t>
-            </w:r>
-            <w:r>
-              <w:rPr>
-                <w:sz w:val="21"/>
-              </w:rPr>
-              <w:t>及讲稿维护</w:t>
+              <w:t>配乐与校准检查、流程及设备验证、视频与宣讲材料</w:t>
             </w:r>
           </w:p>
         </w:tc>
@@ -8203,7 +7955,7 @@
         <w:pStyle w:val="21"/>
       </w:pPr>
       <w:r>
-        <w:t>按成果组织协作</w:t>
+        <w:t>设计与实现的协同</w:t>
       </w:r>
     </w:p>
     <w:p>
@@ -8211,1089 +7963,7 @@
         <w:ind w:firstLine="480"/>
       </w:pPr>
       <w:r>
-        <w:t>策划提出需要改变的体验和具体位置，程序给出实现及版本，测试按相同场景检查结果。涉及跳跃、光桥或节拍参数的修改，需要同时复核操作、画面提示和说明材料，避免其中一项更新后其他内容仍沿用旧版本。</w:t>
-      </w:r>
-    </w:p>
-    <w:tbl>
-      <w:tblPr>
-        <w:tblW w:w="0" w:type="auto"/>
-        <w:jc w:val="center"/>
-        <w:tblBorders>
-          <w:top w:val="single" w:sz="4" w:space="0" w:color="D9D9D9"/>
-          <w:left w:val="single" w:sz="4" w:space="0" w:color="D9D9D9"/>
-          <w:bottom w:val="single" w:sz="4" w:space="0" w:color="D9D9D9"/>
-          <w:right w:val="single" w:sz="4" w:space="0" w:color="D9D9D9"/>
-          <w:insideH w:val="single" w:sz="4" w:space="0" w:color="D9D9D9"/>
-          <w:insideV w:val="single" w:sz="4" w:space="0" w:color="D9D9D9"/>
-        </w:tblBorders>
-        <w:tblLayout w:type="fixed"/>
-        <w:tblLook w:val="04A0" w:firstRow="1" w:lastRow="0" w:firstColumn="1" w:lastColumn="0" w:noHBand="0" w:noVBand="1"/>
-      </w:tblPr>
-      <w:tblGrid>
-        <w:gridCol w:w="2891"/>
-        <w:gridCol w:w="1984"/>
-        <w:gridCol w:w="4422"/>
-      </w:tblGrid>
-      <w:tr>
-        <w:trPr>
-          <w:cantSplit/>
-          <w:tblHeader/>
-          <w:jc w:val="center"/>
-        </w:trPr>
-        <w:tc>
-          <w:tcPr>
-            <w:tcW w:w="2891" w:type="dxa"/>
-            <w:shd w:val="clear" w:color="auto" w:fill="E8EEF1"/>
-            <w:tcMar>
-              <w:top w:w="75" w:type="dxa"/>
-              <w:left w:w="95" w:type="dxa"/>
-              <w:bottom w:w="75" w:type="dxa"/>
-              <w:right w:w="95" w:type="dxa"/>
-            </w:tcMar>
-            <w:vAlign w:val="center"/>
-          </w:tcPr>
-          <w:p>
-            <w:pPr>
-              <w:spacing w:after="0" w:line="300" w:lineRule="exact"/>
-            </w:pPr>
-            <w:r>
-              <w:rPr>
-                <w:rFonts w:eastAsia="黑体"/>
-                <w:sz w:val="21"/>
-              </w:rPr>
-              <w:t>事项</w:t>
-            </w:r>
-          </w:p>
-        </w:tc>
-        <w:tc>
-          <w:tcPr>
-            <w:tcW w:w="1984" w:type="dxa"/>
-            <w:shd w:val="clear" w:color="auto" w:fill="E8EEF1"/>
-            <w:tcMar>
-              <w:top w:w="75" w:type="dxa"/>
-              <w:left w:w="95" w:type="dxa"/>
-              <w:bottom w:w="75" w:type="dxa"/>
-              <w:right w:w="95" w:type="dxa"/>
-            </w:tcMar>
-            <w:vAlign w:val="center"/>
-          </w:tcPr>
-          <w:p>
-            <w:pPr>
-              <w:spacing w:after="0" w:line="300" w:lineRule="exact"/>
-            </w:pPr>
-            <w:r>
-              <w:rPr>
-                <w:rFonts w:eastAsia="黑体"/>
-                <w:sz w:val="21"/>
-              </w:rPr>
-              <w:t>主责</w:t>
-            </w:r>
-          </w:p>
-        </w:tc>
-        <w:tc>
-          <w:tcPr>
-            <w:tcW w:w="4422" w:type="dxa"/>
-            <w:shd w:val="clear" w:color="auto" w:fill="E8EEF1"/>
-            <w:tcMar>
-              <w:top w:w="75" w:type="dxa"/>
-              <w:left w:w="95" w:type="dxa"/>
-              <w:bottom w:w="75" w:type="dxa"/>
-              <w:right w:w="95" w:type="dxa"/>
-            </w:tcMar>
-            <w:vAlign w:val="center"/>
-          </w:tcPr>
-          <w:p>
-            <w:pPr>
-              <w:spacing w:after="0" w:line="300" w:lineRule="exact"/>
-            </w:pPr>
-            <w:r>
-              <w:rPr>
-                <w:rFonts w:eastAsia="黑体"/>
-                <w:sz w:val="21"/>
-              </w:rPr>
-              <w:t>配合与复核</w:t>
-            </w:r>
-          </w:p>
-        </w:tc>
-      </w:tr>
-      <w:tr>
-        <w:trPr>
-          <w:cantSplit/>
-          <w:jc w:val="center"/>
-        </w:trPr>
-        <w:tc>
-          <w:tcPr>
-            <w:tcW w:w="2891" w:type="dxa"/>
-            <w:shd w:val="clear" w:color="auto" w:fill="F7F4EC"/>
-            <w:tcMar>
-              <w:top w:w="75" w:type="dxa"/>
-              <w:left w:w="95" w:type="dxa"/>
-              <w:bottom w:w="75" w:type="dxa"/>
-              <w:right w:w="95" w:type="dxa"/>
-            </w:tcMar>
-            <w:vAlign w:val="center"/>
-          </w:tcPr>
-          <w:p>
-            <w:pPr>
-              <w:spacing w:after="0" w:line="300" w:lineRule="exact"/>
-            </w:pPr>
-            <w:r>
-              <w:rPr>
-                <w:sz w:val="21"/>
-              </w:rPr>
-              <w:t>玩法、关卡和视觉调整</w:t>
-            </w:r>
-          </w:p>
-        </w:tc>
-        <w:tc>
-          <w:tcPr>
-            <w:tcW w:w="1984" w:type="dxa"/>
-            <w:shd w:val="clear" w:color="auto" w:fill="F8FAFB"/>
-            <w:tcMar>
-              <w:top w:w="75" w:type="dxa"/>
-              <w:left w:w="95" w:type="dxa"/>
-              <w:bottom w:w="75" w:type="dxa"/>
-              <w:right w:w="95" w:type="dxa"/>
-            </w:tcMar>
-            <w:vAlign w:val="center"/>
-          </w:tcPr>
-          <w:p>
-            <w:pPr>
-              <w:spacing w:after="0" w:line="300" w:lineRule="exact"/>
-            </w:pPr>
-            <w:r>
-              <w:rPr>
-                <w:sz w:val="21"/>
-              </w:rPr>
-              <w:t>沈语雯</w:t>
-            </w:r>
-          </w:p>
-        </w:tc>
-        <w:tc>
-          <w:tcPr>
-            <w:tcW w:w="4422" w:type="dxa"/>
-            <w:shd w:val="clear" w:color="auto" w:fill="F8FAFB"/>
-            <w:tcMar>
-              <w:top w:w="75" w:type="dxa"/>
-              <w:left w:w="95" w:type="dxa"/>
-              <w:bottom w:w="75" w:type="dxa"/>
-              <w:right w:w="95" w:type="dxa"/>
-            </w:tcMar>
-            <w:vAlign w:val="center"/>
-          </w:tcPr>
-          <w:p>
-            <w:pPr>
-              <w:spacing w:after="0" w:line="300" w:lineRule="exact"/>
-            </w:pPr>
-            <w:r>
-              <w:rPr>
-                <w:sz w:val="21"/>
-              </w:rPr>
-              <w:t>严楷哲评估并落实；李星莹复核实际体验</w:t>
-            </w:r>
-          </w:p>
-        </w:tc>
-      </w:tr>
-      <w:tr>
-        <w:trPr>
-          <w:cantSplit/>
-          <w:jc w:val="center"/>
-        </w:trPr>
-        <w:tc>
-          <w:tcPr>
-            <w:tcW w:w="2891" w:type="dxa"/>
-            <w:shd w:val="clear" w:color="auto" w:fill="F7F4EC"/>
-            <w:tcMar>
-              <w:top w:w="75" w:type="dxa"/>
-              <w:left w:w="95" w:type="dxa"/>
-              <w:bottom w:w="75" w:type="dxa"/>
-              <w:right w:w="95" w:type="dxa"/>
-            </w:tcMar>
-            <w:vAlign w:val="center"/>
-          </w:tcPr>
-          <w:p>
-            <w:pPr>
-              <w:spacing w:after="0" w:line="300" w:lineRule="exact"/>
-            </w:pPr>
-            <w:r>
-              <w:rPr>
-                <w:sz w:val="21"/>
-              </w:rPr>
-              <w:t>程序修复和版本导出</w:t>
-            </w:r>
-          </w:p>
-        </w:tc>
-        <w:tc>
-          <w:tcPr>
-            <w:tcW w:w="1984" w:type="dxa"/>
-            <w:shd w:val="clear" w:color="auto" w:fill="FFFFFF"/>
-            <w:tcMar>
-              <w:top w:w="75" w:type="dxa"/>
-              <w:left w:w="95" w:type="dxa"/>
-              <w:bottom w:w="75" w:type="dxa"/>
-              <w:right w:w="95" w:type="dxa"/>
-            </w:tcMar>
-            <w:vAlign w:val="center"/>
-          </w:tcPr>
-          <w:p>
-            <w:pPr>
-              <w:spacing w:after="0" w:line="300" w:lineRule="exact"/>
-            </w:pPr>
-            <w:r>
-              <w:rPr>
-                <w:sz w:val="21"/>
-              </w:rPr>
-              <w:t>严楷哲</w:t>
-            </w:r>
-          </w:p>
-        </w:tc>
-        <w:tc>
-          <w:tcPr>
-            <w:tcW w:w="4422" w:type="dxa"/>
-            <w:shd w:val="clear" w:color="auto" w:fill="FFFFFF"/>
-            <w:tcMar>
-              <w:top w:w="75" w:type="dxa"/>
-              <w:left w:w="95" w:type="dxa"/>
-              <w:bottom w:w="75" w:type="dxa"/>
-              <w:right w:w="95" w:type="dxa"/>
-            </w:tcMar>
-            <w:vAlign w:val="center"/>
-          </w:tcPr>
-          <w:p>
-            <w:pPr>
-              <w:spacing w:after="0" w:line="300" w:lineRule="exact"/>
-            </w:pPr>
-            <w:r>
-              <w:rPr>
-                <w:sz w:val="21"/>
-              </w:rPr>
-              <w:t>李星莹复测；沈语雯核对规则和画面</w:t>
-            </w:r>
-          </w:p>
-        </w:tc>
-      </w:tr>
-      <w:tr>
-        <w:trPr>
-          <w:cantSplit/>
-          <w:jc w:val="center"/>
-        </w:trPr>
-        <w:tc>
-          <w:tcPr>
-            <w:tcW w:w="2891" w:type="dxa"/>
-            <w:shd w:val="clear" w:color="auto" w:fill="F7F4EC"/>
-            <w:tcMar>
-              <w:top w:w="75" w:type="dxa"/>
-              <w:left w:w="95" w:type="dxa"/>
-              <w:bottom w:w="75" w:type="dxa"/>
-              <w:right w:w="95" w:type="dxa"/>
-            </w:tcMar>
-            <w:vAlign w:val="center"/>
-          </w:tcPr>
-          <w:p>
-            <w:pPr>
-              <w:spacing w:after="0" w:line="300" w:lineRule="exact"/>
-            </w:pPr>
-            <w:r>
-              <w:rPr>
-                <w:sz w:val="21"/>
-              </w:rPr>
-              <w:t>声音、同步与设备检查</w:t>
-            </w:r>
-          </w:p>
-        </w:tc>
-        <w:tc>
-          <w:tcPr>
-            <w:tcW w:w="1984" w:type="dxa"/>
-            <w:shd w:val="clear" w:color="auto" w:fill="F8FAFB"/>
-            <w:tcMar>
-              <w:top w:w="75" w:type="dxa"/>
-              <w:left w:w="95" w:type="dxa"/>
-              <w:bottom w:w="75" w:type="dxa"/>
-              <w:right w:w="95" w:type="dxa"/>
-            </w:tcMar>
-            <w:vAlign w:val="center"/>
-          </w:tcPr>
-          <w:p>
-            <w:pPr>
-              <w:spacing w:after="0" w:line="300" w:lineRule="exact"/>
-            </w:pPr>
-            <w:r>
-              <w:rPr>
-                <w:sz w:val="21"/>
-              </w:rPr>
-              <w:t>李星莹</w:t>
-            </w:r>
-          </w:p>
-        </w:tc>
-        <w:tc>
-          <w:tcPr>
-            <w:tcW w:w="4422" w:type="dxa"/>
-            <w:shd w:val="clear" w:color="auto" w:fill="F8FAFB"/>
-            <w:tcMar>
-              <w:top w:w="75" w:type="dxa"/>
-              <w:left w:w="95" w:type="dxa"/>
-              <w:bottom w:w="75" w:type="dxa"/>
-              <w:right w:w="95" w:type="dxa"/>
-            </w:tcMar>
-            <w:vAlign w:val="center"/>
-          </w:tcPr>
-          <w:p>
-            <w:pPr>
-              <w:spacing w:after="0" w:line="300" w:lineRule="exact"/>
-            </w:pPr>
-            <w:r>
-              <w:rPr>
-                <w:sz w:val="21"/>
-              </w:rPr>
-              <w:t>严楷哲定位处理；沈语雯核对反馈可读性</w:t>
-            </w:r>
-          </w:p>
-        </w:tc>
-      </w:tr>
-      <w:tr>
-        <w:trPr>
-          <w:cantSplit/>
-          <w:jc w:val="center"/>
-        </w:trPr>
-        <w:tc>
-          <w:tcPr>
-            <w:tcW w:w="2891" w:type="dxa"/>
-            <w:shd w:val="clear" w:color="auto" w:fill="F7F4EC"/>
-            <w:tcMar>
-              <w:top w:w="75" w:type="dxa"/>
-              <w:left w:w="95" w:type="dxa"/>
-              <w:bottom w:w="75" w:type="dxa"/>
-              <w:right w:w="95" w:type="dxa"/>
-            </w:tcMar>
-            <w:vAlign w:val="center"/>
-          </w:tcPr>
-          <w:p>
-            <w:pPr>
-              <w:spacing w:after="0" w:line="300" w:lineRule="exact"/>
-            </w:pPr>
-            <w:r>
-              <w:rPr>
-                <w:sz w:val="21"/>
-              </w:rPr>
-              <w:t>策划与展示内容</w:t>
-            </w:r>
-          </w:p>
-        </w:tc>
-        <w:tc>
-          <w:tcPr>
-            <w:tcW w:w="1984" w:type="dxa"/>
-            <w:shd w:val="clear" w:color="auto" w:fill="FFFFFF"/>
-            <w:tcMar>
-              <w:top w:w="75" w:type="dxa"/>
-              <w:left w:w="95" w:type="dxa"/>
-              <w:bottom w:w="75" w:type="dxa"/>
-              <w:right w:w="95" w:type="dxa"/>
-            </w:tcMar>
-            <w:vAlign w:val="center"/>
-          </w:tcPr>
-          <w:p>
-            <w:pPr>
-              <w:spacing w:after="0" w:line="300" w:lineRule="exact"/>
-            </w:pPr>
-            <w:r>
-              <w:rPr>
-                <w:sz w:val="21"/>
-              </w:rPr>
-              <w:t>策划沈语雯</w:t>
-            </w:r>
-            <w:r>
-              <w:rPr>
-                <w:sz w:val="21"/>
-              </w:rPr>
-              <w:br/>
-            </w:r>
-            <w:r>
-              <w:rPr>
-                <w:sz w:val="21"/>
-              </w:rPr>
-              <w:t>展示李星莹</w:t>
-            </w:r>
-          </w:p>
-        </w:tc>
-        <w:tc>
-          <w:tcPr>
-            <w:tcW w:w="4422" w:type="dxa"/>
-            <w:shd w:val="clear" w:color="auto" w:fill="FFFFFF"/>
-            <w:tcMar>
-              <w:top w:w="75" w:type="dxa"/>
-              <w:left w:w="95" w:type="dxa"/>
-              <w:bottom w:w="75" w:type="dxa"/>
-              <w:right w:w="95" w:type="dxa"/>
-            </w:tcMar>
-            <w:vAlign w:val="center"/>
-          </w:tcPr>
-          <w:p>
-            <w:pPr>
-              <w:spacing w:after="0" w:line="300" w:lineRule="exact"/>
-            </w:pPr>
-            <w:r>
-              <w:rPr>
-                <w:sz w:val="21"/>
-              </w:rPr>
-              <w:t>严楷哲核对工程版本；三人确认用语与画面</w:t>
-            </w:r>
-          </w:p>
-        </w:tc>
-      </w:tr>
-      <w:tr>
-        <w:trPr>
-          <w:cantSplit/>
-          <w:jc w:val="center"/>
-        </w:trPr>
-        <w:tc>
-          <w:tcPr>
-            <w:tcW w:w="2891" w:type="dxa"/>
-            <w:shd w:val="clear" w:color="auto" w:fill="F7F4EC"/>
-            <w:tcMar>
-              <w:top w:w="75" w:type="dxa"/>
-              <w:left w:w="95" w:type="dxa"/>
-              <w:bottom w:w="75" w:type="dxa"/>
-              <w:right w:w="95" w:type="dxa"/>
-            </w:tcMar>
-            <w:vAlign w:val="center"/>
-          </w:tcPr>
-          <w:p>
-            <w:pPr>
-              <w:spacing w:after="0" w:line="300" w:lineRule="exact"/>
-            </w:pPr>
-            <w:r>
-              <w:rPr>
-                <w:sz w:val="21"/>
-              </w:rPr>
-              <w:t>最终目录与备份</w:t>
-            </w:r>
-          </w:p>
-        </w:tc>
-        <w:tc>
-          <w:tcPr>
-            <w:tcW w:w="1984" w:type="dxa"/>
-            <w:shd w:val="clear" w:color="auto" w:fill="F8FAFB"/>
-            <w:tcMar>
-              <w:top w:w="75" w:type="dxa"/>
-              <w:left w:w="95" w:type="dxa"/>
-              <w:bottom w:w="75" w:type="dxa"/>
-              <w:right w:w="95" w:type="dxa"/>
-            </w:tcMar>
-            <w:vAlign w:val="center"/>
-          </w:tcPr>
-          <w:p>
-            <w:pPr>
-              <w:spacing w:after="0" w:line="300" w:lineRule="exact"/>
-            </w:pPr>
-            <w:r>
-              <w:rPr>
-                <w:sz w:val="21"/>
-              </w:rPr>
-              <w:t>严楷哲</w:t>
-            </w:r>
-          </w:p>
-        </w:tc>
-        <w:tc>
-          <w:tcPr>
-            <w:tcW w:w="4422" w:type="dxa"/>
-            <w:shd w:val="clear" w:color="auto" w:fill="F8FAFB"/>
-            <w:tcMar>
-              <w:top w:w="75" w:type="dxa"/>
-              <w:left w:w="95" w:type="dxa"/>
-              <w:bottom w:w="75" w:type="dxa"/>
-              <w:right w:w="95" w:type="dxa"/>
-            </w:tcMar>
-            <w:vAlign w:val="center"/>
-          </w:tcPr>
-          <w:p>
-            <w:pPr>
-              <w:spacing w:after="0" w:line="300" w:lineRule="exact"/>
-            </w:pPr>
-            <w:r>
-              <w:rPr>
-                <w:sz w:val="21"/>
-              </w:rPr>
-              <w:t>沈语雯、李星莹分别核对负责文件</w:t>
-            </w:r>
-          </w:p>
-        </w:tc>
-      </w:tr>
-    </w:tbl>
-    <w:p>
-      <w:pPr>
-        <w:spacing w:after="60" w:line="240" w:lineRule="auto"/>
-      </w:pPr>
-    </w:p>
-    <w:p>
-      <w:pPr>
-        <w:pStyle w:val="21"/>
-      </w:pPr>
-      <w:r>
-        <w:t>问题处理与完成条件</w:t>
-      </w:r>
-    </w:p>
-    <w:p>
-      <w:pPr>
-        <w:ind w:firstLine="480"/>
-      </w:pPr>
-      <w:r>
-        <w:t>问题记录至少包含版本、设备、位置、操作步骤、预期与实际结果。主负责人修改后说明影响范围，原记录人复测；通过后再同步文档与展示画面。无法启动、无法通关和状态错误优先处理，其次是影响理解或节拍感的问题。未复测事项保留待确认状态。</w:t>
-      </w:r>
-    </w:p>
-    <w:p>
-      <w:pPr>
-        <w:pStyle w:val="ReportSection"/>
-        <w:pageBreakBefore/>
-        <w:spacing w:before="0" w:after="240"/>
-      </w:pPr>
-      <w:bookmarkStart w:id="13" w:name="_Toc243856765"/>
-      <w:r>
-        <w:rPr>
-          <w:sz w:val="32"/>
-        </w:rPr>
-        <w:lastRenderedPageBreak/>
-        <w:t>严楷哲</w:t>
-      </w:r>
-      <w:r>
-        <w:rPr>
-          <w:sz w:val="32"/>
-        </w:rPr>
-        <w:t xml:space="preserve"> </w:t>
-      </w:r>
-      <w:r>
-        <w:rPr>
-          <w:sz w:val="32"/>
-        </w:rPr>
-        <w:t>队长与程序负责人</w:t>
-      </w:r>
-      <w:bookmarkEnd w:id="13"/>
-    </w:p>
-    <w:p>
-      <w:r>
-        <w:t>学院</w:t>
-      </w:r>
-      <w:r>
-        <w:t xml:space="preserve">  </w:t>
-      </w:r>
-      <w:r>
-        <w:t>集成电路科学与工程学院（产教融合学院）</w:t>
-      </w:r>
-      <w:r>
-        <w:br/>
-      </w:r>
-      <w:r>
-        <w:t>专业</w:t>
-      </w:r>
-      <w:r>
-        <w:t xml:space="preserve">  </w:t>
-      </w:r>
-      <w:r>
-        <w:t>集成电路设计与集成系统</w:t>
-      </w:r>
-    </w:p>
-    <w:p>
-      <w:pPr>
-        <w:pStyle w:val="31"/>
-      </w:pPr>
-      <w:r>
-        <w:t>职责定位</w:t>
-      </w:r>
-    </w:p>
-    <w:p>
-      <w:pPr>
-        <w:ind w:firstLine="480"/>
-      </w:pPr>
-      <w:r>
-        <w:t>担任队长，负责程序维护、版本管理与工作统筹。将策划调整、测试问题和材料更新落实为可执行任务，确定处理顺序与交接对象，组织三人围绕同一版本完成复核。</w:t>
-      </w:r>
-    </w:p>
-    <w:p>
-      <w:pPr>
-        <w:pStyle w:val="31"/>
-      </w:pPr>
-      <w:r>
-        <w:t>程序维护与规则落实</w:t>
-      </w:r>
-    </w:p>
-    <w:p>
-      <w:pPr>
-        <w:ind w:firstLine="480"/>
-      </w:pPr>
-      <w:r>
-        <w:t>维护角色移动、真实起落事件、节拍时钟、光桥、激光及房间流程。重点检查两拍起落、四拍临时桥、落拍固定和共鸣出口之间的关系，以及暂停、重试后的时间与状态是否一致。涉及跳跃、平台或判定参数的调整，先与沈语雯核对预期，再落实到工程和操作提示中。</w:t>
-      </w:r>
-    </w:p>
-    <w:p>
-      <w:pPr>
-        <w:pStyle w:val="31"/>
-      </w:pPr>
-      <w:r>
-        <w:t>问题处理与版本管理</w:t>
-      </w:r>
-    </w:p>
-    <w:p>
-      <w:pPr>
-        <w:ind w:firstLine="480"/>
-      </w:pPr>
-      <w:r>
-        <w:t>根据李星莹提供的版本、设备和复现步骤定位问题，优先处理无法启动、无法通关、机关异常及状态残留。修复后说明改动位置与影响范围，导出带有明确版本标记的运行包。源码、可执行文件和包内说明保持对应，供成员按原步骤复测。</w:t>
-      </w:r>
-    </w:p>
-    <w:p>
-      <w:pPr>
-        <w:pStyle w:val="31"/>
-      </w:pPr>
-      <w:r>
-        <w:t>进度统筹与材料汇总</w:t>
-      </w:r>
-    </w:p>
-    <w:p>
-      <w:pPr>
-        <w:ind w:firstLine="480"/>
-      </w:pPr>
-      <w:r>
-        <w:t>维护统一待办，为每项工作写明负责人、所需材料和验收条件。接收沈语雯复核的策划内容，以及李星莹核验的音画与展示文件，检查名称、规则和版本是否一致。统筹最终目录、离线备份与演示设备；正式提交前组织三人核对文件和访问权限，保存提交结果。</w:t>
-      </w:r>
-    </w:p>
-    <w:p>
-      <w:pPr>
-        <w:pStyle w:val="31"/>
-      </w:pPr>
-      <w:r>
-        <w:t>交付与复核</w:t>
-      </w:r>
-    </w:p>
-    <w:p>
-      <w:pPr>
-        <w:ind w:firstLine="480"/>
-      </w:pPr>
-      <w:r>
-        <w:t>负责交付游戏工程、</w:t>
-      </w:r>
-      <w:r>
-        <w:t xml:space="preserve">Windows </w:t>
-      </w:r>
-      <w:r>
-        <w:t>运行包、版本说明和最终目录。程序修复交李星莹复测；玩法或界面变化交沈语雯复核。尚未解决的问题保留影响说明，避免混入</w:t>
-      </w:r>
-      <w:r>
-        <w:t>“</w:t>
-      </w:r>
-      <w:r>
-        <w:t>已完成</w:t>
-      </w:r>
-      <w:r>
-        <w:t>”</w:t>
-      </w:r>
-      <w:r>
-        <w:t>事项。版本确定后记录使用范围，减少成员误用旧文件。</w:t>
-      </w:r>
-    </w:p>
-    <w:p>
-      <w:pPr>
-        <w:pStyle w:val="31"/>
-      </w:pPr>
-      <w:r>
-        <w:t>协作边界</w:t>
-      </w:r>
-    </w:p>
-    <w:p>
-      <w:pPr>
-        <w:ind w:firstLine="480"/>
-      </w:pPr>
-      <w:r>
-        <w:rPr>
-          <w:spacing w:val="-5"/>
-        </w:rPr>
-        <w:t>负责技术实现与任务协调，玩法取舍须与策划负责人确认，声音与展示更新由材料负责人同步。队长汇总验收结果，原问题是否解决仍以复测记录和对应成员确认作为依据。</w:t>
-      </w:r>
-    </w:p>
-    <w:p>
-      <w:pPr>
-        <w:pStyle w:val="ReportSection"/>
-        <w:pageBreakBefore/>
-        <w:spacing w:before="0" w:after="240"/>
-      </w:pPr>
-      <w:bookmarkStart w:id="14" w:name="_Toc243856766"/>
-      <w:r>
-        <w:rPr>
-          <w:sz w:val="32"/>
-        </w:rPr>
-        <w:lastRenderedPageBreak/>
-        <w:t>沈语雯</w:t>
-      </w:r>
-      <w:r>
-        <w:rPr>
-          <w:sz w:val="32"/>
-        </w:rPr>
-        <w:t xml:space="preserve"> </w:t>
-      </w:r>
-      <w:r>
-        <w:rPr>
-          <w:sz w:val="32"/>
-        </w:rPr>
-        <w:t>策划与视觉负责人</w:t>
-      </w:r>
-      <w:bookmarkEnd w:id="14"/>
-    </w:p>
-    <w:p>
-      <w:r>
-        <w:t>学院</w:t>
-      </w:r>
-      <w:r>
-        <w:t xml:space="preserve">  </w:t>
-      </w:r>
-      <w:r>
-        <w:t>计算机学院、软件学院、网络空间安全学院</w:t>
-      </w:r>
-      <w:r>
-        <w:br/>
-      </w:r>
-      <w:r>
-        <w:t>专业</w:t>
-      </w:r>
-      <w:r>
-        <w:t xml:space="preserve">  </w:t>
-      </w:r>
-      <w:r>
-        <w:t>计算机科学与技术</w:t>
-      </w:r>
-    </w:p>
-    <w:p>
-      <w:pPr>
-        <w:pStyle w:val="31"/>
-      </w:pPr>
-      <w:r>
-        <w:t>职责定位</w:t>
-      </w:r>
-    </w:p>
-    <w:p>
-      <w:pPr>
-        <w:ind w:firstLine="480"/>
-      </w:pPr>
-      <w:r>
-        <w:t>负责玩法策划、关卡设计与视觉交互。将</w:t>
-      </w:r>
-      <w:r>
-        <w:t>“</w:t>
-      </w:r>
-      <w:r>
-        <w:t>起跳造路，落拍留光</w:t>
-      </w:r>
-      <w:r>
-        <w:t>”</w:t>
-      </w:r>
-      <w:r>
-        <w:t>落实为清楚的规则、路线和提示，并检查游戏、设计报告及展示材料是否传达同一套体验。</w:t>
-      </w:r>
-    </w:p>
-    <w:p>
-      <w:pPr>
-        <w:pStyle w:val="31"/>
-      </w:pPr>
-      <w:r>
-        <w:t>玩法规则与策划维护</w:t>
-      </w:r>
-    </w:p>
-    <w:p>
-      <w:pPr>
-        <w:ind w:firstLine="480"/>
-      </w:pPr>
-      <w:r>
-        <w:t>维护起跳判定、临时桥、落拍固定、激光阶段、计分和出口条件的说明，区分当前实现与后续计划。参数变更后同步正文、表格和图注，重点核对四拍寿命、金桥仅在当前尝试内固定等容易产生误解的表述，保证文字能在实际游戏中找到对应结果。</w:t>
-      </w:r>
-    </w:p>
-    <w:p>
-      <w:pPr>
-        <w:pStyle w:val="31"/>
-      </w:pPr>
-      <w:r>
-        <w:t>关卡检查与体验分析</w:t>
-      </w:r>
-    </w:p>
-    <w:p>
-      <w:pPr>
-        <w:ind w:firstLine="480"/>
-      </w:pPr>
-      <w:r>
-        <w:t>逐间检查</w:t>
-      </w:r>
-      <w:r>
-        <w:t>“</w:t>
-      </w:r>
-      <w:r>
-        <w:t>唤醒余音、让光留下、接续回响</w:t>
-      </w:r>
-      <w:r>
-        <w:t>”</w:t>
-      </w:r>
-      <w:r>
-        <w:t>的递进，核对桥前起跳空间、桥后落脚点、安全等待位置及激光间歇。结合试玩记录定位理解或操作困难，写明房间、位置、行为和预期结果；提出调整时说明希望解决的问题，交严楷哲评估实现，更新后再检查原处。</w:t>
-      </w:r>
-    </w:p>
-    <w:p>
-      <w:pPr>
-        <w:pStyle w:val="31"/>
-      </w:pPr>
-      <w:r>
-        <w:t>视觉交互与内容审核</w:t>
-      </w:r>
-    </w:p>
-    <w:p>
-      <w:pPr>
-        <w:ind w:firstLine="480"/>
-      </w:pPr>
-      <w:r>
-        <w:t>检查青桥、金桥、预警虚线和危险光束是否容易区分，确认角色落点、共鸣数量及出口状态清楚可见。统一教学、按键提示、判定和结算用语，避免文字遮挡操作区域。审核视频、</w:t>
-      </w:r>
-      <w:r>
-        <w:t>PPT</w:t>
-      </w:r>
-      <w:r>
-        <w:t>和讲稿中的规则、截图与讲述顺序，并准备立意、关卡及视觉设计方面的答辩说明。</w:t>
-      </w:r>
-    </w:p>
-    <w:p>
-      <w:pPr>
-        <w:pStyle w:val="31"/>
-      </w:pPr>
-      <w:r>
-        <w:t>交付与复核</w:t>
-      </w:r>
-    </w:p>
-    <w:p>
-      <w:pPr>
-        <w:ind w:firstLine="480"/>
-      </w:pPr>
-      <w:r>
-        <w:t>负责交付更新后的设计报告、关卡与界面问题清单、具体调整建议及核对后的展示文案。每项建议附问题位置、预期变化和验收条件；交付前由严楷哲核对技术事实，李星莹检查其与当前运行版本和展示画面是否一致。</w:t>
-      </w:r>
-    </w:p>
-    <w:p>
-      <w:pPr>
-        <w:pStyle w:val="31"/>
-      </w:pPr>
-      <w:r>
-        <w:t>协作边界</w:t>
-      </w:r>
-    </w:p>
-    <w:p>
-      <w:pPr>
-        <w:ind w:firstLine="480"/>
-      </w:pPr>
-      <w:r>
-        <w:t>对规则解释、关卡体验和视觉表达承担主责；涉及程序、声音或材料文件的修改，与对应负责人约定后执行。策划建议与已落实改动分开记录，实际试玩未确认的判断保留为待验证项。</w:t>
-      </w:r>
-    </w:p>
-    <w:p>
-      <w:pPr>
-        <w:pStyle w:val="ReportSection"/>
-        <w:pageBreakBefore/>
-        <w:spacing w:before="0" w:after="240"/>
-      </w:pPr>
-      <w:bookmarkStart w:id="15" w:name="_Toc243856767"/>
-      <w:r>
-        <w:rPr>
-          <w:sz w:val="32"/>
-        </w:rPr>
-        <w:lastRenderedPageBreak/>
-        <w:t>李星莹</w:t>
-      </w:r>
-      <w:r>
-        <w:rPr>
-          <w:sz w:val="32"/>
-        </w:rPr>
-        <w:t xml:space="preserve"> </w:t>
-      </w:r>
-      <w:r>
-        <w:rPr>
-          <w:sz w:val="32"/>
-        </w:rPr>
-        <w:t>音频测试与展示负责人</w:t>
-      </w:r>
-      <w:bookmarkEnd w:id="15"/>
-    </w:p>
-    <w:p>
-      <w:r>
-        <w:t>学院</w:t>
-      </w:r>
-      <w:r>
-        <w:t xml:space="preserve">  </w:t>
-      </w:r>
-      <w:r>
-        <w:t>计算机学院、软件学院、网络空间安全学院</w:t>
-      </w:r>
-      <w:r>
-        <w:br/>
-      </w:r>
-      <w:r>
-        <w:t>专业</w:t>
-      </w:r>
-      <w:r>
-        <w:t xml:space="preserve">  </w:t>
-      </w:r>
-      <w:r>
-        <w:t>计算机科学与技术</w:t>
-      </w:r>
-    </w:p>
-    <w:p>
-      <w:pPr>
-        <w:pStyle w:val="31"/>
-      </w:pPr>
-      <w:r>
-        <w:t>职责定位</w:t>
-      </w:r>
-    </w:p>
-    <w:p>
-      <w:pPr>
-        <w:ind w:firstLine="480"/>
-      </w:pPr>
-      <w:r>
-        <w:t>负责音频检查、功能与设备验证，以及展示材料维护。将游玩中出现的问题记录为可复现的步骤，并确保声音、画面、字幕与讲述对应当前版本。</w:t>
-      </w:r>
-    </w:p>
-    <w:p>
-      <w:pPr>
-        <w:pStyle w:val="31"/>
-      </w:pPr>
-      <w:r>
-        <w:t>声音与同步检查</w:t>
-      </w:r>
-    </w:p>
-    <w:p>
-      <w:pPr>
-        <w:ind w:firstLine="480"/>
-      </w:pPr>
-      <w:r>
-        <w:t>检查循环配乐衔接、响度、音乐开关及暂停恢复，记录扬声器或耳机环境下的判定感受和校准设置。若出现听感与判定不一致，提供设备、偏差表现和操作条件，交严楷哲检查时钟与校准处理；后续事件音效另列为完善任务。</w:t>
-      </w:r>
-    </w:p>
-    <w:p>
-      <w:pPr>
-        <w:pStyle w:val="31"/>
-      </w:pPr>
-      <w:r>
-        <w:t>功能测试与复测</w:t>
-      </w:r>
-    </w:p>
-    <w:p>
-      <w:pPr>
-        <w:ind w:firstLine="480"/>
-      </w:pPr>
-      <w:r>
-        <w:t>按启动、教学、三房间、失败重试、暂停继续、校准及结算逐项检查，安排完整通关和独立</w:t>
-      </w:r>
-      <w:r>
-        <w:t xml:space="preserve"> Windows </w:t>
-      </w:r>
-      <w:r>
-        <w:t>设备验证。记录版本、系统、操作步骤、预期与实际结果，必要时附截图或录像。收到修复包后按相同步骤复测，保留通过结果或仍可复现的情况。</w:t>
-      </w:r>
-    </w:p>
-    <w:p>
-      <w:pPr>
-        <w:pStyle w:val="31"/>
-      </w:pPr>
-      <w:r>
-        <w:t>展示文件与排练</w:t>
-      </w:r>
-    </w:p>
-    <w:p>
-      <w:pPr>
-        <w:ind w:firstLine="480"/>
-      </w:pPr>
-      <w:r>
-        <w:t>完整核看介绍视频的字幕、解说、音乐平衡和画面衔接，确认成片不超过五分钟。维护</w:t>
-      </w:r>
-      <w:r>
-        <w:t>PPT</w:t>
-      </w:r>
-      <w:r>
-        <w:t>与讲稿中的姓名、分工及规则说明，与沈语雯核对内容，组织三至五分钟的计时排练，记录翻页、讲述和游戏演示需要衔接的位置。</w:t>
-      </w:r>
-    </w:p>
-    <w:p>
-      <w:pPr>
-        <w:pStyle w:val="31"/>
-      </w:pPr>
-      <w:r>
-        <w:t>音画归档与文件核验</w:t>
-      </w:r>
-    </w:p>
-    <w:p>
-      <w:pPr>
-        <w:ind w:firstLine="480"/>
-      </w:pPr>
-      <w:r>
-        <w:t>维护图标、截图、配乐及来源清单，资源变化后同步素材包。检查文件可打开、压缩包可解压，协助验证分享下载，并准备视频、</w:t>
-      </w:r>
-      <w:r>
-        <w:t>PPT</w:t>
-      </w:r>
-      <w:r>
-        <w:t>、讲稿和备用</w:t>
-      </w:r>
-      <w:r>
-        <w:t>PDF</w:t>
-      </w:r>
-      <w:r>
-        <w:t>，供最终审核与现场使用。</w:t>
-      </w:r>
-    </w:p>
-    <w:p>
-      <w:pPr>
-        <w:pStyle w:val="31"/>
-      </w:pPr>
-      <w:r>
-        <w:t>交付与复核</w:t>
-      </w:r>
-    </w:p>
-    <w:p>
-      <w:pPr>
-        <w:ind w:firstLine="480"/>
-      </w:pPr>
-      <w:r>
-        <w:t>负责交付测试与复测记录、核验后的音画和展示文件、排练计时及下载检查记录。规则文字由沈语雯复核，运行版本与程序问题由严楷哲确认，尚未执行的检查保留待办状态。</w:t>
-      </w:r>
-    </w:p>
-    <w:p>
-      <w:pPr>
-        <w:pStyle w:val="31"/>
-      </w:pPr>
-      <w:r>
-        <w:t>协作边界</w:t>
-      </w:r>
-    </w:p>
-    <w:p>
-      <w:pPr>
-        <w:ind w:firstLine="480"/>
-      </w:pPr>
-      <w:r>
-        <w:t>承担验证和文件维护主责，记录测试事实；规则取舍、程序修复分别交对应负责人处理。现场主讲与辅助顺序在完整排练后确定。</w:t>
-      </w:r>
-    </w:p>
-    <w:p>
-      <w:pPr>
-        <w:pStyle w:val="ReportSection"/>
-        <w:pageBreakBefore/>
-        <w:spacing w:before="0" w:after="240"/>
-      </w:pPr>
-      <w:bookmarkStart w:id="16" w:name="_Toc243856768"/>
-      <w:r>
-        <w:rPr>
-          <w:sz w:val="32"/>
-        </w:rPr>
-        <w:lastRenderedPageBreak/>
-        <w:t>阶段安排与作品资料</w:t>
-      </w:r>
-      <w:bookmarkEnd w:id="16"/>
-    </w:p>
-    <w:p>
-      <w:pPr>
-        <w:ind w:firstLine="480"/>
-      </w:pPr>
-      <w:r>
-        <w:t>下表为后续工作计划，日期表示预定窗口。实际完成后记录版本与结果；未通过的检查继续保留负责人和处理意见。更细的逐日活动见配套《人员分工与活动安排》。</w:t>
+        <w:t>核心机制同时涉及时间、空间与反馈。策划负责说明一次跳跃应产生的体验，程序把规则落实到运动和状态，音频与测试工作关注玩家实际听到、看到和操作到的结果。三者通过同一组关卡与机关条件相互联系。</w:t>
       </w:r>
     </w:p>
     <w:tbl>
@@ -9313,8 +7983,8 @@
       </w:tblPr>
       <w:tblGrid>
         <w:gridCol w:w="2324"/>
-        <w:gridCol w:w="2551"/>
-        <w:gridCol w:w="4422"/>
+        <w:gridCol w:w="3458"/>
+        <w:gridCol w:w="3515"/>
       </w:tblGrid>
       <w:tr>
         <w:trPr>
@@ -9343,13 +8013,13 @@
                 <w:rFonts w:eastAsia="黑体"/>
                 <w:sz w:val="21"/>
               </w:rPr>
-              <w:t>计划阶段</w:t>
+              <w:t>协作内容</w:t>
             </w:r>
           </w:p>
         </w:tc>
         <w:tc>
           <w:tcPr>
-            <w:tcW w:w="2551" w:type="dxa"/>
+            <w:tcW w:w="3458" w:type="dxa"/>
             <w:shd w:val="clear" w:color="auto" w:fill="E8EEF1"/>
             <w:tcMar>
               <w:top w:w="75" w:type="dxa"/>
@@ -9368,13 +8038,13 @@
                 <w:rFonts w:eastAsia="黑体"/>
                 <w:sz w:val="21"/>
               </w:rPr>
-              <w:t>人员安排</w:t>
+              <w:t>程序实现</w:t>
             </w:r>
           </w:p>
         </w:tc>
         <w:tc>
           <w:tcPr>
-            <w:tcW w:w="4422" w:type="dxa"/>
+            <w:tcW w:w="3515" w:type="dxa"/>
             <w:shd w:val="clear" w:color="auto" w:fill="E8EEF1"/>
             <w:tcMar>
               <w:top w:w="75" w:type="dxa"/>
@@ -9393,7 +8063,7 @@
                 <w:rFonts w:eastAsia="黑体"/>
                 <w:sz w:val="21"/>
               </w:rPr>
-              <w:t>工作与成果</w:t>
+              <w:t>策划与验证关注</w:t>
             </w:r>
           </w:p>
         </w:tc>
@@ -9423,43 +8093,13 @@
               <w:rPr>
                 <w:sz w:val="21"/>
               </w:rPr>
-              <w:t>10</w:t>
-            </w:r>
-            <w:r>
-              <w:rPr>
-                <w:sz w:val="21"/>
-              </w:rPr>
-              <w:t>月</w:t>
-            </w:r>
-            <w:r>
-              <w:rPr>
-                <w:sz w:val="21"/>
-              </w:rPr>
-              <w:t>25—26</w:t>
-            </w:r>
-            <w:r>
-              <w:rPr>
-                <w:sz w:val="21"/>
-              </w:rPr>
-              <w:t>日</w:t>
-            </w:r>
-            <w:r>
-              <w:rPr>
-                <w:sz w:val="21"/>
-              </w:rPr>
-              <w:br/>
-            </w:r>
-            <w:r>
-              <w:rPr>
-                <w:sz w:val="21"/>
-              </w:rPr>
-              <w:t>集中检查</w:t>
+              <w:t>两拍起落与四拍光桥</w:t>
             </w:r>
           </w:p>
         </w:tc>
         <w:tc>
           <w:tcPr>
-            <w:tcW w:w="2551" w:type="dxa"/>
+            <w:tcW w:w="3458" w:type="dxa"/>
             <w:shd w:val="clear" w:color="auto" w:fill="F8FAFB"/>
             <w:tcMar>
               <w:top w:w="75" w:type="dxa"/>
@@ -9477,37 +8117,13 @@
               <w:rPr>
                 <w:sz w:val="21"/>
               </w:rPr>
-              <w:t>李星莹记录</w:t>
-            </w:r>
-            <w:r>
-              <w:rPr>
-                <w:sz w:val="21"/>
-              </w:rPr>
-              <w:br/>
-            </w:r>
-            <w:r>
-              <w:rPr>
-                <w:sz w:val="21"/>
-              </w:rPr>
-              <w:t>严楷哲修复</w:t>
-            </w:r>
-            <w:r>
-              <w:rPr>
-                <w:sz w:val="21"/>
-              </w:rPr>
-              <w:br/>
-            </w:r>
-            <w:r>
-              <w:rPr>
-                <w:sz w:val="21"/>
-              </w:rPr>
-              <w:t>沈语雯核对体验</w:t>
+              <w:t>运动参数、判定窗口、桥面碰撞与计时</w:t>
             </w:r>
           </w:p>
         </w:tc>
         <w:tc>
           <w:tcPr>
-            <w:tcW w:w="4422" w:type="dxa"/>
+            <w:tcW w:w="3515" w:type="dxa"/>
             <w:shd w:val="clear" w:color="auto" w:fill="F8FAFB"/>
             <w:tcMar>
               <w:top w:w="75" w:type="dxa"/>
@@ -9525,7 +8141,7 @@
               <w:rPr>
                 <w:sz w:val="21"/>
               </w:rPr>
-              <w:t>完成全流程与独立设备检查，形成问题清单、修复说明和复测结果</w:t>
+              <w:t>落点空间、修复条件与反馈是否对应</w:t>
             </w:r>
           </w:p>
         </w:tc>
@@ -9555,43 +8171,13 @@
               <w:rPr>
                 <w:sz w:val="21"/>
               </w:rPr>
-              <w:t>10</w:t>
-            </w:r>
-            <w:r>
-              <w:rPr>
-                <w:sz w:val="21"/>
-              </w:rPr>
-              <w:t>月</w:t>
-            </w:r>
-            <w:r>
-              <w:rPr>
-                <w:sz w:val="21"/>
-              </w:rPr>
-              <w:t>27—28</w:t>
-            </w:r>
-            <w:r>
-              <w:rPr>
-                <w:sz w:val="21"/>
-              </w:rPr>
-              <w:t>日</w:t>
-            </w:r>
-            <w:r>
-              <w:rPr>
-                <w:sz w:val="21"/>
-              </w:rPr>
-              <w:br/>
-            </w:r>
-            <w:r>
-              <w:rPr>
-                <w:sz w:val="21"/>
-              </w:rPr>
-              <w:t>统一版本</w:t>
+              <w:t>激光与安全等待</w:t>
             </w:r>
           </w:p>
         </w:tc>
         <w:tc>
           <w:tcPr>
-            <w:tcW w:w="2551" w:type="dxa"/>
+            <w:tcW w:w="3458" w:type="dxa"/>
             <w:shd w:val="clear" w:color="auto" w:fill="FFFFFF"/>
             <w:tcMar>
               <w:top w:w="75" w:type="dxa"/>
@@ -9609,37 +8195,13 @@
               <w:rPr>
                 <w:sz w:val="21"/>
               </w:rPr>
-              <w:t>严楷哲定版本</w:t>
-            </w:r>
-            <w:r>
-              <w:rPr>
-                <w:sz w:val="21"/>
-              </w:rPr>
-              <w:br/>
-            </w:r>
-            <w:r>
-              <w:rPr>
-                <w:sz w:val="21"/>
-              </w:rPr>
-              <w:t>沈语雯审内容</w:t>
-            </w:r>
-            <w:r>
-              <w:rPr>
-                <w:sz w:val="21"/>
-              </w:rPr>
-              <w:br/>
-            </w:r>
-            <w:r>
-              <w:rPr>
-                <w:sz w:val="21"/>
-              </w:rPr>
-              <w:t>李星莹整材料</w:t>
+              <w:t>预警、危险、间歇的周期及相位</w:t>
             </w:r>
           </w:p>
         </w:tc>
         <w:tc>
           <w:tcPr>
-            <w:tcW w:w="4422" w:type="dxa"/>
+            <w:tcW w:w="3515" w:type="dxa"/>
             <w:shd w:val="clear" w:color="auto" w:fill="FFFFFF"/>
             <w:tcMar>
               <w:top w:w="75" w:type="dxa"/>
@@ -9657,7 +8219,7 @@
               <w:rPr>
                 <w:sz w:val="21"/>
               </w:rPr>
-              <w:t>核对工程与运行包，同步报告、截图、视频和宣讲文件</w:t>
+              <w:t>等待位置、通过时机与状态辨识</w:t>
             </w:r>
           </w:p>
         </w:tc>
@@ -9687,43 +8249,13 @@
               <w:rPr>
                 <w:sz w:val="21"/>
               </w:rPr>
-              <w:t>10</w:t>
-            </w:r>
-            <w:r>
-              <w:rPr>
-                <w:sz w:val="21"/>
-              </w:rPr>
-              <w:t>月</w:t>
-            </w:r>
-            <w:r>
-              <w:rPr>
-                <w:sz w:val="21"/>
-              </w:rPr>
-              <w:t>29</w:t>
-            </w:r>
-            <w:r>
-              <w:rPr>
-                <w:sz w:val="21"/>
-              </w:rPr>
-              <w:t>日</w:t>
-            </w:r>
-            <w:r>
-              <w:rPr>
-                <w:sz w:val="21"/>
-              </w:rPr>
-              <w:br/>
-            </w:r>
-            <w:r>
-              <w:rPr>
-                <w:sz w:val="21"/>
-              </w:rPr>
-              <w:t>展示排练</w:t>
+              <w:t>声音与视觉拍点</w:t>
             </w:r>
           </w:p>
         </w:tc>
         <w:tc>
           <w:tcPr>
-            <w:tcW w:w="2551" w:type="dxa"/>
+            <w:tcW w:w="3458" w:type="dxa"/>
             <w:shd w:val="clear" w:color="auto" w:fill="F8FAFB"/>
             <w:tcMar>
               <w:top w:w="75" w:type="dxa"/>
@@ -9741,25 +8273,13 @@
               <w:rPr>
                 <w:sz w:val="21"/>
               </w:rPr>
-              <w:t>李星莹组织</w:t>
-            </w:r>
-            <w:r>
-              <w:rPr>
-                <w:sz w:val="21"/>
-              </w:rPr>
-              <w:br/>
-            </w:r>
-            <w:r>
-              <w:rPr>
-                <w:sz w:val="21"/>
-              </w:rPr>
-              <w:t>严楷哲、沈语雯配合</w:t>
+              <w:t>统一时钟、输出补偿与校准</w:t>
             </w:r>
           </w:p>
         </w:tc>
         <w:tc>
           <w:tcPr>
-            <w:tcW w:w="4422" w:type="dxa"/>
+            <w:tcW w:w="3515" w:type="dxa"/>
             <w:shd w:val="clear" w:color="auto" w:fill="F8FAFB"/>
             <w:tcMar>
               <w:top w:w="75" w:type="dxa"/>
@@ -9777,19 +8297,7 @@
               <w:rPr>
                 <w:sz w:val="21"/>
               </w:rPr>
-              <w:t>完成</w:t>
-            </w:r>
-            <w:r>
-              <w:rPr>
-                <w:sz w:val="21"/>
-              </w:rPr>
-              <w:t>3—5</w:t>
-            </w:r>
-            <w:r>
-              <w:rPr>
-                <w:sz w:val="21"/>
-              </w:rPr>
-              <w:t>分钟计时，确定讲述、翻页和演示衔接</w:t>
+              <w:t>音乐主拍、角色光环和拍灯的参照关系</w:t>
             </w:r>
           </w:p>
         </w:tc>
@@ -9819,67 +8327,13 @@
               <w:rPr>
                 <w:sz w:val="21"/>
               </w:rPr>
-              <w:t>10</w:t>
-            </w:r>
-            <w:r>
-              <w:rPr>
-                <w:sz w:val="21"/>
-              </w:rPr>
-              <w:t>月</w:t>
-            </w:r>
-            <w:r>
-              <w:rPr>
-                <w:sz w:val="21"/>
-              </w:rPr>
-              <w:t>30</w:t>
-            </w:r>
-            <w:r>
-              <w:rPr>
-                <w:sz w:val="21"/>
-              </w:rPr>
-              <w:t>日</w:t>
-            </w:r>
-            <w:r>
-              <w:rPr>
-                <w:sz w:val="21"/>
-              </w:rPr>
-              <w:t>—11</w:t>
-            </w:r>
-            <w:r>
-              <w:rPr>
-                <w:sz w:val="21"/>
-              </w:rPr>
-              <w:t>月</w:t>
-            </w:r>
-            <w:r>
-              <w:rPr>
-                <w:sz w:val="21"/>
-              </w:rPr>
-              <w:t>1</w:t>
-            </w:r>
-            <w:r>
-              <w:rPr>
-                <w:sz w:val="21"/>
-              </w:rPr>
-              <w:t>日</w:t>
-            </w:r>
-            <w:r>
-              <w:rPr>
-                <w:sz w:val="21"/>
-              </w:rPr>
-              <w:br/>
-            </w:r>
-            <w:r>
-              <w:rPr>
-                <w:sz w:val="21"/>
-              </w:rPr>
-              <w:t>交付与状态复核</w:t>
+              <w:t>完整游玩流程</w:t>
             </w:r>
           </w:p>
         </w:tc>
         <w:tc>
           <w:tcPr>
-            <w:tcW w:w="2551" w:type="dxa"/>
+            <w:tcW w:w="3458" w:type="dxa"/>
             <w:shd w:val="clear" w:color="auto" w:fill="FFFFFF"/>
             <w:tcMar>
               <w:top w:w="75" w:type="dxa"/>
@@ -9897,25 +8351,13 @@
               <w:rPr>
                 <w:sz w:val="21"/>
               </w:rPr>
-              <w:t>严楷哲统筹</w:t>
-            </w:r>
-            <w:r>
-              <w:rPr>
-                <w:sz w:val="21"/>
-              </w:rPr>
-              <w:br/>
-            </w:r>
-            <w:r>
-              <w:rPr>
-                <w:sz w:val="21"/>
-              </w:rPr>
-              <w:t>三人复核各自文件</w:t>
+              <w:t>重试、暂停、共鸣出口与结算</w:t>
             </w:r>
           </w:p>
         </w:tc>
         <w:tc>
           <w:tcPr>
-            <w:tcW w:w="4422" w:type="dxa"/>
+            <w:tcW w:w="3515" w:type="dxa"/>
             <w:shd w:val="clear" w:color="auto" w:fill="FFFFFF"/>
             <w:tcMar>
               <w:top w:w="75" w:type="dxa"/>
@@ -9933,115 +8375,7 @@
               <w:rPr>
                 <w:sz w:val="21"/>
               </w:rPr>
-              <w:t>核对五类材料、分享下载及实际提交状态，保留最终目录与备份</w:t>
-            </w:r>
-          </w:p>
-        </w:tc>
-      </w:tr>
-      <w:tr>
-        <w:trPr>
-          <w:cantSplit/>
-          <w:jc w:val="center"/>
-        </w:trPr>
-        <w:tc>
-          <w:tcPr>
-            <w:tcW w:w="2324" w:type="dxa"/>
-            <w:shd w:val="clear" w:color="auto" w:fill="F7F4EC"/>
-            <w:tcMar>
-              <w:top w:w="75" w:type="dxa"/>
-              <w:left w:w="95" w:type="dxa"/>
-              <w:bottom w:w="75" w:type="dxa"/>
-              <w:right w:w="95" w:type="dxa"/>
-            </w:tcMar>
-            <w:vAlign w:val="center"/>
-          </w:tcPr>
-          <w:p>
-            <w:pPr>
-              <w:spacing w:after="0" w:line="300" w:lineRule="exact"/>
-            </w:pPr>
-            <w:r>
-              <w:rPr>
-                <w:sz w:val="21"/>
-              </w:rPr>
-              <w:t>11</w:t>
-            </w:r>
-            <w:r>
-              <w:rPr>
-                <w:sz w:val="21"/>
-              </w:rPr>
-              <w:t>月</w:t>
-            </w:r>
-            <w:r>
-              <w:rPr>
-                <w:sz w:val="21"/>
-              </w:rPr>
-              <w:t>2—8</w:t>
-            </w:r>
-            <w:r>
-              <w:rPr>
-                <w:sz w:val="21"/>
-              </w:rPr>
-              <w:t>日</w:t>
-            </w:r>
-            <w:r>
-              <w:rPr>
-                <w:sz w:val="21"/>
-              </w:rPr>
-              <w:br/>
-            </w:r>
-            <w:r>
-              <w:rPr>
-                <w:sz w:val="21"/>
-              </w:rPr>
-              <w:t>现场准备</w:t>
-            </w:r>
-          </w:p>
-        </w:tc>
-        <w:tc>
-          <w:tcPr>
-            <w:tcW w:w="2551" w:type="dxa"/>
-            <w:shd w:val="clear" w:color="auto" w:fill="F8FAFB"/>
-            <w:tcMar>
-              <w:top w:w="75" w:type="dxa"/>
-              <w:left w:w="95" w:type="dxa"/>
-              <w:bottom w:w="75" w:type="dxa"/>
-              <w:right w:w="95" w:type="dxa"/>
-            </w:tcMar>
-            <w:vAlign w:val="center"/>
-          </w:tcPr>
-          <w:p>
-            <w:pPr>
-              <w:spacing w:after="0" w:line="300" w:lineRule="exact"/>
-            </w:pPr>
-            <w:r>
-              <w:rPr>
-                <w:sz w:val="21"/>
-              </w:rPr>
-              <w:t>按排练确定分工</w:t>
-            </w:r>
-          </w:p>
-        </w:tc>
-        <w:tc>
-          <w:tcPr>
-            <w:tcW w:w="4422" w:type="dxa"/>
-            <w:shd w:val="clear" w:color="auto" w:fill="F8FAFB"/>
-            <w:tcMar>
-              <w:top w:w="75" w:type="dxa"/>
-              <w:left w:w="95" w:type="dxa"/>
-              <w:bottom w:w="75" w:type="dxa"/>
-              <w:right w:w="95" w:type="dxa"/>
-            </w:tcMar>
-            <w:vAlign w:val="center"/>
-          </w:tcPr>
-          <w:p>
-            <w:pPr>
-              <w:spacing w:after="0" w:line="300" w:lineRule="exact"/>
-            </w:pPr>
-            <w:r>
-              <w:rPr>
-                <w:sz w:val="21"/>
-              </w:rPr>
-              <w:t>验证离线放映与运行，准备设计、实现、测试方面的说明</w:t>
+              <w:t>教学顺序、失败原因及进程提示</w:t>
             </w:r>
           </w:p>
         </w:tc>
@@ -10057,7 +8391,7 @@
         <w:pStyle w:val="21"/>
       </w:pPr>
       <w:r>
-        <w:t>现场职责</w:t>
+        <w:t>作品呈现</w:t>
       </w:r>
     </w:p>
     <w:p>
@@ -10065,67 +8399,66 @@
         <w:ind w:firstLine="480"/>
       </w:pPr>
       <w:r>
-        <w:t>严楷哲负责运行版本与程序实现说明，沈语雯负责立意、关卡及视觉设计说明，李星莹负责音频、验证及展示文件。主讲、翻页与演示顺序在完整排练后确定，三人均保留一份离线材料。</w:t>
+        <w:t>设计报告以机制与关卡分析说明创作思路，介绍视频使用实际游戏画面展示起跳、落桥与通关，宣讲材料结合设计意图和实现结果展开。三位成员分别承担程序、设计、音频与验证方面的说明。</w:t>
       </w:r>
     </w:p>
     <w:p>
       <w:pPr>
-        <w:pStyle w:val="21"/>
-      </w:pPr>
-      <w:r>
-        <w:t>资料来源与对应版本</w:t>
-      </w:r>
+        <w:pStyle w:val="ReportSection"/>
+        <w:pageBreakBefore/>
+        <w:spacing w:before="0" w:after="240"/>
+      </w:pPr>
+      <w:bookmarkStart w:id="13" w:name="_Toc243857962"/>
+      <w:r>
+        <w:rPr>
+          <w:sz w:val="32"/>
+        </w:rPr>
+        <w:lastRenderedPageBreak/>
+        <w:t>严楷哲</w:t>
+      </w:r>
+      <w:r>
+        <w:rPr>
+          <w:sz w:val="32"/>
+        </w:rPr>
+        <w:t xml:space="preserve"> </w:t>
+      </w:r>
+      <w:r>
+        <w:rPr>
+          <w:sz w:val="32"/>
+        </w:rPr>
+        <w:t>队长与程序负责人</w:t>
+      </w:r>
+      <w:bookmarkEnd w:id="13"/>
     </w:p>
     <w:p>
-      <w:pPr>
-        <w:ind w:firstLine="480"/>
-      </w:pPr>
-      <w:r>
-        <w:t>本报告对应《踏光：两拍回响》</w:t>
-      </w:r>
-      <w:r>
-        <w:t>v0.2</w:t>
-      </w:r>
-      <w:r>
-        <w:t>。文中截图为当前游戏画面，桥体、激光和界面局部仅作裁切与标注；时间、路线和实现示意均依据工程绘制。</w:t>
+      <w:r>
+        <w:t>学院</w:t>
+      </w:r>
+      <w:r>
+        <w:t xml:space="preserve">  </w:t>
+      </w:r>
+      <w:r>
+        <w:t>集成电路科学与工程学院（产教融合学院）</w:t>
+      </w:r>
+      <w:r>
+        <w:br/>
+      </w:r>
+      <w:r>
+        <w:t>专业</w:t>
+      </w:r>
+      <w:r>
+        <w:t xml:space="preserve">  </w:t>
+      </w:r>
+      <w:r>
+        <w:t>集成电路设计与集成系统</w:t>
       </w:r>
     </w:p>
     <w:p>
       <w:pPr>
-        <w:ind w:firstLine="480"/>
-      </w:pPr>
-      <w:r>
-        <w:t>图标为</w:t>
-      </w:r>
-      <w:r>
-        <w:t>SVG</w:t>
-      </w:r>
-      <w:r>
-        <w:t>，角色、场景及机关由工程绘制，循环配乐和生成工具随工程保存。资源用途与来源记录见</w:t>
-      </w:r>
-      <w:r>
-        <w:t xml:space="preserve"> docs/assets.md</w:t>
-      </w:r>
-      <w:r>
-        <w:t>，运行方法与检查见</w:t>
-      </w:r>
-      <w:r>
-        <w:t xml:space="preserve"> docs/development.md</w:t>
-      </w:r>
-      <w:r>
-        <w:t>，许可资料见</w:t>
-      </w:r>
-      <w:r>
-        <w:t xml:space="preserve"> NOTICE </w:t>
-      </w:r>
-      <w:r>
-        <w:t>和</w:t>
-      </w:r>
-      <w:r>
-        <w:t xml:space="preserve"> THIRD_PARTY_NOTICES.md</w:t>
-      </w:r>
-      <w:r>
-        <w:t>。</w:t>
+        <w:pStyle w:val="31"/>
+      </w:pPr>
+      <w:r>
+        <w:t>职责定位</w:t>
       </w:r>
     </w:p>
     <w:p>
@@ -10133,10 +8466,435 @@
         <w:ind w:firstLine="480"/>
       </w:pPr>
       <w:r>
-        <w:t>工程与版本资料</w:t>
-      </w:r>
-      <w:r>
-        <w:t xml:space="preserve">  github.com/xunraozhou/treadlight</w:t>
+        <w:t>担任队长，负责游戏程序、工程版本与技术统筹。围绕</w:t>
+      </w:r>
+      <w:r>
+        <w:t>“</w:t>
+      </w:r>
+      <w:r>
+        <w:t>起跳造路、落拍留光</w:t>
+      </w:r>
+      <w:r>
+        <w:t>”</w:t>
+      </w:r>
+      <w:r>
+        <w:t>的核心体验，组织角色运动、节拍判定、机关状态和房间流程的实现，使规则、画面与实际操作相互对应。</w:t>
+      </w:r>
+    </w:p>
+    <w:p>
+      <w:pPr>
+        <w:pStyle w:val="31"/>
+      </w:pPr>
+      <w:r>
+        <w:t>角色运动与动作判定</w:t>
+      </w:r>
+    </w:p>
+    <w:p>
+      <w:pPr>
+        <w:ind w:firstLine="480"/>
+      </w:pPr>
+      <w:r>
+        <w:t>负责水平移动、重力、地面单次起跳及碰撞处理，保持普通跳跃与踩拍跳跃的轨迹一致。以角色实际离地和着地作为判定依据，区分按键输入、空中运动与有效落桥，处理同拍重复判定、目标桥关联及首次修复奖励，保证每次共鸣增加都有对应的动作过程。</w:t>
+      </w:r>
+    </w:p>
+    <w:p>
+      <w:pPr>
+        <w:pStyle w:val="31"/>
+      </w:pPr>
+      <w:r>
+        <w:t>节拍时钟与声音同步</w:t>
+      </w:r>
+    </w:p>
+    <w:p>
+      <w:pPr>
+        <w:ind w:firstLine="480"/>
+      </w:pPr>
+      <w:r>
+        <w:t>负责统一节拍时钟及其与音频播放的衔接，处理混音等待、输出延迟、判定校准和设置保存。使桥面寿命、激光阶段与视觉拍点读取同一进度；暂停时同步冻结，继续时保持原有相位，重试时重新建立准备拍，避免不同系统各自计时造成偏差。</w:t>
+      </w:r>
+    </w:p>
+    <w:p>
+      <w:pPr>
+        <w:pStyle w:val="31"/>
+      </w:pPr>
+      <w:r>
+        <w:t>机关状态与房间流程</w:t>
+      </w:r>
+    </w:p>
+    <w:p>
+      <w:pPr>
+        <w:ind w:firstLine="480"/>
+      </w:pPr>
+      <w:r>
+        <w:t>负责光桥的激活、末拍闪烁、到期消失和落拍固定，以及激光预警、危险阶段与伤害检测。维护三间房间的场景配置、共鸣数量、出口条件和结算逻辑，区分当前房间与累计表现，保证失败重试能够恢复完整的初始状态。</w:t>
+      </w:r>
+    </w:p>
+    <w:p>
+      <w:pPr>
+        <w:pStyle w:val="31"/>
+      </w:pPr>
+      <w:r>
+        <w:t>程序验证与版本维护</w:t>
+      </w:r>
+    </w:p>
+    <w:p>
+      <w:pPr>
+        <w:ind w:firstLine="480"/>
+      </w:pPr>
+      <w:r>
+        <w:t>负责判定边界、机关状态和通关条件的程序检查，并以实际角色物理路线核对关卡可行性。维护可导入的工程与可运行版本，处理启动、资源加载、碰撞和流程异常。参数调整时同时检查受影响的运动、机关及界面表现，保持各部分使用一致的规则。</w:t>
+      </w:r>
+    </w:p>
+    <w:p>
+      <w:pPr>
+        <w:pStyle w:val="31"/>
+      </w:pPr>
+      <w:r>
+        <w:t>技术统筹与作品说明</w:t>
+      </w:r>
+    </w:p>
+    <w:p>
+      <w:pPr>
+        <w:ind w:firstLine="480"/>
+      </w:pPr>
+      <w:r>
+        <w:t>负责将策划中的路线、节拍关系和交互要求落实为工程行为，与沈语雯讨论地形和操作的配合，与李星莹共同分析声音及设备表现。作品说明中承担程序结构、时间同步和实现验证的介绍，解释核心机制的技术依据与当前版本的功能范围。</w:t>
+      </w:r>
+    </w:p>
+    <w:p>
+      <w:pPr>
+        <w:pStyle w:val="ReportSection"/>
+        <w:pageBreakBefore/>
+        <w:spacing w:before="0" w:after="240"/>
+      </w:pPr>
+      <w:bookmarkStart w:id="14" w:name="_Toc243857963"/>
+      <w:r>
+        <w:rPr>
+          <w:sz w:val="32"/>
+        </w:rPr>
+        <w:lastRenderedPageBreak/>
+        <w:t>沈语雯</w:t>
+      </w:r>
+      <w:r>
+        <w:rPr>
+          <w:sz w:val="32"/>
+        </w:rPr>
+        <w:t xml:space="preserve"> </w:t>
+      </w:r>
+      <w:r>
+        <w:rPr>
+          <w:sz w:val="32"/>
+        </w:rPr>
+        <w:t>策划与视觉负责人</w:t>
+      </w:r>
+      <w:bookmarkEnd w:id="14"/>
+    </w:p>
+    <w:p>
+      <w:r>
+        <w:t>学院</w:t>
+      </w:r>
+      <w:r>
+        <w:t xml:space="preserve">  </w:t>
+      </w:r>
+      <w:r>
+        <w:t>计算机学院、软件学院、网络空间安全学院</w:t>
+      </w:r>
+      <w:r>
+        <w:br/>
+      </w:r>
+      <w:r>
+        <w:t>专业</w:t>
+      </w:r>
+      <w:r>
+        <w:t xml:space="preserve">  </w:t>
+      </w:r>
+      <w:r>
+        <w:t>计算机科学与技术</w:t>
+      </w:r>
+    </w:p>
+    <w:p>
+      <w:pPr>
+        <w:pStyle w:val="31"/>
+      </w:pPr>
+      <w:r>
+        <w:t>职责定位</w:t>
+      </w:r>
+    </w:p>
+    <w:p>
+      <w:pPr>
+        <w:ind w:firstLine="480"/>
+      </w:pPr>
+      <w:r>
+        <w:t>负责玩法策划、关卡设计与视觉交互。围绕</w:t>
+      </w:r>
+      <w:r>
+        <w:t>“</w:t>
+      </w:r>
+      <w:r>
+        <w:t>律动</w:t>
+      </w:r>
+      <w:r>
+        <w:t>”</w:t>
+      </w:r>
+      <w:r>
+        <w:t>主题，说明角色起落、道路修复和场景变化之间的关系，将作品立意落实到玩家能够观察、尝试并逐步掌握的游戏过程。</w:t>
+      </w:r>
+    </w:p>
+    <w:p>
+      <w:pPr>
+        <w:pStyle w:val="31"/>
+      </w:pPr>
+      <w:r>
+        <w:t>核心玩法与规则设计</w:t>
+      </w:r>
+    </w:p>
+    <w:p>
+      <w:pPr>
+        <w:ind w:firstLine="480"/>
+      </w:pPr>
+      <w:r>
+        <w:t>负责起跳激活、四拍临时桥、落拍固定及共鸣出口的规则说明，梳理成功、偏拍和失败三类结果。分析两拍飞行、桥面宽度、有效判定窗口与安全等待之间的配合，明确普通移动和节拍交互各自的作用，使时间判断与空间选择构成完整的修复体验。</w:t>
+      </w:r>
+    </w:p>
+    <w:p>
+      <w:pPr>
+        <w:pStyle w:val="31"/>
+      </w:pPr>
+      <w:r>
+        <w:t>关卡结构与学习递进</w:t>
+      </w:r>
+    </w:p>
+    <w:p>
+      <w:pPr>
+        <w:ind w:firstLine="480"/>
+      </w:pPr>
+      <w:r>
+        <w:t>负责</w:t>
+      </w:r>
+      <w:r>
+        <w:t>“</w:t>
+      </w:r>
+      <w:r>
+        <w:t>唤醒余音、让光留下、接续回响</w:t>
+      </w:r>
+      <w:r>
+        <w:t>”</w:t>
+      </w:r>
+      <w:r>
+        <w:t>的教学顺序和路线分析。第一间集中呈现青桥与金桥的区别，第二间引入激光周期，第三间组织连续修复。检查桥前起跳空间、桥后落脚点、固定平台和高低差，使每段路线具有清楚的观察、行动与调整位置。</w:t>
+      </w:r>
+    </w:p>
+    <w:p>
+      <w:pPr>
+        <w:pStyle w:val="31"/>
+      </w:pPr>
+      <w:r>
+        <w:t>视觉表现与状态辨识</w:t>
+      </w:r>
+    </w:p>
+    <w:p>
+      <w:pPr>
+        <w:ind w:firstLine="480"/>
+      </w:pPr>
+      <w:r>
+        <w:t>负责角色、地形、桥面和危险区域之间的信息层次，检查背景与前景的明暗关系。通过青色与金色、虚线与实体、闪烁与波纹表达机关状态，保持角色落点、共鸣进度和出口变化清楚可见；关注画面效果对平台边缘和危险范围判断的影响。</w:t>
+      </w:r>
+    </w:p>
+    <w:p>
+      <w:pPr>
+        <w:pStyle w:val="31"/>
+      </w:pPr>
+      <w:r>
+        <w:t>教学界面与交互文字</w:t>
+      </w:r>
+    </w:p>
+    <w:p>
+      <w:pPr>
+        <w:ind w:firstLine="480"/>
+      </w:pPr>
+      <w:r>
+        <w:t>负责教学、按键提示、判定反馈、失败及结算的文字表达，使各处使用一致的规则名称。教学重点说明落地自动判定与全部共鸣开门，界面重点区分任务进展和操作表现。检查提示出现的位置与时机，避免阅读文字遮挡角色、桥边和激光预警。</w:t>
+      </w:r>
+    </w:p>
+    <w:p>
+      <w:pPr>
+        <w:pStyle w:val="31"/>
+      </w:pPr>
+      <w:r>
+        <w:t>体验分析与设计呈现</w:t>
+      </w:r>
+    </w:p>
+    <w:p>
+      <w:pPr>
+        <w:ind w:firstLine="480"/>
+      </w:pPr>
+      <w:r>
+        <w:t>负责从试玩中的具体操作分析规则理解与路线困难，关注玩家是否识别修复结果、是否知道等待和重试的机会。维护设计报告中的机制分析、关卡图和画面说明，审核视频、</w:t>
+      </w:r>
+      <w:r>
+        <w:t>PPT</w:t>
+      </w:r>
+      <w:r>
+        <w:t>及讲稿对玩法的表达，使展示能够清楚解释设计选择及其在游戏中的结果。</w:t>
+      </w:r>
+    </w:p>
+    <w:p>
+      <w:pPr>
+        <w:pStyle w:val="ReportSection"/>
+        <w:pageBreakBefore/>
+        <w:spacing w:before="0" w:after="240"/>
+      </w:pPr>
+      <w:bookmarkStart w:id="15" w:name="_Toc243857964"/>
+      <w:r>
+        <w:rPr>
+          <w:sz w:val="32"/>
+        </w:rPr>
+        <w:lastRenderedPageBreak/>
+        <w:t>李星莹</w:t>
+      </w:r>
+      <w:r>
+        <w:rPr>
+          <w:sz w:val="32"/>
+        </w:rPr>
+        <w:t xml:space="preserve"> </w:t>
+      </w:r>
+      <w:r>
+        <w:rPr>
+          <w:sz w:val="32"/>
+        </w:rPr>
+        <w:t>音频测试与展示负责人</w:t>
+      </w:r>
+      <w:bookmarkEnd w:id="15"/>
+    </w:p>
+    <w:p>
+      <w:r>
+        <w:t>学院</w:t>
+      </w:r>
+      <w:r>
+        <w:t xml:space="preserve">  </w:t>
+      </w:r>
+      <w:r>
+        <w:t>计算机学院、软件学院、网络空间安全学院</w:t>
+      </w:r>
+      <w:r>
+        <w:br/>
+      </w:r>
+      <w:r>
+        <w:t>专业</w:t>
+      </w:r>
+      <w:r>
+        <w:t xml:space="preserve">  </w:t>
+      </w:r>
+      <w:r>
+        <w:t>计算机科学与技术</w:t>
+      </w:r>
+    </w:p>
+    <w:p>
+      <w:pPr>
+        <w:pStyle w:val="31"/>
+      </w:pPr>
+      <w:r>
+        <w:t>职责定位</w:t>
+      </w:r>
+    </w:p>
+    <w:p>
+      <w:pPr>
+        <w:ind w:firstLine="480"/>
+      </w:pPr>
+      <w:r>
+        <w:t>负责音频表现、游戏验证与展示材料。围绕节拍感、操作反馈和完整游玩流程，检查声音、画面及判定的关系，并通过实际游戏画面说明作品的核心体验与完成情况。</w:t>
+      </w:r>
+    </w:p>
+    <w:p>
+      <w:pPr>
+        <w:pStyle w:val="31"/>
+      </w:pPr>
+      <w:r>
+        <w:t>配乐与声音表现</w:t>
+      </w:r>
+    </w:p>
+    <w:p>
+      <w:pPr>
+        <w:ind w:firstLine="480"/>
+      </w:pPr>
+      <w:r>
+        <w:t>负责循环配乐的节奏清晰度、衔接和响度检查，关注打击节奏、低音与旋律是否有利于辨认主拍。检查音乐开关及不同输出方式下的听感，分析事件反馈需要补充的位置；完善声音表现时，控制修复、失败和通关反馈对主要节拍的遮盖。</w:t>
+      </w:r>
+    </w:p>
+    <w:p>
+      <w:pPr>
+        <w:pStyle w:val="31"/>
+      </w:pPr>
+      <w:r>
+        <w:t>判定感受与音画时序</w:t>
+      </w:r>
+    </w:p>
+    <w:p>
+      <w:pPr>
+        <w:ind w:firstLine="480"/>
+      </w:pPr>
+      <w:r>
+        <w:t>负责检查听到的拍点、角色光环、四拍灯和动作判定是否能够相互参照。结合扬声器或耳机、校准数值与实际操作分析偏差，并检查校准保存、暂停继续和重新开始后的节奏衔接，为时间处理与提示调整提供具体的体验依据。</w:t>
+      </w:r>
+    </w:p>
+    <w:p>
+      <w:pPr>
+        <w:pStyle w:val="31"/>
+      </w:pPr>
+      <w:r>
+        <w:t>功能流程与设备验证</w:t>
+      </w:r>
+    </w:p>
+    <w:p>
+      <w:pPr>
+        <w:ind w:firstLine="480"/>
+      </w:pPr>
+      <w:r>
+        <w:t>负责启动、教学、三间房间、失败重试、暂停、校准和最终结算的功能验证。检查光桥状态、激光预警、共鸣出口与屏幕反馈的一致性，关注重复尝试后的异常。通过完整通关和独立</w:t>
+      </w:r>
+      <w:r>
+        <w:t>Windows</w:t>
+      </w:r>
+      <w:r>
+        <w:t>设备检查中文显示、按键、窗口与音频表现，复测程序调整后原有问题是否仍然出现。</w:t>
+      </w:r>
+    </w:p>
+    <w:p>
+      <w:pPr>
+        <w:pStyle w:val="31"/>
+      </w:pPr>
+      <w:r>
+        <w:t>视频与宣讲材料</w:t>
+      </w:r>
+    </w:p>
+    <w:p>
+      <w:pPr>
+        <w:ind w:firstLine="480"/>
+      </w:pPr>
+      <w:r>
+        <w:t>负责介绍视频、</w:t>
+      </w:r>
+      <w:r>
+        <w:t>PPT</w:t>
+      </w:r>
+      <w:r>
+        <w:t>及讲稿的维护，使讲述顺序与实际游戏过程对应。视频重点呈现起跳、落桥、固定和通关，检查底部字幕、解说及背景音乐的平衡；宣讲材料围绕设计意图、机制特点、关卡递进和实现结果组织，避免画面与口述描述不同的规则。</w:t>
+      </w:r>
+    </w:p>
+    <w:p>
+      <w:pPr>
+        <w:pStyle w:val="31"/>
+      </w:pPr>
+      <w:r>
+        <w:t>素材说明与结果呈现</w:t>
+      </w:r>
+    </w:p>
+    <w:p>
+      <w:pPr>
+        <w:ind w:firstLine="480"/>
+      </w:pPr>
+      <w:r>
+        <w:t>负责整理游戏截图、图标、配乐及相应来源说明，区分游戏实录、规则示意和展示用图。将验证中的设备、操作条件和结果整理为可理解的说明，配合严楷哲分析运行问题、沈语雯判断教学和视觉效果，在作品展示中说明声音设计、验证方法及体验完善方向。</w:t>
       </w:r>
     </w:p>
     <w:sectPr>
@@ -10432,31 +9190,31 @@
       </w:rPr>
     </w:lvl>
   </w:abstractNum>
-  <w:num w:numId="1" w16cid:durableId="77335737">
+  <w:num w:numId="1" w16cid:durableId="978412916">
     <w:abstractNumId w:val="8"/>
   </w:num>
-  <w:num w:numId="2" w16cid:durableId="842936566">
+  <w:num w:numId="2" w16cid:durableId="1469321159">
     <w:abstractNumId w:val="6"/>
   </w:num>
-  <w:num w:numId="3" w16cid:durableId="1114330766">
+  <w:num w:numId="3" w16cid:durableId="2038311581">
     <w:abstractNumId w:val="5"/>
   </w:num>
-  <w:num w:numId="4" w16cid:durableId="1252396802">
+  <w:num w:numId="4" w16cid:durableId="350381134">
     <w:abstractNumId w:val="4"/>
   </w:num>
-  <w:num w:numId="5" w16cid:durableId="398989492">
+  <w:num w:numId="5" w16cid:durableId="421220504">
     <w:abstractNumId w:val="7"/>
   </w:num>
-  <w:num w:numId="6" w16cid:durableId="579415334">
+  <w:num w:numId="6" w16cid:durableId="1066609924">
     <w:abstractNumId w:val="3"/>
   </w:num>
-  <w:num w:numId="7" w16cid:durableId="563104569">
+  <w:num w:numId="7" w16cid:durableId="767238554">
     <w:abstractNumId w:val="2"/>
   </w:num>
-  <w:num w:numId="8" w16cid:durableId="916130676">
+  <w:num w:numId="8" w16cid:durableId="511333024">
     <w:abstractNumId w:val="1"/>
   </w:num>
-  <w:num w:numId="9" w16cid:durableId="646009770">
+  <w:num w:numId="9" w16cid:durableId="1478568675">
     <w:abstractNumId w:val="0"/>
   </w:num>
 </w:numbering>
@@ -21883,7 +20641,7 @@
     <w:autoRedefine/>
     <w:uiPriority w:val="39"/>
     <w:unhideWhenUsed/>
-    <w:rsid w:val="00580103"/>
+    <w:rsid w:val="00AC78F9"/>
   </w:style>
   <w:style w:type="paragraph" w:styleId="TOC2">
     <w:name w:val="toc 2"/>
@@ -21892,7 +20650,7 @@
     <w:autoRedefine/>
     <w:uiPriority w:val="39"/>
     <w:unhideWhenUsed/>
-    <w:rsid w:val="00580103"/>
+    <w:rsid w:val="00AC78F9"/>
     <w:pPr>
       <w:ind w:leftChars="200" w:left="420"/>
     </w:pPr>
@@ -21902,7 +20660,7 @@
     <w:basedOn w:val="a2"/>
     <w:uiPriority w:val="99"/>
     <w:unhideWhenUsed/>
-    <w:rsid w:val="00580103"/>
+    <w:rsid w:val="00AC78F9"/>
     <w:rPr>
       <w:color w:val="0000FF" w:themeColor="hyperlink"/>
       <w:u w:val="single"/>

</xml_diff>